<commit_message>
update notes adn clean directory
</commit_message>
<xml_diff>
--- a/Notes.docx
+++ b/Notes.docx
@@ -79,7 +79,25 @@
           <w:sz w:val="22"/>
           <w:szCs w:val="22"/>
         </w:rPr>
-        <w:t xml:space="preserve"> in a normal condition or without spring framework we would need to create an instance(object) of the class and inject it where it should, manage it. This creates tight coupling. However the inversion of control allows spring boot using @Autowired to create an object for us, inject where </w:t>
+        <w:t xml:space="preserve"> in a normal condition or without spring framework we would need to create an instance(object) of the class and inject it where it should, manage it. This creates tight coupling. </w:t>
+      </w:r>
+      <w:proofErr w:type="gramStart"/>
+      <w:r>
+        <w:rPr>
+          <w:color w:val="000000" w:themeColor="text1"/>
+          <w:sz w:val="22"/>
+          <w:szCs w:val="22"/>
+        </w:rPr>
+        <w:t>However</w:t>
+      </w:r>
+      <w:proofErr w:type="gramEnd"/>
+      <w:r>
+        <w:rPr>
+          <w:color w:val="000000" w:themeColor="text1"/>
+          <w:sz w:val="22"/>
+          <w:szCs w:val="22"/>
+        </w:rPr>
+        <w:t xml:space="preserve"> the inversion of control allows spring boot using @Autowired to create an object for us, inject where </w:t>
       </w:r>
       <w:proofErr w:type="spellStart"/>
       <w:r>
@@ -238,25 +256,23 @@
           <w:sz w:val="22"/>
           <w:szCs w:val="22"/>
         </w:rPr>
-        <w:t xml:space="preserve">@configuration to configure a class  must be </w:t>
-      </w:r>
-      <w:proofErr w:type="spellStart"/>
-      <w:r>
-        <w:rPr>
-          <w:color w:val="000000" w:themeColor="text1"/>
-          <w:sz w:val="22"/>
-          <w:szCs w:val="22"/>
-        </w:rPr>
-        <w:t>non final</w:t>
-      </w:r>
-      <w:proofErr w:type="spellEnd"/>
-      <w:r>
-        <w:rPr>
-          <w:color w:val="000000" w:themeColor="text1"/>
-          <w:sz w:val="22"/>
-          <w:szCs w:val="22"/>
-        </w:rPr>
-        <w:t xml:space="preserve"> and public</w:t>
+        <w:t>@configuration to configure a class must be non</w:t>
+      </w:r>
+      <w:r>
+        <w:rPr>
+          <w:color w:val="000000" w:themeColor="text1"/>
+          <w:sz w:val="22"/>
+          <w:szCs w:val="22"/>
+        </w:rPr>
+        <w:t>-</w:t>
+      </w:r>
+      <w:r>
+        <w:rPr>
+          <w:color w:val="000000" w:themeColor="text1"/>
+          <w:sz w:val="22"/>
+          <w:szCs w:val="22"/>
+        </w:rPr>
+        <w:t>final and public</w:t>
       </w:r>
     </w:p>
     <w:p>
@@ -429,7 +445,25 @@
           <w:sz w:val="22"/>
           <w:szCs w:val="22"/>
         </w:rPr>
-        <w:t>In the app configuration class when we define beans using methods we annotate those methods with @Bean, and this bean that is returned from the method is named the same as the method name but if we wrote @Bean(“name”) now the spring boot will name that bean as name.</w:t>
+        <w:t xml:space="preserve">In the app configuration class when we define beans using </w:t>
+      </w:r>
+      <w:proofErr w:type="gramStart"/>
+      <w:r>
+        <w:rPr>
+          <w:color w:val="000000" w:themeColor="text1"/>
+          <w:sz w:val="22"/>
+          <w:szCs w:val="22"/>
+        </w:rPr>
+        <w:t>methods</w:t>
+      </w:r>
+      <w:proofErr w:type="gramEnd"/>
+      <w:r>
+        <w:rPr>
+          <w:color w:val="000000" w:themeColor="text1"/>
+          <w:sz w:val="22"/>
+          <w:szCs w:val="22"/>
+        </w:rPr>
+        <w:t xml:space="preserve"> we annotate those methods with @Bean, and this bean that is returned from the method is named the same as the method name but if we wrote @Bean(“name”) now the spring boot will name that bean as name.</w:t>
       </w:r>
     </w:p>
     <w:p>
@@ -516,43 +550,71 @@
           <w:sz w:val="22"/>
           <w:szCs w:val="22"/>
         </w:rPr>
-        <w:t xml:space="preserve">@Qualifier(“primary”) is a way that we use to </w:t>
-      </w:r>
-      <w:proofErr w:type="spellStart"/>
-      <w:r>
-        <w:rPr>
-          <w:color w:val="000000" w:themeColor="text1"/>
-          <w:sz w:val="22"/>
-          <w:szCs w:val="22"/>
-        </w:rPr>
-        <w:t>prioiritze</w:t>
-      </w:r>
-      <w:proofErr w:type="spellEnd"/>
-      <w:r>
-        <w:rPr>
-          <w:color w:val="000000" w:themeColor="text1"/>
-          <w:sz w:val="22"/>
-          <w:szCs w:val="22"/>
-        </w:rPr>
-        <w:t xml:space="preserve"> or name our beans in case we have 2 beans of the same type, sometimes we would need to </w:t>
-      </w:r>
-      <w:proofErr w:type="spellStart"/>
-      <w:r>
-        <w:rPr>
-          <w:color w:val="000000" w:themeColor="text1"/>
-          <w:sz w:val="22"/>
-          <w:szCs w:val="22"/>
-        </w:rPr>
-        <w:t>autowire</w:t>
-      </w:r>
-      <w:proofErr w:type="spellEnd"/>
-      <w:r>
-        <w:rPr>
-          <w:color w:val="000000" w:themeColor="text1"/>
-          <w:sz w:val="22"/>
-          <w:szCs w:val="22"/>
-        </w:rPr>
-        <w:t xml:space="preserve"> them but our spring container does not know which one so qualifier is how we tell the spring container which one it is.</w:t>
+        <w:t>@Qualifier(“primary”) is a way that we use to priorit</w:t>
+      </w:r>
+      <w:r>
+        <w:rPr>
+          <w:color w:val="000000" w:themeColor="text1"/>
+          <w:sz w:val="22"/>
+          <w:szCs w:val="22"/>
+        </w:rPr>
+        <w:t>i</w:t>
+      </w:r>
+      <w:r>
+        <w:rPr>
+          <w:color w:val="000000" w:themeColor="text1"/>
+          <w:sz w:val="22"/>
+          <w:szCs w:val="22"/>
+        </w:rPr>
+        <w:t xml:space="preserve">ze or name our beans in case we have 2 beans of the same type, sometimes we would need to </w:t>
+      </w:r>
+      <w:r>
+        <w:rPr>
+          <w:color w:val="000000" w:themeColor="text1"/>
+          <w:sz w:val="22"/>
+          <w:szCs w:val="22"/>
+        </w:rPr>
+        <w:t>@A</w:t>
+      </w:r>
+      <w:r>
+        <w:rPr>
+          <w:color w:val="000000" w:themeColor="text1"/>
+          <w:sz w:val="22"/>
+          <w:szCs w:val="22"/>
+        </w:rPr>
+        <w:t>utowire</w:t>
+      </w:r>
+      <w:r>
+        <w:rPr>
+          <w:color w:val="000000" w:themeColor="text1"/>
+          <w:sz w:val="22"/>
+          <w:szCs w:val="22"/>
+        </w:rPr>
+        <w:t>d</w:t>
+      </w:r>
+      <w:r>
+        <w:rPr>
+          <w:color w:val="000000" w:themeColor="text1"/>
+          <w:sz w:val="22"/>
+          <w:szCs w:val="22"/>
+        </w:rPr>
+        <w:t xml:space="preserve"> them but our spring container does not know which one</w:t>
+      </w:r>
+      <w:r>
+        <w:rPr>
+          <w:color w:val="000000" w:themeColor="text1"/>
+          <w:sz w:val="22"/>
+          <w:szCs w:val="22"/>
+        </w:rPr>
+        <w:t>,</w:t>
+      </w:r>
+      <w:r>
+        <w:rPr>
+          <w:color w:val="000000" w:themeColor="text1"/>
+          <w:sz w:val="22"/>
+          <w:szCs w:val="22"/>
+        </w:rPr>
+        <w:t xml:space="preserve"> so qualifier is how we tell the spring container which one it is.</w:t>
       </w:r>
     </w:p>
     <w:p>
@@ -757,7 +819,25 @@
           <w:sz w:val="22"/>
           <w:szCs w:val="22"/>
         </w:rPr>
-        <w:t xml:space="preserve">@Value(“Actual value”) is used to inject value into a variable, whether its hardcoded or comes from another environment or class. Or class path, or file or variable. </w:t>
+        <w:t>@</w:t>
+      </w:r>
+      <w:proofErr w:type="gramStart"/>
+      <w:r>
+        <w:rPr>
+          <w:color w:val="000000" w:themeColor="text1"/>
+          <w:sz w:val="22"/>
+          <w:szCs w:val="22"/>
+        </w:rPr>
+        <w:t>Value(</w:t>
+      </w:r>
+      <w:proofErr w:type="gramEnd"/>
+      <w:r>
+        <w:rPr>
+          <w:color w:val="000000" w:themeColor="text1"/>
+          <w:sz w:val="22"/>
+          <w:szCs w:val="22"/>
+        </w:rPr>
+        <w:t xml:space="preserve">“Actual value”) is used to inject value into a variable, whether its hardcoded or comes from another environment or class. Or class path, or file or variable. </w:t>
       </w:r>
     </w:p>
     <w:p>
@@ -835,7 +915,6 @@
           <w:sz w:val="22"/>
           <w:szCs w:val="22"/>
         </w:rPr>
-        <w:lastRenderedPageBreak/>
         <w:t xml:space="preserve">Spring boot in a nutshell is a less configuration spring. </w:t>
       </w:r>
     </w:p>
@@ -882,6 +961,24 @@
         </w:rPr>
         <w:t>, mainly through standalone execution, embedded servers, and starter dependencies.</w:t>
       </w:r>
+    </w:p>
+    <w:p>
+      <w:pPr>
+        <w:rPr>
+          <w:color w:val="000000" w:themeColor="text1"/>
+          <w:sz w:val="22"/>
+          <w:szCs w:val="22"/>
+        </w:rPr>
+      </w:pPr>
+    </w:p>
+    <w:p>
+      <w:pPr>
+        <w:rPr>
+          <w:color w:val="000000" w:themeColor="text1"/>
+          <w:sz w:val="22"/>
+          <w:szCs w:val="22"/>
+        </w:rPr>
+      </w:pPr>
     </w:p>
     <w:sectPr>
       <w:pgSz w:w="12240" w:h="15840"/>
@@ -1653,6 +1750,7 @@
   <w:style w:type="character" w:default="1" w:styleId="DefaultParagraphFont">
     <w:name w:val="Default Paragraph Font"/>
     <w:uiPriority w:val="1"/>
+    <w:semiHidden/>
     <w:unhideWhenUsed/>
   </w:style>
   <w:style w:type="table" w:default="1" w:styleId="TableNormal">

</xml_diff>

<commit_message>
practice day1 finished, notes also added
</commit_message>
<xml_diff>
--- a/Notes.docx
+++ b/Notes.docx
@@ -961,6 +961,145 @@
         </w:rPr>
         <w:t>, mainly through standalone execution, embedded servers, and starter dependencies.</w:t>
       </w:r>
+    </w:p>
+    <w:p>
+      <w:pPr>
+        <w:rPr>
+          <w:color w:val="000000" w:themeColor="text1"/>
+          <w:sz w:val="22"/>
+          <w:szCs w:val="22"/>
+        </w:rPr>
+      </w:pPr>
+    </w:p>
+    <w:p>
+      <w:pPr>
+        <w:rPr>
+          <w:color w:val="000000" w:themeColor="text1"/>
+          <w:sz w:val="22"/>
+          <w:szCs w:val="22"/>
+        </w:rPr>
+      </w:pPr>
+      <w:r>
+        <w:rPr>
+          <w:color w:val="000000" w:themeColor="text1"/>
+          <w:sz w:val="22"/>
+          <w:szCs w:val="22"/>
+        </w:rPr>
+        <w:t>A very important note is that we either declare @Component, @Service, at the class definition</w:t>
+      </w:r>
+    </w:p>
+    <w:p>
+      <w:pPr>
+        <w:rPr>
+          <w:color w:val="000000" w:themeColor="text1"/>
+          <w:sz w:val="22"/>
+          <w:szCs w:val="22"/>
+        </w:rPr>
+      </w:pPr>
+      <w:r>
+        <w:rPr>
+          <w:color w:val="000000" w:themeColor="text1"/>
+          <w:sz w:val="22"/>
+          <w:szCs w:val="22"/>
+        </w:rPr>
+        <w:t>Or we make a Configuration class with the annotation @Configuration.</w:t>
+      </w:r>
+    </w:p>
+    <w:p>
+      <w:pPr>
+        <w:rPr>
+          <w:color w:val="000000" w:themeColor="text1"/>
+          <w:sz w:val="22"/>
+          <w:szCs w:val="22"/>
+        </w:rPr>
+      </w:pPr>
+      <w:r>
+        <w:rPr>
+          <w:color w:val="000000" w:themeColor="text1"/>
+          <w:sz w:val="22"/>
+          <w:szCs w:val="22"/>
+        </w:rPr>
+        <w:t>But to define @Bean inside the configuration class and define @Component at class level is design mistake this leads to having 2 different beans of the same class.</w:t>
+      </w:r>
+    </w:p>
+    <w:p>
+      <w:pPr>
+        <w:rPr>
+          <w:color w:val="000000" w:themeColor="text1"/>
+          <w:sz w:val="22"/>
+          <w:szCs w:val="22"/>
+        </w:rPr>
+      </w:pPr>
+    </w:p>
+    <w:p>
+      <w:pPr>
+        <w:rPr>
+          <w:color w:val="000000" w:themeColor="text1"/>
+          <w:sz w:val="22"/>
+          <w:szCs w:val="22"/>
+        </w:rPr>
+      </w:pPr>
+      <w:r>
+        <w:rPr>
+          <w:color w:val="000000" w:themeColor="text1"/>
+          <w:sz w:val="22"/>
+          <w:szCs w:val="22"/>
+        </w:rPr>
+        <w:t>Also @</w:t>
+      </w:r>
+      <w:proofErr w:type="gramStart"/>
+      <w:r>
+        <w:rPr>
+          <w:color w:val="000000" w:themeColor="text1"/>
+          <w:sz w:val="22"/>
+          <w:szCs w:val="22"/>
+        </w:rPr>
+        <w:t>PropertySource(</w:t>
+      </w:r>
+      <w:proofErr w:type="gramEnd"/>
+      <w:r>
+        <w:rPr>
+          <w:color w:val="000000" w:themeColor="text1"/>
+          <w:sz w:val="22"/>
+          <w:szCs w:val="22"/>
+        </w:rPr>
+        <w:t>) shall be defined and used at the class level not inside the class.</w:t>
+      </w:r>
+    </w:p>
+    <w:p>
+      <w:pPr>
+        <w:rPr>
+          <w:color w:val="000000" w:themeColor="text1"/>
+          <w:sz w:val="22"/>
+          <w:szCs w:val="22"/>
+        </w:rPr>
+      </w:pPr>
+      <w:r>
+        <w:rPr>
+          <w:color w:val="000000" w:themeColor="text1"/>
+          <w:sz w:val="22"/>
+          <w:szCs w:val="22"/>
+        </w:rPr>
+        <w:t>Another note is that you cannot inject a bean inside a class before declaring that this class is also a bean.</w:t>
+      </w:r>
+    </w:p>
+    <w:p>
+      <w:pPr>
+        <w:rPr>
+          <w:color w:val="000000" w:themeColor="text1"/>
+          <w:sz w:val="22"/>
+          <w:szCs w:val="22"/>
+        </w:rPr>
+      </w:pPr>
+    </w:p>
+    <w:p>
+      <w:pPr>
+        <w:rPr>
+          <w:color w:val="000000" w:themeColor="text1"/>
+          <w:sz w:val="22"/>
+          <w:szCs w:val="22"/>
+        </w:rPr>
+      </w:pPr>
     </w:p>
     <w:p>
       <w:pPr>

</xml_diff>

<commit_message>
add practice and notes for spring profiles
</commit_message>
<xml_diff>
--- a/Notes.docx
+++ b/Notes.docx
@@ -79,43 +79,7 @@
           <w:sz w:val="22"/>
           <w:szCs w:val="22"/>
         </w:rPr>
-        <w:t xml:space="preserve"> in a normal condition or without spring framework we would need to create an instance(object) of the class and inject it where it should, manage it. This creates tight coupling. </w:t>
-      </w:r>
-      <w:proofErr w:type="gramStart"/>
-      <w:r>
-        <w:rPr>
-          <w:color w:val="000000" w:themeColor="text1"/>
-          <w:sz w:val="22"/>
-          <w:szCs w:val="22"/>
-        </w:rPr>
-        <w:t>However</w:t>
-      </w:r>
-      <w:proofErr w:type="gramEnd"/>
-      <w:r>
-        <w:rPr>
-          <w:color w:val="000000" w:themeColor="text1"/>
-          <w:sz w:val="22"/>
-          <w:szCs w:val="22"/>
-        </w:rPr>
-        <w:t xml:space="preserve"> the inversion of control allows spring boot using @Autowired to create an object for us, inject where </w:t>
-      </w:r>
-      <w:proofErr w:type="spellStart"/>
-      <w:r>
-        <w:rPr>
-          <w:color w:val="000000" w:themeColor="text1"/>
-          <w:sz w:val="22"/>
-          <w:szCs w:val="22"/>
-        </w:rPr>
-        <w:t>its</w:t>
-      </w:r>
-      <w:proofErr w:type="spellEnd"/>
-      <w:r>
-        <w:rPr>
-          <w:color w:val="000000" w:themeColor="text1"/>
-          <w:sz w:val="22"/>
-          <w:szCs w:val="22"/>
-        </w:rPr>
-        <w:t xml:space="preserve"> needed.</w:t>
+        <w:t xml:space="preserve"> in a normal condition or without spring framework we would need to create an instance(object) of the class and inject it where it should, manage it. This creates tight coupling. However the inversion of control allows spring boot using @Autowired to create an object for us, inject where its needed.</w:t>
       </w:r>
     </w:p>
     <w:p>
@@ -445,25 +409,7 @@
           <w:sz w:val="22"/>
           <w:szCs w:val="22"/>
         </w:rPr>
-        <w:t xml:space="preserve">In the app configuration class when we define beans using </w:t>
-      </w:r>
-      <w:proofErr w:type="gramStart"/>
-      <w:r>
-        <w:rPr>
-          <w:color w:val="000000" w:themeColor="text1"/>
-          <w:sz w:val="22"/>
-          <w:szCs w:val="22"/>
-        </w:rPr>
-        <w:t>methods</w:t>
-      </w:r>
-      <w:proofErr w:type="gramEnd"/>
-      <w:r>
-        <w:rPr>
-          <w:color w:val="000000" w:themeColor="text1"/>
-          <w:sz w:val="22"/>
-          <w:szCs w:val="22"/>
-        </w:rPr>
-        <w:t xml:space="preserve"> we annotate those methods with @Bean, and this bean that is returned from the method is named the same as the method name but if we wrote @Bean(“name”) now the spring boot will name that bean as name.</w:t>
+        <w:t>In the app configuration class when we define beans using methods we annotate those methods with @Bean, and this bean that is returned from the method is named the same as the method name but if we wrote @Bean(“name”) now the spring boot will name that bean as name.</w:t>
       </w:r>
     </w:p>
     <w:p>
@@ -819,25 +765,7 @@
           <w:sz w:val="22"/>
           <w:szCs w:val="22"/>
         </w:rPr>
-        <w:t>@</w:t>
-      </w:r>
-      <w:proofErr w:type="gramStart"/>
-      <w:r>
-        <w:rPr>
-          <w:color w:val="000000" w:themeColor="text1"/>
-          <w:sz w:val="22"/>
-          <w:szCs w:val="22"/>
-        </w:rPr>
-        <w:t>Value(</w:t>
-      </w:r>
-      <w:proofErr w:type="gramEnd"/>
-      <w:r>
-        <w:rPr>
-          <w:color w:val="000000" w:themeColor="text1"/>
-          <w:sz w:val="22"/>
-          <w:szCs w:val="22"/>
-        </w:rPr>
-        <w:t xml:space="preserve">“Actual value”) is used to inject value into a variable, whether its hardcoded or comes from another environment or class. Or class path, or file or variable. </w:t>
+        <w:t xml:space="preserve">@Value(“Actual value”) is used to inject value into a variable, whether its hardcoded or comes from another environment or class. Or class path, or file or variable. </w:t>
       </w:r>
     </w:p>
     <w:p>
@@ -1045,25 +973,7 @@
           <w:sz w:val="22"/>
           <w:szCs w:val="22"/>
         </w:rPr>
-        <w:t>Also @</w:t>
-      </w:r>
-      <w:proofErr w:type="gramStart"/>
-      <w:r>
-        <w:rPr>
-          <w:color w:val="000000" w:themeColor="text1"/>
-          <w:sz w:val="22"/>
-          <w:szCs w:val="22"/>
-        </w:rPr>
-        <w:t>PropertySource(</w:t>
-      </w:r>
-      <w:proofErr w:type="gramEnd"/>
-      <w:r>
-        <w:rPr>
-          <w:color w:val="000000" w:themeColor="text1"/>
-          <w:sz w:val="22"/>
-          <w:szCs w:val="22"/>
-        </w:rPr>
-        <w:t>) shall be defined and used at the class level not inside the class.</w:t>
+        <w:t>Also @PropertySource() shall be defined and used at the class level not inside the class.</w:t>
       </w:r>
     </w:p>
     <w:p>
@@ -1103,21 +1013,568 @@
     </w:p>
     <w:p>
       <w:pPr>
-        <w:rPr>
-          <w:color w:val="000000" w:themeColor="text1"/>
-          <w:sz w:val="22"/>
-          <w:szCs w:val="22"/>
-        </w:rPr>
-      </w:pPr>
-    </w:p>
-    <w:p>
-      <w:pPr>
-        <w:rPr>
-          <w:color w:val="000000" w:themeColor="text1"/>
-          <w:sz w:val="22"/>
-          <w:szCs w:val="22"/>
-        </w:rPr>
-      </w:pPr>
+        <w:jc w:val="center"/>
+        <w:rPr>
+          <w:b/>
+          <w:bCs/>
+          <w:color w:val="EE0000"/>
+          <w:sz w:val="32"/>
+          <w:szCs w:val="32"/>
+          <w:u w:val="single"/>
+        </w:rPr>
+      </w:pPr>
+      <w:r>
+        <w:rPr>
+          <w:b/>
+          <w:bCs/>
+          <w:color w:val="EE0000"/>
+          <w:sz w:val="32"/>
+          <w:szCs w:val="32"/>
+          <w:u w:val="single"/>
+        </w:rPr>
+        <w:t>Profiles</w:t>
+      </w:r>
+    </w:p>
+    <w:p>
+      <w:pPr>
+        <w:rPr>
+          <w:color w:val="000000" w:themeColor="text1"/>
+          <w:sz w:val="22"/>
+          <w:szCs w:val="22"/>
+        </w:rPr>
+      </w:pPr>
+      <w:r>
+        <w:rPr>
+          <w:color w:val="000000" w:themeColor="text1"/>
+          <w:sz w:val="22"/>
+          <w:szCs w:val="22"/>
+        </w:rPr>
+        <w:t>Spring Boot profiles and the @Profile annotation are core mechanisms for implementing environment-specific configuration and conditional bean registration. They are fundamental to building applications that cleanly separate concerns such as development, testing, staging, and production behavior.</w:t>
+      </w:r>
+      <w:r>
+        <w:rPr>
+          <w:color w:val="000000" w:themeColor="text1"/>
+          <w:sz w:val="22"/>
+          <w:szCs w:val="22"/>
+        </w:rPr>
+        <w:t xml:space="preserve"> </w:t>
+      </w:r>
+    </w:p>
+    <w:p>
+      <w:pPr>
+        <w:rPr>
+          <w:color w:val="000000" w:themeColor="text1"/>
+          <w:sz w:val="22"/>
+          <w:szCs w:val="22"/>
+        </w:rPr>
+      </w:pPr>
+      <w:r>
+        <w:rPr>
+          <w:color w:val="000000" w:themeColor="text1"/>
+          <w:sz w:val="22"/>
+          <w:szCs w:val="22"/>
+        </w:rPr>
+        <w:t>We have 4 types of environments, dev, test, prod, staging</w:t>
+      </w:r>
+    </w:p>
+    <w:p>
+      <w:pPr>
+        <w:rPr>
+          <w:color w:val="000000" w:themeColor="text1"/>
+          <w:sz w:val="22"/>
+          <w:szCs w:val="22"/>
+        </w:rPr>
+      </w:pPr>
+      <w:r>
+        <w:rPr>
+          <w:color w:val="000000" w:themeColor="text1"/>
+          <w:sz w:val="22"/>
+          <w:szCs w:val="22"/>
+        </w:rPr>
+        <w:t>Using @Profile(“test”) for example on a bean or a class makes them only active, loaded and usable during the testing stage. We can also have it on the .application or application YAML</w:t>
+      </w:r>
+    </w:p>
+    <w:p>
+      <w:pPr>
+        <w:rPr>
+          <w:color w:val="000000" w:themeColor="text1"/>
+          <w:sz w:val="22"/>
+          <w:szCs w:val="22"/>
+        </w:rPr>
+      </w:pPr>
+      <w:r>
+        <w:rPr>
+          <w:color w:val="000000" w:themeColor="text1"/>
+          <w:sz w:val="22"/>
+          <w:szCs w:val="22"/>
+        </w:rPr>
+        <w:t>So for instance we have the default configuration file called application.properties</w:t>
+      </w:r>
+    </w:p>
+    <w:p>
+      <w:pPr>
+        <w:rPr>
+          <w:color w:val="000000" w:themeColor="text1"/>
+          <w:sz w:val="22"/>
+          <w:szCs w:val="22"/>
+        </w:rPr>
+      </w:pPr>
+      <w:r>
+        <w:rPr>
+          <w:color w:val="000000" w:themeColor="text1"/>
+          <w:sz w:val="22"/>
+          <w:szCs w:val="22"/>
+        </w:rPr>
+        <w:t xml:space="preserve">Then we can override it with other files depending on the profile </w:t>
+      </w:r>
+    </w:p>
+    <w:p>
+      <w:pPr>
+        <w:rPr>
+          <w:color w:val="000000" w:themeColor="text1"/>
+          <w:sz w:val="22"/>
+          <w:szCs w:val="22"/>
+        </w:rPr>
+      </w:pPr>
+      <w:r>
+        <w:rPr>
+          <w:color w:val="000000" w:themeColor="text1"/>
+          <w:sz w:val="22"/>
+          <w:szCs w:val="22"/>
+        </w:rPr>
+        <w:t>Application-dev.application</w:t>
+      </w:r>
+    </w:p>
+    <w:p>
+      <w:pPr>
+        <w:rPr>
+          <w:color w:val="000000" w:themeColor="text1"/>
+          <w:sz w:val="22"/>
+          <w:szCs w:val="22"/>
+        </w:rPr>
+      </w:pPr>
+      <w:r>
+        <w:rPr>
+          <w:color w:val="000000" w:themeColor="text1"/>
+          <w:sz w:val="22"/>
+          <w:szCs w:val="22"/>
+        </w:rPr>
+        <w:t>And inside this previous file we can set spring.proflies.active=dev</w:t>
+      </w:r>
+    </w:p>
+    <w:p>
+      <w:pPr>
+        <w:rPr>
+          <w:color w:val="000000" w:themeColor="text1"/>
+          <w:sz w:val="22"/>
+          <w:szCs w:val="22"/>
+        </w:rPr>
+      </w:pPr>
+      <w:r>
+        <w:rPr>
+          <w:color w:val="000000" w:themeColor="text1"/>
+          <w:sz w:val="22"/>
+          <w:szCs w:val="22"/>
+        </w:rPr>
+        <w:t>And then we can keep adding to the configuration file based on our settings</w:t>
+      </w:r>
+    </w:p>
+    <w:p>
+      <w:pPr>
+        <w:rPr>
+          <w:color w:val="000000" w:themeColor="text1"/>
+          <w:sz w:val="22"/>
+          <w:szCs w:val="22"/>
+        </w:rPr>
+      </w:pPr>
+    </w:p>
+    <w:p>
+      <w:pPr>
+        <w:rPr>
+          <w:color w:val="000000" w:themeColor="text1"/>
+          <w:sz w:val="22"/>
+          <w:szCs w:val="22"/>
+        </w:rPr>
+      </w:pPr>
+      <w:r>
+        <w:rPr>
+          <w:color w:val="000000" w:themeColor="text1"/>
+          <w:sz w:val="22"/>
+          <w:szCs w:val="22"/>
+        </w:rPr>
+        <w:lastRenderedPageBreak/>
+        <w:t xml:space="preserve">Spring boot also supports logical structure in declaration of profiles so we can define a bean or a component to work both at test at prod by writing </w:t>
+      </w:r>
+    </w:p>
+    <w:p>
+      <w:pPr>
+        <w:rPr>
+          <w:color w:val="000000" w:themeColor="text1"/>
+          <w:sz w:val="22"/>
+          <w:szCs w:val="22"/>
+        </w:rPr>
+      </w:pPr>
+    </w:p>
+    <w:p>
+      <w:pPr>
+        <w:rPr>
+          <w:color w:val="000000" w:themeColor="text1"/>
+          <w:sz w:val="22"/>
+          <w:szCs w:val="22"/>
+        </w:rPr>
+      </w:pPr>
+      <w:r>
+        <w:rPr>
+          <w:color w:val="000000" w:themeColor="text1"/>
+          <w:sz w:val="22"/>
+          <w:szCs w:val="22"/>
+        </w:rPr>
+        <w:t>@Profile(“Test | prod”)</w:t>
+      </w:r>
+    </w:p>
+    <w:p>
+      <w:pPr>
+        <w:rPr>
+          <w:color w:val="000000" w:themeColor="text1"/>
+          <w:sz w:val="22"/>
+          <w:szCs w:val="22"/>
+        </w:rPr>
+      </w:pPr>
+      <w:r>
+        <w:rPr>
+          <w:color w:val="000000" w:themeColor="text1"/>
+          <w:sz w:val="22"/>
+          <w:szCs w:val="22"/>
+        </w:rPr>
+        <w:t>@Profile(“Test &amp; prod”)</w:t>
+      </w:r>
+    </w:p>
+    <w:p>
+      <w:pPr>
+        <w:rPr>
+          <w:color w:val="000000" w:themeColor="text1"/>
+          <w:sz w:val="22"/>
+          <w:szCs w:val="22"/>
+        </w:rPr>
+      </w:pPr>
+      <w:r>
+        <w:rPr>
+          <w:color w:val="000000" w:themeColor="text1"/>
+          <w:sz w:val="22"/>
+          <w:szCs w:val="22"/>
+        </w:rPr>
+        <w:t>@Profile(“!prod”)</w:t>
+      </w:r>
+    </w:p>
+    <w:p>
+      <w:pPr>
+        <w:rPr>
+          <w:color w:val="000000" w:themeColor="text1"/>
+          <w:sz w:val="22"/>
+          <w:szCs w:val="22"/>
+        </w:rPr>
+      </w:pPr>
+    </w:p>
+    <w:p>
+      <w:pPr>
+        <w:rPr>
+          <w:color w:val="000000" w:themeColor="text1"/>
+          <w:sz w:val="22"/>
+          <w:szCs w:val="22"/>
+        </w:rPr>
+      </w:pPr>
+      <w:r>
+        <w:rPr>
+          <w:color w:val="000000" w:themeColor="text1"/>
+          <w:sz w:val="22"/>
+          <w:szCs w:val="22"/>
+        </w:rPr>
+        <w:t xml:space="preserve">To programmatically activate an environment in our main we can use this: </w:t>
+      </w:r>
+    </w:p>
+    <w:p>
+      <w:pPr>
+        <w:rPr>
+          <w:b/>
+          <w:bCs/>
+          <w:color w:val="000000" w:themeColor="text1"/>
+          <w:sz w:val="22"/>
+          <w:szCs w:val="22"/>
+        </w:rPr>
+      </w:pPr>
+      <w:r>
+        <w:rPr>
+          <w:b/>
+          <w:bCs/>
+          <w:color w:val="000000" w:themeColor="text1"/>
+          <w:sz w:val="22"/>
+          <w:szCs w:val="22"/>
+        </w:rPr>
+        <w:t>Programmatically</w:t>
+      </w:r>
+    </w:p>
+    <w:p>
+      <w:pPr>
+        <w:rPr>
+          <w:color w:val="000000" w:themeColor="text1"/>
+          <w:sz w:val="22"/>
+          <w:szCs w:val="22"/>
+        </w:rPr>
+      </w:pPr>
+      <w:r>
+        <w:rPr>
+          <w:color w:val="000000" w:themeColor="text1"/>
+          <w:sz w:val="22"/>
+          <w:szCs w:val="22"/>
+        </w:rPr>
+        <w:t>SpringApplication app = new SpringApplication(MyApp.class);</w:t>
+      </w:r>
+      <w:r>
+        <w:rPr>
+          <w:color w:val="000000" w:themeColor="text1"/>
+          <w:sz w:val="22"/>
+          <w:szCs w:val="22"/>
+        </w:rPr>
+        <w:br/>
+        <w:t>app.setAdditionalProfiles("dev");</w:t>
+      </w:r>
+      <w:r>
+        <w:rPr>
+          <w:color w:val="000000" w:themeColor="text1"/>
+          <w:sz w:val="22"/>
+          <w:szCs w:val="22"/>
+        </w:rPr>
+        <w:br/>
+        <w:t>app.run(args);</w:t>
+      </w:r>
+    </w:p>
+    <w:p>
+      <w:pPr>
+        <w:rPr>
+          <w:color w:val="000000" w:themeColor="text1"/>
+          <w:sz w:val="22"/>
+          <w:szCs w:val="22"/>
+        </w:rPr>
+      </w:pPr>
+    </w:p>
+    <w:p>
+      <w:pPr>
+        <w:rPr>
+          <w:color w:val="000000" w:themeColor="text1"/>
+          <w:sz w:val="22"/>
+          <w:szCs w:val="22"/>
+        </w:rPr>
+      </w:pPr>
+      <w:r>
+        <w:rPr>
+          <w:color w:val="000000" w:themeColor="text1"/>
+          <w:sz w:val="22"/>
+          <w:szCs w:val="22"/>
+        </w:rPr>
+        <w:t>We can also activate the env inside our default properties by writing</w:t>
+      </w:r>
+    </w:p>
+    <w:p>
+      <w:pPr>
+        <w:rPr>
+          <w:color w:val="000000" w:themeColor="text1"/>
+          <w:sz w:val="22"/>
+          <w:szCs w:val="22"/>
+        </w:rPr>
+      </w:pPr>
+      <w:r>
+        <w:rPr>
+          <w:color w:val="000000" w:themeColor="text1"/>
+          <w:sz w:val="22"/>
+          <w:szCs w:val="22"/>
+        </w:rPr>
+        <w:t>Spring.profiles.active=dev,prod</w:t>
+      </w:r>
+    </w:p>
+    <w:p>
+      <w:pPr>
+        <w:rPr>
+          <w:color w:val="000000" w:themeColor="text1"/>
+          <w:sz w:val="22"/>
+          <w:szCs w:val="22"/>
+        </w:rPr>
+      </w:pPr>
+      <w:r>
+        <w:rPr>
+          <w:color w:val="000000" w:themeColor="text1"/>
+          <w:sz w:val="22"/>
+          <w:szCs w:val="22"/>
+        </w:rPr>
+        <w:t>The prod overrides the dev and executes then</w:t>
+      </w:r>
+    </w:p>
+    <w:p>
+      <w:pPr>
+        <w:rPr>
+          <w:b/>
+          <w:bCs/>
+          <w:color w:val="000000" w:themeColor="text1"/>
+          <w:sz w:val="22"/>
+          <w:szCs w:val="22"/>
+        </w:rPr>
+      </w:pPr>
+      <w:r>
+        <w:rPr>
+          <w:b/>
+          <w:bCs/>
+          <w:color w:val="000000" w:themeColor="text1"/>
+          <w:sz w:val="22"/>
+          <w:szCs w:val="22"/>
+        </w:rPr>
+        <w:t>@Profile applies to:</w:t>
+      </w:r>
+    </w:p>
+    <w:p>
+      <w:pPr>
+        <w:numPr>
+          <w:ilvl w:val="0"/>
+          <w:numId w:val="2"/>
+        </w:numPr>
+        <w:rPr>
+          <w:color w:val="000000" w:themeColor="text1"/>
+          <w:sz w:val="22"/>
+          <w:szCs w:val="22"/>
+        </w:rPr>
+      </w:pPr>
+      <w:r>
+        <w:rPr>
+          <w:color w:val="000000" w:themeColor="text1"/>
+          <w:sz w:val="22"/>
+          <w:szCs w:val="22"/>
+        </w:rPr>
+        <w:t xml:space="preserve">@Bean </w:t>
+      </w:r>
+    </w:p>
+    <w:p>
+      <w:pPr>
+        <w:numPr>
+          <w:ilvl w:val="0"/>
+          <w:numId w:val="2"/>
+        </w:numPr>
+        <w:rPr>
+          <w:color w:val="000000" w:themeColor="text1"/>
+          <w:sz w:val="22"/>
+          <w:szCs w:val="22"/>
+        </w:rPr>
+      </w:pPr>
+      <w:r>
+        <w:rPr>
+          <w:color w:val="000000" w:themeColor="text1"/>
+          <w:sz w:val="22"/>
+          <w:szCs w:val="22"/>
+        </w:rPr>
+        <w:t xml:space="preserve">@Component </w:t>
+      </w:r>
+    </w:p>
+    <w:p>
+      <w:pPr>
+        <w:numPr>
+          <w:ilvl w:val="0"/>
+          <w:numId w:val="2"/>
+        </w:numPr>
+        <w:rPr>
+          <w:color w:val="000000" w:themeColor="text1"/>
+          <w:sz w:val="22"/>
+          <w:szCs w:val="22"/>
+        </w:rPr>
+      </w:pPr>
+      <w:r>
+        <w:rPr>
+          <w:color w:val="000000" w:themeColor="text1"/>
+          <w:sz w:val="22"/>
+          <w:szCs w:val="22"/>
+        </w:rPr>
+        <w:t xml:space="preserve">@Configuration </w:t>
+      </w:r>
+    </w:p>
+    <w:p>
+      <w:pPr>
+        <w:rPr>
+          <w:color w:val="000000" w:themeColor="text1"/>
+          <w:sz w:val="22"/>
+          <w:szCs w:val="22"/>
+        </w:rPr>
+      </w:pPr>
+      <w:r>
+        <w:rPr>
+          <w:color w:val="000000" w:themeColor="text1"/>
+          <w:sz w:val="22"/>
+          <w:szCs w:val="22"/>
+        </w:rPr>
+        <w:t>This is important because many people think it only works on beans.</w:t>
+      </w:r>
+    </w:p>
+    <w:p>
+      <w:pPr>
+        <w:numPr>
+          <w:ilvl w:val="0"/>
+          <w:numId w:val="4"/>
+        </w:numPr>
+        <w:rPr>
+          <w:color w:val="000000" w:themeColor="text1"/>
+          <w:sz w:val="22"/>
+          <w:szCs w:val="22"/>
+        </w:rPr>
+      </w:pPr>
+      <w:r>
+        <w:rPr>
+          <w:color w:val="000000" w:themeColor="text1"/>
+          <w:sz w:val="22"/>
+          <w:szCs w:val="22"/>
+        </w:rPr>
+        <w:t xml:space="preserve">Spring does NOT evaluate @Profile on methods </w:t>
+      </w:r>
+      <w:r>
+        <w:rPr>
+          <w:color w:val="000000" w:themeColor="text1"/>
+          <w:sz w:val="22"/>
+          <w:szCs w:val="22"/>
+        </w:rPr>
+        <w:t xml:space="preserve">using @Profile over a method is a design catastrophe </w:t>
+      </w:r>
+    </w:p>
+    <w:p>
+      <w:pPr>
+        <w:numPr>
+          <w:ilvl w:val="0"/>
+          <w:numId w:val="4"/>
+        </w:numPr>
+        <w:rPr>
+          <w:color w:val="000000" w:themeColor="text1"/>
+          <w:sz w:val="22"/>
+          <w:szCs w:val="22"/>
+        </w:rPr>
+      </w:pPr>
+      <w:r>
+        <w:rPr>
+          <w:color w:val="000000" w:themeColor="text1"/>
+          <w:sz w:val="22"/>
+          <w:szCs w:val="22"/>
+        </w:rPr>
+        <w:t>Only beans (@Component, @Bean, @Configuration) are profile-aware</w:t>
+      </w:r>
+    </w:p>
+    <w:p>
+      <w:pPr>
+        <w:rPr>
+          <w:color w:val="000000" w:themeColor="text1"/>
+          <w:sz w:val="22"/>
+          <w:szCs w:val="22"/>
+        </w:rPr>
+      </w:pPr>
+      <w:r>
+        <w:rPr>
+          <w:color w:val="000000" w:themeColor="text1"/>
+          <w:sz w:val="22"/>
+          <w:szCs w:val="22"/>
+        </w:rPr>
+        <w:t>A good architecture is to create an interface and implement based on the environment, use this interface in the main method, so the application can choose based on the active profile</w:t>
+      </w:r>
     </w:p>
     <w:sectPr>
       <w:pgSz w:w="12240" w:h="15840"/>
@@ -1132,6 +1589,453 @@
 <file path=word/numbering.xml><?xml version="1.0" encoding="utf-8"?>
 <w:numbering xmlns:wpc="http://schemas.microsoft.com/office/word/2010/wordprocessingCanvas" xmlns:cx="http://schemas.microsoft.com/office/drawing/2014/chartex" xmlns:cx1="http://schemas.microsoft.com/office/drawing/2015/9/8/chartex" xmlns:cx2="http://schemas.microsoft.com/office/drawing/2015/10/21/chartex" xmlns:cx3="http://schemas.microsoft.com/office/drawing/2016/5/9/chartex" xmlns:cx4="http://schemas.microsoft.com/office/drawing/2016/5/10/chartex" xmlns:cx5="http://schemas.microsoft.com/office/drawing/2016/5/11/chartex" xmlns:cx6="http://schemas.microsoft.com/office/drawing/2016/5/12/chartex" xmlns:cx7="http://schemas.microsoft.com/office/drawing/2016/5/13/chartex" xmlns:cx8="http://schemas.microsoft.com/office/drawing/2016/5/14/chartex" xmlns:mc="http://schemas.openxmlformats.org/markup-compatibility/2006" xmlns:aink="http://schemas.microsoft.com/office/drawing/2016/ink" xmlns:am3d="http://schemas.microsoft.com/office/drawing/2017/model3d" xmlns:o="urn:schemas-microsoft-com:office:office" xmlns:oel="http://schemas.microsoft.com/office/2019/extlst" xmlns:r="http://schemas.openxmlformats.org/officeDocument/2006/relationships" xmlns:m="http://schemas.openxmlformats.org/officeDocument/2006/math" xmlns:v="urn:schemas-microsoft-com:vml" xmlns:wp14="http://schemas.microsoft.com/office/word/2010/wordprocessingDrawing" xmlns:wp="http://schemas.openxmlformats.org/drawingml/2006/wordprocessingDrawing" xmlns:w10="urn:schemas-microsoft-com:office:word" xmlns:w="http://schemas.openxmlformats.org/wordprocessingml/2006/main" xmlns:w14="http://schemas.microsoft.com/office/word/2010/wordml" xmlns:w15="http://schemas.microsoft.com/office/word/2012/wordml" xmlns:w16cex="http://schemas.microsoft.com/office/word/2018/wordml/cex" xmlns:w16cid="http://schemas.microsoft.com/office/word/2016/wordml/cid" xmlns:w16="http://schemas.microsoft.com/office/word/2018/wordml" xmlns:w16du="http://schemas.microsoft.com/office/word/2023/wordml/word16du" xmlns:w16sdtdh="http://schemas.microsoft.com/office/word/2020/wordml/sdtdatahash" xmlns:w16sdtfl="http://schemas.microsoft.com/office/word/2024/wordml/sdtformatlock" xmlns:w16se="http://schemas.microsoft.com/office/word/2015/wordml/symex" xmlns:wpg="http://schemas.microsoft.com/office/word/2010/wordprocessingGroup" xmlns:wpi="http://schemas.microsoft.com/office/word/2010/wordprocessingInk" xmlns:wne="http://schemas.microsoft.com/office/word/2006/wordml" xmlns:wps="http://schemas.microsoft.com/office/word/2010/wordprocessingShape" mc:Ignorable="w14 w15 w16se w16cid w16 w16cex w16sdtdh w16sdtfl w16du wp14">
   <w:abstractNum w:abstractNumId="0" w15:restartNumberingAfterBreak="0">
+    <w:nsid w:val="028276DC"/>
+    <w:multiLevelType w:val="multilevel"/>
+    <w:tmpl w:val="5FA23042"/>
+    <w:lvl w:ilvl="0">
+      <w:start w:val="1"/>
+      <w:numFmt w:val="bullet"/>
+      <w:lvlText w:val=""/>
+      <w:lvlJc w:val="left"/>
+      <w:pPr>
+        <w:tabs>
+          <w:tab w:val="num" w:pos="720"/>
+        </w:tabs>
+        <w:ind w:left="720" w:hanging="360"/>
+      </w:pPr>
+      <w:rPr>
+        <w:rFonts w:ascii="Symbol" w:hAnsi="Symbol" w:hint="default"/>
+        <w:sz w:val="20"/>
+      </w:rPr>
+    </w:lvl>
+    <w:lvl w:ilvl="1" w:tentative="1">
+      <w:start w:val="1"/>
+      <w:numFmt w:val="bullet"/>
+      <w:lvlText w:val="o"/>
+      <w:lvlJc w:val="left"/>
+      <w:pPr>
+        <w:tabs>
+          <w:tab w:val="num" w:pos="1440"/>
+        </w:tabs>
+        <w:ind w:left="1440" w:hanging="360"/>
+      </w:pPr>
+      <w:rPr>
+        <w:rFonts w:ascii="Courier New" w:hAnsi="Courier New" w:hint="default"/>
+        <w:sz w:val="20"/>
+      </w:rPr>
+    </w:lvl>
+    <w:lvl w:ilvl="2" w:tentative="1">
+      <w:start w:val="1"/>
+      <w:numFmt w:val="bullet"/>
+      <w:lvlText w:val=""/>
+      <w:lvlJc w:val="left"/>
+      <w:pPr>
+        <w:tabs>
+          <w:tab w:val="num" w:pos="2160"/>
+        </w:tabs>
+        <w:ind w:left="2160" w:hanging="360"/>
+      </w:pPr>
+      <w:rPr>
+        <w:rFonts w:ascii="Wingdings" w:hAnsi="Wingdings" w:hint="default"/>
+        <w:sz w:val="20"/>
+      </w:rPr>
+    </w:lvl>
+    <w:lvl w:ilvl="3" w:tentative="1">
+      <w:start w:val="1"/>
+      <w:numFmt w:val="bullet"/>
+      <w:lvlText w:val=""/>
+      <w:lvlJc w:val="left"/>
+      <w:pPr>
+        <w:tabs>
+          <w:tab w:val="num" w:pos="2880"/>
+        </w:tabs>
+        <w:ind w:left="2880" w:hanging="360"/>
+      </w:pPr>
+      <w:rPr>
+        <w:rFonts w:ascii="Wingdings" w:hAnsi="Wingdings" w:hint="default"/>
+        <w:sz w:val="20"/>
+      </w:rPr>
+    </w:lvl>
+    <w:lvl w:ilvl="4" w:tentative="1">
+      <w:start w:val="1"/>
+      <w:numFmt w:val="bullet"/>
+      <w:lvlText w:val=""/>
+      <w:lvlJc w:val="left"/>
+      <w:pPr>
+        <w:tabs>
+          <w:tab w:val="num" w:pos="3600"/>
+        </w:tabs>
+        <w:ind w:left="3600" w:hanging="360"/>
+      </w:pPr>
+      <w:rPr>
+        <w:rFonts w:ascii="Wingdings" w:hAnsi="Wingdings" w:hint="default"/>
+        <w:sz w:val="20"/>
+      </w:rPr>
+    </w:lvl>
+    <w:lvl w:ilvl="5" w:tentative="1">
+      <w:start w:val="1"/>
+      <w:numFmt w:val="bullet"/>
+      <w:lvlText w:val=""/>
+      <w:lvlJc w:val="left"/>
+      <w:pPr>
+        <w:tabs>
+          <w:tab w:val="num" w:pos="4320"/>
+        </w:tabs>
+        <w:ind w:left="4320" w:hanging="360"/>
+      </w:pPr>
+      <w:rPr>
+        <w:rFonts w:ascii="Wingdings" w:hAnsi="Wingdings" w:hint="default"/>
+        <w:sz w:val="20"/>
+      </w:rPr>
+    </w:lvl>
+    <w:lvl w:ilvl="6" w:tentative="1">
+      <w:start w:val="1"/>
+      <w:numFmt w:val="bullet"/>
+      <w:lvlText w:val=""/>
+      <w:lvlJc w:val="left"/>
+      <w:pPr>
+        <w:tabs>
+          <w:tab w:val="num" w:pos="5040"/>
+        </w:tabs>
+        <w:ind w:left="5040" w:hanging="360"/>
+      </w:pPr>
+      <w:rPr>
+        <w:rFonts w:ascii="Wingdings" w:hAnsi="Wingdings" w:hint="default"/>
+        <w:sz w:val="20"/>
+      </w:rPr>
+    </w:lvl>
+    <w:lvl w:ilvl="7" w:tentative="1">
+      <w:start w:val="1"/>
+      <w:numFmt w:val="bullet"/>
+      <w:lvlText w:val=""/>
+      <w:lvlJc w:val="left"/>
+      <w:pPr>
+        <w:tabs>
+          <w:tab w:val="num" w:pos="5760"/>
+        </w:tabs>
+        <w:ind w:left="5760" w:hanging="360"/>
+      </w:pPr>
+      <w:rPr>
+        <w:rFonts w:ascii="Wingdings" w:hAnsi="Wingdings" w:hint="default"/>
+        <w:sz w:val="20"/>
+      </w:rPr>
+    </w:lvl>
+    <w:lvl w:ilvl="8" w:tentative="1">
+      <w:start w:val="1"/>
+      <w:numFmt w:val="bullet"/>
+      <w:lvlText w:val=""/>
+      <w:lvlJc w:val="left"/>
+      <w:pPr>
+        <w:tabs>
+          <w:tab w:val="num" w:pos="6480"/>
+        </w:tabs>
+        <w:ind w:left="6480" w:hanging="360"/>
+      </w:pPr>
+      <w:rPr>
+        <w:rFonts w:ascii="Wingdings" w:hAnsi="Wingdings" w:hint="default"/>
+        <w:sz w:val="20"/>
+      </w:rPr>
+    </w:lvl>
+  </w:abstractNum>
+  <w:abstractNum w:abstractNumId="1" w15:restartNumberingAfterBreak="0">
+    <w:nsid w:val="4F9257AE"/>
+    <w:multiLevelType w:val="multilevel"/>
+    <w:tmpl w:val="EE086DD8"/>
+    <w:lvl w:ilvl="0">
+      <w:start w:val="1"/>
+      <w:numFmt w:val="bullet"/>
+      <w:lvlText w:val=""/>
+      <w:lvlJc w:val="left"/>
+      <w:pPr>
+        <w:tabs>
+          <w:tab w:val="num" w:pos="720"/>
+        </w:tabs>
+        <w:ind w:left="720" w:hanging="360"/>
+      </w:pPr>
+      <w:rPr>
+        <w:rFonts w:ascii="Symbol" w:hAnsi="Symbol" w:hint="default"/>
+        <w:sz w:val="20"/>
+      </w:rPr>
+    </w:lvl>
+    <w:lvl w:ilvl="1" w:tentative="1">
+      <w:start w:val="1"/>
+      <w:numFmt w:val="bullet"/>
+      <w:lvlText w:val="o"/>
+      <w:lvlJc w:val="left"/>
+      <w:pPr>
+        <w:tabs>
+          <w:tab w:val="num" w:pos="1440"/>
+        </w:tabs>
+        <w:ind w:left="1440" w:hanging="360"/>
+      </w:pPr>
+      <w:rPr>
+        <w:rFonts w:ascii="Courier New" w:hAnsi="Courier New" w:hint="default"/>
+        <w:sz w:val="20"/>
+      </w:rPr>
+    </w:lvl>
+    <w:lvl w:ilvl="2" w:tentative="1">
+      <w:start w:val="1"/>
+      <w:numFmt w:val="bullet"/>
+      <w:lvlText w:val=""/>
+      <w:lvlJc w:val="left"/>
+      <w:pPr>
+        <w:tabs>
+          <w:tab w:val="num" w:pos="2160"/>
+        </w:tabs>
+        <w:ind w:left="2160" w:hanging="360"/>
+      </w:pPr>
+      <w:rPr>
+        <w:rFonts w:ascii="Wingdings" w:hAnsi="Wingdings" w:hint="default"/>
+        <w:sz w:val="20"/>
+      </w:rPr>
+    </w:lvl>
+    <w:lvl w:ilvl="3" w:tentative="1">
+      <w:start w:val="1"/>
+      <w:numFmt w:val="bullet"/>
+      <w:lvlText w:val=""/>
+      <w:lvlJc w:val="left"/>
+      <w:pPr>
+        <w:tabs>
+          <w:tab w:val="num" w:pos="2880"/>
+        </w:tabs>
+        <w:ind w:left="2880" w:hanging="360"/>
+      </w:pPr>
+      <w:rPr>
+        <w:rFonts w:ascii="Wingdings" w:hAnsi="Wingdings" w:hint="default"/>
+        <w:sz w:val="20"/>
+      </w:rPr>
+    </w:lvl>
+    <w:lvl w:ilvl="4" w:tentative="1">
+      <w:start w:val="1"/>
+      <w:numFmt w:val="bullet"/>
+      <w:lvlText w:val=""/>
+      <w:lvlJc w:val="left"/>
+      <w:pPr>
+        <w:tabs>
+          <w:tab w:val="num" w:pos="3600"/>
+        </w:tabs>
+        <w:ind w:left="3600" w:hanging="360"/>
+      </w:pPr>
+      <w:rPr>
+        <w:rFonts w:ascii="Wingdings" w:hAnsi="Wingdings" w:hint="default"/>
+        <w:sz w:val="20"/>
+      </w:rPr>
+    </w:lvl>
+    <w:lvl w:ilvl="5" w:tentative="1">
+      <w:start w:val="1"/>
+      <w:numFmt w:val="bullet"/>
+      <w:lvlText w:val=""/>
+      <w:lvlJc w:val="left"/>
+      <w:pPr>
+        <w:tabs>
+          <w:tab w:val="num" w:pos="4320"/>
+        </w:tabs>
+        <w:ind w:left="4320" w:hanging="360"/>
+      </w:pPr>
+      <w:rPr>
+        <w:rFonts w:ascii="Wingdings" w:hAnsi="Wingdings" w:hint="default"/>
+        <w:sz w:val="20"/>
+      </w:rPr>
+    </w:lvl>
+    <w:lvl w:ilvl="6" w:tentative="1">
+      <w:start w:val="1"/>
+      <w:numFmt w:val="bullet"/>
+      <w:lvlText w:val=""/>
+      <w:lvlJc w:val="left"/>
+      <w:pPr>
+        <w:tabs>
+          <w:tab w:val="num" w:pos="5040"/>
+        </w:tabs>
+        <w:ind w:left="5040" w:hanging="360"/>
+      </w:pPr>
+      <w:rPr>
+        <w:rFonts w:ascii="Wingdings" w:hAnsi="Wingdings" w:hint="default"/>
+        <w:sz w:val="20"/>
+      </w:rPr>
+    </w:lvl>
+    <w:lvl w:ilvl="7" w:tentative="1">
+      <w:start w:val="1"/>
+      <w:numFmt w:val="bullet"/>
+      <w:lvlText w:val=""/>
+      <w:lvlJc w:val="left"/>
+      <w:pPr>
+        <w:tabs>
+          <w:tab w:val="num" w:pos="5760"/>
+        </w:tabs>
+        <w:ind w:left="5760" w:hanging="360"/>
+      </w:pPr>
+      <w:rPr>
+        <w:rFonts w:ascii="Wingdings" w:hAnsi="Wingdings" w:hint="default"/>
+        <w:sz w:val="20"/>
+      </w:rPr>
+    </w:lvl>
+    <w:lvl w:ilvl="8" w:tentative="1">
+      <w:start w:val="1"/>
+      <w:numFmt w:val="bullet"/>
+      <w:lvlText w:val=""/>
+      <w:lvlJc w:val="left"/>
+      <w:pPr>
+        <w:tabs>
+          <w:tab w:val="num" w:pos="6480"/>
+        </w:tabs>
+        <w:ind w:left="6480" w:hanging="360"/>
+      </w:pPr>
+      <w:rPr>
+        <w:rFonts w:ascii="Wingdings" w:hAnsi="Wingdings" w:hint="default"/>
+        <w:sz w:val="20"/>
+      </w:rPr>
+    </w:lvl>
+  </w:abstractNum>
+  <w:abstractNum w:abstractNumId="2" w15:restartNumberingAfterBreak="0">
+    <w:nsid w:val="5E4F4DFD"/>
+    <w:multiLevelType w:val="multilevel"/>
+    <w:tmpl w:val="492A4422"/>
+    <w:lvl w:ilvl="0">
+      <w:start w:val="1"/>
+      <w:numFmt w:val="bullet"/>
+      <w:lvlText w:val=""/>
+      <w:lvlJc w:val="left"/>
+      <w:pPr>
+        <w:tabs>
+          <w:tab w:val="num" w:pos="720"/>
+        </w:tabs>
+        <w:ind w:left="720" w:hanging="360"/>
+      </w:pPr>
+      <w:rPr>
+        <w:rFonts w:ascii="Symbol" w:hAnsi="Symbol" w:hint="default"/>
+        <w:sz w:val="20"/>
+      </w:rPr>
+    </w:lvl>
+    <w:lvl w:ilvl="1" w:tentative="1">
+      <w:start w:val="1"/>
+      <w:numFmt w:val="bullet"/>
+      <w:lvlText w:val="o"/>
+      <w:lvlJc w:val="left"/>
+      <w:pPr>
+        <w:tabs>
+          <w:tab w:val="num" w:pos="1440"/>
+        </w:tabs>
+        <w:ind w:left="1440" w:hanging="360"/>
+      </w:pPr>
+      <w:rPr>
+        <w:rFonts w:ascii="Courier New" w:hAnsi="Courier New" w:hint="default"/>
+        <w:sz w:val="20"/>
+      </w:rPr>
+    </w:lvl>
+    <w:lvl w:ilvl="2" w:tentative="1">
+      <w:start w:val="1"/>
+      <w:numFmt w:val="bullet"/>
+      <w:lvlText w:val=""/>
+      <w:lvlJc w:val="left"/>
+      <w:pPr>
+        <w:tabs>
+          <w:tab w:val="num" w:pos="2160"/>
+        </w:tabs>
+        <w:ind w:left="2160" w:hanging="360"/>
+      </w:pPr>
+      <w:rPr>
+        <w:rFonts w:ascii="Wingdings" w:hAnsi="Wingdings" w:hint="default"/>
+        <w:sz w:val="20"/>
+      </w:rPr>
+    </w:lvl>
+    <w:lvl w:ilvl="3" w:tentative="1">
+      <w:start w:val="1"/>
+      <w:numFmt w:val="bullet"/>
+      <w:lvlText w:val=""/>
+      <w:lvlJc w:val="left"/>
+      <w:pPr>
+        <w:tabs>
+          <w:tab w:val="num" w:pos="2880"/>
+        </w:tabs>
+        <w:ind w:left="2880" w:hanging="360"/>
+      </w:pPr>
+      <w:rPr>
+        <w:rFonts w:ascii="Wingdings" w:hAnsi="Wingdings" w:hint="default"/>
+        <w:sz w:val="20"/>
+      </w:rPr>
+    </w:lvl>
+    <w:lvl w:ilvl="4" w:tentative="1">
+      <w:start w:val="1"/>
+      <w:numFmt w:val="bullet"/>
+      <w:lvlText w:val=""/>
+      <w:lvlJc w:val="left"/>
+      <w:pPr>
+        <w:tabs>
+          <w:tab w:val="num" w:pos="3600"/>
+        </w:tabs>
+        <w:ind w:left="3600" w:hanging="360"/>
+      </w:pPr>
+      <w:rPr>
+        <w:rFonts w:ascii="Wingdings" w:hAnsi="Wingdings" w:hint="default"/>
+        <w:sz w:val="20"/>
+      </w:rPr>
+    </w:lvl>
+    <w:lvl w:ilvl="5" w:tentative="1">
+      <w:start w:val="1"/>
+      <w:numFmt w:val="bullet"/>
+      <w:lvlText w:val=""/>
+      <w:lvlJc w:val="left"/>
+      <w:pPr>
+        <w:tabs>
+          <w:tab w:val="num" w:pos="4320"/>
+        </w:tabs>
+        <w:ind w:left="4320" w:hanging="360"/>
+      </w:pPr>
+      <w:rPr>
+        <w:rFonts w:ascii="Wingdings" w:hAnsi="Wingdings" w:hint="default"/>
+        <w:sz w:val="20"/>
+      </w:rPr>
+    </w:lvl>
+    <w:lvl w:ilvl="6" w:tentative="1">
+      <w:start w:val="1"/>
+      <w:numFmt w:val="bullet"/>
+      <w:lvlText w:val=""/>
+      <w:lvlJc w:val="left"/>
+      <w:pPr>
+        <w:tabs>
+          <w:tab w:val="num" w:pos="5040"/>
+        </w:tabs>
+        <w:ind w:left="5040" w:hanging="360"/>
+      </w:pPr>
+      <w:rPr>
+        <w:rFonts w:ascii="Wingdings" w:hAnsi="Wingdings" w:hint="default"/>
+        <w:sz w:val="20"/>
+      </w:rPr>
+    </w:lvl>
+    <w:lvl w:ilvl="7" w:tentative="1">
+      <w:start w:val="1"/>
+      <w:numFmt w:val="bullet"/>
+      <w:lvlText w:val=""/>
+      <w:lvlJc w:val="left"/>
+      <w:pPr>
+        <w:tabs>
+          <w:tab w:val="num" w:pos="5760"/>
+        </w:tabs>
+        <w:ind w:left="5760" w:hanging="360"/>
+      </w:pPr>
+      <w:rPr>
+        <w:rFonts w:ascii="Wingdings" w:hAnsi="Wingdings" w:hint="default"/>
+        <w:sz w:val="20"/>
+      </w:rPr>
+    </w:lvl>
+    <w:lvl w:ilvl="8" w:tentative="1">
+      <w:start w:val="1"/>
+      <w:numFmt w:val="bullet"/>
+      <w:lvlText w:val=""/>
+      <w:lvlJc w:val="left"/>
+      <w:pPr>
+        <w:tabs>
+          <w:tab w:val="num" w:pos="6480"/>
+        </w:tabs>
+        <w:ind w:left="6480" w:hanging="360"/>
+      </w:pPr>
+      <w:rPr>
+        <w:rFonts w:ascii="Wingdings" w:hAnsi="Wingdings" w:hint="default"/>
+        <w:sz w:val="20"/>
+      </w:rPr>
+    </w:lvl>
+  </w:abstractNum>
+  <w:abstractNum w:abstractNumId="3" w15:restartNumberingAfterBreak="0">
     <w:nsid w:val="77EA11F1"/>
     <w:multiLevelType w:val="multilevel"/>
     <w:tmpl w:val="EE12BCC2"/>
@@ -1281,7 +2185,16 @@
     </w:lvl>
   </w:abstractNum>
   <w:num w:numId="1" w16cid:durableId="1811704312">
+    <w:abstractNumId w:val="3"/>
+  </w:num>
+  <w:num w:numId="2" w16cid:durableId="1755929129">
     <w:abstractNumId w:val="0"/>
+  </w:num>
+  <w:num w:numId="3" w16cid:durableId="1068578114">
+    <w:abstractNumId w:val="1"/>
+  </w:num>
+  <w:num w:numId="4" w16cid:durableId="540213779">
+    <w:abstractNumId w:val="2"/>
   </w:num>
 </w:numbering>
 </file>
@@ -1889,7 +2802,6 @@
   <w:style w:type="character" w:default="1" w:styleId="DefaultParagraphFont">
     <w:name w:val="Default Paragraph Font"/>
     <w:uiPriority w:val="1"/>
-    <w:semiHidden/>
     <w:unhideWhenUsed/>
   </w:style>
   <w:style w:type="table" w:default="1" w:styleId="TableNormal">

</xml_diff>

<commit_message>
add practice for rest methods
</commit_message>
<xml_diff>
--- a/Notes.docx
+++ b/Notes.docx
@@ -79,43 +79,7 @@
           <w:sz w:val="22"/>
           <w:szCs w:val="22"/>
         </w:rPr>
-        <w:t xml:space="preserve"> in a normal condition or without spring framework we would need to create an instance(object) of the class and inject it where it should, manage it. This creates tight coupling. </w:t>
-      </w:r>
-      <w:proofErr w:type="gramStart"/>
-      <w:r>
-        <w:rPr>
-          <w:color w:val="000000" w:themeColor="text1"/>
-          <w:sz w:val="22"/>
-          <w:szCs w:val="22"/>
-        </w:rPr>
-        <w:t>However</w:t>
-      </w:r>
-      <w:proofErr w:type="gramEnd"/>
-      <w:r>
-        <w:rPr>
-          <w:color w:val="000000" w:themeColor="text1"/>
-          <w:sz w:val="22"/>
-          <w:szCs w:val="22"/>
-        </w:rPr>
-        <w:t xml:space="preserve"> the inversion of control allows spring boot using @Autowired to create an object for us, inject where </w:t>
-      </w:r>
-      <w:proofErr w:type="spellStart"/>
-      <w:r>
-        <w:rPr>
-          <w:color w:val="000000" w:themeColor="text1"/>
-          <w:sz w:val="22"/>
-          <w:szCs w:val="22"/>
-        </w:rPr>
-        <w:t>its</w:t>
-      </w:r>
-      <w:proofErr w:type="spellEnd"/>
-      <w:r>
-        <w:rPr>
-          <w:color w:val="000000" w:themeColor="text1"/>
-          <w:sz w:val="22"/>
-          <w:szCs w:val="22"/>
-        </w:rPr>
-        <w:t xml:space="preserve"> needed.</w:t>
+        <w:t xml:space="preserve"> in a normal condition or without spring framework we would need to create an instance(object) of the class and inject it where it should, manage it. This creates tight coupling. However the inversion of control allows spring boot using @Autowired to create an object for us, inject where its needed.</w:t>
       </w:r>
     </w:p>
     <w:p>
@@ -445,25 +409,7 @@
           <w:sz w:val="22"/>
           <w:szCs w:val="22"/>
         </w:rPr>
-        <w:t xml:space="preserve">In the app configuration class when we define beans using </w:t>
-      </w:r>
-      <w:proofErr w:type="gramStart"/>
-      <w:r>
-        <w:rPr>
-          <w:color w:val="000000" w:themeColor="text1"/>
-          <w:sz w:val="22"/>
-          <w:szCs w:val="22"/>
-        </w:rPr>
-        <w:t>methods</w:t>
-      </w:r>
-      <w:proofErr w:type="gramEnd"/>
-      <w:r>
-        <w:rPr>
-          <w:color w:val="000000" w:themeColor="text1"/>
-          <w:sz w:val="22"/>
-          <w:szCs w:val="22"/>
-        </w:rPr>
-        <w:t xml:space="preserve"> we annotate those methods with @Bean, and this bean that is returned from the method is named the same as the method name but if we wrote @Bean(“name”) now the spring boot will name that bean as name.</w:t>
+        <w:t>In the app configuration class when we define beans using methods we annotate those methods with @Bean, and this bean that is returned from the method is named the same as the method name but if we wrote @Bean(“name”) now the spring boot will name that bean as name.</w:t>
       </w:r>
     </w:p>
     <w:p>
@@ -819,25 +765,7 @@
           <w:sz w:val="22"/>
           <w:szCs w:val="22"/>
         </w:rPr>
-        <w:t>@</w:t>
-      </w:r>
-      <w:proofErr w:type="gramStart"/>
-      <w:r>
-        <w:rPr>
-          <w:color w:val="000000" w:themeColor="text1"/>
-          <w:sz w:val="22"/>
-          <w:szCs w:val="22"/>
-        </w:rPr>
-        <w:t>Value(</w:t>
-      </w:r>
-      <w:proofErr w:type="gramEnd"/>
-      <w:r>
-        <w:rPr>
-          <w:color w:val="000000" w:themeColor="text1"/>
-          <w:sz w:val="22"/>
-          <w:szCs w:val="22"/>
-        </w:rPr>
-        <w:t xml:space="preserve">“Actual value”) is used to inject value into a variable, whether its hardcoded or comes from another environment or class. Or class path, or file or variable. </w:t>
+        <w:t xml:space="preserve">@Value(“Actual value”) is used to inject value into a variable, whether its hardcoded or comes from another environment or class. Or class path, or file or variable. </w:t>
       </w:r>
     </w:p>
     <w:p>
@@ -973,12 +901,1767 @@
     </w:p>
     <w:p>
       <w:pPr>
-        <w:rPr>
-          <w:color w:val="000000" w:themeColor="text1"/>
-          <w:sz w:val="22"/>
-          <w:szCs w:val="22"/>
-        </w:rPr>
-      </w:pPr>
+        <w:jc w:val="center"/>
+        <w:rPr>
+          <w:b/>
+          <w:bCs/>
+          <w:color w:val="EE0000"/>
+          <w:sz w:val="32"/>
+          <w:szCs w:val="32"/>
+          <w:u w:val="single"/>
+        </w:rPr>
+      </w:pPr>
+      <w:r>
+        <w:rPr>
+          <w:b/>
+          <w:bCs/>
+          <w:color w:val="EE0000"/>
+          <w:sz w:val="32"/>
+          <w:szCs w:val="32"/>
+          <w:u w:val="single"/>
+        </w:rPr>
+        <w:t>Spring REST</w:t>
+      </w:r>
+    </w:p>
+    <w:p>
+      <w:pPr>
+        <w:rPr>
+          <w:color w:val="000000" w:themeColor="text1"/>
+          <w:sz w:val="22"/>
+          <w:szCs w:val="22"/>
+        </w:rPr>
+      </w:pPr>
+      <w:r>
+        <w:rPr>
+          <w:color w:val="000000" w:themeColor="text1"/>
+          <w:sz w:val="22"/>
+          <w:szCs w:val="22"/>
+        </w:rPr>
+        <w:t>Representational stateless transfer, a software architecture to make web services to which usually are called RESTFUL APIs.</w:t>
+      </w:r>
+    </w:p>
+    <w:p>
+      <w:pPr>
+        <w:rPr>
+          <w:color w:val="000000" w:themeColor="text1"/>
+          <w:sz w:val="22"/>
+          <w:szCs w:val="22"/>
+        </w:rPr>
+      </w:pPr>
+      <w:r>
+        <w:rPr>
+          <w:color w:val="000000" w:themeColor="text1"/>
+          <w:sz w:val="22"/>
+          <w:szCs w:val="22"/>
+        </w:rPr>
+        <w:t>The main idea is to treat the network components as objects that can be accessed using standard http methods</w:t>
+      </w:r>
+    </w:p>
+    <w:p>
+      <w:pPr>
+        <w:rPr>
+          <w:color w:val="000000" w:themeColor="text1"/>
+          <w:sz w:val="22"/>
+          <w:szCs w:val="22"/>
+        </w:rPr>
+      </w:pPr>
+      <w:r>
+        <w:rPr>
+          <w:color w:val="000000" w:themeColor="text1"/>
+          <w:sz w:val="22"/>
+          <w:szCs w:val="22"/>
+        </w:rPr>
+        <w:t xml:space="preserve">It’s a client server architecture they can work together but each one of them works and handles data independently. </w:t>
+      </w:r>
+    </w:p>
+    <w:p>
+      <w:pPr>
+        <w:rPr>
+          <w:color w:val="000000" w:themeColor="text1"/>
+          <w:sz w:val="22"/>
+          <w:szCs w:val="22"/>
+        </w:rPr>
+      </w:pPr>
+      <w:r>
+        <w:rPr>
+          <w:color w:val="000000" w:themeColor="text1"/>
+          <w:sz w:val="22"/>
+          <w:szCs w:val="22"/>
+        </w:rPr>
+        <w:t>Its stateless meaning the server does not store the requests only executes them</w:t>
+      </w:r>
+    </w:p>
+    <w:p>
+      <w:pPr>
+        <w:rPr>
+          <w:color w:val="000000" w:themeColor="text1"/>
+          <w:sz w:val="22"/>
+          <w:szCs w:val="22"/>
+        </w:rPr>
+      </w:pPr>
+      <w:r>
+        <w:rPr>
+          <w:color w:val="000000" w:themeColor="text1"/>
+          <w:sz w:val="22"/>
+          <w:szCs w:val="22"/>
+        </w:rPr>
+        <w:t>Its layered cacheable system</w:t>
+      </w:r>
+    </w:p>
+    <w:p>
+      <w:pPr>
+        <w:rPr>
+          <w:color w:val="000000" w:themeColor="text1"/>
+          <w:sz w:val="22"/>
+          <w:szCs w:val="22"/>
+        </w:rPr>
+      </w:pPr>
+      <w:r>
+        <w:rPr>
+          <w:color w:val="000000" w:themeColor="text1"/>
+          <w:sz w:val="22"/>
+          <w:szCs w:val="22"/>
+        </w:rPr>
+        <w:t>we have linking of resources</w:t>
+      </w:r>
+    </w:p>
+    <w:p>
+      <w:pPr>
+        <w:rPr>
+          <w:color w:val="000000" w:themeColor="text1"/>
+          <w:sz w:val="22"/>
+          <w:szCs w:val="22"/>
+        </w:rPr>
+      </w:pPr>
+      <w:r>
+        <w:rPr>
+          <w:color w:val="000000" w:themeColor="text1"/>
+          <w:sz w:val="22"/>
+          <w:szCs w:val="22"/>
+        </w:rPr>
+        <w:t xml:space="preserve">we have standard methods </w:t>
+      </w:r>
+      <w:r>
+        <w:rPr>
+          <w:color w:val="EE0000"/>
+          <w:sz w:val="22"/>
+          <w:szCs w:val="22"/>
+        </w:rPr>
+        <w:t>GET, POST, PUT, DELETE</w:t>
+      </w:r>
+    </w:p>
+    <w:p>
+      <w:pPr>
+        <w:rPr>
+          <w:color w:val="000000" w:themeColor="text1"/>
+          <w:sz w:val="22"/>
+          <w:szCs w:val="22"/>
+        </w:rPr>
+      </w:pPr>
+    </w:p>
+    <w:p>
+      <w:pPr>
+        <w:rPr>
+          <w:color w:val="000000" w:themeColor="text1"/>
+          <w:sz w:val="22"/>
+          <w:szCs w:val="22"/>
+        </w:rPr>
+      </w:pPr>
+      <w:r>
+        <w:rPr>
+          <w:color w:val="000000" w:themeColor="text1"/>
+          <w:sz w:val="22"/>
+          <w:szCs w:val="22"/>
+        </w:rPr>
+        <w:t>the resources that hold the data should be plural nouns for instance</w:t>
+      </w:r>
+    </w:p>
+    <w:p>
+      <w:pPr>
+        <w:rPr>
+          <w:color w:val="000000" w:themeColor="text1"/>
+          <w:sz w:val="22"/>
+          <w:szCs w:val="22"/>
+        </w:rPr>
+      </w:pPr>
+      <w:r>
+        <w:rPr>
+          <w:color w:val="EE0000"/>
+          <w:sz w:val="22"/>
+          <w:szCs w:val="22"/>
+        </w:rPr>
+        <w:t>GET / accounts</w:t>
+      </w:r>
+      <w:r>
+        <w:rPr>
+          <w:color w:val="000000" w:themeColor="text1"/>
+          <w:sz w:val="22"/>
+          <w:szCs w:val="22"/>
+        </w:rPr>
+        <w:t xml:space="preserve"> </w:t>
+      </w:r>
+      <w:r>
+        <w:rPr>
+          <w:color w:val="000000" w:themeColor="text1"/>
+          <w:sz w:val="22"/>
+          <w:szCs w:val="22"/>
+        </w:rPr>
+        <w:sym w:font="Wingdings" w:char="F0E0"/>
+      </w:r>
+      <w:r>
+        <w:rPr>
+          <w:color w:val="000000" w:themeColor="text1"/>
+          <w:sz w:val="22"/>
+          <w:szCs w:val="22"/>
+        </w:rPr>
+        <w:t xml:space="preserve"> retrieves all the accounts</w:t>
+      </w:r>
+    </w:p>
+    <w:p>
+      <w:pPr>
+        <w:rPr>
+          <w:color w:val="000000" w:themeColor="text1"/>
+          <w:sz w:val="22"/>
+          <w:szCs w:val="22"/>
+        </w:rPr>
+      </w:pPr>
+      <w:r>
+        <w:rPr>
+          <w:color w:val="EE0000"/>
+          <w:sz w:val="22"/>
+          <w:szCs w:val="22"/>
+        </w:rPr>
+        <w:t>GET/ accounts/1</w:t>
+      </w:r>
+      <w:r>
+        <w:rPr>
+          <w:color w:val="000000" w:themeColor="text1"/>
+          <w:sz w:val="22"/>
+          <w:szCs w:val="22"/>
+        </w:rPr>
+        <w:t xml:space="preserve"> </w:t>
+      </w:r>
+      <w:r>
+        <w:rPr>
+          <w:color w:val="000000" w:themeColor="text1"/>
+          <w:sz w:val="22"/>
+          <w:szCs w:val="22"/>
+        </w:rPr>
+        <w:sym w:font="Wingdings" w:char="F0E0"/>
+      </w:r>
+      <w:r>
+        <w:rPr>
+          <w:color w:val="000000" w:themeColor="text1"/>
+          <w:sz w:val="22"/>
+          <w:szCs w:val="22"/>
+        </w:rPr>
+        <w:t xml:space="preserve"> retrieves the account with the id 1</w:t>
+      </w:r>
+    </w:p>
+    <w:p>
+      <w:pPr>
+        <w:rPr>
+          <w:color w:val="000000" w:themeColor="text1"/>
+          <w:sz w:val="22"/>
+          <w:szCs w:val="22"/>
+        </w:rPr>
+      </w:pPr>
+    </w:p>
+    <w:p>
+      <w:pPr>
+        <w:rPr>
+          <w:color w:val="000000" w:themeColor="text1"/>
+          <w:sz w:val="22"/>
+          <w:szCs w:val="22"/>
+        </w:rPr>
+      </w:pPr>
+      <w:r>
+        <w:rPr>
+          <w:color w:val="000000" w:themeColor="text1"/>
+          <w:sz w:val="22"/>
+          <w:szCs w:val="22"/>
+        </w:rPr>
+        <w:t>In case of nested resources payments inside the accounts it should be like this</w:t>
+      </w:r>
+    </w:p>
+    <w:p>
+      <w:pPr>
+        <w:rPr>
+          <w:color w:val="EE0000"/>
+          <w:sz w:val="22"/>
+          <w:szCs w:val="22"/>
+        </w:rPr>
+      </w:pPr>
+      <w:r>
+        <w:rPr>
+          <w:color w:val="EE0000"/>
+          <w:sz w:val="22"/>
+          <w:szCs w:val="22"/>
+        </w:rPr>
+        <w:t>GET/accounts/1/payments/2</w:t>
+      </w:r>
+    </w:p>
+    <w:p>
+      <w:pPr>
+        <w:rPr>
+          <w:color w:val="000000" w:themeColor="text1"/>
+          <w:sz w:val="22"/>
+          <w:szCs w:val="22"/>
+        </w:rPr>
+      </w:pPr>
+      <w:r>
+        <w:rPr>
+          <w:color w:val="000000" w:themeColor="text1"/>
+          <w:sz w:val="22"/>
+          <w:szCs w:val="22"/>
+        </w:rPr>
+        <w:t>This returns the payment of id 2 inside the account of id 1</w:t>
+      </w:r>
+    </w:p>
+    <w:p>
+      <w:pPr>
+        <w:rPr>
+          <w:color w:val="000000" w:themeColor="text1"/>
+          <w:sz w:val="22"/>
+          <w:szCs w:val="22"/>
+        </w:rPr>
+      </w:pPr>
+    </w:p>
+    <w:p>
+      <w:pPr>
+        <w:rPr>
+          <w:color w:val="000000" w:themeColor="text1"/>
+          <w:sz w:val="22"/>
+          <w:szCs w:val="22"/>
+        </w:rPr>
+      </w:pPr>
+      <w:r>
+        <w:rPr>
+          <w:color w:val="000000" w:themeColor="text1"/>
+          <w:sz w:val="22"/>
+          <w:szCs w:val="22"/>
+        </w:rPr>
+        <w:t xml:space="preserve">We use http messages </w:t>
+      </w:r>
+      <w:r>
+        <w:rPr>
+          <w:color w:val="EE0000"/>
+          <w:sz w:val="22"/>
+          <w:szCs w:val="22"/>
+        </w:rPr>
+        <w:t>GET, POST, PUT, DELETE,PATCH,OPTIONS,HEAD</w:t>
+      </w:r>
+      <w:r>
+        <w:rPr>
+          <w:color w:val="000000" w:themeColor="text1"/>
+          <w:sz w:val="22"/>
+          <w:szCs w:val="22"/>
+        </w:rPr>
+        <w:t xml:space="preserve"> to specify what should be done </w:t>
+      </w:r>
+    </w:p>
+    <w:p>
+      <w:pPr>
+        <w:rPr>
+          <w:color w:val="000000" w:themeColor="text1"/>
+          <w:sz w:val="22"/>
+          <w:szCs w:val="22"/>
+        </w:rPr>
+      </w:pPr>
+    </w:p>
+    <w:p>
+      <w:pPr>
+        <w:rPr>
+          <w:color w:val="EE0000"/>
+          <w:sz w:val="22"/>
+          <w:szCs w:val="22"/>
+        </w:rPr>
+      </w:pPr>
+      <w:r>
+        <w:rPr>
+          <w:color w:val="EE0000"/>
+          <w:sz w:val="22"/>
+          <w:szCs w:val="22"/>
+        </w:rPr>
+        <w:lastRenderedPageBreak/>
+        <w:t>GET method</w:t>
+      </w:r>
+    </w:p>
+    <w:p>
+      <w:pPr>
+        <w:rPr>
+          <w:color w:val="EE0000"/>
+          <w:sz w:val="22"/>
+          <w:szCs w:val="22"/>
+        </w:rPr>
+      </w:pPr>
+      <w:r>
+        <w:rPr>
+          <w:color w:val="EE0000"/>
+          <w:sz w:val="22"/>
+          <w:szCs w:val="22"/>
+        </w:rPr>
+        <w:t>@GetMapping(“/users/{id}”)</w:t>
+      </w:r>
+    </w:p>
+    <w:p>
+      <w:pPr>
+        <w:rPr>
+          <w:color w:val="EE0000"/>
+          <w:sz w:val="22"/>
+          <w:szCs w:val="22"/>
+        </w:rPr>
+      </w:pPr>
+      <w:r>
+        <w:rPr>
+          <w:color w:val="EE0000"/>
+          <w:sz w:val="22"/>
+          <w:szCs w:val="22"/>
+        </w:rPr>
+        <w:t>Public void printProduct(){}</w:t>
+      </w:r>
+    </w:p>
+    <w:p>
+      <w:pPr>
+        <w:rPr>
+          <w:color w:val="000000" w:themeColor="text1"/>
+          <w:sz w:val="22"/>
+          <w:szCs w:val="22"/>
+        </w:rPr>
+      </w:pPr>
+      <w:r>
+        <w:rPr>
+          <w:color w:val="000000" w:themeColor="text1"/>
+          <w:sz w:val="22"/>
+          <w:szCs w:val="22"/>
+        </w:rPr>
+        <w:t>This annotation is triggered aka mapped into the function its on once the http request of get/users/{id} is accessed it just fetches data from the server and show it to the user its very safe</w:t>
+      </w:r>
+    </w:p>
+    <w:p>
+      <w:pPr>
+        <w:rPr>
+          <w:color w:val="EE0000"/>
+          <w:sz w:val="22"/>
+          <w:szCs w:val="22"/>
+        </w:rPr>
+      </w:pPr>
+    </w:p>
+    <w:p>
+      <w:pPr>
+        <w:rPr>
+          <w:color w:val="EE0000"/>
+          <w:sz w:val="22"/>
+          <w:szCs w:val="22"/>
+        </w:rPr>
+      </w:pPr>
+      <w:r>
+        <w:rPr>
+          <w:color w:val="EE0000"/>
+          <w:sz w:val="22"/>
+          <w:szCs w:val="22"/>
+        </w:rPr>
+        <w:t>POST</w:t>
+      </w:r>
+    </w:p>
+    <w:p>
+      <w:pPr>
+        <w:rPr>
+          <w:color w:val="EE0000"/>
+          <w:sz w:val="22"/>
+          <w:szCs w:val="22"/>
+        </w:rPr>
+      </w:pPr>
+      <w:r>
+        <w:rPr>
+          <w:color w:val="EE0000"/>
+          <w:sz w:val="22"/>
+          <w:szCs w:val="22"/>
+        </w:rPr>
+        <w:t>@PostMapping(“/users”)</w:t>
+      </w:r>
+    </w:p>
+    <w:p>
+      <w:pPr>
+        <w:rPr>
+          <w:color w:val="000000" w:themeColor="text1"/>
+          <w:sz w:val="22"/>
+          <w:szCs w:val="22"/>
+        </w:rPr>
+      </w:pPr>
+      <w:r>
+        <w:rPr>
+          <w:color w:val="000000" w:themeColor="text1"/>
+          <w:sz w:val="22"/>
+          <w:szCs w:val="22"/>
+        </w:rPr>
+        <w:t xml:space="preserve">Post is used to create a new resource in the database </w:t>
+      </w:r>
+    </w:p>
+    <w:p>
+      <w:pPr>
+        <w:rPr>
+          <w:color w:val="000000" w:themeColor="text1"/>
+          <w:sz w:val="22"/>
+          <w:szCs w:val="22"/>
+        </w:rPr>
+      </w:pPr>
+    </w:p>
+    <w:p>
+      <w:pPr>
+        <w:rPr>
+          <w:color w:val="EE0000"/>
+          <w:sz w:val="22"/>
+          <w:szCs w:val="22"/>
+        </w:rPr>
+      </w:pPr>
+      <w:r>
+        <w:rPr>
+          <w:color w:val="EE0000"/>
+          <w:sz w:val="22"/>
+          <w:szCs w:val="22"/>
+        </w:rPr>
+        <w:t>PUT</w:t>
+      </w:r>
+    </w:p>
+    <w:p>
+      <w:pPr>
+        <w:rPr>
+          <w:color w:val="EE0000"/>
+          <w:sz w:val="22"/>
+          <w:szCs w:val="22"/>
+        </w:rPr>
+      </w:pPr>
+      <w:r>
+        <w:rPr>
+          <w:color w:val="EE0000"/>
+          <w:sz w:val="22"/>
+          <w:szCs w:val="22"/>
+        </w:rPr>
+        <w:t>@PutMapping</w:t>
+      </w:r>
+    </w:p>
+    <w:p>
+      <w:pPr>
+        <w:rPr>
+          <w:color w:val="EE0000"/>
+          <w:sz w:val="22"/>
+          <w:szCs w:val="22"/>
+        </w:rPr>
+      </w:pPr>
+      <w:r>
+        <w:rPr>
+          <w:color w:val="EE0000"/>
+          <w:sz w:val="22"/>
+          <w:szCs w:val="22"/>
+        </w:rPr>
+        <w:t>@PutMapping("/users/{id}")</w:t>
+      </w:r>
+      <w:r>
+        <w:rPr>
+          <w:color w:val="EE0000"/>
+          <w:sz w:val="22"/>
+          <w:szCs w:val="22"/>
+        </w:rPr>
+        <w:br/>
+        <w:t>public User updateUser(@PathVariable Long id, @RequestBody User user) {</w:t>
+      </w:r>
+      <w:r>
+        <w:rPr>
+          <w:color w:val="EE0000"/>
+          <w:sz w:val="22"/>
+          <w:szCs w:val="22"/>
+        </w:rPr>
+        <w:br/>
+        <w:t xml:space="preserve">    user.setId(id);</w:t>
+      </w:r>
+      <w:r>
+        <w:rPr>
+          <w:color w:val="EE0000"/>
+          <w:sz w:val="22"/>
+          <w:szCs w:val="22"/>
+        </w:rPr>
+        <w:br/>
+        <w:t xml:space="preserve">    return userService.update(user);</w:t>
+      </w:r>
+      <w:r>
+        <w:rPr>
+          <w:color w:val="EE0000"/>
+          <w:sz w:val="22"/>
+          <w:szCs w:val="22"/>
+        </w:rPr>
+        <w:br/>
+        <w:t>}</w:t>
+      </w:r>
+    </w:p>
+    <w:p>
+      <w:pPr>
+        <w:rPr>
+          <w:color w:val="000000" w:themeColor="text1"/>
+          <w:sz w:val="22"/>
+          <w:szCs w:val="22"/>
+        </w:rPr>
+      </w:pPr>
+      <w:r>
+        <w:rPr>
+          <w:color w:val="000000" w:themeColor="text1"/>
+          <w:sz w:val="22"/>
+          <w:szCs w:val="22"/>
+        </w:rPr>
+        <w:t>Update an existing resource by replacing it completely.</w:t>
+      </w:r>
+    </w:p>
+    <w:p>
+      <w:pPr>
+        <w:rPr>
+          <w:color w:val="000000" w:themeColor="text1"/>
+          <w:sz w:val="22"/>
+          <w:szCs w:val="22"/>
+        </w:rPr>
+      </w:pPr>
+      <w:r>
+        <w:rPr>
+          <w:b/>
+          <w:bCs/>
+          <w:color w:val="000000" w:themeColor="text1"/>
+          <w:sz w:val="22"/>
+          <w:szCs w:val="22"/>
+        </w:rPr>
+        <w:t>How it behaves:</w:t>
+      </w:r>
+    </w:p>
+    <w:p>
+      <w:pPr>
+        <w:numPr>
+          <w:ilvl w:val="0"/>
+          <w:numId w:val="2"/>
+        </w:numPr>
+        <w:rPr>
+          <w:color w:val="000000" w:themeColor="text1"/>
+          <w:sz w:val="22"/>
+          <w:szCs w:val="22"/>
+        </w:rPr>
+      </w:pPr>
+      <w:r>
+        <w:rPr>
+          <w:color w:val="000000" w:themeColor="text1"/>
+          <w:sz w:val="22"/>
+          <w:szCs w:val="22"/>
+        </w:rPr>
+        <w:t xml:space="preserve">Client sends full updated object </w:t>
+      </w:r>
+    </w:p>
+    <w:p>
+      <w:pPr>
+        <w:numPr>
+          <w:ilvl w:val="0"/>
+          <w:numId w:val="2"/>
+        </w:numPr>
+        <w:rPr>
+          <w:color w:val="000000" w:themeColor="text1"/>
+          <w:sz w:val="22"/>
+          <w:szCs w:val="22"/>
+        </w:rPr>
+      </w:pPr>
+      <w:r>
+        <w:rPr>
+          <w:color w:val="000000" w:themeColor="text1"/>
+          <w:sz w:val="22"/>
+          <w:szCs w:val="22"/>
+        </w:rPr>
+        <w:t xml:space="preserve">Existing data is completely replaced </w:t>
+      </w:r>
+    </w:p>
+    <w:p>
+      <w:pPr>
+        <w:numPr>
+          <w:ilvl w:val="0"/>
+          <w:numId w:val="2"/>
+        </w:numPr>
+        <w:rPr>
+          <w:color w:val="000000" w:themeColor="text1"/>
+          <w:sz w:val="22"/>
+          <w:szCs w:val="22"/>
+        </w:rPr>
+      </w:pPr>
+      <w:r>
+        <w:rPr>
+          <w:color w:val="000000" w:themeColor="text1"/>
+          <w:sz w:val="22"/>
+          <w:szCs w:val="22"/>
+        </w:rPr>
+        <w:t>Missing fields may be overwritten (often set to null)</w:t>
+      </w:r>
+    </w:p>
+    <w:p>
+      <w:pPr>
+        <w:rPr>
+          <w:color w:val="000000" w:themeColor="text1"/>
+          <w:sz w:val="22"/>
+          <w:szCs w:val="22"/>
+        </w:rPr>
+      </w:pPr>
+    </w:p>
+    <w:p>
+      <w:pPr>
+        <w:rPr>
+          <w:color w:val="EE0000"/>
+          <w:sz w:val="22"/>
+          <w:szCs w:val="22"/>
+        </w:rPr>
+      </w:pPr>
+      <w:r>
+        <w:rPr>
+          <w:color w:val="EE0000"/>
+          <w:sz w:val="22"/>
+          <w:szCs w:val="22"/>
+        </w:rPr>
+        <w:t>DELETE</w:t>
+      </w:r>
+    </w:p>
+    <w:p>
+      <w:pPr>
+        <w:rPr>
+          <w:color w:val="EE0000"/>
+          <w:sz w:val="22"/>
+          <w:szCs w:val="22"/>
+        </w:rPr>
+      </w:pPr>
+      <w:r>
+        <w:rPr>
+          <w:color w:val="EE0000"/>
+          <w:sz w:val="22"/>
+          <w:szCs w:val="22"/>
+        </w:rPr>
+        <w:t>@DeleteMapping("/users/{id}")</w:t>
+      </w:r>
+    </w:p>
+    <w:p>
+      <w:pPr>
+        <w:rPr>
+          <w:color w:val="EE0000"/>
+          <w:sz w:val="22"/>
+          <w:szCs w:val="22"/>
+        </w:rPr>
+      </w:pPr>
+      <w:r>
+        <w:rPr>
+          <w:color w:val="EE0000"/>
+          <w:sz w:val="22"/>
+          <w:szCs w:val="22"/>
+        </w:rPr>
+        <w:t>public void deleteUser(@PathVariable Long id) {</w:t>
+      </w:r>
+    </w:p>
+    <w:p>
+      <w:pPr>
+        <w:rPr>
+          <w:color w:val="EE0000"/>
+          <w:sz w:val="22"/>
+          <w:szCs w:val="22"/>
+        </w:rPr>
+      </w:pPr>
+      <w:r>
+        <w:rPr>
+          <w:color w:val="EE0000"/>
+          <w:sz w:val="22"/>
+          <w:szCs w:val="22"/>
+        </w:rPr>
+        <w:t xml:space="preserve">    userService.delete(id);</w:t>
+      </w:r>
+    </w:p>
+    <w:p>
+      <w:pPr>
+        <w:rPr>
+          <w:color w:val="EE0000"/>
+          <w:sz w:val="22"/>
+          <w:szCs w:val="22"/>
+        </w:rPr>
+      </w:pPr>
+      <w:r>
+        <w:rPr>
+          <w:color w:val="EE0000"/>
+          <w:sz w:val="22"/>
+          <w:szCs w:val="22"/>
+        </w:rPr>
+        <w:t>}</w:t>
+      </w:r>
+    </w:p>
+    <w:p>
+      <w:pPr>
+        <w:rPr>
+          <w:color w:val="000000" w:themeColor="text1"/>
+          <w:sz w:val="22"/>
+          <w:szCs w:val="22"/>
+        </w:rPr>
+      </w:pPr>
+      <w:r>
+        <w:rPr>
+          <w:color w:val="000000" w:themeColor="text1"/>
+          <w:sz w:val="22"/>
+          <w:szCs w:val="22"/>
+        </w:rPr>
+        <w:t>Is used to remove a resource from the databse</w:t>
+      </w:r>
+    </w:p>
+    <w:p>
+      <w:pPr>
+        <w:rPr>
+          <w:color w:val="EE0000"/>
+          <w:sz w:val="22"/>
+          <w:szCs w:val="22"/>
+        </w:rPr>
+      </w:pPr>
+      <w:r>
+        <w:rPr>
+          <w:color w:val="EE0000"/>
+          <w:sz w:val="22"/>
+          <w:szCs w:val="22"/>
+        </w:rPr>
+        <w:lastRenderedPageBreak/>
+        <w:t>PUT</w:t>
+      </w:r>
+    </w:p>
+    <w:p>
+      <w:pPr>
+        <w:rPr>
+          <w:color w:val="EE0000"/>
+          <w:sz w:val="22"/>
+          <w:szCs w:val="22"/>
+        </w:rPr>
+      </w:pPr>
+      <w:r>
+        <w:rPr>
+          <w:color w:val="EE0000"/>
+          <w:sz w:val="22"/>
+          <w:szCs w:val="22"/>
+        </w:rPr>
+        <w:t>@PutMapping(“/users”)</w:t>
+      </w:r>
+    </w:p>
+    <w:p>
+      <w:pPr>
+        <w:rPr>
+          <w:color w:val="EE0000"/>
+          <w:sz w:val="22"/>
+          <w:szCs w:val="22"/>
+        </w:rPr>
+      </w:pPr>
+      <w:r>
+        <w:rPr>
+          <w:color w:val="EE0000"/>
+          <w:sz w:val="22"/>
+          <w:szCs w:val="22"/>
+        </w:rPr>
+        <w:t>@PatchMapping("/users/{id}")</w:t>
+      </w:r>
+    </w:p>
+    <w:p>
+      <w:pPr>
+        <w:rPr>
+          <w:color w:val="EE0000"/>
+          <w:sz w:val="22"/>
+          <w:szCs w:val="22"/>
+        </w:rPr>
+      </w:pPr>
+      <w:r>
+        <w:rPr>
+          <w:color w:val="EE0000"/>
+          <w:sz w:val="22"/>
+          <w:szCs w:val="22"/>
+        </w:rPr>
+        <w:t>public User patchUser(@PathVariable Long id, @RequestBody Map&lt;String, Object&gt; updates) {</w:t>
+      </w:r>
+    </w:p>
+    <w:p>
+      <w:pPr>
+        <w:rPr>
+          <w:color w:val="EE0000"/>
+          <w:sz w:val="22"/>
+          <w:szCs w:val="22"/>
+        </w:rPr>
+      </w:pPr>
+      <w:r>
+        <w:rPr>
+          <w:color w:val="EE0000"/>
+          <w:sz w:val="22"/>
+          <w:szCs w:val="22"/>
+        </w:rPr>
+        <w:t xml:space="preserve">    return userService.partialUpdate(id, updates);</w:t>
+      </w:r>
+    </w:p>
+    <w:p>
+      <w:pPr>
+        <w:rPr>
+          <w:color w:val="EE0000"/>
+          <w:sz w:val="22"/>
+          <w:szCs w:val="22"/>
+        </w:rPr>
+      </w:pPr>
+      <w:r>
+        <w:rPr>
+          <w:color w:val="EE0000"/>
+          <w:sz w:val="22"/>
+          <w:szCs w:val="22"/>
+        </w:rPr>
+        <w:t>}</w:t>
+      </w:r>
+    </w:p>
+    <w:p>
+      <w:pPr>
+        <w:rPr>
+          <w:color w:val="000000" w:themeColor="text1"/>
+          <w:sz w:val="22"/>
+          <w:szCs w:val="22"/>
+        </w:rPr>
+      </w:pPr>
+      <w:r>
+        <w:rPr>
+          <w:color w:val="000000" w:themeColor="text1"/>
+          <w:sz w:val="22"/>
+          <w:szCs w:val="22"/>
+        </w:rPr>
+        <w:t>Update only specific fields of a resource (not the whole object).</w:t>
+      </w:r>
+      <w:r>
+        <w:rPr>
+          <w:color w:val="000000" w:themeColor="text1"/>
+          <w:sz w:val="22"/>
+          <w:szCs w:val="22"/>
+        </w:rPr>
+        <w:t xml:space="preserve"> </w:t>
+      </w:r>
+    </w:p>
+    <w:p>
+      <w:pPr>
+        <w:rPr>
+          <w:color w:val="000000" w:themeColor="text1"/>
+          <w:sz w:val="22"/>
+          <w:szCs w:val="22"/>
+        </w:rPr>
+      </w:pPr>
+      <w:r>
+        <w:rPr>
+          <w:color w:val="000000" w:themeColor="text1"/>
+          <w:sz w:val="22"/>
+          <w:szCs w:val="22"/>
+        </w:rPr>
+        <w:t>Real-life analogy:</w:t>
+      </w:r>
+      <w:r>
+        <w:rPr>
+          <w:color w:val="000000" w:themeColor="text1"/>
+          <w:sz w:val="22"/>
+          <w:szCs w:val="22"/>
+        </w:rPr>
+        <w:br/>
+        <w:t>Changing just your email address, not your entire profile.</w:t>
+      </w:r>
+    </w:p>
+    <w:p>
+      <w:pPr>
+        <w:rPr>
+          <w:color w:val="000000" w:themeColor="text1"/>
+          <w:sz w:val="22"/>
+          <w:szCs w:val="22"/>
+        </w:rPr>
+      </w:pPr>
+    </w:p>
+    <w:p>
+      <w:pPr>
+        <w:rPr>
+          <w:color w:val="000000" w:themeColor="text1"/>
+          <w:sz w:val="22"/>
+          <w:szCs w:val="22"/>
+        </w:rPr>
+      </w:pPr>
+      <w:r>
+        <w:rPr>
+          <w:color w:val="000000" w:themeColor="text1"/>
+          <w:sz w:val="22"/>
+          <w:szCs w:val="22"/>
+        </w:rPr>
+        <w:t>OPTIONS — Discover Supported Methods</w:t>
+      </w:r>
+    </w:p>
+    <w:p>
+      <w:pPr>
+        <w:rPr>
+          <w:color w:val="EE0000"/>
+          <w:sz w:val="22"/>
+          <w:szCs w:val="22"/>
+        </w:rPr>
+      </w:pPr>
+      <w:r>
+        <w:rPr>
+          <w:color w:val="EE0000"/>
+          <w:sz w:val="22"/>
+          <w:szCs w:val="22"/>
+        </w:rPr>
+        <w:t>@RequestMapping(value = "/users", method = RequestMethod.OPTIONS)</w:t>
+      </w:r>
+    </w:p>
+    <w:p>
+      <w:pPr>
+        <w:rPr>
+          <w:color w:val="EE0000"/>
+          <w:sz w:val="22"/>
+          <w:szCs w:val="22"/>
+        </w:rPr>
+      </w:pPr>
+      <w:r>
+        <w:rPr>
+          <w:color w:val="EE0000"/>
+          <w:sz w:val="22"/>
+          <w:szCs w:val="22"/>
+        </w:rPr>
+        <w:t>public ResponseEntity&lt;?&gt; options() {</w:t>
+      </w:r>
+    </w:p>
+    <w:p>
+      <w:pPr>
+        <w:rPr>
+          <w:color w:val="EE0000"/>
+          <w:sz w:val="22"/>
+          <w:szCs w:val="22"/>
+        </w:rPr>
+      </w:pPr>
+      <w:r>
+        <w:rPr>
+          <w:color w:val="EE0000"/>
+          <w:sz w:val="22"/>
+          <w:szCs w:val="22"/>
+        </w:rPr>
+        <w:t xml:space="preserve">    return ResponseEntity.ok()</w:t>
+      </w:r>
+    </w:p>
+    <w:p>
+      <w:pPr>
+        <w:rPr>
+          <w:color w:val="EE0000"/>
+          <w:sz w:val="22"/>
+          <w:szCs w:val="22"/>
+        </w:rPr>
+      </w:pPr>
+      <w:r>
+        <w:rPr>
+          <w:color w:val="EE0000"/>
+          <w:sz w:val="22"/>
+          <w:szCs w:val="22"/>
+        </w:rPr>
+        <w:t xml:space="preserve">        .header("Allow", "GET, POST, PUT, DELETE, PATCH, OPTIONS")</w:t>
+      </w:r>
+    </w:p>
+    <w:p>
+      <w:pPr>
+        <w:rPr>
+          <w:color w:val="EE0000"/>
+          <w:sz w:val="22"/>
+          <w:szCs w:val="22"/>
+        </w:rPr>
+      </w:pPr>
+      <w:r>
+        <w:rPr>
+          <w:color w:val="EE0000"/>
+          <w:sz w:val="22"/>
+          <w:szCs w:val="22"/>
+        </w:rPr>
+        <w:t xml:space="preserve">        .build();</w:t>
+      </w:r>
+    </w:p>
+    <w:p>
+      <w:pPr>
+        <w:rPr>
+          <w:color w:val="EE0000"/>
+          <w:sz w:val="22"/>
+          <w:szCs w:val="22"/>
+        </w:rPr>
+      </w:pPr>
+      <w:r>
+        <w:rPr>
+          <w:color w:val="EE0000"/>
+          <w:sz w:val="22"/>
+          <w:szCs w:val="22"/>
+        </w:rPr>
+        <w:t>}</w:t>
+      </w:r>
+    </w:p>
+    <w:p>
+      <w:pPr>
+        <w:rPr>
+          <w:color w:val="000000" w:themeColor="text1"/>
+          <w:sz w:val="22"/>
+          <w:szCs w:val="22"/>
+        </w:rPr>
+      </w:pPr>
+      <w:r>
+        <w:rPr>
+          <w:color w:val="000000" w:themeColor="text1"/>
+          <w:sz w:val="22"/>
+          <w:szCs w:val="22"/>
+        </w:rPr>
+        <w:t>Purpose:</w:t>
+      </w:r>
+      <w:r>
+        <w:rPr>
+          <w:color w:val="000000" w:themeColor="text1"/>
+          <w:sz w:val="22"/>
+          <w:szCs w:val="22"/>
+        </w:rPr>
+        <w:br/>
+        <w:t>Ask the server what operations are allowed on a resource.</w:t>
+      </w:r>
+    </w:p>
+    <w:p>
+      <w:pPr>
+        <w:rPr>
+          <w:color w:val="000000" w:themeColor="text1"/>
+          <w:sz w:val="22"/>
+          <w:szCs w:val="22"/>
+        </w:rPr>
+      </w:pPr>
+    </w:p>
+    <w:p>
+      <w:pPr>
+        <w:rPr>
+          <w:color w:val="000000" w:themeColor="text1"/>
+          <w:sz w:val="22"/>
+          <w:szCs w:val="22"/>
+        </w:rPr>
+      </w:pPr>
+    </w:p>
+    <w:p>
+      <w:pPr>
+        <w:rPr>
+          <w:color w:val="000000" w:themeColor="text1"/>
+          <w:sz w:val="22"/>
+          <w:szCs w:val="22"/>
+        </w:rPr>
+      </w:pPr>
+    </w:p>
+    <w:p>
+      <w:pPr>
+        <w:rPr>
+          <w:color w:val="000000" w:themeColor="text1"/>
+          <w:sz w:val="22"/>
+          <w:szCs w:val="22"/>
+        </w:rPr>
+      </w:pPr>
+    </w:p>
+    <w:p>
+      <w:pPr>
+        <w:rPr>
+          <w:color w:val="000000" w:themeColor="text1"/>
+          <w:sz w:val="22"/>
+          <w:szCs w:val="22"/>
+        </w:rPr>
+      </w:pPr>
+    </w:p>
+    <w:p>
+      <w:pPr>
+        <w:rPr>
+          <w:color w:val="000000" w:themeColor="text1"/>
+          <w:sz w:val="22"/>
+          <w:szCs w:val="22"/>
+        </w:rPr>
+      </w:pPr>
+    </w:p>
+    <w:p>
+      <w:pPr>
+        <w:rPr>
+          <w:color w:val="000000" w:themeColor="text1"/>
+          <w:sz w:val="22"/>
+          <w:szCs w:val="22"/>
+        </w:rPr>
+      </w:pPr>
+    </w:p>
+    <w:p>
+      <w:pPr>
+        <w:rPr>
+          <w:color w:val="000000" w:themeColor="text1"/>
+          <w:sz w:val="22"/>
+          <w:szCs w:val="22"/>
+        </w:rPr>
+      </w:pPr>
+    </w:p>
+    <w:p>
+      <w:pPr>
+        <w:rPr>
+          <w:color w:val="EE0000"/>
+          <w:sz w:val="22"/>
+          <w:szCs w:val="22"/>
+        </w:rPr>
+      </w:pPr>
+    </w:p>
+    <w:p>
+      <w:pPr>
+        <w:rPr>
+          <w:color w:val="EE0000"/>
+          <w:sz w:val="22"/>
+          <w:szCs w:val="22"/>
+        </w:rPr>
+      </w:pPr>
+      <w:r>
+        <w:rPr>
+          <w:color w:val="EE0000"/>
+          <w:sz w:val="22"/>
+          <w:szCs w:val="22"/>
+        </w:rPr>
+        <w:lastRenderedPageBreak/>
+        <w:t>HEAD — Retrieve Headers Only</w:t>
+      </w:r>
+    </w:p>
+    <w:p>
+      <w:pPr>
+        <w:rPr>
+          <w:color w:val="EE0000"/>
+          <w:sz w:val="22"/>
+          <w:szCs w:val="22"/>
+        </w:rPr>
+      </w:pPr>
+      <w:r>
+        <w:rPr>
+          <w:color w:val="EE0000"/>
+          <w:sz w:val="22"/>
+          <w:szCs w:val="22"/>
+        </w:rPr>
+        <w:t>@RequestMapping(value = "/users/{id}", method = RequestMethod.HEAD)</w:t>
+      </w:r>
+    </w:p>
+    <w:p>
+      <w:pPr>
+        <w:rPr>
+          <w:color w:val="EE0000"/>
+          <w:sz w:val="22"/>
+          <w:szCs w:val="22"/>
+        </w:rPr>
+      </w:pPr>
+      <w:r>
+        <w:rPr>
+          <w:color w:val="EE0000"/>
+          <w:sz w:val="22"/>
+          <w:szCs w:val="22"/>
+        </w:rPr>
+        <w:t>public ResponseEntity&lt;Void&gt; headUser(@PathVariable Long id) {</w:t>
+      </w:r>
+    </w:p>
+    <w:p>
+      <w:pPr>
+        <w:rPr>
+          <w:color w:val="EE0000"/>
+          <w:sz w:val="22"/>
+          <w:szCs w:val="22"/>
+        </w:rPr>
+      </w:pPr>
+      <w:r>
+        <w:rPr>
+          <w:color w:val="EE0000"/>
+          <w:sz w:val="22"/>
+          <w:szCs w:val="22"/>
+        </w:rPr>
+        <w:t xml:space="preserve">    if (userService.exists(id)) {</w:t>
+      </w:r>
+    </w:p>
+    <w:p>
+      <w:pPr>
+        <w:rPr>
+          <w:color w:val="EE0000"/>
+          <w:sz w:val="22"/>
+          <w:szCs w:val="22"/>
+        </w:rPr>
+      </w:pPr>
+      <w:r>
+        <w:rPr>
+          <w:color w:val="EE0000"/>
+          <w:sz w:val="22"/>
+          <w:szCs w:val="22"/>
+        </w:rPr>
+        <w:t xml:space="preserve">        return ResponseEntity.ok().build();</w:t>
+      </w:r>
+    </w:p>
+    <w:p>
+      <w:pPr>
+        <w:rPr>
+          <w:color w:val="EE0000"/>
+          <w:sz w:val="22"/>
+          <w:szCs w:val="22"/>
+        </w:rPr>
+      </w:pPr>
+      <w:r>
+        <w:rPr>
+          <w:color w:val="EE0000"/>
+          <w:sz w:val="22"/>
+          <w:szCs w:val="22"/>
+        </w:rPr>
+        <w:t xml:space="preserve">    } else {</w:t>
+      </w:r>
+    </w:p>
+    <w:p>
+      <w:pPr>
+        <w:rPr>
+          <w:color w:val="EE0000"/>
+          <w:sz w:val="22"/>
+          <w:szCs w:val="22"/>
+        </w:rPr>
+      </w:pPr>
+      <w:r>
+        <w:rPr>
+          <w:color w:val="EE0000"/>
+          <w:sz w:val="22"/>
+          <w:szCs w:val="22"/>
+        </w:rPr>
+        <w:t xml:space="preserve">        return ResponseEntity.notFound().build();</w:t>
+      </w:r>
+    </w:p>
+    <w:p>
+      <w:pPr>
+        <w:rPr>
+          <w:color w:val="EE0000"/>
+          <w:sz w:val="22"/>
+          <w:szCs w:val="22"/>
+        </w:rPr>
+      </w:pPr>
+      <w:r>
+        <w:rPr>
+          <w:color w:val="EE0000"/>
+          <w:sz w:val="22"/>
+          <w:szCs w:val="22"/>
+        </w:rPr>
+        <w:t xml:space="preserve">    }</w:t>
+      </w:r>
+    </w:p>
+    <w:p>
+      <w:pPr>
+        <w:rPr>
+          <w:color w:val="EE0000"/>
+          <w:sz w:val="22"/>
+          <w:szCs w:val="22"/>
+        </w:rPr>
+      </w:pPr>
+      <w:r>
+        <w:rPr>
+          <w:color w:val="EE0000"/>
+          <w:sz w:val="22"/>
+          <w:szCs w:val="22"/>
+        </w:rPr>
+        <w:t>}</w:t>
+      </w:r>
+    </w:p>
+    <w:p>
+      <w:pPr>
+        <w:rPr>
+          <w:color w:val="EE0000"/>
+          <w:sz w:val="22"/>
+          <w:szCs w:val="22"/>
+        </w:rPr>
+      </w:pPr>
+      <w:r>
+        <w:rPr>
+          <w:color w:val="000000" w:themeColor="text1"/>
+          <w:sz w:val="22"/>
+          <w:szCs w:val="22"/>
+        </w:rPr>
+        <w:t>Purpose:</w:t>
+      </w:r>
+      <w:r>
+        <w:rPr>
+          <w:color w:val="000000" w:themeColor="text1"/>
+          <w:sz w:val="22"/>
+          <w:szCs w:val="22"/>
+        </w:rPr>
+        <w:br/>
+        <w:t>Same as GET, but returns only headers (no response body</w:t>
+      </w:r>
+      <w:r>
+        <w:rPr>
+          <w:color w:val="EE0000"/>
+          <w:sz w:val="22"/>
+          <w:szCs w:val="22"/>
+        </w:rPr>
+        <w:t>).</w:t>
+      </w:r>
+    </w:p>
+    <w:p>
+      <w:pPr>
+        <w:rPr>
+          <w:color w:val="EE0000"/>
+          <w:sz w:val="22"/>
+          <w:szCs w:val="22"/>
+        </w:rPr>
+      </w:pPr>
+    </w:p>
+    <w:p>
+      <w:pPr>
+        <w:rPr>
+          <w:b/>
+          <w:bCs/>
+          <w:color w:val="000000" w:themeColor="text1"/>
+          <w:u w:val="single"/>
+        </w:rPr>
+      </w:pPr>
+      <w:r>
+        <w:rPr>
+          <w:b/>
+          <w:bCs/>
+          <w:color w:val="000000" w:themeColor="text1"/>
+          <w:u w:val="single"/>
+        </w:rPr>
+        <w:t>Response Status code</w:t>
+      </w:r>
+    </w:p>
+    <w:p>
+      <w:pPr>
+        <w:rPr>
+          <w:color w:val="000000" w:themeColor="text1"/>
+          <w:sz w:val="22"/>
+          <w:szCs w:val="22"/>
+        </w:rPr>
+      </w:pPr>
+      <w:r>
+        <w:rPr>
+          <w:color w:val="000000" w:themeColor="text1"/>
+          <w:sz w:val="22"/>
+          <w:szCs w:val="22"/>
+        </w:rPr>
+        <w:t>First digit defines the class of the response while the last 2 digits they don’t have any specific</w:t>
+      </w:r>
+    </w:p>
+    <w:p>
+      <w:pPr>
+        <w:rPr>
+          <w:color w:val="000000" w:themeColor="text1"/>
+          <w:sz w:val="22"/>
+          <w:szCs w:val="22"/>
+        </w:rPr>
+      </w:pPr>
+      <w:r>
+        <w:rPr>
+          <w:b/>
+          <w:bCs/>
+          <w:color w:val="EE0000"/>
+        </w:rPr>
+        <w:t>1xx</w:t>
+      </w:r>
+      <w:r>
+        <w:rPr>
+          <w:b/>
+          <w:bCs/>
+          <w:color w:val="EE0000"/>
+        </w:rPr>
+        <w:t>:</w:t>
+      </w:r>
+      <w:r>
+        <w:rPr>
+          <w:b/>
+          <w:bCs/>
+          <w:color w:val="EE0000"/>
+        </w:rPr>
+        <w:tab/>
+      </w:r>
+      <w:r>
+        <w:rPr>
+          <w:color w:val="000000" w:themeColor="text1"/>
+          <w:sz w:val="22"/>
+          <w:szCs w:val="22"/>
+        </w:rPr>
+        <w:t>Informational</w:t>
+      </w:r>
+    </w:p>
+    <w:p>
+      <w:pPr>
+        <w:rPr>
+          <w:color w:val="000000" w:themeColor="text1"/>
+          <w:sz w:val="22"/>
+          <w:szCs w:val="22"/>
+        </w:rPr>
+      </w:pPr>
+      <w:r>
+        <w:rPr>
+          <w:b/>
+          <w:bCs/>
+          <w:color w:val="EE0000"/>
+        </w:rPr>
+        <w:t>2xx</w:t>
+      </w:r>
+      <w:r>
+        <w:rPr>
+          <w:b/>
+          <w:bCs/>
+          <w:color w:val="EE0000"/>
+        </w:rPr>
+        <w:t>:</w:t>
+      </w:r>
+      <w:r>
+        <w:rPr>
+          <w:b/>
+          <w:bCs/>
+          <w:color w:val="EE0000"/>
+        </w:rPr>
+        <w:tab/>
+      </w:r>
+      <w:r>
+        <w:rPr>
+          <w:color w:val="000000" w:themeColor="text1"/>
+          <w:sz w:val="22"/>
+          <w:szCs w:val="22"/>
+        </w:rPr>
+        <w:t>Success</w:t>
+      </w:r>
+      <w:r>
+        <w:rPr>
+          <w:color w:val="000000" w:themeColor="text1"/>
+          <w:sz w:val="22"/>
+          <w:szCs w:val="22"/>
+        </w:rPr>
+        <w:t xml:space="preserve">…. </w:t>
+      </w:r>
+      <w:r>
+        <w:rPr>
+          <w:color w:val="000000" w:themeColor="text1"/>
+          <w:sz w:val="22"/>
+          <w:szCs w:val="22"/>
+        </w:rPr>
+        <w:t xml:space="preserve">200 OK -&gt; standard response for success, 201 CREATED </w:t>
+      </w:r>
+      <w:r>
+        <w:rPr>
+          <w:color w:val="000000" w:themeColor="text1"/>
+          <w:sz w:val="22"/>
+          <w:szCs w:val="22"/>
+        </w:rPr>
+        <w:tab/>
+        <w:t xml:space="preserve">-&gt; A new resource was created from the post method, 204 no content DELETE PUT POST </w:t>
+      </w:r>
+    </w:p>
+    <w:p>
+      <w:pPr>
+        <w:rPr>
+          <w:color w:val="000000" w:themeColor="text1"/>
+          <w:sz w:val="22"/>
+          <w:szCs w:val="22"/>
+        </w:rPr>
+      </w:pPr>
+      <w:r>
+        <w:rPr>
+          <w:b/>
+          <w:bCs/>
+          <w:color w:val="EE0000"/>
+        </w:rPr>
+        <w:t>3xx</w:t>
+      </w:r>
+      <w:r>
+        <w:rPr>
+          <w:b/>
+          <w:bCs/>
+          <w:color w:val="EE0000"/>
+        </w:rPr>
+        <w:t>:</w:t>
+      </w:r>
+      <w:r>
+        <w:rPr>
+          <w:b/>
+          <w:bCs/>
+          <w:color w:val="EE0000"/>
+        </w:rPr>
+        <w:tab/>
+      </w:r>
+      <w:r>
+        <w:rPr>
+          <w:color w:val="000000" w:themeColor="text1"/>
+          <w:sz w:val="22"/>
+          <w:szCs w:val="22"/>
+        </w:rPr>
+        <w:t>Redirection</w:t>
+      </w:r>
+      <w:r>
+        <w:rPr>
+          <w:color w:val="000000" w:themeColor="text1"/>
+          <w:sz w:val="22"/>
+          <w:szCs w:val="22"/>
+        </w:rPr>
+        <w:t xml:space="preserve">, </w:t>
+      </w:r>
+      <w:r>
+        <w:rPr>
+          <w:color w:val="000000" w:themeColor="text1"/>
+          <w:sz w:val="22"/>
+          <w:szCs w:val="22"/>
+        </w:rPr>
+        <w:t xml:space="preserve">304 NOT Modified </w:t>
+      </w:r>
+      <w:r>
+        <w:rPr>
+          <w:color w:val="000000" w:themeColor="text1"/>
+          <w:sz w:val="22"/>
+          <w:szCs w:val="22"/>
+        </w:rPr>
+        <w:sym w:font="Wingdings" w:char="F0E0"/>
+      </w:r>
+      <w:r>
+        <w:rPr>
+          <w:color w:val="000000" w:themeColor="text1"/>
+          <w:sz w:val="22"/>
+          <w:szCs w:val="22"/>
+        </w:rPr>
+        <w:t xml:space="preserve"> for caching, if the current version matches the version in the client cache we get this message from the server and no more content. We just use the local version of the request.</w:t>
+      </w:r>
+    </w:p>
+    <w:p>
+      <w:pPr>
+        <w:rPr>
+          <w:color w:val="000000" w:themeColor="text1"/>
+          <w:sz w:val="22"/>
+          <w:szCs w:val="22"/>
+        </w:rPr>
+      </w:pPr>
+      <w:r>
+        <w:rPr>
+          <w:b/>
+          <w:bCs/>
+          <w:color w:val="EE0000"/>
+        </w:rPr>
+        <w:t>4xx</w:t>
+      </w:r>
+      <w:r>
+        <w:rPr>
+          <w:b/>
+          <w:bCs/>
+          <w:color w:val="EE0000"/>
+        </w:rPr>
+        <w:t>:</w:t>
+      </w:r>
+      <w:r>
+        <w:rPr>
+          <w:b/>
+          <w:bCs/>
+          <w:color w:val="EE0000"/>
+        </w:rPr>
+        <w:tab/>
+      </w:r>
+      <w:r>
+        <w:rPr>
+          <w:color w:val="000000" w:themeColor="text1"/>
+          <w:sz w:val="22"/>
+          <w:szCs w:val="22"/>
+        </w:rPr>
+        <w:t>client error</w:t>
+      </w:r>
+      <w:r>
+        <w:rPr>
+          <w:color w:val="000000" w:themeColor="text1"/>
+          <w:sz w:val="22"/>
+          <w:szCs w:val="22"/>
+        </w:rPr>
+        <w:t xml:space="preserve">, 400 bad request, the server was not able to understand the request because of invalid syntax. 401 unauthorized -&gt; means requires user authentication. 403 forbidden the client does not have the necessary authorization for the certain resources. </w:t>
+      </w:r>
+    </w:p>
+    <w:p>
+      <w:pPr>
+        <w:rPr>
+          <w:color w:val="000000" w:themeColor="text1"/>
+          <w:sz w:val="22"/>
+          <w:szCs w:val="22"/>
+        </w:rPr>
+      </w:pPr>
+      <w:r>
+        <w:rPr>
+          <w:b/>
+          <w:bCs/>
+          <w:color w:val="EE0000"/>
+        </w:rPr>
+        <w:t>5xx</w:t>
+      </w:r>
+      <w:r>
+        <w:rPr>
+          <w:b/>
+          <w:bCs/>
+          <w:color w:val="EE0000"/>
+        </w:rPr>
+        <w:t>:</w:t>
+      </w:r>
+      <w:r>
+        <w:rPr>
+          <w:b/>
+          <w:bCs/>
+          <w:color w:val="EE0000"/>
+        </w:rPr>
+        <w:tab/>
+      </w:r>
+      <w:r>
+        <w:rPr>
+          <w:color w:val="000000" w:themeColor="text1"/>
+          <w:sz w:val="22"/>
+          <w:szCs w:val="22"/>
+        </w:rPr>
+        <w:t>server error</w:t>
+      </w:r>
+      <w:r>
+        <w:rPr>
+          <w:color w:val="000000" w:themeColor="text1"/>
+          <w:sz w:val="22"/>
+          <w:szCs w:val="22"/>
+        </w:rPr>
+        <w:t xml:space="preserve">, 500 server error when the server has an undefined issue and no more information is known or provided. 503 server unavailable, which means that the server is down because its overloaded or under maintenance. </w:t>
+      </w:r>
+    </w:p>
+    <w:p>
+      <w:pPr>
+        <w:rPr>
+          <w:color w:val="000000" w:themeColor="text1"/>
+          <w:sz w:val="22"/>
+          <w:szCs w:val="22"/>
+        </w:rPr>
+      </w:pPr>
+    </w:p>
+    <w:p>
+      <w:pPr>
+        <w:rPr>
+          <w:color w:val="000000" w:themeColor="text1"/>
+          <w:sz w:val="22"/>
+          <w:szCs w:val="22"/>
+        </w:rPr>
+      </w:pPr>
+      <w:r>
+        <w:rPr>
+          <w:color w:val="000000" w:themeColor="text1"/>
+          <w:sz w:val="22"/>
+          <w:szCs w:val="22"/>
+        </w:rPr>
+        <w:t xml:space="preserve">What is a </w:t>
+      </w:r>
+      <w:r>
+        <w:rPr>
+          <w:color w:val="000000" w:themeColor="text1"/>
+          <w:sz w:val="22"/>
+          <w:szCs w:val="22"/>
+        </w:rPr>
+        <w:t>rest</w:t>
+      </w:r>
+      <w:r>
+        <w:rPr>
+          <w:color w:val="000000" w:themeColor="text1"/>
+          <w:sz w:val="22"/>
+          <w:szCs w:val="22"/>
+        </w:rPr>
+        <w:t>controller</w:t>
+      </w:r>
+    </w:p>
+    <w:p>
+      <w:pPr>
+        <w:rPr>
+          <w:color w:val="000000" w:themeColor="text1"/>
+          <w:sz w:val="22"/>
+          <w:szCs w:val="22"/>
+        </w:rPr>
+      </w:pPr>
+      <w:r>
+        <w:rPr>
+          <w:color w:val="000000" w:themeColor="text1"/>
+          <w:sz w:val="22"/>
+          <w:szCs w:val="22"/>
+        </w:rPr>
+        <w:t>Response status annotation</w:t>
+      </w:r>
     </w:p>
     <w:sectPr>
       <w:pgSz w:w="12240" w:h="15840"/>
@@ -993,9 +2676,9 @@
 <file path=word/numbering.xml><?xml version="1.0" encoding="utf-8"?>
 <w:numbering xmlns:wpc="http://schemas.microsoft.com/office/word/2010/wordprocessingCanvas" xmlns:cx="http://schemas.microsoft.com/office/drawing/2014/chartex" xmlns:cx1="http://schemas.microsoft.com/office/drawing/2015/9/8/chartex" xmlns:cx2="http://schemas.microsoft.com/office/drawing/2015/10/21/chartex" xmlns:cx3="http://schemas.microsoft.com/office/drawing/2016/5/9/chartex" xmlns:cx4="http://schemas.microsoft.com/office/drawing/2016/5/10/chartex" xmlns:cx5="http://schemas.microsoft.com/office/drawing/2016/5/11/chartex" xmlns:cx6="http://schemas.microsoft.com/office/drawing/2016/5/12/chartex" xmlns:cx7="http://schemas.microsoft.com/office/drawing/2016/5/13/chartex" xmlns:cx8="http://schemas.microsoft.com/office/drawing/2016/5/14/chartex" xmlns:mc="http://schemas.openxmlformats.org/markup-compatibility/2006" xmlns:aink="http://schemas.microsoft.com/office/drawing/2016/ink" xmlns:am3d="http://schemas.microsoft.com/office/drawing/2017/model3d" xmlns:o="urn:schemas-microsoft-com:office:office" xmlns:oel="http://schemas.microsoft.com/office/2019/extlst" xmlns:r="http://schemas.openxmlformats.org/officeDocument/2006/relationships" xmlns:m="http://schemas.openxmlformats.org/officeDocument/2006/math" xmlns:v="urn:schemas-microsoft-com:vml" xmlns:wp14="http://schemas.microsoft.com/office/word/2010/wordprocessingDrawing" xmlns:wp="http://schemas.openxmlformats.org/drawingml/2006/wordprocessingDrawing" xmlns:w10="urn:schemas-microsoft-com:office:word" xmlns:w="http://schemas.openxmlformats.org/wordprocessingml/2006/main" xmlns:w14="http://schemas.microsoft.com/office/word/2010/wordml" xmlns:w15="http://schemas.microsoft.com/office/word/2012/wordml" xmlns:w16cex="http://schemas.microsoft.com/office/word/2018/wordml/cex" xmlns:w16cid="http://schemas.microsoft.com/office/word/2016/wordml/cid" xmlns:w16="http://schemas.microsoft.com/office/word/2018/wordml" xmlns:w16du="http://schemas.microsoft.com/office/word/2023/wordml/word16du" xmlns:w16sdtdh="http://schemas.microsoft.com/office/word/2020/wordml/sdtdatahash" xmlns:w16sdtfl="http://schemas.microsoft.com/office/word/2024/wordml/sdtformatlock" xmlns:w16se="http://schemas.microsoft.com/office/word/2015/wordml/symex" xmlns:wpg="http://schemas.microsoft.com/office/word/2010/wordprocessingGroup" xmlns:wpi="http://schemas.microsoft.com/office/word/2010/wordprocessingInk" xmlns:wne="http://schemas.microsoft.com/office/word/2006/wordml" xmlns:wps="http://schemas.microsoft.com/office/word/2010/wordprocessingShape" mc:Ignorable="w14 w15 w16se w16cid w16 w16cex w16sdtdh w16sdtfl w16du wp14">
   <w:abstractNum w:abstractNumId="0" w15:restartNumberingAfterBreak="0">
-    <w:nsid w:val="77EA11F1"/>
+    <w:nsid w:val="59426FE7"/>
     <w:multiLevelType w:val="multilevel"/>
-    <w:tmpl w:val="EE12BCC2"/>
+    <w:tmpl w:val="682E412E"/>
     <w:lvl w:ilvl="0">
       <w:start w:val="1"/>
       <w:numFmt w:val="bullet"/>
@@ -1141,7 +2824,159 @@
       </w:rPr>
     </w:lvl>
   </w:abstractNum>
+  <w:abstractNum w:abstractNumId="1" w15:restartNumberingAfterBreak="0">
+    <w:nsid w:val="77EA11F1"/>
+    <w:multiLevelType w:val="multilevel"/>
+    <w:tmpl w:val="EE12BCC2"/>
+    <w:lvl w:ilvl="0">
+      <w:start w:val="1"/>
+      <w:numFmt w:val="bullet"/>
+      <w:lvlText w:val=""/>
+      <w:lvlJc w:val="left"/>
+      <w:pPr>
+        <w:tabs>
+          <w:tab w:val="num" w:pos="720"/>
+        </w:tabs>
+        <w:ind w:left="720" w:hanging="360"/>
+      </w:pPr>
+      <w:rPr>
+        <w:rFonts w:ascii="Symbol" w:hAnsi="Symbol" w:hint="default"/>
+        <w:sz w:val="20"/>
+      </w:rPr>
+    </w:lvl>
+    <w:lvl w:ilvl="1" w:tentative="1">
+      <w:start w:val="1"/>
+      <w:numFmt w:val="bullet"/>
+      <w:lvlText w:val="o"/>
+      <w:lvlJc w:val="left"/>
+      <w:pPr>
+        <w:tabs>
+          <w:tab w:val="num" w:pos="1440"/>
+        </w:tabs>
+        <w:ind w:left="1440" w:hanging="360"/>
+      </w:pPr>
+      <w:rPr>
+        <w:rFonts w:ascii="Courier New" w:hAnsi="Courier New" w:hint="default"/>
+        <w:sz w:val="20"/>
+      </w:rPr>
+    </w:lvl>
+    <w:lvl w:ilvl="2" w:tentative="1">
+      <w:start w:val="1"/>
+      <w:numFmt w:val="bullet"/>
+      <w:lvlText w:val=""/>
+      <w:lvlJc w:val="left"/>
+      <w:pPr>
+        <w:tabs>
+          <w:tab w:val="num" w:pos="2160"/>
+        </w:tabs>
+        <w:ind w:left="2160" w:hanging="360"/>
+      </w:pPr>
+      <w:rPr>
+        <w:rFonts w:ascii="Wingdings" w:hAnsi="Wingdings" w:hint="default"/>
+        <w:sz w:val="20"/>
+      </w:rPr>
+    </w:lvl>
+    <w:lvl w:ilvl="3" w:tentative="1">
+      <w:start w:val="1"/>
+      <w:numFmt w:val="bullet"/>
+      <w:lvlText w:val=""/>
+      <w:lvlJc w:val="left"/>
+      <w:pPr>
+        <w:tabs>
+          <w:tab w:val="num" w:pos="2880"/>
+        </w:tabs>
+        <w:ind w:left="2880" w:hanging="360"/>
+      </w:pPr>
+      <w:rPr>
+        <w:rFonts w:ascii="Wingdings" w:hAnsi="Wingdings" w:hint="default"/>
+        <w:sz w:val="20"/>
+      </w:rPr>
+    </w:lvl>
+    <w:lvl w:ilvl="4" w:tentative="1">
+      <w:start w:val="1"/>
+      <w:numFmt w:val="bullet"/>
+      <w:lvlText w:val=""/>
+      <w:lvlJc w:val="left"/>
+      <w:pPr>
+        <w:tabs>
+          <w:tab w:val="num" w:pos="3600"/>
+        </w:tabs>
+        <w:ind w:left="3600" w:hanging="360"/>
+      </w:pPr>
+      <w:rPr>
+        <w:rFonts w:ascii="Wingdings" w:hAnsi="Wingdings" w:hint="default"/>
+        <w:sz w:val="20"/>
+      </w:rPr>
+    </w:lvl>
+    <w:lvl w:ilvl="5" w:tentative="1">
+      <w:start w:val="1"/>
+      <w:numFmt w:val="bullet"/>
+      <w:lvlText w:val=""/>
+      <w:lvlJc w:val="left"/>
+      <w:pPr>
+        <w:tabs>
+          <w:tab w:val="num" w:pos="4320"/>
+        </w:tabs>
+        <w:ind w:left="4320" w:hanging="360"/>
+      </w:pPr>
+      <w:rPr>
+        <w:rFonts w:ascii="Wingdings" w:hAnsi="Wingdings" w:hint="default"/>
+        <w:sz w:val="20"/>
+      </w:rPr>
+    </w:lvl>
+    <w:lvl w:ilvl="6" w:tentative="1">
+      <w:start w:val="1"/>
+      <w:numFmt w:val="bullet"/>
+      <w:lvlText w:val=""/>
+      <w:lvlJc w:val="left"/>
+      <w:pPr>
+        <w:tabs>
+          <w:tab w:val="num" w:pos="5040"/>
+        </w:tabs>
+        <w:ind w:left="5040" w:hanging="360"/>
+      </w:pPr>
+      <w:rPr>
+        <w:rFonts w:ascii="Wingdings" w:hAnsi="Wingdings" w:hint="default"/>
+        <w:sz w:val="20"/>
+      </w:rPr>
+    </w:lvl>
+    <w:lvl w:ilvl="7" w:tentative="1">
+      <w:start w:val="1"/>
+      <w:numFmt w:val="bullet"/>
+      <w:lvlText w:val=""/>
+      <w:lvlJc w:val="left"/>
+      <w:pPr>
+        <w:tabs>
+          <w:tab w:val="num" w:pos="5760"/>
+        </w:tabs>
+        <w:ind w:left="5760" w:hanging="360"/>
+      </w:pPr>
+      <w:rPr>
+        <w:rFonts w:ascii="Wingdings" w:hAnsi="Wingdings" w:hint="default"/>
+        <w:sz w:val="20"/>
+      </w:rPr>
+    </w:lvl>
+    <w:lvl w:ilvl="8" w:tentative="1">
+      <w:start w:val="1"/>
+      <w:numFmt w:val="bullet"/>
+      <w:lvlText w:val=""/>
+      <w:lvlJc w:val="left"/>
+      <w:pPr>
+        <w:tabs>
+          <w:tab w:val="num" w:pos="6480"/>
+        </w:tabs>
+        <w:ind w:left="6480" w:hanging="360"/>
+      </w:pPr>
+      <w:rPr>
+        <w:rFonts w:ascii="Wingdings" w:hAnsi="Wingdings" w:hint="default"/>
+        <w:sz w:val="20"/>
+      </w:rPr>
+    </w:lvl>
+  </w:abstractNum>
   <w:num w:numId="1" w16cid:durableId="1811704312">
+    <w:abstractNumId w:val="1"/>
+  </w:num>
+  <w:num w:numId="2" w16cid:durableId="65300249">
     <w:abstractNumId w:val="0"/>
   </w:num>
 </w:numbering>
@@ -1750,7 +3585,6 @@
   <w:style w:type="character" w:default="1" w:styleId="DefaultParagraphFont">
     <w:name w:val="Default Paragraph Font"/>
     <w:uiPriority w:val="1"/>
-    <w:semiHidden/>
     <w:unhideWhenUsed/>
   </w:style>
   <w:style w:type="table" w:default="1" w:styleId="TableNormal">
@@ -2064,6 +3898,17 @@
       <w:spacing w:val="5"/>
     </w:rPr>
   </w:style>
+  <w:style w:type="paragraph" w:styleId="NormalWeb">
+    <w:name w:val="Normal (Web)"/>
+    <w:basedOn w:val="Normal"/>
+    <w:uiPriority w:val="99"/>
+    <w:semiHidden/>
+    <w:unhideWhenUsed/>
+    <w:rsid w:val="004D0BE8"/>
+    <w:rPr>
+      <w:rFonts w:ascii="Times New Roman" w:hAnsi="Times New Roman" w:cs="Times New Roman"/>
+    </w:rPr>
+  </w:style>
 </w:styles>
 </file>
 

</xml_diff>

<commit_message>
add rest controller notes and some practice
</commit_message>
<xml_diff>
--- a/Notes.docx
+++ b/Notes.docx
@@ -79,7 +79,43 @@
           <w:sz w:val="22"/>
           <w:szCs w:val="22"/>
         </w:rPr>
-        <w:t xml:space="preserve"> in a normal condition or without spring framework we would need to create an instance(object) of the class and inject it where it should, manage it. This creates tight coupling. However the inversion of control allows spring boot using @Autowired to create an object for us, inject where its needed.</w:t>
+        <w:t xml:space="preserve"> in a normal condition or without spring framework we would need to create an instance(object) of the class and inject it where it should, manage it. This creates tight coupling. </w:t>
+      </w:r>
+      <w:proofErr w:type="gramStart"/>
+      <w:r>
+        <w:rPr>
+          <w:color w:val="000000" w:themeColor="text1"/>
+          <w:sz w:val="22"/>
+          <w:szCs w:val="22"/>
+        </w:rPr>
+        <w:t>However</w:t>
+      </w:r>
+      <w:proofErr w:type="gramEnd"/>
+      <w:r>
+        <w:rPr>
+          <w:color w:val="000000" w:themeColor="text1"/>
+          <w:sz w:val="22"/>
+          <w:szCs w:val="22"/>
+        </w:rPr>
+        <w:t xml:space="preserve"> the inversion of control allows spring boot using @Autowired to create an object for us, inject where </w:t>
+      </w:r>
+      <w:proofErr w:type="spellStart"/>
+      <w:r>
+        <w:rPr>
+          <w:color w:val="000000" w:themeColor="text1"/>
+          <w:sz w:val="22"/>
+          <w:szCs w:val="22"/>
+        </w:rPr>
+        <w:t>its</w:t>
+      </w:r>
+      <w:proofErr w:type="spellEnd"/>
+      <w:r>
+        <w:rPr>
+          <w:color w:val="000000" w:themeColor="text1"/>
+          <w:sz w:val="22"/>
+          <w:szCs w:val="22"/>
+        </w:rPr>
+        <w:t xml:space="preserve"> needed.</w:t>
       </w:r>
     </w:p>
     <w:p>
@@ -409,7 +445,25 @@
           <w:sz w:val="22"/>
           <w:szCs w:val="22"/>
         </w:rPr>
-        <w:t>In the app configuration class when we define beans using methods we annotate those methods with @Bean, and this bean that is returned from the method is named the same as the method name but if we wrote @Bean(“name”) now the spring boot will name that bean as name.</w:t>
+        <w:t xml:space="preserve">In the app configuration class when we define beans using </w:t>
+      </w:r>
+      <w:proofErr w:type="gramStart"/>
+      <w:r>
+        <w:rPr>
+          <w:color w:val="000000" w:themeColor="text1"/>
+          <w:sz w:val="22"/>
+          <w:szCs w:val="22"/>
+        </w:rPr>
+        <w:t>methods</w:t>
+      </w:r>
+      <w:proofErr w:type="gramEnd"/>
+      <w:r>
+        <w:rPr>
+          <w:color w:val="000000" w:themeColor="text1"/>
+          <w:sz w:val="22"/>
+          <w:szCs w:val="22"/>
+        </w:rPr>
+        <w:t xml:space="preserve"> we annotate those methods with @Bean, and this bean that is returned from the method is named the same as the method name but if we wrote @Bean(“name”) now the spring boot will name that bean as name.</w:t>
       </w:r>
     </w:p>
     <w:p>
@@ -765,7 +819,25 @@
           <w:sz w:val="22"/>
           <w:szCs w:val="22"/>
         </w:rPr>
-        <w:t xml:space="preserve">@Value(“Actual value”) is used to inject value into a variable, whether its hardcoded or comes from another environment or class. Or class path, or file or variable. </w:t>
+        <w:t>@</w:t>
+      </w:r>
+      <w:proofErr w:type="gramStart"/>
+      <w:r>
+        <w:rPr>
+          <w:color w:val="000000" w:themeColor="text1"/>
+          <w:sz w:val="22"/>
+          <w:szCs w:val="22"/>
+        </w:rPr>
+        <w:t>Value(</w:t>
+      </w:r>
+      <w:proofErr w:type="gramEnd"/>
+      <w:r>
+        <w:rPr>
+          <w:color w:val="000000" w:themeColor="text1"/>
+          <w:sz w:val="22"/>
+          <w:szCs w:val="22"/>
+        </w:rPr>
+        <w:t xml:space="preserve">“Actual value”) is used to inject value into a variable, whether its hardcoded or comes from another environment or class. Or class path, or file or variable. </w:t>
       </w:r>
     </w:p>
     <w:p>
@@ -1181,7 +1253,25 @@
           <w:sz w:val="22"/>
           <w:szCs w:val="22"/>
         </w:rPr>
-        <w:t>In case of nested resources payments inside the accounts it should be like this</w:t>
+        <w:t xml:space="preserve">In case of nested resources payments inside the </w:t>
+      </w:r>
+      <w:proofErr w:type="gramStart"/>
+      <w:r>
+        <w:rPr>
+          <w:color w:val="000000" w:themeColor="text1"/>
+          <w:sz w:val="22"/>
+          <w:szCs w:val="22"/>
+        </w:rPr>
+        <w:t>accounts</w:t>
+      </w:r>
+      <w:proofErr w:type="gramEnd"/>
+      <w:r>
+        <w:rPr>
+          <w:color w:val="000000" w:themeColor="text1"/>
+          <w:sz w:val="22"/>
+          <w:szCs w:val="22"/>
+        </w:rPr>
+        <w:t xml:space="preserve"> it should be like this</w:t>
       </w:r>
     </w:p>
     <w:p>
@@ -1249,8 +1339,36 @@
           <w:sz w:val="22"/>
           <w:szCs w:val="22"/>
         </w:rPr>
-        <w:t>GET, POST, PUT, DELETE,PATCH,OPTIONS,HEAD</w:t>
-      </w:r>
+        <w:t xml:space="preserve">GET, POST, PUT, </w:t>
+      </w:r>
+      <w:proofErr w:type="gramStart"/>
+      <w:r>
+        <w:rPr>
+          <w:color w:val="EE0000"/>
+          <w:sz w:val="22"/>
+          <w:szCs w:val="22"/>
+        </w:rPr>
+        <w:t>DELETE,PATCH</w:t>
+      </w:r>
+      <w:proofErr w:type="gramEnd"/>
+      <w:r>
+        <w:rPr>
+          <w:color w:val="EE0000"/>
+          <w:sz w:val="22"/>
+          <w:szCs w:val="22"/>
+        </w:rPr>
+        <w:t>,</w:t>
+      </w:r>
+      <w:proofErr w:type="gramStart"/>
+      <w:r>
+        <w:rPr>
+          <w:color w:val="EE0000"/>
+          <w:sz w:val="22"/>
+          <w:szCs w:val="22"/>
+        </w:rPr>
+        <w:t>OPTIONS,HEAD</w:t>
+      </w:r>
+      <w:proofErr w:type="gramEnd"/>
       <w:r>
         <w:rPr>
           <w:color w:val="000000" w:themeColor="text1"/>
@@ -1318,24 +1436,70 @@
           <w:sz w:val="22"/>
           <w:szCs w:val="22"/>
         </w:rPr>
-        <w:t>Public void printProduct(){}</w:t>
-      </w:r>
-    </w:p>
-    <w:p>
-      <w:pPr>
-        <w:rPr>
-          <w:color w:val="000000" w:themeColor="text1"/>
-          <w:sz w:val="22"/>
-          <w:szCs w:val="22"/>
-        </w:rPr>
-      </w:pPr>
-      <w:r>
-        <w:rPr>
-          <w:color w:val="000000" w:themeColor="text1"/>
-          <w:sz w:val="22"/>
-          <w:szCs w:val="22"/>
-        </w:rPr>
-        <w:t>This annotation is triggered aka mapped into the function its on once the http request of get/users/{id} is accessed it just fetches data from the server and show it to the user its very safe</w:t>
+        <w:t xml:space="preserve">Public void </w:t>
+      </w:r>
+      <w:proofErr w:type="spellStart"/>
+      <w:proofErr w:type="gramStart"/>
+      <w:r>
+        <w:rPr>
+          <w:color w:val="EE0000"/>
+          <w:sz w:val="22"/>
+          <w:szCs w:val="22"/>
+        </w:rPr>
+        <w:t>printProduct</w:t>
+      </w:r>
+      <w:proofErr w:type="spellEnd"/>
+      <w:r>
+        <w:rPr>
+          <w:color w:val="EE0000"/>
+          <w:sz w:val="22"/>
+          <w:szCs w:val="22"/>
+        </w:rPr>
+        <w:t>(){</w:t>
+      </w:r>
+      <w:proofErr w:type="gramEnd"/>
+      <w:r>
+        <w:rPr>
+          <w:color w:val="EE0000"/>
+          <w:sz w:val="22"/>
+          <w:szCs w:val="22"/>
+        </w:rPr>
+        <w:t>}</w:t>
+      </w:r>
+    </w:p>
+    <w:p>
+      <w:pPr>
+        <w:rPr>
+          <w:color w:val="000000" w:themeColor="text1"/>
+          <w:sz w:val="22"/>
+          <w:szCs w:val="22"/>
+        </w:rPr>
+      </w:pPr>
+      <w:r>
+        <w:rPr>
+          <w:color w:val="000000" w:themeColor="text1"/>
+          <w:sz w:val="22"/>
+          <w:szCs w:val="22"/>
+        </w:rPr>
+        <w:t xml:space="preserve">This annotation is triggered aka mapped into the function </w:t>
+      </w:r>
+      <w:proofErr w:type="spellStart"/>
+      <w:r>
+        <w:rPr>
+          <w:color w:val="000000" w:themeColor="text1"/>
+          <w:sz w:val="22"/>
+          <w:szCs w:val="22"/>
+        </w:rPr>
+        <w:t>its</w:t>
+      </w:r>
+      <w:proofErr w:type="spellEnd"/>
+      <w:r>
+        <w:rPr>
+          <w:color w:val="000000" w:themeColor="text1"/>
+          <w:sz w:val="22"/>
+          <w:szCs w:val="22"/>
+        </w:rPr>
+        <w:t xml:space="preserve"> on once the http request of get/users/{id} is accessed it just fetches data from the server and show it to the user its very safe</w:t>
       </w:r>
     </w:p>
     <w:p>
@@ -1464,7 +1628,35 @@
           <w:szCs w:val="22"/>
         </w:rPr>
         <w:br/>
-        <w:t>public User updateUser(@PathVariable Long id, @RequestBody User user) {</w:t>
+        <w:t xml:space="preserve">public User </w:t>
+      </w:r>
+      <w:proofErr w:type="spellStart"/>
+      <w:proofErr w:type="gramStart"/>
+      <w:r>
+        <w:rPr>
+          <w:color w:val="EE0000"/>
+          <w:sz w:val="22"/>
+          <w:szCs w:val="22"/>
+        </w:rPr>
+        <w:t>updateUser</w:t>
+      </w:r>
+      <w:proofErr w:type="spellEnd"/>
+      <w:r>
+        <w:rPr>
+          <w:color w:val="EE0000"/>
+          <w:sz w:val="22"/>
+          <w:szCs w:val="22"/>
+        </w:rPr>
+        <w:t>(</w:t>
+      </w:r>
+      <w:proofErr w:type="gramEnd"/>
+      <w:r>
+        <w:rPr>
+          <w:color w:val="EE0000"/>
+          <w:sz w:val="22"/>
+          <w:szCs w:val="22"/>
+        </w:rPr>
+        <w:t>@PathVariable Long id, @RequestBody User user) {</w:t>
       </w:r>
       <w:r>
         <w:rPr>
@@ -1473,7 +1665,27 @@
           <w:szCs w:val="22"/>
         </w:rPr>
         <w:br/>
-        <w:t xml:space="preserve">    user.setId(id);</w:t>
+        <w:t xml:space="preserve">    </w:t>
+      </w:r>
+      <w:proofErr w:type="spellStart"/>
+      <w:proofErr w:type="gramStart"/>
+      <w:r>
+        <w:rPr>
+          <w:color w:val="EE0000"/>
+          <w:sz w:val="22"/>
+          <w:szCs w:val="22"/>
+        </w:rPr>
+        <w:t>user.setId</w:t>
+      </w:r>
+      <w:proofErr w:type="spellEnd"/>
+      <w:proofErr w:type="gramEnd"/>
+      <w:r>
+        <w:rPr>
+          <w:color w:val="EE0000"/>
+          <w:sz w:val="22"/>
+          <w:szCs w:val="22"/>
+        </w:rPr>
+        <w:t>(id);</w:t>
       </w:r>
       <w:r>
         <w:rPr>
@@ -1482,7 +1694,25 @@
           <w:szCs w:val="22"/>
         </w:rPr>
         <w:br/>
-        <w:t xml:space="preserve">    return userService.update(user);</w:t>
+        <w:t xml:space="preserve">    return </w:t>
+      </w:r>
+      <w:proofErr w:type="spellStart"/>
+      <w:r>
+        <w:rPr>
+          <w:color w:val="EE0000"/>
+          <w:sz w:val="22"/>
+          <w:szCs w:val="22"/>
+        </w:rPr>
+        <w:t>userService.update</w:t>
+      </w:r>
+      <w:proofErr w:type="spellEnd"/>
+      <w:r>
+        <w:rPr>
+          <w:color w:val="EE0000"/>
+          <w:sz w:val="22"/>
+          <w:szCs w:val="22"/>
+        </w:rPr>
+        <w:t>(user);</w:t>
       </w:r>
       <w:r>
         <w:rPr>
@@ -1650,24 +1880,70 @@
           <w:sz w:val="22"/>
           <w:szCs w:val="22"/>
         </w:rPr>
-        <w:t>public void deleteUser(@PathVariable Long id) {</w:t>
-      </w:r>
-    </w:p>
-    <w:p>
-      <w:pPr>
-        <w:rPr>
-          <w:color w:val="EE0000"/>
-          <w:sz w:val="22"/>
-          <w:szCs w:val="22"/>
-        </w:rPr>
-      </w:pPr>
-      <w:r>
-        <w:rPr>
-          <w:color w:val="EE0000"/>
-          <w:sz w:val="22"/>
-          <w:szCs w:val="22"/>
-        </w:rPr>
-        <w:t xml:space="preserve">    userService.delete(id);</w:t>
+        <w:t xml:space="preserve">public void </w:t>
+      </w:r>
+      <w:proofErr w:type="spellStart"/>
+      <w:proofErr w:type="gramStart"/>
+      <w:r>
+        <w:rPr>
+          <w:color w:val="EE0000"/>
+          <w:sz w:val="22"/>
+          <w:szCs w:val="22"/>
+        </w:rPr>
+        <w:t>deleteUser</w:t>
+      </w:r>
+      <w:proofErr w:type="spellEnd"/>
+      <w:r>
+        <w:rPr>
+          <w:color w:val="EE0000"/>
+          <w:sz w:val="22"/>
+          <w:szCs w:val="22"/>
+        </w:rPr>
+        <w:t>(</w:t>
+      </w:r>
+      <w:proofErr w:type="gramEnd"/>
+      <w:r>
+        <w:rPr>
+          <w:color w:val="EE0000"/>
+          <w:sz w:val="22"/>
+          <w:szCs w:val="22"/>
+        </w:rPr>
+        <w:t>@PathVariable Long id) {</w:t>
+      </w:r>
+    </w:p>
+    <w:p>
+      <w:pPr>
+        <w:rPr>
+          <w:color w:val="EE0000"/>
+          <w:sz w:val="22"/>
+          <w:szCs w:val="22"/>
+        </w:rPr>
+      </w:pPr>
+      <w:r>
+        <w:rPr>
+          <w:color w:val="EE0000"/>
+          <w:sz w:val="22"/>
+          <w:szCs w:val="22"/>
+        </w:rPr>
+        <w:t xml:space="preserve">    </w:t>
+      </w:r>
+      <w:proofErr w:type="spellStart"/>
+      <w:r>
+        <w:rPr>
+          <w:color w:val="EE0000"/>
+          <w:sz w:val="22"/>
+          <w:szCs w:val="22"/>
+        </w:rPr>
+        <w:t>userService.delete</w:t>
+      </w:r>
+      <w:proofErr w:type="spellEnd"/>
+      <w:r>
+        <w:rPr>
+          <w:color w:val="EE0000"/>
+          <w:sz w:val="22"/>
+          <w:szCs w:val="22"/>
+        </w:rPr>
+        <w:t>(id);</w:t>
       </w:r>
     </w:p>
     <w:p>
@@ -1701,8 +1977,18 @@
           <w:sz w:val="22"/>
           <w:szCs w:val="22"/>
         </w:rPr>
-        <w:t>Is used to remove a resource from the databse</w:t>
-      </w:r>
+        <w:t xml:space="preserve">Is used to remove a resource from the </w:t>
+      </w:r>
+      <w:proofErr w:type="spellStart"/>
+      <w:r>
+        <w:rPr>
+          <w:color w:val="000000" w:themeColor="text1"/>
+          <w:sz w:val="22"/>
+          <w:szCs w:val="22"/>
+        </w:rPr>
+        <w:t>databse</w:t>
+      </w:r>
+      <w:proofErr w:type="spellEnd"/>
     </w:p>
     <w:p>
       <w:pPr>
@@ -1770,24 +2056,70 @@
           <w:sz w:val="22"/>
           <w:szCs w:val="22"/>
         </w:rPr>
-        <w:t>public User patchUser(@PathVariable Long id, @RequestBody Map&lt;String, Object&gt; updates) {</w:t>
-      </w:r>
-    </w:p>
-    <w:p>
-      <w:pPr>
-        <w:rPr>
-          <w:color w:val="EE0000"/>
-          <w:sz w:val="22"/>
-          <w:szCs w:val="22"/>
-        </w:rPr>
-      </w:pPr>
-      <w:r>
-        <w:rPr>
-          <w:color w:val="EE0000"/>
-          <w:sz w:val="22"/>
-          <w:szCs w:val="22"/>
-        </w:rPr>
-        <w:t xml:space="preserve">    return userService.partialUpdate(id, updates);</w:t>
+        <w:t xml:space="preserve">public User </w:t>
+      </w:r>
+      <w:proofErr w:type="spellStart"/>
+      <w:proofErr w:type="gramStart"/>
+      <w:r>
+        <w:rPr>
+          <w:color w:val="EE0000"/>
+          <w:sz w:val="22"/>
+          <w:szCs w:val="22"/>
+        </w:rPr>
+        <w:t>patchUser</w:t>
+      </w:r>
+      <w:proofErr w:type="spellEnd"/>
+      <w:r>
+        <w:rPr>
+          <w:color w:val="EE0000"/>
+          <w:sz w:val="22"/>
+          <w:szCs w:val="22"/>
+        </w:rPr>
+        <w:t>(</w:t>
+      </w:r>
+      <w:proofErr w:type="gramEnd"/>
+      <w:r>
+        <w:rPr>
+          <w:color w:val="EE0000"/>
+          <w:sz w:val="22"/>
+          <w:szCs w:val="22"/>
+        </w:rPr>
+        <w:t>@PathVariable Long id, @RequestBody Map&lt;String, Object&gt; updates) {</w:t>
+      </w:r>
+    </w:p>
+    <w:p>
+      <w:pPr>
+        <w:rPr>
+          <w:color w:val="EE0000"/>
+          <w:sz w:val="22"/>
+          <w:szCs w:val="22"/>
+        </w:rPr>
+      </w:pPr>
+      <w:r>
+        <w:rPr>
+          <w:color w:val="EE0000"/>
+          <w:sz w:val="22"/>
+          <w:szCs w:val="22"/>
+        </w:rPr>
+        <w:t xml:space="preserve">    return </w:t>
+      </w:r>
+      <w:proofErr w:type="spellStart"/>
+      <w:r>
+        <w:rPr>
+          <w:color w:val="EE0000"/>
+          <w:sz w:val="22"/>
+          <w:szCs w:val="22"/>
+        </w:rPr>
+        <w:t>userService.partialUpdate</w:t>
+      </w:r>
+      <w:proofErr w:type="spellEnd"/>
+      <w:r>
+        <w:rPr>
+          <w:color w:val="EE0000"/>
+          <w:sz w:val="22"/>
+          <w:szCs w:val="22"/>
+        </w:rPr>
+        <w:t>(id, updates);</w:t>
       </w:r>
     </w:p>
     <w:p>
@@ -1821,15 +2153,7 @@
           <w:sz w:val="22"/>
           <w:szCs w:val="22"/>
         </w:rPr>
-        <w:t>Update only specific fields of a resource (not the whole object).</w:t>
-      </w:r>
-      <w:r>
-        <w:rPr>
-          <w:color w:val="000000" w:themeColor="text1"/>
-          <w:sz w:val="22"/>
-          <w:szCs w:val="22"/>
-        </w:rPr>
-        <w:t xml:space="preserve"> </w:t>
+        <w:t xml:space="preserve">Update only specific fields of a resource (not the whole object). </w:t>
       </w:r>
     </w:p>
     <w:p>
@@ -1898,75 +2222,201 @@
           <w:sz w:val="22"/>
           <w:szCs w:val="22"/>
         </w:rPr>
-        <w:t>@RequestMapping(value = "/users", method = RequestMethod.OPTIONS)</w:t>
-      </w:r>
-    </w:p>
-    <w:p>
-      <w:pPr>
-        <w:rPr>
-          <w:color w:val="EE0000"/>
-          <w:sz w:val="22"/>
-          <w:szCs w:val="22"/>
-        </w:rPr>
-      </w:pPr>
-      <w:r>
-        <w:rPr>
-          <w:color w:val="EE0000"/>
-          <w:sz w:val="22"/>
-          <w:szCs w:val="22"/>
-        </w:rPr>
-        <w:t>public ResponseEntity&lt;?&gt; options() {</w:t>
-      </w:r>
-    </w:p>
-    <w:p>
-      <w:pPr>
-        <w:rPr>
-          <w:color w:val="EE0000"/>
-          <w:sz w:val="22"/>
-          <w:szCs w:val="22"/>
-        </w:rPr>
-      </w:pPr>
-      <w:r>
-        <w:rPr>
-          <w:color w:val="EE0000"/>
-          <w:sz w:val="22"/>
-          <w:szCs w:val="22"/>
-        </w:rPr>
-        <w:t xml:space="preserve">    return ResponseEntity.ok()</w:t>
-      </w:r>
-    </w:p>
-    <w:p>
-      <w:pPr>
-        <w:rPr>
-          <w:color w:val="EE0000"/>
-          <w:sz w:val="22"/>
-          <w:szCs w:val="22"/>
-        </w:rPr>
-      </w:pPr>
-      <w:r>
-        <w:rPr>
-          <w:color w:val="EE0000"/>
-          <w:sz w:val="22"/>
-          <w:szCs w:val="22"/>
-        </w:rPr>
-        <w:t xml:space="preserve">        .header("Allow", "GET, POST, PUT, DELETE, PATCH, OPTIONS")</w:t>
-      </w:r>
-    </w:p>
-    <w:p>
-      <w:pPr>
-        <w:rPr>
-          <w:color w:val="EE0000"/>
-          <w:sz w:val="22"/>
-          <w:szCs w:val="22"/>
-        </w:rPr>
-      </w:pPr>
-      <w:r>
-        <w:rPr>
-          <w:color w:val="EE0000"/>
-          <w:sz w:val="22"/>
-          <w:szCs w:val="22"/>
-        </w:rPr>
-        <w:t xml:space="preserve">        .build();</w:t>
+        <w:t>@</w:t>
+      </w:r>
+      <w:proofErr w:type="gramStart"/>
+      <w:r>
+        <w:rPr>
+          <w:color w:val="EE0000"/>
+          <w:sz w:val="22"/>
+          <w:szCs w:val="22"/>
+        </w:rPr>
+        <w:t>RequestMapping(</w:t>
+      </w:r>
+      <w:proofErr w:type="gramEnd"/>
+      <w:r>
+        <w:rPr>
+          <w:color w:val="EE0000"/>
+          <w:sz w:val="22"/>
+          <w:szCs w:val="22"/>
+        </w:rPr>
+        <w:t xml:space="preserve">value = "/users", method = </w:t>
+      </w:r>
+      <w:proofErr w:type="spellStart"/>
+      <w:r>
+        <w:rPr>
+          <w:color w:val="EE0000"/>
+          <w:sz w:val="22"/>
+          <w:szCs w:val="22"/>
+        </w:rPr>
+        <w:t>RequestMethod.OPTIONS</w:t>
+      </w:r>
+      <w:proofErr w:type="spellEnd"/>
+      <w:r>
+        <w:rPr>
+          <w:color w:val="EE0000"/>
+          <w:sz w:val="22"/>
+          <w:szCs w:val="22"/>
+        </w:rPr>
+        <w:t>)</w:t>
+      </w:r>
+    </w:p>
+    <w:p>
+      <w:pPr>
+        <w:rPr>
+          <w:color w:val="EE0000"/>
+          <w:sz w:val="22"/>
+          <w:szCs w:val="22"/>
+        </w:rPr>
+      </w:pPr>
+      <w:r>
+        <w:rPr>
+          <w:color w:val="EE0000"/>
+          <w:sz w:val="22"/>
+          <w:szCs w:val="22"/>
+        </w:rPr>
+        <w:t xml:space="preserve">public </w:t>
+      </w:r>
+      <w:proofErr w:type="spellStart"/>
+      <w:r>
+        <w:rPr>
+          <w:color w:val="EE0000"/>
+          <w:sz w:val="22"/>
+          <w:szCs w:val="22"/>
+        </w:rPr>
+        <w:t>ResponseEntity</w:t>
+      </w:r>
+      <w:proofErr w:type="spellEnd"/>
+      <w:r>
+        <w:rPr>
+          <w:color w:val="EE0000"/>
+          <w:sz w:val="22"/>
+          <w:szCs w:val="22"/>
+        </w:rPr>
+        <w:t xml:space="preserve">&lt;?&gt; </w:t>
+      </w:r>
+      <w:proofErr w:type="gramStart"/>
+      <w:r>
+        <w:rPr>
+          <w:color w:val="EE0000"/>
+          <w:sz w:val="22"/>
+          <w:szCs w:val="22"/>
+        </w:rPr>
+        <w:t>options(</w:t>
+      </w:r>
+      <w:proofErr w:type="gramEnd"/>
+      <w:r>
+        <w:rPr>
+          <w:color w:val="EE0000"/>
+          <w:sz w:val="22"/>
+          <w:szCs w:val="22"/>
+        </w:rPr>
+        <w:t>) {</w:t>
+      </w:r>
+    </w:p>
+    <w:p>
+      <w:pPr>
+        <w:rPr>
+          <w:color w:val="EE0000"/>
+          <w:sz w:val="22"/>
+          <w:szCs w:val="22"/>
+        </w:rPr>
+      </w:pPr>
+      <w:r>
+        <w:rPr>
+          <w:color w:val="EE0000"/>
+          <w:sz w:val="22"/>
+          <w:szCs w:val="22"/>
+        </w:rPr>
+        <w:t xml:space="preserve">    return </w:t>
+      </w:r>
+      <w:proofErr w:type="spellStart"/>
+      <w:r>
+        <w:rPr>
+          <w:color w:val="EE0000"/>
+          <w:sz w:val="22"/>
+          <w:szCs w:val="22"/>
+        </w:rPr>
+        <w:t>ResponseEntity.ok</w:t>
+      </w:r>
+      <w:proofErr w:type="spellEnd"/>
+      <w:r>
+        <w:rPr>
+          <w:color w:val="EE0000"/>
+          <w:sz w:val="22"/>
+          <w:szCs w:val="22"/>
+        </w:rPr>
+        <w:t>()</w:t>
+      </w:r>
+    </w:p>
+    <w:p>
+      <w:pPr>
+        <w:rPr>
+          <w:color w:val="EE0000"/>
+          <w:sz w:val="22"/>
+          <w:szCs w:val="22"/>
+        </w:rPr>
+      </w:pPr>
+      <w:r>
+        <w:rPr>
+          <w:color w:val="EE0000"/>
+          <w:sz w:val="22"/>
+          <w:szCs w:val="22"/>
+        </w:rPr>
+        <w:t xml:space="preserve">        </w:t>
+      </w:r>
+      <w:proofErr w:type="gramStart"/>
+      <w:r>
+        <w:rPr>
+          <w:color w:val="EE0000"/>
+          <w:sz w:val="22"/>
+          <w:szCs w:val="22"/>
+        </w:rPr>
+        <w:t>.header</w:t>
+      </w:r>
+      <w:proofErr w:type="gramEnd"/>
+      <w:r>
+        <w:rPr>
+          <w:color w:val="EE0000"/>
+          <w:sz w:val="22"/>
+          <w:szCs w:val="22"/>
+        </w:rPr>
+        <w:t>("Allow", "GET, POST, PUT, DELETE, PATCH, OPTIONS")</w:t>
+      </w:r>
+    </w:p>
+    <w:p>
+      <w:pPr>
+        <w:rPr>
+          <w:color w:val="EE0000"/>
+          <w:sz w:val="22"/>
+          <w:szCs w:val="22"/>
+        </w:rPr>
+      </w:pPr>
+      <w:r>
+        <w:rPr>
+          <w:color w:val="EE0000"/>
+          <w:sz w:val="22"/>
+          <w:szCs w:val="22"/>
+        </w:rPr>
+        <w:t xml:space="preserve">        </w:t>
+      </w:r>
+      <w:proofErr w:type="gramStart"/>
+      <w:r>
+        <w:rPr>
+          <w:color w:val="EE0000"/>
+          <w:sz w:val="22"/>
+          <w:szCs w:val="22"/>
+        </w:rPr>
+        <w:t>.build</w:t>
+      </w:r>
+      <w:proofErr w:type="gramEnd"/>
+      <w:r>
+        <w:rPr>
+          <w:color w:val="EE0000"/>
+          <w:sz w:val="22"/>
+          <w:szCs w:val="22"/>
+        </w:rPr>
+        <w:t>();</w:t>
       </w:r>
     </w:p>
     <w:p>
@@ -2125,58 +2575,194 @@
           <w:sz w:val="22"/>
           <w:szCs w:val="22"/>
         </w:rPr>
-        <w:t>@RequestMapping(value = "/users/{id}", method = RequestMethod.HEAD)</w:t>
-      </w:r>
-    </w:p>
-    <w:p>
-      <w:pPr>
-        <w:rPr>
-          <w:color w:val="EE0000"/>
-          <w:sz w:val="22"/>
-          <w:szCs w:val="22"/>
-        </w:rPr>
-      </w:pPr>
-      <w:r>
-        <w:rPr>
-          <w:color w:val="EE0000"/>
-          <w:sz w:val="22"/>
-          <w:szCs w:val="22"/>
-        </w:rPr>
-        <w:t>public ResponseEntity&lt;Void&gt; headUser(@PathVariable Long id) {</w:t>
-      </w:r>
-    </w:p>
-    <w:p>
-      <w:pPr>
-        <w:rPr>
-          <w:color w:val="EE0000"/>
-          <w:sz w:val="22"/>
-          <w:szCs w:val="22"/>
-        </w:rPr>
-      </w:pPr>
-      <w:r>
-        <w:rPr>
-          <w:color w:val="EE0000"/>
-          <w:sz w:val="22"/>
-          <w:szCs w:val="22"/>
-        </w:rPr>
-        <w:t xml:space="preserve">    if (userService.exists(id)) {</w:t>
-      </w:r>
-    </w:p>
-    <w:p>
-      <w:pPr>
-        <w:rPr>
-          <w:color w:val="EE0000"/>
-          <w:sz w:val="22"/>
-          <w:szCs w:val="22"/>
-        </w:rPr>
-      </w:pPr>
-      <w:r>
-        <w:rPr>
-          <w:color w:val="EE0000"/>
-          <w:sz w:val="22"/>
-          <w:szCs w:val="22"/>
-        </w:rPr>
-        <w:t xml:space="preserve">        return ResponseEntity.ok().build();</w:t>
+        <w:t>@</w:t>
+      </w:r>
+      <w:proofErr w:type="gramStart"/>
+      <w:r>
+        <w:rPr>
+          <w:color w:val="EE0000"/>
+          <w:sz w:val="22"/>
+          <w:szCs w:val="22"/>
+        </w:rPr>
+        <w:t>RequestMapping(</w:t>
+      </w:r>
+      <w:proofErr w:type="gramEnd"/>
+      <w:r>
+        <w:rPr>
+          <w:color w:val="EE0000"/>
+          <w:sz w:val="22"/>
+          <w:szCs w:val="22"/>
+        </w:rPr>
+        <w:t xml:space="preserve">value = "/users/{id}", method = </w:t>
+      </w:r>
+      <w:proofErr w:type="spellStart"/>
+      <w:r>
+        <w:rPr>
+          <w:color w:val="EE0000"/>
+          <w:sz w:val="22"/>
+          <w:szCs w:val="22"/>
+        </w:rPr>
+        <w:t>RequestMethod.HEAD</w:t>
+      </w:r>
+      <w:proofErr w:type="spellEnd"/>
+      <w:r>
+        <w:rPr>
+          <w:color w:val="EE0000"/>
+          <w:sz w:val="22"/>
+          <w:szCs w:val="22"/>
+        </w:rPr>
+        <w:t>)</w:t>
+      </w:r>
+    </w:p>
+    <w:p>
+      <w:pPr>
+        <w:rPr>
+          <w:color w:val="EE0000"/>
+          <w:sz w:val="22"/>
+          <w:szCs w:val="22"/>
+        </w:rPr>
+      </w:pPr>
+      <w:r>
+        <w:rPr>
+          <w:color w:val="EE0000"/>
+          <w:sz w:val="22"/>
+          <w:szCs w:val="22"/>
+        </w:rPr>
+        <w:t xml:space="preserve">public </w:t>
+      </w:r>
+      <w:proofErr w:type="spellStart"/>
+      <w:r>
+        <w:rPr>
+          <w:color w:val="EE0000"/>
+          <w:sz w:val="22"/>
+          <w:szCs w:val="22"/>
+        </w:rPr>
+        <w:t>ResponseEntity</w:t>
+      </w:r>
+      <w:proofErr w:type="spellEnd"/>
+      <w:r>
+        <w:rPr>
+          <w:color w:val="EE0000"/>
+          <w:sz w:val="22"/>
+          <w:szCs w:val="22"/>
+        </w:rPr>
+        <w:t xml:space="preserve">&lt;Void&gt; </w:t>
+      </w:r>
+      <w:proofErr w:type="spellStart"/>
+      <w:proofErr w:type="gramStart"/>
+      <w:r>
+        <w:rPr>
+          <w:color w:val="EE0000"/>
+          <w:sz w:val="22"/>
+          <w:szCs w:val="22"/>
+        </w:rPr>
+        <w:t>headUser</w:t>
+      </w:r>
+      <w:proofErr w:type="spellEnd"/>
+      <w:r>
+        <w:rPr>
+          <w:color w:val="EE0000"/>
+          <w:sz w:val="22"/>
+          <w:szCs w:val="22"/>
+        </w:rPr>
+        <w:t>(</w:t>
+      </w:r>
+      <w:proofErr w:type="gramEnd"/>
+      <w:r>
+        <w:rPr>
+          <w:color w:val="EE0000"/>
+          <w:sz w:val="22"/>
+          <w:szCs w:val="22"/>
+        </w:rPr>
+        <w:t>@PathVariable Long id) {</w:t>
+      </w:r>
+    </w:p>
+    <w:p>
+      <w:pPr>
+        <w:rPr>
+          <w:color w:val="EE0000"/>
+          <w:sz w:val="22"/>
+          <w:szCs w:val="22"/>
+        </w:rPr>
+      </w:pPr>
+      <w:r>
+        <w:rPr>
+          <w:color w:val="EE0000"/>
+          <w:sz w:val="22"/>
+          <w:szCs w:val="22"/>
+        </w:rPr>
+        <w:t xml:space="preserve">    if (</w:t>
+      </w:r>
+      <w:proofErr w:type="spellStart"/>
+      <w:r>
+        <w:rPr>
+          <w:color w:val="EE0000"/>
+          <w:sz w:val="22"/>
+          <w:szCs w:val="22"/>
+        </w:rPr>
+        <w:t>userService.exists</w:t>
+      </w:r>
+      <w:proofErr w:type="spellEnd"/>
+      <w:r>
+        <w:rPr>
+          <w:color w:val="EE0000"/>
+          <w:sz w:val="22"/>
+          <w:szCs w:val="22"/>
+        </w:rPr>
+        <w:t>(id)) {</w:t>
+      </w:r>
+    </w:p>
+    <w:p>
+      <w:pPr>
+        <w:rPr>
+          <w:color w:val="EE0000"/>
+          <w:sz w:val="22"/>
+          <w:szCs w:val="22"/>
+        </w:rPr>
+      </w:pPr>
+      <w:r>
+        <w:rPr>
+          <w:color w:val="EE0000"/>
+          <w:sz w:val="22"/>
+          <w:szCs w:val="22"/>
+        </w:rPr>
+        <w:t xml:space="preserve">        return </w:t>
+      </w:r>
+      <w:proofErr w:type="spellStart"/>
+      <w:r>
+        <w:rPr>
+          <w:color w:val="EE0000"/>
+          <w:sz w:val="22"/>
+          <w:szCs w:val="22"/>
+        </w:rPr>
+        <w:t>ResponseEntity.ok</w:t>
+      </w:r>
+      <w:proofErr w:type="spellEnd"/>
+      <w:r>
+        <w:rPr>
+          <w:color w:val="EE0000"/>
+          <w:sz w:val="22"/>
+          <w:szCs w:val="22"/>
+        </w:rPr>
+        <w:t>(</w:t>
+      </w:r>
+      <w:proofErr w:type="gramStart"/>
+      <w:r>
+        <w:rPr>
+          <w:color w:val="EE0000"/>
+          <w:sz w:val="22"/>
+          <w:szCs w:val="22"/>
+        </w:rPr>
+        <w:t>).build</w:t>
+      </w:r>
+      <w:proofErr w:type="gramEnd"/>
+      <w:r>
+        <w:rPr>
+          <w:color w:val="EE0000"/>
+          <w:sz w:val="22"/>
+          <w:szCs w:val="22"/>
+        </w:rPr>
+        <w:t>();</w:t>
       </w:r>
     </w:p>
     <w:p>
@@ -2210,7 +2796,43 @@
           <w:sz w:val="22"/>
           <w:szCs w:val="22"/>
         </w:rPr>
-        <w:t xml:space="preserve">        return ResponseEntity.notFound().build();</w:t>
+        <w:t xml:space="preserve">        return </w:t>
+      </w:r>
+      <w:proofErr w:type="spellStart"/>
+      <w:r>
+        <w:rPr>
+          <w:color w:val="EE0000"/>
+          <w:sz w:val="22"/>
+          <w:szCs w:val="22"/>
+        </w:rPr>
+        <w:t>ResponseEntity.notFound</w:t>
+      </w:r>
+      <w:proofErr w:type="spellEnd"/>
+      <w:r>
+        <w:rPr>
+          <w:color w:val="EE0000"/>
+          <w:sz w:val="22"/>
+          <w:szCs w:val="22"/>
+        </w:rPr>
+        <w:t>(</w:t>
+      </w:r>
+      <w:proofErr w:type="gramStart"/>
+      <w:r>
+        <w:rPr>
+          <w:color w:val="EE0000"/>
+          <w:sz w:val="22"/>
+          <w:szCs w:val="22"/>
+        </w:rPr>
+        <w:t>).build</w:t>
+      </w:r>
+      <w:proofErr w:type="gramEnd"/>
+      <w:r>
+        <w:rPr>
+          <w:color w:val="EE0000"/>
+          <w:sz w:val="22"/>
+          <w:szCs w:val="22"/>
+        </w:rPr>
+        <w:t>();</w:t>
       </w:r>
     </w:p>
     <w:p>
@@ -2413,15 +3035,7 @@
           <w:sz w:val="22"/>
           <w:szCs w:val="22"/>
         </w:rPr>
-        <w:t xml:space="preserve">…. </w:t>
-      </w:r>
-      <w:r>
-        <w:rPr>
-          <w:color w:val="000000" w:themeColor="text1"/>
-          <w:sz w:val="22"/>
-          <w:szCs w:val="22"/>
-        </w:rPr>
-        <w:t xml:space="preserve">200 OK -&gt; standard response for success, 201 CREATED </w:t>
+        <w:t xml:space="preserve">…. 200 OK -&gt; standard response for success, 201 CREATED </w:t>
       </w:r>
       <w:r>
         <w:rPr>
@@ -2503,7 +3117,25 @@
           <w:sz w:val="22"/>
           <w:szCs w:val="22"/>
         </w:rPr>
-        <w:t xml:space="preserve"> for caching, if the current version matches the version in the client cache we get this message from the server and no more content. We just use the local version of the request.</w:t>
+        <w:t xml:space="preserve"> for caching, if the current version matches the version in the client </w:t>
+      </w:r>
+      <w:proofErr w:type="gramStart"/>
+      <w:r>
+        <w:rPr>
+          <w:color w:val="000000" w:themeColor="text1"/>
+          <w:sz w:val="22"/>
+          <w:szCs w:val="22"/>
+        </w:rPr>
+        <w:t>cache</w:t>
+      </w:r>
+      <w:proofErr w:type="gramEnd"/>
+      <w:r>
+        <w:rPr>
+          <w:color w:val="000000" w:themeColor="text1"/>
+          <w:sz w:val="22"/>
+          <w:szCs w:val="22"/>
+        </w:rPr>
+        <w:t xml:space="preserve"> we get this message from the server and no more content. We just use the local version of the request.</w:t>
       </w:r>
     </w:p>
     <w:p>
@@ -2552,7 +3184,25 @@
           <w:sz w:val="22"/>
           <w:szCs w:val="22"/>
         </w:rPr>
-        <w:t xml:space="preserve">, 400 bad request, the server was not able to understand the request because of invalid syntax. 401 unauthorized -&gt; means requires user authentication. 403 forbidden the client does not have the necessary authorization for the certain resources. </w:t>
+        <w:t xml:space="preserve">, 400 bad </w:t>
+      </w:r>
+      <w:proofErr w:type="gramStart"/>
+      <w:r>
+        <w:rPr>
+          <w:color w:val="000000" w:themeColor="text1"/>
+          <w:sz w:val="22"/>
+          <w:szCs w:val="22"/>
+        </w:rPr>
+        <w:t>request</w:t>
+      </w:r>
+      <w:proofErr w:type="gramEnd"/>
+      <w:r>
+        <w:rPr>
+          <w:color w:val="000000" w:themeColor="text1"/>
+          <w:sz w:val="22"/>
+          <w:szCs w:val="22"/>
+        </w:rPr>
+        <w:t xml:space="preserve">, the server was not able to understand the request because of invalid syntax. 401 unauthorized -&gt; means requires user authentication. 403 forbidden the client does not have the necessary authorization for the certain resources. </w:t>
       </w:r>
     </w:p>
     <w:p>
@@ -2601,66 +3251,384 @@
           <w:sz w:val="22"/>
           <w:szCs w:val="22"/>
         </w:rPr>
-        <w:t xml:space="preserve">, 500 server error when the server has an undefined issue and no more information is known or provided. 503 server unavailable, which means that the server is down because its overloaded or under maintenance. </w:t>
-      </w:r>
-    </w:p>
-    <w:p>
-      <w:pPr>
-        <w:rPr>
-          <w:color w:val="000000" w:themeColor="text1"/>
-          <w:sz w:val="22"/>
-          <w:szCs w:val="22"/>
-        </w:rPr>
-      </w:pPr>
-    </w:p>
-    <w:p>
-      <w:pPr>
-        <w:rPr>
-          <w:color w:val="000000" w:themeColor="text1"/>
-          <w:sz w:val="22"/>
-          <w:szCs w:val="22"/>
-        </w:rPr>
-      </w:pPr>
-      <w:r>
-        <w:rPr>
-          <w:color w:val="000000" w:themeColor="text1"/>
-          <w:sz w:val="22"/>
-          <w:szCs w:val="22"/>
-        </w:rPr>
+        <w:t xml:space="preserve">, 500 server error when the server has an undefined issue and no more information is known or provided. 503 </w:t>
+      </w:r>
+      <w:proofErr w:type="gramStart"/>
+      <w:r>
+        <w:rPr>
+          <w:color w:val="000000" w:themeColor="text1"/>
+          <w:sz w:val="22"/>
+          <w:szCs w:val="22"/>
+        </w:rPr>
+        <w:t>server</w:t>
+      </w:r>
+      <w:proofErr w:type="gramEnd"/>
+      <w:r>
+        <w:rPr>
+          <w:color w:val="000000" w:themeColor="text1"/>
+          <w:sz w:val="22"/>
+          <w:szCs w:val="22"/>
+        </w:rPr>
+        <w:t xml:space="preserve"> unavailable, which means that the server is down because its overloaded or under maintenance. </w:t>
+      </w:r>
+    </w:p>
+    <w:p>
+      <w:pPr>
+        <w:rPr>
+          <w:color w:val="000000" w:themeColor="text1"/>
+          <w:sz w:val="22"/>
+          <w:szCs w:val="22"/>
+        </w:rPr>
+      </w:pPr>
+    </w:p>
+    <w:p>
+      <w:pPr>
+        <w:rPr>
+          <w:color w:val="000000" w:themeColor="text1"/>
+          <w:sz w:val="22"/>
+          <w:szCs w:val="22"/>
+        </w:rPr>
+      </w:pPr>
+    </w:p>
+    <w:p>
+      <w:pPr>
+        <w:rPr>
+          <w:color w:val="000000" w:themeColor="text1"/>
+          <w:sz w:val="22"/>
+          <w:szCs w:val="22"/>
+        </w:rPr>
+      </w:pPr>
+    </w:p>
+    <w:p>
+      <w:pPr>
+        <w:rPr>
+          <w:color w:val="000000" w:themeColor="text1"/>
+          <w:sz w:val="22"/>
+          <w:szCs w:val="22"/>
+        </w:rPr>
+      </w:pPr>
+    </w:p>
+    <w:p>
+      <w:pPr>
+        <w:jc w:val="center"/>
+        <w:rPr>
+          <w:b/>
+          <w:bCs/>
+          <w:color w:val="EE0000"/>
+          <w:sz w:val="32"/>
+          <w:szCs w:val="32"/>
+          <w:u w:val="single"/>
+        </w:rPr>
+      </w:pPr>
+      <w:r>
+        <w:rPr>
+          <w:b/>
+          <w:bCs/>
+          <w:color w:val="EE0000"/>
+          <w:sz w:val="32"/>
+          <w:szCs w:val="32"/>
+          <w:u w:val="single"/>
+        </w:rPr>
+        <w:lastRenderedPageBreak/>
         <w:t xml:space="preserve">What is a </w:t>
       </w:r>
       <w:r>
         <w:rPr>
-          <w:color w:val="000000" w:themeColor="text1"/>
-          <w:sz w:val="22"/>
-          <w:szCs w:val="22"/>
-        </w:rPr>
-        <w:t>rest</w:t>
-      </w:r>
-      <w:r>
-        <w:rPr>
-          <w:color w:val="000000" w:themeColor="text1"/>
-          <w:sz w:val="22"/>
-          <w:szCs w:val="22"/>
-        </w:rPr>
-        <w:t>controller</w:t>
-      </w:r>
-    </w:p>
-    <w:p>
-      <w:pPr>
-        <w:rPr>
-          <w:color w:val="000000" w:themeColor="text1"/>
-          <w:sz w:val="22"/>
-          <w:szCs w:val="22"/>
-        </w:rPr>
-      </w:pPr>
-      <w:r>
-        <w:rPr>
-          <w:color w:val="000000" w:themeColor="text1"/>
-          <w:sz w:val="22"/>
-          <w:szCs w:val="22"/>
-        </w:rPr>
-        <w:t>Response status annotation</w:t>
+          <w:b/>
+          <w:bCs/>
+          <w:color w:val="EE0000"/>
+          <w:sz w:val="32"/>
+          <w:szCs w:val="32"/>
+          <w:u w:val="single"/>
+        </w:rPr>
+        <w:t>@R</w:t>
+      </w:r>
+      <w:r>
+        <w:rPr>
+          <w:b/>
+          <w:bCs/>
+          <w:color w:val="EE0000"/>
+          <w:sz w:val="32"/>
+          <w:szCs w:val="32"/>
+          <w:u w:val="single"/>
+        </w:rPr>
+        <w:t>est</w:t>
+      </w:r>
+      <w:r>
+        <w:rPr>
+          <w:b/>
+          <w:bCs/>
+          <w:color w:val="EE0000"/>
+          <w:sz w:val="32"/>
+          <w:szCs w:val="32"/>
+          <w:u w:val="single"/>
+        </w:rPr>
+        <w:t>C</w:t>
+      </w:r>
+      <w:r>
+        <w:rPr>
+          <w:b/>
+          <w:bCs/>
+          <w:color w:val="EE0000"/>
+          <w:sz w:val="32"/>
+          <w:szCs w:val="32"/>
+          <w:u w:val="single"/>
+        </w:rPr>
+        <w:t>ontroller</w:t>
+      </w:r>
+    </w:p>
+    <w:p>
+      <w:pPr>
+        <w:rPr>
+          <w:b/>
+          <w:bCs/>
+          <w:color w:val="000000" w:themeColor="text1"/>
+          <w:sz w:val="22"/>
+          <w:szCs w:val="22"/>
+        </w:rPr>
+      </w:pPr>
+      <w:r>
+        <w:rPr>
+          <w:color w:val="000000" w:themeColor="text1"/>
+          <w:sz w:val="22"/>
+          <w:szCs w:val="22"/>
+        </w:rPr>
+        <w:t>A @RestController is a Spring annotation used to define a controller that handles HTTP requests and returns data directly in the response body. A controller processes incoming HTTP requests, executes application logic, and produces a response. Unlike a regular @Controller, which typically returns a view (HTML page), a @RestController returns raw data such as JSON or XML.</w:t>
+      </w:r>
+    </w:p>
+    <w:p>
+      <w:pPr>
+        <w:rPr>
+          <w:color w:val="000000" w:themeColor="text1"/>
+          <w:sz w:val="22"/>
+          <w:szCs w:val="22"/>
+        </w:rPr>
+      </w:pPr>
+    </w:p>
+    <w:p>
+      <w:pPr>
+        <w:jc w:val="center"/>
+        <w:rPr>
+          <w:b/>
+          <w:bCs/>
+          <w:color w:val="EE0000"/>
+          <w:sz w:val="32"/>
+          <w:szCs w:val="32"/>
+          <w:u w:val="single"/>
+        </w:rPr>
+      </w:pPr>
+      <w:r>
+        <w:rPr>
+          <w:b/>
+          <w:bCs/>
+          <w:color w:val="EE0000"/>
+          <w:sz w:val="32"/>
+          <w:szCs w:val="32"/>
+          <w:u w:val="single"/>
+        </w:rPr>
+        <w:t>@RequestBody</w:t>
+      </w:r>
+    </w:p>
+    <w:p>
+      <w:pPr>
+        <w:rPr>
+          <w:color w:val="000000" w:themeColor="text1"/>
+          <w:sz w:val="22"/>
+          <w:szCs w:val="22"/>
+        </w:rPr>
+      </w:pPr>
+      <w:r>
+        <w:rPr>
+          <w:color w:val="000000" w:themeColor="text1"/>
+          <w:sz w:val="22"/>
+          <w:szCs w:val="22"/>
+        </w:rPr>
+        <w:t>What is @ResponseStatus?</w:t>
+      </w:r>
+    </w:p>
+    <w:p>
+      <w:pPr>
+        <w:rPr>
+          <w:color w:val="000000" w:themeColor="text1"/>
+          <w:sz w:val="22"/>
+          <w:szCs w:val="22"/>
+        </w:rPr>
+      </w:pPr>
+      <w:r>
+        <w:rPr>
+          <w:color w:val="000000" w:themeColor="text1"/>
+          <w:sz w:val="22"/>
+          <w:szCs w:val="22"/>
+        </w:rPr>
+        <w:t>@ResponseStatus is an annotation used to:</w:t>
+      </w:r>
+    </w:p>
+    <w:p>
+      <w:pPr>
+        <w:rPr>
+          <w:color w:val="000000" w:themeColor="text1"/>
+          <w:sz w:val="22"/>
+          <w:szCs w:val="22"/>
+        </w:rPr>
+      </w:pPr>
+      <w:r>
+        <w:rPr>
+          <w:color w:val="000000" w:themeColor="text1"/>
+          <w:sz w:val="22"/>
+          <w:szCs w:val="22"/>
+        </w:rPr>
+        <w:t>Manually set the HTTP status code of a response</w:t>
+      </w:r>
+    </w:p>
+    <w:p>
+      <w:pPr>
+        <w:rPr>
+          <w:color w:val="000000" w:themeColor="text1"/>
+          <w:sz w:val="22"/>
+          <w:szCs w:val="22"/>
+        </w:rPr>
+      </w:pPr>
+      <w:r>
+        <w:rPr>
+          <w:color w:val="000000" w:themeColor="text1"/>
+          <w:sz w:val="22"/>
+          <w:szCs w:val="22"/>
+        </w:rPr>
+        <w:t>@PostMapping("/users")</w:t>
+      </w:r>
+      <w:r>
+        <w:rPr>
+          <w:color w:val="000000" w:themeColor="text1"/>
+          <w:sz w:val="22"/>
+          <w:szCs w:val="22"/>
+        </w:rPr>
+        <w:br/>
+        <w:t>@</w:t>
+      </w:r>
+      <w:proofErr w:type="gramStart"/>
+      <w:r>
+        <w:rPr>
+          <w:color w:val="000000" w:themeColor="text1"/>
+          <w:sz w:val="22"/>
+          <w:szCs w:val="22"/>
+        </w:rPr>
+        <w:t>ResponseStatus(</w:t>
+      </w:r>
+      <w:proofErr w:type="gramEnd"/>
+      <w:r>
+        <w:rPr>
+          <w:color w:val="000000" w:themeColor="text1"/>
+          <w:sz w:val="22"/>
+          <w:szCs w:val="22"/>
+        </w:rPr>
+        <w:t>HttpStatus.CREATED)</w:t>
+      </w:r>
+      <w:r>
+        <w:rPr>
+          <w:color w:val="000000" w:themeColor="text1"/>
+          <w:sz w:val="22"/>
+          <w:szCs w:val="22"/>
+        </w:rPr>
+        <w:br/>
+        <w:t xml:space="preserve">public User </w:t>
+      </w:r>
+      <w:proofErr w:type="spellStart"/>
+      <w:proofErr w:type="gramStart"/>
+      <w:r>
+        <w:rPr>
+          <w:color w:val="000000" w:themeColor="text1"/>
+          <w:sz w:val="22"/>
+          <w:szCs w:val="22"/>
+        </w:rPr>
+        <w:t>createUser</w:t>
+      </w:r>
+      <w:proofErr w:type="spellEnd"/>
+      <w:r>
+        <w:rPr>
+          <w:color w:val="000000" w:themeColor="text1"/>
+          <w:sz w:val="22"/>
+          <w:szCs w:val="22"/>
+        </w:rPr>
+        <w:t>(</w:t>
+      </w:r>
+      <w:proofErr w:type="gramEnd"/>
+      <w:r>
+        <w:rPr>
+          <w:color w:val="000000" w:themeColor="text1"/>
+          <w:sz w:val="22"/>
+          <w:szCs w:val="22"/>
+        </w:rPr>
+        <w:t>@RequestBody User user) {</w:t>
+      </w:r>
+      <w:r>
+        <w:rPr>
+          <w:color w:val="000000" w:themeColor="text1"/>
+          <w:sz w:val="22"/>
+          <w:szCs w:val="22"/>
+        </w:rPr>
+        <w:br/>
+        <w:t>return user;</w:t>
+      </w:r>
+      <w:r>
+        <w:rPr>
+          <w:color w:val="000000" w:themeColor="text1"/>
+          <w:sz w:val="22"/>
+          <w:szCs w:val="22"/>
+        </w:rPr>
+        <w:br/>
+        <w:t>}</w:t>
+      </w:r>
+    </w:p>
+    <w:p>
+      <w:pPr>
+        <w:rPr>
+          <w:color w:val="EE0000"/>
+          <w:sz w:val="22"/>
+          <w:szCs w:val="22"/>
+        </w:rPr>
+      </w:pPr>
+    </w:p>
+    <w:p>
+      <w:pPr>
+        <w:rPr>
+          <w:color w:val="000000" w:themeColor="text1"/>
+          <w:sz w:val="22"/>
+          <w:szCs w:val="22"/>
+        </w:rPr>
+      </w:pPr>
+    </w:p>
+    <w:p>
+      <w:pPr>
+        <w:rPr>
+          <w:color w:val="000000" w:themeColor="text1"/>
+          <w:sz w:val="22"/>
+          <w:szCs w:val="22"/>
+        </w:rPr>
+      </w:pPr>
+      <w:r>
+        <w:rPr>
+          <w:color w:val="000000" w:themeColor="text1"/>
+          <w:sz w:val="22"/>
+          <w:szCs w:val="22"/>
+        </w:rPr>
+        <w:t>as next to a parameter</w:t>
+      </w:r>
+    </w:p>
+    <w:p>
+      <w:pPr>
+        <w:rPr>
+          <w:color w:val="000000" w:themeColor="text1"/>
+          <w:sz w:val="22"/>
+          <w:szCs w:val="22"/>
+        </w:rPr>
+      </w:pPr>
+      <w:r>
+        <w:rPr>
+          <w:color w:val="000000" w:themeColor="text1"/>
+          <w:sz w:val="22"/>
+          <w:szCs w:val="22"/>
+        </w:rPr>
+        <w:t>@JsonProperty</w:t>
       </w:r>
     </w:p>
     <w:sectPr>

</xml_diff>

<commit_message>
add Json and body request annotations
</commit_message>
<xml_diff>
--- a/Notes.docx
+++ b/Notes.docx
@@ -3426,7 +3426,18 @@
           <w:szCs w:val="32"/>
           <w:u w:val="single"/>
         </w:rPr>
-        <w:t>@RequestBody</w:t>
+        <w:t>@Re</w:t>
+      </w:r>
+      <w:r>
+        <w:rPr>
+          <w:b/>
+          <w:bCs/>
+          <w:color w:val="EE0000"/>
+          <w:sz w:val="32"/>
+          <w:szCs w:val="32"/>
+          <w:u w:val="single"/>
+        </w:rPr>
+        <w:t>sponseStatus</w:t>
       </w:r>
     </w:p>
     <w:p>
@@ -3599,37 +3610,420 @@
     </w:p>
     <w:p>
       <w:pPr>
-        <w:rPr>
-          <w:color w:val="000000" w:themeColor="text1"/>
-          <w:sz w:val="22"/>
-          <w:szCs w:val="22"/>
-        </w:rPr>
-      </w:pPr>
-      <w:r>
-        <w:rPr>
-          <w:color w:val="000000" w:themeColor="text1"/>
-          <w:sz w:val="22"/>
-          <w:szCs w:val="22"/>
-        </w:rPr>
-        <w:t>as next to a parameter</w:t>
-      </w:r>
-    </w:p>
-    <w:p>
-      <w:pPr>
-        <w:rPr>
-          <w:color w:val="000000" w:themeColor="text1"/>
-          <w:sz w:val="22"/>
-          <w:szCs w:val="22"/>
-        </w:rPr>
-      </w:pPr>
-      <w:r>
-        <w:rPr>
-          <w:color w:val="000000" w:themeColor="text1"/>
-          <w:sz w:val="22"/>
-          <w:szCs w:val="22"/>
-        </w:rPr>
-        <w:t>@JsonProperty</w:t>
-      </w:r>
+        <w:jc w:val="center"/>
+        <w:rPr>
+          <w:b/>
+          <w:bCs/>
+          <w:color w:val="EE0000"/>
+          <w:sz w:val="32"/>
+          <w:szCs w:val="32"/>
+          <w:u w:val="single"/>
+        </w:rPr>
+      </w:pPr>
+      <w:r>
+        <w:rPr>
+          <w:b/>
+          <w:bCs/>
+          <w:color w:val="EE0000"/>
+          <w:sz w:val="32"/>
+          <w:szCs w:val="32"/>
+          <w:u w:val="single"/>
+        </w:rPr>
+        <w:t>@RequestBody</w:t>
+      </w:r>
+    </w:p>
+    <w:p>
+      <w:pPr>
+        <w:rPr>
+          <w:color w:val="000000" w:themeColor="text1"/>
+          <w:sz w:val="22"/>
+          <w:szCs w:val="22"/>
+        </w:rPr>
+      </w:pPr>
+      <w:r>
+        <w:rPr>
+          <w:color w:val="000000" w:themeColor="text1"/>
+          <w:sz w:val="22"/>
+          <w:szCs w:val="22"/>
+        </w:rPr>
+        <w:t>Take the HTTP request body (usually JSON) and convert it into a Java object.</w:t>
+      </w:r>
+      <w:r>
+        <w:rPr>
+          <w:color w:val="000000" w:themeColor="text1"/>
+          <w:sz w:val="22"/>
+          <w:szCs w:val="22"/>
+        </w:rPr>
+        <w:t xml:space="preserve"> </w:t>
+      </w:r>
+      <w:r>
+        <w:rPr>
+          <w:color w:val="000000" w:themeColor="text1"/>
+          <w:sz w:val="22"/>
+          <w:szCs w:val="22"/>
+        </w:rPr>
+        <w:t>@RequestBody is an annotation used in Spring MVC / Spring Boot to indicate:</w:t>
+      </w:r>
+    </w:p>
+    <w:p>
+      <w:pPr>
+        <w:rPr>
+          <w:color w:val="000000" w:themeColor="text1"/>
+          <w:sz w:val="22"/>
+          <w:szCs w:val="22"/>
+        </w:rPr>
+      </w:pPr>
+      <w:r>
+        <w:rPr>
+          <w:color w:val="000000" w:themeColor="text1"/>
+          <w:sz w:val="22"/>
+          <w:szCs w:val="22"/>
+        </w:rPr>
+        <w:t>Take the raw HTTP request body, deserialize it (usually from JSON), and bind it to a Java object so it can be used in backend logic</w:t>
+      </w:r>
+    </w:p>
+    <w:p>
+      <w:pPr>
+        <w:rPr>
+          <w:color w:val="000000" w:themeColor="text1"/>
+          <w:sz w:val="22"/>
+          <w:szCs w:val="22"/>
+        </w:rPr>
+      </w:pPr>
+      <w:r>
+        <w:rPr>
+          <w:color w:val="000000" w:themeColor="text1"/>
+          <w:sz w:val="22"/>
+          <w:szCs w:val="22"/>
+        </w:rPr>
+        <w:t>Example</w:t>
+      </w:r>
+    </w:p>
+    <w:p>
+      <w:pPr>
+        <w:rPr>
+          <w:color w:val="4472C4" w:themeColor="accent1"/>
+          <w:sz w:val="22"/>
+          <w:szCs w:val="22"/>
+        </w:rPr>
+      </w:pPr>
+      <w:r>
+        <w:rPr>
+          <w:color w:val="4472C4" w:themeColor="accent1"/>
+          <w:sz w:val="22"/>
+          <w:szCs w:val="22"/>
+        </w:rPr>
+        <w:t>@PostMapping("/user/post")</w:t>
+      </w:r>
+      <w:r>
+        <w:rPr>
+          <w:color w:val="4472C4" w:themeColor="accent1"/>
+          <w:sz w:val="22"/>
+          <w:szCs w:val="22"/>
+        </w:rPr>
+        <w:br/>
+        <w:t>@</w:t>
+      </w:r>
+      <w:proofErr w:type="gramStart"/>
+      <w:r>
+        <w:rPr>
+          <w:color w:val="4472C4" w:themeColor="accent1"/>
+          <w:sz w:val="22"/>
+          <w:szCs w:val="22"/>
+        </w:rPr>
+        <w:t>ResponseStatus(</w:t>
+      </w:r>
+      <w:proofErr w:type="gramEnd"/>
+      <w:r>
+        <w:rPr>
+          <w:color w:val="4472C4" w:themeColor="accent1"/>
+          <w:sz w:val="22"/>
+          <w:szCs w:val="22"/>
+        </w:rPr>
+        <w:t>HttpStatus.</w:t>
+      </w:r>
+      <w:r>
+        <w:rPr>
+          <w:i/>
+          <w:iCs/>
+          <w:color w:val="4472C4" w:themeColor="accent1"/>
+          <w:sz w:val="22"/>
+          <w:szCs w:val="22"/>
+        </w:rPr>
+        <w:t>CREATED</w:t>
+      </w:r>
+      <w:r>
+        <w:rPr>
+          <w:color w:val="4472C4" w:themeColor="accent1"/>
+          <w:sz w:val="22"/>
+          <w:szCs w:val="22"/>
+        </w:rPr>
+        <w:t>)</w:t>
+      </w:r>
+      <w:r>
+        <w:rPr>
+          <w:color w:val="4472C4" w:themeColor="accent1"/>
+          <w:sz w:val="22"/>
+          <w:szCs w:val="22"/>
+        </w:rPr>
+        <w:br/>
+        <w:t>@Autowired</w:t>
+      </w:r>
+      <w:r>
+        <w:rPr>
+          <w:color w:val="4472C4" w:themeColor="accent1"/>
+          <w:sz w:val="22"/>
+          <w:szCs w:val="22"/>
+        </w:rPr>
+        <w:t xml:space="preserve"> </w:t>
+      </w:r>
+      <w:r>
+        <w:rPr>
+          <w:color w:val="4472C4" w:themeColor="accent1"/>
+          <w:sz w:val="22"/>
+          <w:szCs w:val="22"/>
+        </w:rPr>
+        <w:sym w:font="Wingdings" w:char="F0E0"/>
+      </w:r>
+      <w:r>
+        <w:rPr>
+          <w:color w:val="4472C4" w:themeColor="accent1"/>
+          <w:sz w:val="22"/>
+          <w:szCs w:val="22"/>
+        </w:rPr>
+        <w:t xml:space="preserve"> incorrect there is no dependency injection to be done</w:t>
+      </w:r>
+      <w:r>
+        <w:rPr>
+          <w:color w:val="4472C4" w:themeColor="accent1"/>
+          <w:sz w:val="22"/>
+          <w:szCs w:val="22"/>
+        </w:rPr>
+        <w:br/>
+        <w:t xml:space="preserve">public String </w:t>
+      </w:r>
+      <w:proofErr w:type="spellStart"/>
+      <w:proofErr w:type="gramStart"/>
+      <w:r>
+        <w:rPr>
+          <w:color w:val="4472C4" w:themeColor="accent1"/>
+          <w:sz w:val="22"/>
+          <w:szCs w:val="22"/>
+        </w:rPr>
+        <w:t>printUser</w:t>
+      </w:r>
+      <w:proofErr w:type="spellEnd"/>
+      <w:r>
+        <w:rPr>
+          <w:color w:val="4472C4" w:themeColor="accent1"/>
+          <w:sz w:val="22"/>
+          <w:szCs w:val="22"/>
+        </w:rPr>
+        <w:t>( @</w:t>
+      </w:r>
+      <w:proofErr w:type="gramEnd"/>
+      <w:r>
+        <w:rPr>
+          <w:color w:val="4472C4" w:themeColor="accent1"/>
+          <w:sz w:val="22"/>
+          <w:szCs w:val="22"/>
+        </w:rPr>
+        <w:t xml:space="preserve">RequestBody Order </w:t>
+      </w:r>
+      <w:proofErr w:type="gramStart"/>
+      <w:r>
+        <w:rPr>
+          <w:color w:val="4472C4" w:themeColor="accent1"/>
+          <w:sz w:val="22"/>
+          <w:szCs w:val="22"/>
+        </w:rPr>
+        <w:t>order){</w:t>
+      </w:r>
+      <w:proofErr w:type="gramEnd"/>
+      <w:r>
+        <w:rPr>
+          <w:color w:val="4472C4" w:themeColor="accent1"/>
+          <w:sz w:val="22"/>
+          <w:szCs w:val="22"/>
+        </w:rPr>
+        <w:br/>
+        <w:t xml:space="preserve">    return "welcome the order details are " + </w:t>
+      </w:r>
+      <w:proofErr w:type="spellStart"/>
+      <w:proofErr w:type="gramStart"/>
+      <w:r>
+        <w:rPr>
+          <w:color w:val="4472C4" w:themeColor="accent1"/>
+          <w:sz w:val="22"/>
+          <w:szCs w:val="22"/>
+        </w:rPr>
+        <w:t>order.toString</w:t>
+      </w:r>
+      <w:proofErr w:type="spellEnd"/>
+      <w:proofErr w:type="gramEnd"/>
+      <w:r>
+        <w:rPr>
+          <w:color w:val="4472C4" w:themeColor="accent1"/>
+          <w:sz w:val="22"/>
+          <w:szCs w:val="22"/>
+        </w:rPr>
+        <w:t>();</w:t>
+      </w:r>
+      <w:r>
+        <w:rPr>
+          <w:color w:val="4472C4" w:themeColor="accent1"/>
+          <w:sz w:val="22"/>
+          <w:szCs w:val="22"/>
+        </w:rPr>
+        <w:br/>
+        <w:t>}</w:t>
+      </w:r>
+    </w:p>
+    <w:p>
+      <w:pPr>
+        <w:rPr>
+          <w:color w:val="000000" w:themeColor="text1"/>
+          <w:sz w:val="22"/>
+          <w:szCs w:val="22"/>
+        </w:rPr>
+      </w:pPr>
+      <w:r>
+        <w:rPr>
+          <w:color w:val="000000" w:themeColor="text1"/>
+          <w:sz w:val="22"/>
+          <w:szCs w:val="22"/>
+        </w:rPr>
+        <w:t xml:space="preserve">To explain the dynamics, here we have a post (create new user or data), and we just take the data from the user and printing it no logic is happening in the backend, the @RequestBody is the </w:t>
+      </w:r>
+      <w:r>
+        <w:rPr>
+          <w:color w:val="000000" w:themeColor="text1"/>
+          <w:sz w:val="22"/>
+          <w:szCs w:val="22"/>
+        </w:rPr>
+        <w:lastRenderedPageBreak/>
+        <w:t>focus. The request body tells the Spring boot that we will be passing data in the http request body and this data should be changed from JSON into JAVA object called order</w:t>
+      </w:r>
+    </w:p>
+    <w:p>
+      <w:pPr>
+        <w:rPr>
+          <w:color w:val="000000" w:themeColor="text1"/>
+          <w:sz w:val="22"/>
+          <w:szCs w:val="22"/>
+        </w:rPr>
+      </w:pPr>
+      <w:r>
+        <w:rPr>
+          <w:color w:val="000000" w:themeColor="text1"/>
+          <w:sz w:val="22"/>
+          <w:szCs w:val="22"/>
+        </w:rPr>
+        <w:t xml:space="preserve">After collecting this </w:t>
+      </w:r>
+      <w:proofErr w:type="gramStart"/>
+      <w:r>
+        <w:rPr>
+          <w:color w:val="000000" w:themeColor="text1"/>
+          <w:sz w:val="22"/>
+          <w:szCs w:val="22"/>
+        </w:rPr>
+        <w:t>data</w:t>
+      </w:r>
+      <w:proofErr w:type="gramEnd"/>
+      <w:r>
+        <w:rPr>
+          <w:color w:val="000000" w:themeColor="text1"/>
+          <w:sz w:val="22"/>
+          <w:szCs w:val="22"/>
+        </w:rPr>
+        <w:t xml:space="preserve"> we should then inside the order class map our </w:t>
+      </w:r>
+      <w:proofErr w:type="spellStart"/>
+      <w:r>
+        <w:rPr>
+          <w:color w:val="000000" w:themeColor="text1"/>
+          <w:sz w:val="22"/>
+          <w:szCs w:val="22"/>
+        </w:rPr>
+        <w:t>json</w:t>
+      </w:r>
+      <w:proofErr w:type="spellEnd"/>
+      <w:r>
+        <w:rPr>
+          <w:color w:val="000000" w:themeColor="text1"/>
+          <w:sz w:val="22"/>
+          <w:szCs w:val="22"/>
+        </w:rPr>
+        <w:t xml:space="preserve"> into java variables.</w:t>
+      </w:r>
+    </w:p>
+    <w:p>
+      <w:pPr>
+        <w:rPr>
+          <w:color w:val="000000" w:themeColor="text1"/>
+          <w:sz w:val="22"/>
+          <w:szCs w:val="22"/>
+        </w:rPr>
+      </w:pPr>
+      <w:r>
+        <w:rPr>
+          <w:color w:val="000000" w:themeColor="text1"/>
+          <w:sz w:val="22"/>
+          <w:szCs w:val="22"/>
+        </w:rPr>
+        <w:t>Without @RequestBody spring boot will try to deserialize the data automatically</w:t>
+      </w:r>
+    </w:p>
+    <w:p>
+      <w:pPr>
+        <w:rPr>
+          <w:color w:val="000000" w:themeColor="text1"/>
+          <w:sz w:val="22"/>
+          <w:szCs w:val="22"/>
+        </w:rPr>
+      </w:pPr>
+      <w:r>
+        <w:rPr>
+          <w:color w:val="000000" w:themeColor="text1"/>
+          <w:sz w:val="22"/>
+          <w:szCs w:val="22"/>
+        </w:rPr>
+        <w:t>To map the data into java variables we should use @J</w:t>
+      </w:r>
+      <w:r>
+        <w:rPr>
+          <w:color w:val="000000" w:themeColor="text1"/>
+          <w:sz w:val="22"/>
+          <w:szCs w:val="22"/>
+        </w:rPr>
+        <w:t>son</w:t>
+      </w:r>
+      <w:r>
+        <w:rPr>
+          <w:color w:val="000000" w:themeColor="text1"/>
+          <w:sz w:val="22"/>
+          <w:szCs w:val="22"/>
+        </w:rPr>
+        <w:t>Property</w:t>
+      </w:r>
+      <w:r>
+        <w:rPr>
+          <w:color w:val="000000" w:themeColor="text1"/>
+          <w:sz w:val="22"/>
+          <w:szCs w:val="22"/>
+        </w:rPr>
+        <w:t xml:space="preserve"> if the variable names are different from the JSON names of the corresponding variable</w:t>
+      </w:r>
+    </w:p>
+    <w:p>
+      <w:pPr>
+        <w:rPr>
+          <w:color w:val="000000" w:themeColor="text1"/>
+          <w:sz w:val="22"/>
+          <w:szCs w:val="22"/>
+        </w:rPr>
+      </w:pPr>
     </w:p>
     <w:sectPr>
       <w:pgSz w:w="12240" w:h="15840"/>
@@ -4350,6 +4744,7 @@
   <w:style w:type="paragraph" w:default="1" w:styleId="Normal">
     <w:name w:val="Normal"/>
     <w:qFormat/>
+    <w:rsid w:val="003E03D1"/>
   </w:style>
   <w:style w:type="paragraph" w:styleId="Heading1">
     <w:name w:val="heading 1"/>

</xml_diff>

<commit_message>
add notes from yesterday
</commit_message>
<xml_diff>
--- a/Notes.docx
+++ b/Notes.docx
@@ -4024,6 +4024,1071 @@
           <w:szCs w:val="22"/>
         </w:rPr>
       </w:pPr>
+    </w:p>
+    <w:p>
+      <w:pPr>
+        <w:rPr>
+          <w:color w:val="000000" w:themeColor="text1"/>
+          <w:sz w:val="22"/>
+          <w:szCs w:val="22"/>
+        </w:rPr>
+      </w:pPr>
+    </w:p>
+    <w:p>
+      <w:pPr>
+        <w:jc w:val="center"/>
+        <w:rPr>
+          <w:b/>
+          <w:bCs/>
+          <w:color w:val="EE0000"/>
+          <w:sz w:val="32"/>
+          <w:szCs w:val="32"/>
+          <w:u w:val="single"/>
+        </w:rPr>
+      </w:pPr>
+      <w:r>
+        <w:rPr>
+          <w:b/>
+          <w:bCs/>
+          <w:color w:val="EE0000"/>
+          <w:sz w:val="32"/>
+          <w:szCs w:val="32"/>
+          <w:u w:val="single"/>
+        </w:rPr>
+        <w:t>Record class</w:t>
+      </w:r>
+    </w:p>
+    <w:p>
+      <w:pPr>
+        <w:rPr>
+          <w:color w:val="000000" w:themeColor="text1"/>
+          <w:sz w:val="22"/>
+          <w:szCs w:val="22"/>
+        </w:rPr>
+      </w:pPr>
+      <w:r>
+        <w:rPr>
+          <w:color w:val="000000" w:themeColor="text1"/>
+          <w:sz w:val="22"/>
+          <w:szCs w:val="22"/>
+        </w:rPr>
+        <w:t>Records are final by default and all their fields are also final</w:t>
+      </w:r>
+    </w:p>
+    <w:p>
+      <w:pPr>
+        <w:rPr>
+          <w:color w:val="000000" w:themeColor="text1"/>
+          <w:sz w:val="22"/>
+          <w:szCs w:val="22"/>
+        </w:rPr>
+      </w:pPr>
+      <w:r>
+        <w:rPr>
+          <w:color w:val="000000" w:themeColor="text1"/>
+          <w:sz w:val="22"/>
+          <w:szCs w:val="22"/>
+        </w:rPr>
+        <w:t>A concise way to declare a class whose main purpose is to hold data, with built-in immutability and automatically generated methods.</w:t>
+      </w:r>
+      <w:r>
+        <w:rPr>
+          <w:color w:val="000000" w:themeColor="text1"/>
+          <w:sz w:val="22"/>
+          <w:szCs w:val="22"/>
+        </w:rPr>
+        <w:t xml:space="preserve"> </w:t>
+      </w:r>
+    </w:p>
+    <w:p>
+      <w:pPr>
+        <w:rPr>
+          <w:color w:val="000000" w:themeColor="text1"/>
+          <w:sz w:val="22"/>
+          <w:szCs w:val="22"/>
+        </w:rPr>
+      </w:pPr>
+      <w:r>
+        <w:rPr>
+          <w:color w:val="000000" w:themeColor="text1"/>
+          <w:sz w:val="22"/>
+          <w:szCs w:val="22"/>
+        </w:rPr>
+        <w:t xml:space="preserve">Example from the online course: when we were mapping the JSON data from the request body into the </w:t>
+      </w:r>
+      <w:proofErr w:type="gramStart"/>
+      <w:r>
+        <w:rPr>
+          <w:color w:val="000000" w:themeColor="text1"/>
+          <w:sz w:val="22"/>
+          <w:szCs w:val="22"/>
+        </w:rPr>
+        <w:t>class</w:t>
+      </w:r>
+      <w:proofErr w:type="gramEnd"/>
+      <w:r>
+        <w:rPr>
+          <w:color w:val="000000" w:themeColor="text1"/>
+          <w:sz w:val="22"/>
+          <w:szCs w:val="22"/>
+        </w:rPr>
+        <w:t xml:space="preserve"> we were using a class called order, inside this class we mapped the </w:t>
+      </w:r>
+      <w:proofErr w:type="spellStart"/>
+      <w:r>
+        <w:rPr>
+          <w:color w:val="000000" w:themeColor="text1"/>
+          <w:sz w:val="22"/>
+          <w:szCs w:val="22"/>
+        </w:rPr>
+        <w:t>json</w:t>
+      </w:r>
+      <w:proofErr w:type="spellEnd"/>
+      <w:r>
+        <w:rPr>
+          <w:color w:val="000000" w:themeColor="text1"/>
+          <w:sz w:val="22"/>
+          <w:szCs w:val="22"/>
+        </w:rPr>
+        <w:t xml:space="preserve"> variables on the variables of the class, then declared setters and getters. </w:t>
+      </w:r>
+    </w:p>
+    <w:p>
+      <w:pPr>
+        <w:rPr>
+          <w:color w:val="000000" w:themeColor="text1"/>
+          <w:sz w:val="22"/>
+          <w:szCs w:val="22"/>
+        </w:rPr>
+      </w:pPr>
+      <w:r>
+        <w:rPr>
+          <w:color w:val="000000" w:themeColor="text1"/>
+          <w:sz w:val="22"/>
+          <w:szCs w:val="22"/>
+        </w:rPr>
+        <w:t xml:space="preserve">A record class declared as public record </w:t>
+      </w:r>
+      <w:proofErr w:type="gramStart"/>
+      <w:r>
+        <w:rPr>
+          <w:color w:val="000000" w:themeColor="text1"/>
+          <w:sz w:val="22"/>
+          <w:szCs w:val="22"/>
+        </w:rPr>
+        <w:t>order(</w:t>
+      </w:r>
+      <w:proofErr w:type="gramEnd"/>
+      <w:r>
+        <w:rPr>
+          <w:color w:val="000000" w:themeColor="text1"/>
+          <w:sz w:val="22"/>
+          <w:szCs w:val="22"/>
+        </w:rPr>
+        <w:t>variable1, variable2, variable</w:t>
+      </w:r>
+      <w:proofErr w:type="gramStart"/>
+      <w:r>
+        <w:rPr>
+          <w:color w:val="000000" w:themeColor="text1"/>
+          <w:sz w:val="22"/>
+          <w:szCs w:val="22"/>
+        </w:rPr>
+        <w:t>3){</w:t>
+      </w:r>
+      <w:proofErr w:type="gramEnd"/>
+      <w:r>
+        <w:rPr>
+          <w:color w:val="000000" w:themeColor="text1"/>
+          <w:sz w:val="22"/>
+          <w:szCs w:val="22"/>
+        </w:rPr>
+        <w:t>}</w:t>
+      </w:r>
+    </w:p>
+    <w:p>
+      <w:pPr>
+        <w:rPr>
+          <w:color w:val="000000" w:themeColor="text1"/>
+          <w:sz w:val="22"/>
+          <w:szCs w:val="22"/>
+        </w:rPr>
+      </w:pPr>
+      <w:r>
+        <w:rPr>
+          <w:color w:val="000000" w:themeColor="text1"/>
+          <w:sz w:val="22"/>
+          <w:szCs w:val="22"/>
+        </w:rPr>
+        <w:t xml:space="preserve">The record creates setters and getters and </w:t>
+      </w:r>
+      <w:proofErr w:type="spellStart"/>
+      <w:proofErr w:type="gramStart"/>
+      <w:r>
+        <w:rPr>
+          <w:color w:val="000000" w:themeColor="text1"/>
+          <w:sz w:val="22"/>
+          <w:szCs w:val="22"/>
+        </w:rPr>
+        <w:t>toString</w:t>
+      </w:r>
+      <w:proofErr w:type="spellEnd"/>
+      <w:r>
+        <w:rPr>
+          <w:color w:val="000000" w:themeColor="text1"/>
+          <w:sz w:val="22"/>
+          <w:szCs w:val="22"/>
+        </w:rPr>
+        <w:t>(</w:t>
+      </w:r>
+      <w:proofErr w:type="gramEnd"/>
+      <w:r>
+        <w:rPr>
+          <w:color w:val="000000" w:themeColor="text1"/>
+          <w:sz w:val="22"/>
+          <w:szCs w:val="22"/>
+        </w:rPr>
+        <w:t xml:space="preserve">) automatically and maps the </w:t>
+      </w:r>
+      <w:proofErr w:type="spellStart"/>
+      <w:r>
+        <w:rPr>
+          <w:color w:val="000000" w:themeColor="text1"/>
+          <w:sz w:val="22"/>
+          <w:szCs w:val="22"/>
+        </w:rPr>
+        <w:t>json</w:t>
+      </w:r>
+      <w:proofErr w:type="spellEnd"/>
+      <w:r>
+        <w:rPr>
+          <w:color w:val="000000" w:themeColor="text1"/>
+          <w:sz w:val="22"/>
+          <w:szCs w:val="22"/>
+        </w:rPr>
+        <w:t xml:space="preserve"> data on our record.</w:t>
+      </w:r>
+    </w:p>
+    <w:p>
+      <w:pPr>
+        <w:rPr>
+          <w:color w:val="000000" w:themeColor="text1"/>
+          <w:sz w:val="22"/>
+          <w:szCs w:val="22"/>
+        </w:rPr>
+      </w:pPr>
+      <w:r>
+        <w:rPr>
+          <w:color w:val="000000" w:themeColor="text1"/>
+          <w:sz w:val="22"/>
+          <w:szCs w:val="22"/>
+        </w:rPr>
+        <w:t>A record can implement an interface but cannot extend a class.</w:t>
+      </w:r>
+    </w:p>
+    <w:p>
+      <w:pPr>
+        <w:rPr>
+          <w:color w:val="4472C4" w:themeColor="accent1"/>
+          <w:sz w:val="22"/>
+          <w:szCs w:val="22"/>
+        </w:rPr>
+      </w:pPr>
+      <w:r>
+        <w:rPr>
+          <w:color w:val="4472C4" w:themeColor="accent1"/>
+          <w:sz w:val="22"/>
+          <w:szCs w:val="22"/>
+        </w:rPr>
+        <w:t>P</w:t>
+      </w:r>
+      <w:r>
+        <w:rPr>
+          <w:color w:val="4472C4" w:themeColor="accent1"/>
+          <w:sz w:val="22"/>
+          <w:szCs w:val="22"/>
+        </w:rPr>
+        <w:t xml:space="preserve">ublic record </w:t>
+      </w:r>
+      <w:proofErr w:type="spellStart"/>
+      <w:r>
+        <w:rPr>
+          <w:color w:val="4472C4" w:themeColor="accent1"/>
+          <w:sz w:val="22"/>
+          <w:szCs w:val="22"/>
+        </w:rPr>
+        <w:t>OrderRequest</w:t>
+      </w:r>
+      <w:proofErr w:type="spellEnd"/>
+      <w:r>
+        <w:rPr>
+          <w:color w:val="4472C4" w:themeColor="accent1"/>
+          <w:sz w:val="22"/>
+          <w:szCs w:val="22"/>
+        </w:rPr>
+        <w:t>(</w:t>
+      </w:r>
+      <w:r>
+        <w:rPr>
+          <w:color w:val="4472C4" w:themeColor="accent1"/>
+          <w:sz w:val="22"/>
+          <w:szCs w:val="22"/>
+        </w:rPr>
+        <w:br/>
+        <w:t>@JsonProperty(</w:t>
+      </w:r>
+      <w:r>
+        <w:rPr>
+          <w:color w:val="4472C4" w:themeColor="accent1"/>
+          <w:sz w:val="22"/>
+          <w:szCs w:val="22"/>
+        </w:rPr>
+        <w:t>“</w:t>
+      </w:r>
+      <w:r>
+        <w:rPr>
+          <w:color w:val="4472C4" w:themeColor="accent1"/>
+          <w:sz w:val="22"/>
+          <w:szCs w:val="22"/>
+        </w:rPr>
+        <w:t>customer_name</w:t>
+      </w:r>
+      <w:r>
+        <w:rPr>
+          <w:color w:val="4472C4" w:themeColor="accent1"/>
+          <w:sz w:val="22"/>
+          <w:szCs w:val="22"/>
+        </w:rPr>
+        <w:t>”</w:t>
+      </w:r>
+      <w:r>
+        <w:rPr>
+          <w:color w:val="4472C4" w:themeColor="accent1"/>
+          <w:sz w:val="22"/>
+          <w:szCs w:val="22"/>
+        </w:rPr>
+        <w:t xml:space="preserve">) String </w:t>
+      </w:r>
+      <w:proofErr w:type="spellStart"/>
+      <w:r>
+        <w:rPr>
+          <w:color w:val="4472C4" w:themeColor="accent1"/>
+          <w:sz w:val="22"/>
+          <w:szCs w:val="22"/>
+        </w:rPr>
+        <w:t>customerName</w:t>
+      </w:r>
+      <w:proofErr w:type="spellEnd"/>
+      <w:r>
+        <w:rPr>
+          <w:color w:val="4472C4" w:themeColor="accent1"/>
+          <w:sz w:val="22"/>
+          <w:szCs w:val="22"/>
+        </w:rPr>
+        <w:t>,</w:t>
+      </w:r>
+      <w:r>
+        <w:rPr>
+          <w:color w:val="4472C4" w:themeColor="accent1"/>
+          <w:sz w:val="22"/>
+          <w:szCs w:val="22"/>
+        </w:rPr>
+        <w:br/>
+        <w:t>@JsonProperty(</w:t>
+      </w:r>
+      <w:r>
+        <w:rPr>
+          <w:color w:val="4472C4" w:themeColor="accent1"/>
+          <w:sz w:val="22"/>
+          <w:szCs w:val="22"/>
+        </w:rPr>
+        <w:t>“</w:t>
+      </w:r>
+      <w:r>
+        <w:rPr>
+          <w:color w:val="4472C4" w:themeColor="accent1"/>
+          <w:sz w:val="22"/>
+          <w:szCs w:val="22"/>
+        </w:rPr>
+        <w:t>product_name</w:t>
+      </w:r>
+      <w:r>
+        <w:rPr>
+          <w:color w:val="4472C4" w:themeColor="accent1"/>
+          <w:sz w:val="22"/>
+          <w:szCs w:val="22"/>
+        </w:rPr>
+        <w:t>”</w:t>
+      </w:r>
+      <w:r>
+        <w:rPr>
+          <w:color w:val="4472C4" w:themeColor="accent1"/>
+          <w:sz w:val="22"/>
+          <w:szCs w:val="22"/>
+        </w:rPr>
+        <w:t xml:space="preserve">) String </w:t>
+      </w:r>
+      <w:proofErr w:type="spellStart"/>
+      <w:r>
+        <w:rPr>
+          <w:color w:val="4472C4" w:themeColor="accent1"/>
+          <w:sz w:val="22"/>
+          <w:szCs w:val="22"/>
+        </w:rPr>
+        <w:t>productName</w:t>
+      </w:r>
+      <w:proofErr w:type="spellEnd"/>
+      <w:r>
+        <w:rPr>
+          <w:color w:val="4472C4" w:themeColor="accent1"/>
+          <w:sz w:val="22"/>
+          <w:szCs w:val="22"/>
+        </w:rPr>
+        <w:t>,</w:t>
+      </w:r>
+      <w:r>
+        <w:rPr>
+          <w:color w:val="4472C4" w:themeColor="accent1"/>
+          <w:sz w:val="22"/>
+          <w:szCs w:val="22"/>
+        </w:rPr>
+        <w:br/>
+        <w:t>int quantity</w:t>
+      </w:r>
+      <w:r>
+        <w:rPr>
+          <w:color w:val="4472C4" w:themeColor="accent1"/>
+          <w:sz w:val="22"/>
+          <w:szCs w:val="22"/>
+        </w:rPr>
+        <w:br/>
+        <w:t>) {}</w:t>
+      </w:r>
+    </w:p>
+    <w:p>
+      <w:pPr>
+        <w:rPr>
+          <w:color w:val="000000" w:themeColor="text1"/>
+          <w:sz w:val="22"/>
+          <w:szCs w:val="22"/>
+        </w:rPr>
+      </w:pPr>
+    </w:p>
+    <w:p>
+      <w:pPr>
+        <w:jc w:val="center"/>
+        <w:rPr>
+          <w:b/>
+          <w:bCs/>
+          <w:color w:val="EE0000"/>
+          <w:sz w:val="32"/>
+          <w:szCs w:val="32"/>
+          <w:u w:val="single"/>
+        </w:rPr>
+      </w:pPr>
+      <w:r>
+        <w:rPr>
+          <w:b/>
+          <w:bCs/>
+          <w:color w:val="EE0000"/>
+          <w:sz w:val="32"/>
+          <w:szCs w:val="32"/>
+          <w:u w:val="single"/>
+        </w:rPr>
+        <w:t>@pathvariable</w:t>
+      </w:r>
+    </w:p>
+    <w:p>
+      <w:pPr>
+        <w:rPr>
+          <w:color w:val="000000" w:themeColor="text1"/>
+          <w:sz w:val="22"/>
+          <w:szCs w:val="22"/>
+        </w:rPr>
+      </w:pPr>
+      <w:r>
+        <w:rPr>
+          <w:color w:val="4472C4" w:themeColor="accent1"/>
+          <w:sz w:val="22"/>
+          <w:szCs w:val="22"/>
+        </w:rPr>
+        <w:t>@PathVariable</w:t>
+      </w:r>
+      <w:r>
+        <w:rPr>
+          <w:color w:val="000000" w:themeColor="text1"/>
+          <w:sz w:val="22"/>
+          <w:szCs w:val="22"/>
+        </w:rPr>
+        <w:t xml:space="preserve"> is used to capture dynamic values from the URL path and pass them into a controller method.</w:t>
+      </w:r>
+    </w:p>
+    <w:p>
+      <w:pPr>
+        <w:rPr>
+          <w:color w:val="4472C4" w:themeColor="accent1"/>
+          <w:sz w:val="22"/>
+          <w:szCs w:val="22"/>
+        </w:rPr>
+      </w:pPr>
+      <w:r>
+        <w:rPr>
+          <w:color w:val="4472C4" w:themeColor="accent1"/>
+          <w:sz w:val="22"/>
+          <w:szCs w:val="22"/>
+        </w:rPr>
+        <w:t>@GetMapping("/orders/{id}")</w:t>
+      </w:r>
+    </w:p>
+    <w:p>
+      <w:pPr>
+        <w:rPr>
+          <w:color w:val="4472C4" w:themeColor="accent1"/>
+          <w:sz w:val="22"/>
+          <w:szCs w:val="22"/>
+        </w:rPr>
+      </w:pPr>
+      <w:r>
+        <w:rPr>
+          <w:color w:val="4472C4" w:themeColor="accent1"/>
+          <w:sz w:val="22"/>
+          <w:szCs w:val="22"/>
+        </w:rPr>
+        <w:t xml:space="preserve">public String </w:t>
+      </w:r>
+      <w:proofErr w:type="spellStart"/>
+      <w:proofErr w:type="gramStart"/>
+      <w:r>
+        <w:rPr>
+          <w:color w:val="4472C4" w:themeColor="accent1"/>
+          <w:sz w:val="22"/>
+          <w:szCs w:val="22"/>
+        </w:rPr>
+        <w:t>getOrder</w:t>
+      </w:r>
+      <w:proofErr w:type="spellEnd"/>
+      <w:r>
+        <w:rPr>
+          <w:color w:val="4472C4" w:themeColor="accent1"/>
+          <w:sz w:val="22"/>
+          <w:szCs w:val="22"/>
+        </w:rPr>
+        <w:t>(</w:t>
+      </w:r>
+      <w:proofErr w:type="gramEnd"/>
+      <w:r>
+        <w:rPr>
+          <w:color w:val="4472C4" w:themeColor="accent1"/>
+          <w:sz w:val="22"/>
+          <w:szCs w:val="22"/>
+        </w:rPr>
+        <w:t>@PathVariable int id) {</w:t>
+      </w:r>
+    </w:p>
+    <w:p>
+      <w:pPr>
+        <w:rPr>
+          <w:color w:val="4472C4" w:themeColor="accent1"/>
+          <w:sz w:val="22"/>
+          <w:szCs w:val="22"/>
+        </w:rPr>
+      </w:pPr>
+      <w:r>
+        <w:rPr>
+          <w:color w:val="4472C4" w:themeColor="accent1"/>
+          <w:sz w:val="22"/>
+          <w:szCs w:val="22"/>
+        </w:rPr>
+        <w:t xml:space="preserve">    return "Order ID: " + id;}</w:t>
+      </w:r>
+    </w:p>
+    <w:p>
+      <w:pPr>
+        <w:jc w:val="center"/>
+        <w:rPr>
+          <w:b/>
+          <w:bCs/>
+          <w:color w:val="EE0000"/>
+          <w:sz w:val="32"/>
+          <w:szCs w:val="32"/>
+          <w:u w:val="single"/>
+        </w:rPr>
+      </w:pPr>
+      <w:r>
+        <w:rPr>
+          <w:b/>
+          <w:bCs/>
+          <w:color w:val="EE0000"/>
+          <w:sz w:val="32"/>
+          <w:szCs w:val="32"/>
+          <w:u w:val="single"/>
+        </w:rPr>
+        <w:lastRenderedPageBreak/>
+        <w:t>@RequestParam</w:t>
+      </w:r>
+    </w:p>
+    <w:p>
+      <w:pPr>
+        <w:rPr>
+          <w:color w:val="000000" w:themeColor="text1"/>
+          <w:sz w:val="22"/>
+          <w:szCs w:val="22"/>
+        </w:rPr>
+      </w:pPr>
+      <w:r>
+        <w:rPr>
+          <w:color w:val="000000" w:themeColor="text1"/>
+          <w:sz w:val="22"/>
+          <w:szCs w:val="22"/>
+        </w:rPr>
+        <w:t>Variable as request paramete</w:t>
+      </w:r>
+      <w:r>
+        <w:rPr>
+          <w:color w:val="000000" w:themeColor="text1"/>
+          <w:sz w:val="22"/>
+          <w:szCs w:val="22"/>
+        </w:rPr>
+        <w:t>r</w:t>
+      </w:r>
+    </w:p>
+    <w:p>
+      <w:pPr>
+        <w:rPr>
+          <w:color w:val="000000" w:themeColor="text1"/>
+          <w:sz w:val="22"/>
+          <w:szCs w:val="22"/>
+        </w:rPr>
+      </w:pPr>
+      <w:r>
+        <w:rPr>
+          <w:color w:val="000000" w:themeColor="text1"/>
+          <w:sz w:val="22"/>
+          <w:szCs w:val="22"/>
+        </w:rPr>
+        <w:t>Request dispatching</w:t>
+      </w:r>
+    </w:p>
+    <w:p>
+      <w:pPr>
+        <w:rPr>
+          <w:color w:val="4472C4" w:themeColor="accent1"/>
+          <w:sz w:val="22"/>
+          <w:szCs w:val="22"/>
+        </w:rPr>
+      </w:pPr>
+      <w:r>
+        <w:rPr>
+          <w:color w:val="4472C4" w:themeColor="accent1"/>
+          <w:sz w:val="22"/>
+          <w:szCs w:val="22"/>
+        </w:rPr>
+        <w:t>@GetMapping("/orders")</w:t>
+      </w:r>
+    </w:p>
+    <w:p>
+      <w:pPr>
+        <w:rPr>
+          <w:color w:val="4472C4" w:themeColor="accent1"/>
+          <w:sz w:val="22"/>
+          <w:szCs w:val="22"/>
+        </w:rPr>
+      </w:pPr>
+      <w:r>
+        <w:rPr>
+          <w:color w:val="4472C4" w:themeColor="accent1"/>
+          <w:sz w:val="22"/>
+          <w:szCs w:val="22"/>
+        </w:rPr>
+        <w:t xml:space="preserve">public String </w:t>
+      </w:r>
+      <w:proofErr w:type="spellStart"/>
+      <w:proofErr w:type="gramStart"/>
+      <w:r>
+        <w:rPr>
+          <w:color w:val="4472C4" w:themeColor="accent1"/>
+          <w:sz w:val="22"/>
+          <w:szCs w:val="22"/>
+        </w:rPr>
+        <w:t>getOrder</w:t>
+      </w:r>
+      <w:proofErr w:type="spellEnd"/>
+      <w:r>
+        <w:rPr>
+          <w:color w:val="4472C4" w:themeColor="accent1"/>
+          <w:sz w:val="22"/>
+          <w:szCs w:val="22"/>
+        </w:rPr>
+        <w:t>(</w:t>
+      </w:r>
+      <w:proofErr w:type="gramEnd"/>
+    </w:p>
+    <w:p>
+      <w:pPr>
+        <w:rPr>
+          <w:color w:val="4472C4" w:themeColor="accent1"/>
+          <w:sz w:val="22"/>
+          <w:szCs w:val="22"/>
+        </w:rPr>
+      </w:pPr>
+      <w:r>
+        <w:rPr>
+          <w:color w:val="4472C4" w:themeColor="accent1"/>
+          <w:sz w:val="22"/>
+          <w:szCs w:val="22"/>
+        </w:rPr>
+        <w:t xml:space="preserve">    @RequestParam int id,</w:t>
+      </w:r>
+    </w:p>
+    <w:p>
+      <w:pPr>
+        <w:rPr>
+          <w:color w:val="4472C4" w:themeColor="accent1"/>
+          <w:sz w:val="22"/>
+          <w:szCs w:val="22"/>
+        </w:rPr>
+      </w:pPr>
+      <w:r>
+        <w:rPr>
+          <w:color w:val="4472C4" w:themeColor="accent1"/>
+          <w:sz w:val="22"/>
+          <w:szCs w:val="22"/>
+        </w:rPr>
+        <w:t xml:space="preserve">    @RequestParam String status</w:t>
+      </w:r>
+    </w:p>
+    <w:p>
+      <w:pPr>
+        <w:rPr>
+          <w:color w:val="4472C4" w:themeColor="accent1"/>
+          <w:sz w:val="22"/>
+          <w:szCs w:val="22"/>
+        </w:rPr>
+      </w:pPr>
+      <w:r>
+        <w:rPr>
+          <w:color w:val="4472C4" w:themeColor="accent1"/>
+          <w:sz w:val="22"/>
+          <w:szCs w:val="22"/>
+        </w:rPr>
+        <w:t>) {</w:t>
+      </w:r>
+    </w:p>
+    <w:p>
+      <w:pPr>
+        <w:rPr>
+          <w:color w:val="4472C4" w:themeColor="accent1"/>
+          <w:sz w:val="22"/>
+          <w:szCs w:val="22"/>
+        </w:rPr>
+      </w:pPr>
+      <w:r>
+        <w:rPr>
+          <w:color w:val="4472C4" w:themeColor="accent1"/>
+          <w:sz w:val="22"/>
+          <w:szCs w:val="22"/>
+        </w:rPr>
+        <w:t xml:space="preserve">    return id + " " + status;</w:t>
+      </w:r>
+    </w:p>
+    <w:p>
+      <w:pPr>
+        <w:rPr>
+          <w:color w:val="4472C4" w:themeColor="accent1"/>
+          <w:sz w:val="22"/>
+          <w:szCs w:val="22"/>
+        </w:rPr>
+      </w:pPr>
+      <w:r>
+        <w:rPr>
+          <w:color w:val="4472C4" w:themeColor="accent1"/>
+          <w:sz w:val="22"/>
+          <w:szCs w:val="22"/>
+        </w:rPr>
+        <w:t>}</w:t>
+      </w:r>
+    </w:p>
+    <w:p>
+      <w:pPr>
+        <w:rPr>
+          <w:color w:val="000000" w:themeColor="text1"/>
+          <w:sz w:val="22"/>
+          <w:szCs w:val="22"/>
+        </w:rPr>
+      </w:pPr>
+    </w:p>
+    <w:p>
+      <w:pPr>
+        <w:rPr>
+          <w:color w:val="EE0000"/>
+          <w:sz w:val="22"/>
+          <w:szCs w:val="22"/>
+        </w:rPr>
+      </w:pPr>
+      <w:r>
+        <w:rPr>
+          <w:color w:val="EE0000"/>
+          <w:sz w:val="22"/>
+          <w:szCs w:val="22"/>
+        </w:rPr>
+        <w:t xml:space="preserve">A method name should be unique even if it accepts different path variable or parameters still it should hold a unique name, for each method so for example </w:t>
+      </w:r>
+    </w:p>
+    <w:p>
+      <w:pPr>
+        <w:rPr>
+          <w:color w:val="EE0000"/>
+          <w:sz w:val="22"/>
+          <w:szCs w:val="22"/>
+        </w:rPr>
+      </w:pPr>
+      <w:r>
+        <w:rPr>
+          <w:color w:val="EE0000"/>
+          <w:sz w:val="22"/>
+          <w:szCs w:val="22"/>
+        </w:rPr>
+        <w:t xml:space="preserve">We can have 2 </w:t>
+      </w:r>
+      <w:proofErr w:type="gramStart"/>
+      <w:r>
+        <w:rPr>
+          <w:color w:val="EE0000"/>
+          <w:sz w:val="22"/>
+          <w:szCs w:val="22"/>
+        </w:rPr>
+        <w:t>method</w:t>
+      </w:r>
+      <w:proofErr w:type="gramEnd"/>
+      <w:r>
+        <w:rPr>
+          <w:color w:val="EE0000"/>
+          <w:sz w:val="22"/>
+          <w:szCs w:val="22"/>
+        </w:rPr>
+        <w:t xml:space="preserve"> called /hello but for different methods so one can be </w:t>
+      </w:r>
+      <w:proofErr w:type="gramStart"/>
+      <w:r>
+        <w:rPr>
+          <w:color w:val="EE0000"/>
+          <w:sz w:val="22"/>
+          <w:szCs w:val="22"/>
+        </w:rPr>
+        <w:t>get</w:t>
+      </w:r>
+      <w:proofErr w:type="gramEnd"/>
+      <w:r>
+        <w:rPr>
+          <w:color w:val="EE0000"/>
+          <w:sz w:val="22"/>
+          <w:szCs w:val="22"/>
+        </w:rPr>
+        <w:t xml:space="preserve"> and the other post</w:t>
+      </w:r>
+    </w:p>
+    <w:p>
+      <w:pPr>
+        <w:rPr>
+          <w:color w:val="EE0000"/>
+          <w:sz w:val="22"/>
+          <w:szCs w:val="22"/>
+        </w:rPr>
+      </w:pPr>
+      <w:r>
+        <w:rPr>
+          <w:color w:val="EE0000"/>
+          <w:sz w:val="22"/>
+          <w:szCs w:val="22"/>
+        </w:rPr>
+        <w:t>But we cannot have 2 hello methods even if the first one is accepting path variable and the second not since both are GET</w:t>
+      </w:r>
+    </w:p>
+    <w:p>
+      <w:pPr>
+        <w:rPr>
+          <w:color w:val="000000" w:themeColor="text1"/>
+          <w:sz w:val="22"/>
+          <w:szCs w:val="22"/>
+        </w:rPr>
+      </w:pPr>
+    </w:p>
+    <w:p>
+      <w:pPr>
+        <w:rPr>
+          <w:color w:val="000000" w:themeColor="text1"/>
+          <w:sz w:val="22"/>
+          <w:szCs w:val="22"/>
+        </w:rPr>
+      </w:pPr>
+    </w:p>
+    <w:p>
+      <w:pPr>
+        <w:rPr>
+          <w:color w:val="000000" w:themeColor="text1"/>
+          <w:sz w:val="22"/>
+          <w:szCs w:val="22"/>
+        </w:rPr>
+      </w:pPr>
+    </w:p>
+    <w:p>
+      <w:pPr>
+        <w:rPr>
+          <w:color w:val="000000" w:themeColor="text1"/>
+          <w:sz w:val="22"/>
+          <w:szCs w:val="22"/>
+        </w:rPr>
+      </w:pPr>
+      <w:r>
+        <w:rPr>
+          <w:color w:val="000000" w:themeColor="text1"/>
+          <w:sz w:val="22"/>
+          <w:szCs w:val="22"/>
+        </w:rPr>
+        <w:t>Data source configuration</w:t>
+      </w:r>
+    </w:p>
+    <w:p>
+      <w:pPr>
+        <w:rPr>
+          <w:color w:val="000000" w:themeColor="text1"/>
+          <w:sz w:val="22"/>
+          <w:szCs w:val="22"/>
+        </w:rPr>
+      </w:pPr>
+      <w:r>
+        <w:rPr>
+          <w:color w:val="000000" w:themeColor="text1"/>
+          <w:sz w:val="22"/>
+          <w:szCs w:val="22"/>
+        </w:rPr>
+        <w:t>Spring:</w:t>
+      </w:r>
+    </w:p>
+    <w:p>
+      <w:pPr>
+        <w:rPr>
+          <w:color w:val="000000" w:themeColor="text1"/>
+          <w:sz w:val="22"/>
+          <w:szCs w:val="22"/>
+        </w:rPr>
+      </w:pPr>
+      <w:r>
+        <w:rPr>
+          <w:color w:val="000000" w:themeColor="text1"/>
+          <w:sz w:val="22"/>
+          <w:szCs w:val="22"/>
+        </w:rPr>
+        <w:tab/>
+      </w:r>
+      <w:proofErr w:type="spellStart"/>
+      <w:r>
+        <w:rPr>
+          <w:color w:val="000000" w:themeColor="text1"/>
+          <w:sz w:val="22"/>
+          <w:szCs w:val="22"/>
+        </w:rPr>
+        <w:t>Datasource</w:t>
+      </w:r>
+      <w:proofErr w:type="spellEnd"/>
+      <w:r>
+        <w:rPr>
+          <w:color w:val="000000" w:themeColor="text1"/>
+          <w:sz w:val="22"/>
+          <w:szCs w:val="22"/>
+        </w:rPr>
+        <w:t>:</w:t>
+      </w:r>
+    </w:p>
+    <w:p>
+      <w:pPr>
+        <w:rPr>
+          <w:color w:val="000000" w:themeColor="text1"/>
+          <w:sz w:val="22"/>
+          <w:szCs w:val="22"/>
+        </w:rPr>
+      </w:pPr>
+      <w:r>
+        <w:rPr>
+          <w:color w:val="000000" w:themeColor="text1"/>
+          <w:sz w:val="22"/>
+          <w:szCs w:val="22"/>
+        </w:rPr>
+        <w:tab/>
+      </w:r>
+      <w:r>
+        <w:rPr>
+          <w:color w:val="000000" w:themeColor="text1"/>
+          <w:sz w:val="22"/>
+          <w:szCs w:val="22"/>
+        </w:rPr>
+        <w:tab/>
+        <w:t>url:</w:t>
+      </w:r>
+    </w:p>
+    <w:p>
+      <w:pPr>
+        <w:rPr>
+          <w:color w:val="000000" w:themeColor="text1"/>
+          <w:sz w:val="22"/>
+          <w:szCs w:val="22"/>
+        </w:rPr>
+      </w:pPr>
+      <w:r>
+        <w:rPr>
+          <w:color w:val="000000" w:themeColor="text1"/>
+          <w:sz w:val="22"/>
+          <w:szCs w:val="22"/>
+        </w:rPr>
+        <w:tab/>
+        <w:t>username:</w:t>
+      </w:r>
+    </w:p>
+    <w:p>
+      <w:pPr>
+        <w:rPr>
+          <w:color w:val="000000" w:themeColor="text1"/>
+          <w:sz w:val="22"/>
+          <w:szCs w:val="22"/>
+        </w:rPr>
+      </w:pPr>
+      <w:r>
+        <w:rPr>
+          <w:color w:val="000000" w:themeColor="text1"/>
+          <w:sz w:val="22"/>
+          <w:szCs w:val="22"/>
+        </w:rPr>
+        <w:tab/>
+        <w:t>password:</w:t>
+      </w:r>
+    </w:p>
+    <w:p>
+      <w:pPr>
+        <w:rPr>
+          <w:color w:val="000000" w:themeColor="text1"/>
+          <w:sz w:val="22"/>
+          <w:szCs w:val="22"/>
+        </w:rPr>
+      </w:pPr>
+      <w:r>
+        <w:rPr>
+          <w:color w:val="000000" w:themeColor="text1"/>
+          <w:sz w:val="22"/>
+          <w:szCs w:val="22"/>
+        </w:rPr>
+        <w:tab/>
+        <w:t xml:space="preserve">driver-class-name: for this we need to add the database dependency of </w:t>
+      </w:r>
+      <w:proofErr w:type="spellStart"/>
+      <w:r>
+        <w:rPr>
+          <w:color w:val="000000" w:themeColor="text1"/>
+          <w:sz w:val="22"/>
+          <w:szCs w:val="22"/>
+        </w:rPr>
+        <w:t>mysql</w:t>
+      </w:r>
+      <w:proofErr w:type="spellEnd"/>
     </w:p>
     <w:sectPr>
       <w:pgSz w:w="12240" w:h="15840"/>

</xml_diff>

<commit_message>
add some notes and code for repository practice
</commit_message>
<xml_diff>
--- a/Notes.docx
+++ b/Notes.docx
@@ -79,43 +79,7 @@
           <w:sz w:val="22"/>
           <w:szCs w:val="22"/>
         </w:rPr>
-        <w:t xml:space="preserve"> in a normal condition or without spring framework we would need to create an instance(object) of the class and inject it where it should, manage it. This creates tight coupling. </w:t>
-      </w:r>
-      <w:proofErr w:type="gramStart"/>
-      <w:r>
-        <w:rPr>
-          <w:color w:val="000000" w:themeColor="text1"/>
-          <w:sz w:val="22"/>
-          <w:szCs w:val="22"/>
-        </w:rPr>
-        <w:t>However</w:t>
-      </w:r>
-      <w:proofErr w:type="gramEnd"/>
-      <w:r>
-        <w:rPr>
-          <w:color w:val="000000" w:themeColor="text1"/>
-          <w:sz w:val="22"/>
-          <w:szCs w:val="22"/>
-        </w:rPr>
-        <w:t xml:space="preserve"> the inversion of control allows spring boot using @Autowired to create an object for us, inject where </w:t>
-      </w:r>
-      <w:proofErr w:type="spellStart"/>
-      <w:r>
-        <w:rPr>
-          <w:color w:val="000000" w:themeColor="text1"/>
-          <w:sz w:val="22"/>
-          <w:szCs w:val="22"/>
-        </w:rPr>
-        <w:t>its</w:t>
-      </w:r>
-      <w:proofErr w:type="spellEnd"/>
-      <w:r>
-        <w:rPr>
-          <w:color w:val="000000" w:themeColor="text1"/>
-          <w:sz w:val="22"/>
-          <w:szCs w:val="22"/>
-        </w:rPr>
-        <w:t xml:space="preserve"> needed.</w:t>
+        <w:t xml:space="preserve"> in a normal condition or without spring framework we would need to create an instance(object) of the class and inject it where it should, manage it. This creates tight coupling. However the inversion of control allows spring boot using @Autowired to create an object for us, inject where its needed.</w:t>
       </w:r>
     </w:p>
     <w:p>
@@ -445,25 +409,7 @@
           <w:sz w:val="22"/>
           <w:szCs w:val="22"/>
         </w:rPr>
-        <w:t xml:space="preserve">In the app configuration class when we define beans using </w:t>
-      </w:r>
-      <w:proofErr w:type="gramStart"/>
-      <w:r>
-        <w:rPr>
-          <w:color w:val="000000" w:themeColor="text1"/>
-          <w:sz w:val="22"/>
-          <w:szCs w:val="22"/>
-        </w:rPr>
-        <w:t>methods</w:t>
-      </w:r>
-      <w:proofErr w:type="gramEnd"/>
-      <w:r>
-        <w:rPr>
-          <w:color w:val="000000" w:themeColor="text1"/>
-          <w:sz w:val="22"/>
-          <w:szCs w:val="22"/>
-        </w:rPr>
-        <w:t xml:space="preserve"> we annotate those methods with @Bean, and this bean that is returned from the method is named the same as the method name but if we wrote @Bean(“name”) now the spring boot will name that bean as name.</w:t>
+        <w:t>In the app configuration class when we define beans using methods we annotate those methods with @Bean, and this bean that is returned from the method is named the same as the method name but if we wrote @Bean(“name”) now the spring boot will name that bean as name.</w:t>
       </w:r>
     </w:p>
     <w:p>
@@ -819,25 +765,7 @@
           <w:sz w:val="22"/>
           <w:szCs w:val="22"/>
         </w:rPr>
-        <w:t>@</w:t>
-      </w:r>
-      <w:proofErr w:type="gramStart"/>
-      <w:r>
-        <w:rPr>
-          <w:color w:val="000000" w:themeColor="text1"/>
-          <w:sz w:val="22"/>
-          <w:szCs w:val="22"/>
-        </w:rPr>
-        <w:t>Value(</w:t>
-      </w:r>
-      <w:proofErr w:type="gramEnd"/>
-      <w:r>
-        <w:rPr>
-          <w:color w:val="000000" w:themeColor="text1"/>
-          <w:sz w:val="22"/>
-          <w:szCs w:val="22"/>
-        </w:rPr>
-        <w:t xml:space="preserve">“Actual value”) is used to inject value into a variable, whether its hardcoded or comes from another environment or class. Or class path, or file or variable. </w:t>
+        <w:t xml:space="preserve">@Value(“Actual value”) is used to inject value into a variable, whether its hardcoded or comes from another environment or class. Or class path, or file or variable. </w:t>
       </w:r>
     </w:p>
     <w:p>
@@ -1253,25 +1181,7 @@
           <w:sz w:val="22"/>
           <w:szCs w:val="22"/>
         </w:rPr>
-        <w:t xml:space="preserve">In case of nested resources payments inside the </w:t>
-      </w:r>
-      <w:proofErr w:type="gramStart"/>
-      <w:r>
-        <w:rPr>
-          <w:color w:val="000000" w:themeColor="text1"/>
-          <w:sz w:val="22"/>
-          <w:szCs w:val="22"/>
-        </w:rPr>
-        <w:t>accounts</w:t>
-      </w:r>
-      <w:proofErr w:type="gramEnd"/>
-      <w:r>
-        <w:rPr>
-          <w:color w:val="000000" w:themeColor="text1"/>
-          <w:sz w:val="22"/>
-          <w:szCs w:val="22"/>
-        </w:rPr>
-        <w:t xml:space="preserve"> it should be like this</w:t>
+        <w:t>In case of nested resources payments inside the accounts it should be like this</w:t>
       </w:r>
     </w:p>
     <w:p>
@@ -1339,36 +1249,8 @@
           <w:sz w:val="22"/>
           <w:szCs w:val="22"/>
         </w:rPr>
-        <w:t xml:space="preserve">GET, POST, PUT, </w:t>
-      </w:r>
-      <w:proofErr w:type="gramStart"/>
-      <w:r>
-        <w:rPr>
-          <w:color w:val="EE0000"/>
-          <w:sz w:val="22"/>
-          <w:szCs w:val="22"/>
-        </w:rPr>
-        <w:t>DELETE,PATCH</w:t>
-      </w:r>
-      <w:proofErr w:type="gramEnd"/>
-      <w:r>
-        <w:rPr>
-          <w:color w:val="EE0000"/>
-          <w:sz w:val="22"/>
-          <w:szCs w:val="22"/>
-        </w:rPr>
-        <w:t>,</w:t>
-      </w:r>
-      <w:proofErr w:type="gramStart"/>
-      <w:r>
-        <w:rPr>
-          <w:color w:val="EE0000"/>
-          <w:sz w:val="22"/>
-          <w:szCs w:val="22"/>
-        </w:rPr>
-        <w:t>OPTIONS,HEAD</w:t>
-      </w:r>
-      <w:proofErr w:type="gramEnd"/>
+        <w:t>GET, POST, PUT, DELETE,PATCH,OPTIONS,HEAD</w:t>
+      </w:r>
       <w:r>
         <w:rPr>
           <w:color w:val="000000" w:themeColor="text1"/>
@@ -1436,70 +1318,24 @@
           <w:sz w:val="22"/>
           <w:szCs w:val="22"/>
         </w:rPr>
-        <w:t xml:space="preserve">Public void </w:t>
-      </w:r>
-      <w:proofErr w:type="spellStart"/>
-      <w:proofErr w:type="gramStart"/>
-      <w:r>
-        <w:rPr>
-          <w:color w:val="EE0000"/>
-          <w:sz w:val="22"/>
-          <w:szCs w:val="22"/>
-        </w:rPr>
-        <w:t>printProduct</w:t>
-      </w:r>
-      <w:proofErr w:type="spellEnd"/>
-      <w:r>
-        <w:rPr>
-          <w:color w:val="EE0000"/>
-          <w:sz w:val="22"/>
-          <w:szCs w:val="22"/>
-        </w:rPr>
-        <w:t>(){</w:t>
-      </w:r>
-      <w:proofErr w:type="gramEnd"/>
-      <w:r>
-        <w:rPr>
-          <w:color w:val="EE0000"/>
-          <w:sz w:val="22"/>
-          <w:szCs w:val="22"/>
-        </w:rPr>
-        <w:t>}</w:t>
-      </w:r>
-    </w:p>
-    <w:p>
-      <w:pPr>
-        <w:rPr>
-          <w:color w:val="000000" w:themeColor="text1"/>
-          <w:sz w:val="22"/>
-          <w:szCs w:val="22"/>
-        </w:rPr>
-      </w:pPr>
-      <w:r>
-        <w:rPr>
-          <w:color w:val="000000" w:themeColor="text1"/>
-          <w:sz w:val="22"/>
-          <w:szCs w:val="22"/>
-        </w:rPr>
-        <w:t xml:space="preserve">This annotation is triggered aka mapped into the function </w:t>
-      </w:r>
-      <w:proofErr w:type="spellStart"/>
-      <w:r>
-        <w:rPr>
-          <w:color w:val="000000" w:themeColor="text1"/>
-          <w:sz w:val="22"/>
-          <w:szCs w:val="22"/>
-        </w:rPr>
-        <w:t>its</w:t>
-      </w:r>
-      <w:proofErr w:type="spellEnd"/>
-      <w:r>
-        <w:rPr>
-          <w:color w:val="000000" w:themeColor="text1"/>
-          <w:sz w:val="22"/>
-          <w:szCs w:val="22"/>
-        </w:rPr>
-        <w:t xml:space="preserve"> on once the http request of get/users/{id} is accessed it just fetches data from the server and show it to the user its very safe</w:t>
+        <w:t>Public void printProduct(){}</w:t>
+      </w:r>
+    </w:p>
+    <w:p>
+      <w:pPr>
+        <w:rPr>
+          <w:color w:val="000000" w:themeColor="text1"/>
+          <w:sz w:val="22"/>
+          <w:szCs w:val="22"/>
+        </w:rPr>
+      </w:pPr>
+      <w:r>
+        <w:rPr>
+          <w:color w:val="000000" w:themeColor="text1"/>
+          <w:sz w:val="22"/>
+          <w:szCs w:val="22"/>
+        </w:rPr>
+        <w:t>This annotation is triggered aka mapped into the function its on once the http request of get/users/{id} is accessed it just fetches data from the server and show it to the user its very safe</w:t>
       </w:r>
     </w:p>
     <w:p>
@@ -1628,35 +1464,7 @@
           <w:szCs w:val="22"/>
         </w:rPr>
         <w:br/>
-        <w:t xml:space="preserve">public User </w:t>
-      </w:r>
-      <w:proofErr w:type="spellStart"/>
-      <w:proofErr w:type="gramStart"/>
-      <w:r>
-        <w:rPr>
-          <w:color w:val="EE0000"/>
-          <w:sz w:val="22"/>
-          <w:szCs w:val="22"/>
-        </w:rPr>
-        <w:t>updateUser</w:t>
-      </w:r>
-      <w:proofErr w:type="spellEnd"/>
-      <w:r>
-        <w:rPr>
-          <w:color w:val="EE0000"/>
-          <w:sz w:val="22"/>
-          <w:szCs w:val="22"/>
-        </w:rPr>
-        <w:t>(</w:t>
-      </w:r>
-      <w:proofErr w:type="gramEnd"/>
-      <w:r>
-        <w:rPr>
-          <w:color w:val="EE0000"/>
-          <w:sz w:val="22"/>
-          <w:szCs w:val="22"/>
-        </w:rPr>
-        <w:t>@PathVariable Long id, @RequestBody User user) {</w:t>
+        <w:t>public User updateUser(@PathVariable Long id, @RequestBody User user) {</w:t>
       </w:r>
       <w:r>
         <w:rPr>
@@ -1665,27 +1473,7 @@
           <w:szCs w:val="22"/>
         </w:rPr>
         <w:br/>
-        <w:t xml:space="preserve">    </w:t>
-      </w:r>
-      <w:proofErr w:type="spellStart"/>
-      <w:proofErr w:type="gramStart"/>
-      <w:r>
-        <w:rPr>
-          <w:color w:val="EE0000"/>
-          <w:sz w:val="22"/>
-          <w:szCs w:val="22"/>
-        </w:rPr>
-        <w:t>user.setId</w:t>
-      </w:r>
-      <w:proofErr w:type="spellEnd"/>
-      <w:proofErr w:type="gramEnd"/>
-      <w:r>
-        <w:rPr>
-          <w:color w:val="EE0000"/>
-          <w:sz w:val="22"/>
-          <w:szCs w:val="22"/>
-        </w:rPr>
-        <w:t>(id);</w:t>
+        <w:t xml:space="preserve">    user.setId(id);</w:t>
       </w:r>
       <w:r>
         <w:rPr>
@@ -1694,25 +1482,7 @@
           <w:szCs w:val="22"/>
         </w:rPr>
         <w:br/>
-        <w:t xml:space="preserve">    return </w:t>
-      </w:r>
-      <w:proofErr w:type="spellStart"/>
-      <w:r>
-        <w:rPr>
-          <w:color w:val="EE0000"/>
-          <w:sz w:val="22"/>
-          <w:szCs w:val="22"/>
-        </w:rPr>
-        <w:t>userService.update</w:t>
-      </w:r>
-      <w:proofErr w:type="spellEnd"/>
-      <w:r>
-        <w:rPr>
-          <w:color w:val="EE0000"/>
-          <w:sz w:val="22"/>
-          <w:szCs w:val="22"/>
-        </w:rPr>
-        <w:t>(user);</w:t>
+        <w:t xml:space="preserve">    return userService.update(user);</w:t>
       </w:r>
       <w:r>
         <w:rPr>
@@ -1880,70 +1650,24 @@
           <w:sz w:val="22"/>
           <w:szCs w:val="22"/>
         </w:rPr>
-        <w:t xml:space="preserve">public void </w:t>
-      </w:r>
-      <w:proofErr w:type="spellStart"/>
-      <w:proofErr w:type="gramStart"/>
-      <w:r>
-        <w:rPr>
-          <w:color w:val="EE0000"/>
-          <w:sz w:val="22"/>
-          <w:szCs w:val="22"/>
-        </w:rPr>
-        <w:t>deleteUser</w:t>
-      </w:r>
-      <w:proofErr w:type="spellEnd"/>
-      <w:r>
-        <w:rPr>
-          <w:color w:val="EE0000"/>
-          <w:sz w:val="22"/>
-          <w:szCs w:val="22"/>
-        </w:rPr>
-        <w:t>(</w:t>
-      </w:r>
-      <w:proofErr w:type="gramEnd"/>
-      <w:r>
-        <w:rPr>
-          <w:color w:val="EE0000"/>
-          <w:sz w:val="22"/>
-          <w:szCs w:val="22"/>
-        </w:rPr>
-        <w:t>@PathVariable Long id) {</w:t>
-      </w:r>
-    </w:p>
-    <w:p>
-      <w:pPr>
-        <w:rPr>
-          <w:color w:val="EE0000"/>
-          <w:sz w:val="22"/>
-          <w:szCs w:val="22"/>
-        </w:rPr>
-      </w:pPr>
-      <w:r>
-        <w:rPr>
-          <w:color w:val="EE0000"/>
-          <w:sz w:val="22"/>
-          <w:szCs w:val="22"/>
-        </w:rPr>
-        <w:t xml:space="preserve">    </w:t>
-      </w:r>
-      <w:proofErr w:type="spellStart"/>
-      <w:r>
-        <w:rPr>
-          <w:color w:val="EE0000"/>
-          <w:sz w:val="22"/>
-          <w:szCs w:val="22"/>
-        </w:rPr>
-        <w:t>userService.delete</w:t>
-      </w:r>
-      <w:proofErr w:type="spellEnd"/>
-      <w:r>
-        <w:rPr>
-          <w:color w:val="EE0000"/>
-          <w:sz w:val="22"/>
-          <w:szCs w:val="22"/>
-        </w:rPr>
-        <w:t>(id);</w:t>
+        <w:t>public void deleteUser(@PathVariable Long id) {</w:t>
+      </w:r>
+    </w:p>
+    <w:p>
+      <w:pPr>
+        <w:rPr>
+          <w:color w:val="EE0000"/>
+          <w:sz w:val="22"/>
+          <w:szCs w:val="22"/>
+        </w:rPr>
+      </w:pPr>
+      <w:r>
+        <w:rPr>
+          <w:color w:val="EE0000"/>
+          <w:sz w:val="22"/>
+          <w:szCs w:val="22"/>
+        </w:rPr>
+        <w:t xml:space="preserve">    userService.delete(id);</w:t>
       </w:r>
     </w:p>
     <w:p>
@@ -1977,18 +1701,8 @@
           <w:sz w:val="22"/>
           <w:szCs w:val="22"/>
         </w:rPr>
-        <w:t xml:space="preserve">Is used to remove a resource from the </w:t>
-      </w:r>
-      <w:proofErr w:type="spellStart"/>
-      <w:r>
-        <w:rPr>
-          <w:color w:val="000000" w:themeColor="text1"/>
-          <w:sz w:val="22"/>
-          <w:szCs w:val="22"/>
-        </w:rPr>
-        <w:t>databse</w:t>
-      </w:r>
-      <w:proofErr w:type="spellEnd"/>
+        <w:t>Is used to remove a resource from the databse</w:t>
+      </w:r>
     </w:p>
     <w:p>
       <w:pPr>
@@ -2056,70 +1770,24 @@
           <w:sz w:val="22"/>
           <w:szCs w:val="22"/>
         </w:rPr>
-        <w:t xml:space="preserve">public User </w:t>
-      </w:r>
-      <w:proofErr w:type="spellStart"/>
-      <w:proofErr w:type="gramStart"/>
-      <w:r>
-        <w:rPr>
-          <w:color w:val="EE0000"/>
-          <w:sz w:val="22"/>
-          <w:szCs w:val="22"/>
-        </w:rPr>
-        <w:t>patchUser</w:t>
-      </w:r>
-      <w:proofErr w:type="spellEnd"/>
-      <w:r>
-        <w:rPr>
-          <w:color w:val="EE0000"/>
-          <w:sz w:val="22"/>
-          <w:szCs w:val="22"/>
-        </w:rPr>
-        <w:t>(</w:t>
-      </w:r>
-      <w:proofErr w:type="gramEnd"/>
-      <w:r>
-        <w:rPr>
-          <w:color w:val="EE0000"/>
-          <w:sz w:val="22"/>
-          <w:szCs w:val="22"/>
-        </w:rPr>
-        <w:t>@PathVariable Long id, @RequestBody Map&lt;String, Object&gt; updates) {</w:t>
-      </w:r>
-    </w:p>
-    <w:p>
-      <w:pPr>
-        <w:rPr>
-          <w:color w:val="EE0000"/>
-          <w:sz w:val="22"/>
-          <w:szCs w:val="22"/>
-        </w:rPr>
-      </w:pPr>
-      <w:r>
-        <w:rPr>
-          <w:color w:val="EE0000"/>
-          <w:sz w:val="22"/>
-          <w:szCs w:val="22"/>
-        </w:rPr>
-        <w:t xml:space="preserve">    return </w:t>
-      </w:r>
-      <w:proofErr w:type="spellStart"/>
-      <w:r>
-        <w:rPr>
-          <w:color w:val="EE0000"/>
-          <w:sz w:val="22"/>
-          <w:szCs w:val="22"/>
-        </w:rPr>
-        <w:t>userService.partialUpdate</w:t>
-      </w:r>
-      <w:proofErr w:type="spellEnd"/>
-      <w:r>
-        <w:rPr>
-          <w:color w:val="EE0000"/>
-          <w:sz w:val="22"/>
-          <w:szCs w:val="22"/>
-        </w:rPr>
-        <w:t>(id, updates);</w:t>
+        <w:t>public User patchUser(@PathVariable Long id, @RequestBody Map&lt;String, Object&gt; updates) {</w:t>
+      </w:r>
+    </w:p>
+    <w:p>
+      <w:pPr>
+        <w:rPr>
+          <w:color w:val="EE0000"/>
+          <w:sz w:val="22"/>
+          <w:szCs w:val="22"/>
+        </w:rPr>
+      </w:pPr>
+      <w:r>
+        <w:rPr>
+          <w:color w:val="EE0000"/>
+          <w:sz w:val="22"/>
+          <w:szCs w:val="22"/>
+        </w:rPr>
+        <w:t xml:space="preserve">    return userService.partialUpdate(id, updates);</w:t>
       </w:r>
     </w:p>
     <w:p>
@@ -2222,201 +1890,75 @@
           <w:sz w:val="22"/>
           <w:szCs w:val="22"/>
         </w:rPr>
-        <w:t>@</w:t>
-      </w:r>
-      <w:proofErr w:type="gramStart"/>
-      <w:r>
-        <w:rPr>
-          <w:color w:val="EE0000"/>
-          <w:sz w:val="22"/>
-          <w:szCs w:val="22"/>
-        </w:rPr>
-        <w:t>RequestMapping(</w:t>
-      </w:r>
-      <w:proofErr w:type="gramEnd"/>
-      <w:r>
-        <w:rPr>
-          <w:color w:val="EE0000"/>
-          <w:sz w:val="22"/>
-          <w:szCs w:val="22"/>
-        </w:rPr>
-        <w:t xml:space="preserve">value = "/users", method = </w:t>
-      </w:r>
-      <w:proofErr w:type="spellStart"/>
-      <w:r>
-        <w:rPr>
-          <w:color w:val="EE0000"/>
-          <w:sz w:val="22"/>
-          <w:szCs w:val="22"/>
-        </w:rPr>
-        <w:t>RequestMethod.OPTIONS</w:t>
-      </w:r>
-      <w:proofErr w:type="spellEnd"/>
-      <w:r>
-        <w:rPr>
-          <w:color w:val="EE0000"/>
-          <w:sz w:val="22"/>
-          <w:szCs w:val="22"/>
-        </w:rPr>
-        <w:t>)</w:t>
-      </w:r>
-    </w:p>
-    <w:p>
-      <w:pPr>
-        <w:rPr>
-          <w:color w:val="EE0000"/>
-          <w:sz w:val="22"/>
-          <w:szCs w:val="22"/>
-        </w:rPr>
-      </w:pPr>
-      <w:r>
-        <w:rPr>
-          <w:color w:val="EE0000"/>
-          <w:sz w:val="22"/>
-          <w:szCs w:val="22"/>
-        </w:rPr>
-        <w:t xml:space="preserve">public </w:t>
-      </w:r>
-      <w:proofErr w:type="spellStart"/>
-      <w:r>
-        <w:rPr>
-          <w:color w:val="EE0000"/>
-          <w:sz w:val="22"/>
-          <w:szCs w:val="22"/>
-        </w:rPr>
-        <w:t>ResponseEntity</w:t>
-      </w:r>
-      <w:proofErr w:type="spellEnd"/>
-      <w:r>
-        <w:rPr>
-          <w:color w:val="EE0000"/>
-          <w:sz w:val="22"/>
-          <w:szCs w:val="22"/>
-        </w:rPr>
-        <w:t xml:space="preserve">&lt;?&gt; </w:t>
-      </w:r>
-      <w:proofErr w:type="gramStart"/>
-      <w:r>
-        <w:rPr>
-          <w:color w:val="EE0000"/>
-          <w:sz w:val="22"/>
-          <w:szCs w:val="22"/>
-        </w:rPr>
-        <w:t>options(</w:t>
-      </w:r>
-      <w:proofErr w:type="gramEnd"/>
-      <w:r>
-        <w:rPr>
-          <w:color w:val="EE0000"/>
-          <w:sz w:val="22"/>
-          <w:szCs w:val="22"/>
-        </w:rPr>
-        <w:t>) {</w:t>
-      </w:r>
-    </w:p>
-    <w:p>
-      <w:pPr>
-        <w:rPr>
-          <w:color w:val="EE0000"/>
-          <w:sz w:val="22"/>
-          <w:szCs w:val="22"/>
-        </w:rPr>
-      </w:pPr>
-      <w:r>
-        <w:rPr>
-          <w:color w:val="EE0000"/>
-          <w:sz w:val="22"/>
-          <w:szCs w:val="22"/>
-        </w:rPr>
-        <w:t xml:space="preserve">    return </w:t>
-      </w:r>
-      <w:proofErr w:type="spellStart"/>
-      <w:r>
-        <w:rPr>
-          <w:color w:val="EE0000"/>
-          <w:sz w:val="22"/>
-          <w:szCs w:val="22"/>
-        </w:rPr>
-        <w:t>ResponseEntity.ok</w:t>
-      </w:r>
-      <w:proofErr w:type="spellEnd"/>
-      <w:r>
-        <w:rPr>
-          <w:color w:val="EE0000"/>
-          <w:sz w:val="22"/>
-          <w:szCs w:val="22"/>
-        </w:rPr>
-        <w:t>()</w:t>
-      </w:r>
-    </w:p>
-    <w:p>
-      <w:pPr>
-        <w:rPr>
-          <w:color w:val="EE0000"/>
-          <w:sz w:val="22"/>
-          <w:szCs w:val="22"/>
-        </w:rPr>
-      </w:pPr>
-      <w:r>
-        <w:rPr>
-          <w:color w:val="EE0000"/>
-          <w:sz w:val="22"/>
-          <w:szCs w:val="22"/>
-        </w:rPr>
-        <w:t xml:space="preserve">        </w:t>
-      </w:r>
-      <w:proofErr w:type="gramStart"/>
-      <w:r>
-        <w:rPr>
-          <w:color w:val="EE0000"/>
-          <w:sz w:val="22"/>
-          <w:szCs w:val="22"/>
-        </w:rPr>
-        <w:t>.header</w:t>
-      </w:r>
-      <w:proofErr w:type="gramEnd"/>
-      <w:r>
-        <w:rPr>
-          <w:color w:val="EE0000"/>
-          <w:sz w:val="22"/>
-          <w:szCs w:val="22"/>
-        </w:rPr>
-        <w:t>("Allow", "GET, POST, PUT, DELETE, PATCH, OPTIONS")</w:t>
-      </w:r>
-    </w:p>
-    <w:p>
-      <w:pPr>
-        <w:rPr>
-          <w:color w:val="EE0000"/>
-          <w:sz w:val="22"/>
-          <w:szCs w:val="22"/>
-        </w:rPr>
-      </w:pPr>
-      <w:r>
-        <w:rPr>
-          <w:color w:val="EE0000"/>
-          <w:sz w:val="22"/>
-          <w:szCs w:val="22"/>
-        </w:rPr>
-        <w:t xml:space="preserve">        </w:t>
-      </w:r>
-      <w:proofErr w:type="gramStart"/>
-      <w:r>
-        <w:rPr>
-          <w:color w:val="EE0000"/>
-          <w:sz w:val="22"/>
-          <w:szCs w:val="22"/>
-        </w:rPr>
-        <w:t>.build</w:t>
-      </w:r>
-      <w:proofErr w:type="gramEnd"/>
-      <w:r>
-        <w:rPr>
-          <w:color w:val="EE0000"/>
-          <w:sz w:val="22"/>
-          <w:szCs w:val="22"/>
-        </w:rPr>
-        <w:t>();</w:t>
+        <w:t>@RequestMapping(value = "/users", method = RequestMethod.OPTIONS)</w:t>
+      </w:r>
+    </w:p>
+    <w:p>
+      <w:pPr>
+        <w:rPr>
+          <w:color w:val="EE0000"/>
+          <w:sz w:val="22"/>
+          <w:szCs w:val="22"/>
+        </w:rPr>
+      </w:pPr>
+      <w:r>
+        <w:rPr>
+          <w:color w:val="EE0000"/>
+          <w:sz w:val="22"/>
+          <w:szCs w:val="22"/>
+        </w:rPr>
+        <w:t>public ResponseEntity&lt;?&gt; options() {</w:t>
+      </w:r>
+    </w:p>
+    <w:p>
+      <w:pPr>
+        <w:rPr>
+          <w:color w:val="EE0000"/>
+          <w:sz w:val="22"/>
+          <w:szCs w:val="22"/>
+        </w:rPr>
+      </w:pPr>
+      <w:r>
+        <w:rPr>
+          <w:color w:val="EE0000"/>
+          <w:sz w:val="22"/>
+          <w:szCs w:val="22"/>
+        </w:rPr>
+        <w:t xml:space="preserve">    return ResponseEntity.ok()</w:t>
+      </w:r>
+    </w:p>
+    <w:p>
+      <w:pPr>
+        <w:rPr>
+          <w:color w:val="EE0000"/>
+          <w:sz w:val="22"/>
+          <w:szCs w:val="22"/>
+        </w:rPr>
+      </w:pPr>
+      <w:r>
+        <w:rPr>
+          <w:color w:val="EE0000"/>
+          <w:sz w:val="22"/>
+          <w:szCs w:val="22"/>
+        </w:rPr>
+        <w:t xml:space="preserve">        .header("Allow", "GET, POST, PUT, DELETE, PATCH, OPTIONS")</w:t>
+      </w:r>
+    </w:p>
+    <w:p>
+      <w:pPr>
+        <w:rPr>
+          <w:color w:val="EE0000"/>
+          <w:sz w:val="22"/>
+          <w:szCs w:val="22"/>
+        </w:rPr>
+      </w:pPr>
+      <w:r>
+        <w:rPr>
+          <w:color w:val="EE0000"/>
+          <w:sz w:val="22"/>
+          <w:szCs w:val="22"/>
+        </w:rPr>
+        <w:t xml:space="preserve">        .build();</w:t>
       </w:r>
     </w:p>
     <w:p>
@@ -2575,194 +2117,58 @@
           <w:sz w:val="22"/>
           <w:szCs w:val="22"/>
         </w:rPr>
-        <w:t>@</w:t>
-      </w:r>
-      <w:proofErr w:type="gramStart"/>
-      <w:r>
-        <w:rPr>
-          <w:color w:val="EE0000"/>
-          <w:sz w:val="22"/>
-          <w:szCs w:val="22"/>
-        </w:rPr>
-        <w:t>RequestMapping(</w:t>
-      </w:r>
-      <w:proofErr w:type="gramEnd"/>
-      <w:r>
-        <w:rPr>
-          <w:color w:val="EE0000"/>
-          <w:sz w:val="22"/>
-          <w:szCs w:val="22"/>
-        </w:rPr>
-        <w:t xml:space="preserve">value = "/users/{id}", method = </w:t>
-      </w:r>
-      <w:proofErr w:type="spellStart"/>
-      <w:r>
-        <w:rPr>
-          <w:color w:val="EE0000"/>
-          <w:sz w:val="22"/>
-          <w:szCs w:val="22"/>
-        </w:rPr>
-        <w:t>RequestMethod.HEAD</w:t>
-      </w:r>
-      <w:proofErr w:type="spellEnd"/>
-      <w:r>
-        <w:rPr>
-          <w:color w:val="EE0000"/>
-          <w:sz w:val="22"/>
-          <w:szCs w:val="22"/>
-        </w:rPr>
-        <w:t>)</w:t>
-      </w:r>
-    </w:p>
-    <w:p>
-      <w:pPr>
-        <w:rPr>
-          <w:color w:val="EE0000"/>
-          <w:sz w:val="22"/>
-          <w:szCs w:val="22"/>
-        </w:rPr>
-      </w:pPr>
-      <w:r>
-        <w:rPr>
-          <w:color w:val="EE0000"/>
-          <w:sz w:val="22"/>
-          <w:szCs w:val="22"/>
-        </w:rPr>
-        <w:t xml:space="preserve">public </w:t>
-      </w:r>
-      <w:proofErr w:type="spellStart"/>
-      <w:r>
-        <w:rPr>
-          <w:color w:val="EE0000"/>
-          <w:sz w:val="22"/>
-          <w:szCs w:val="22"/>
-        </w:rPr>
-        <w:t>ResponseEntity</w:t>
-      </w:r>
-      <w:proofErr w:type="spellEnd"/>
-      <w:r>
-        <w:rPr>
-          <w:color w:val="EE0000"/>
-          <w:sz w:val="22"/>
-          <w:szCs w:val="22"/>
-        </w:rPr>
-        <w:t xml:space="preserve">&lt;Void&gt; </w:t>
-      </w:r>
-      <w:proofErr w:type="spellStart"/>
-      <w:proofErr w:type="gramStart"/>
-      <w:r>
-        <w:rPr>
-          <w:color w:val="EE0000"/>
-          <w:sz w:val="22"/>
-          <w:szCs w:val="22"/>
-        </w:rPr>
-        <w:t>headUser</w:t>
-      </w:r>
-      <w:proofErr w:type="spellEnd"/>
-      <w:r>
-        <w:rPr>
-          <w:color w:val="EE0000"/>
-          <w:sz w:val="22"/>
-          <w:szCs w:val="22"/>
-        </w:rPr>
-        <w:t>(</w:t>
-      </w:r>
-      <w:proofErr w:type="gramEnd"/>
-      <w:r>
-        <w:rPr>
-          <w:color w:val="EE0000"/>
-          <w:sz w:val="22"/>
-          <w:szCs w:val="22"/>
-        </w:rPr>
-        <w:t>@PathVariable Long id) {</w:t>
-      </w:r>
-    </w:p>
-    <w:p>
-      <w:pPr>
-        <w:rPr>
-          <w:color w:val="EE0000"/>
-          <w:sz w:val="22"/>
-          <w:szCs w:val="22"/>
-        </w:rPr>
-      </w:pPr>
-      <w:r>
-        <w:rPr>
-          <w:color w:val="EE0000"/>
-          <w:sz w:val="22"/>
-          <w:szCs w:val="22"/>
-        </w:rPr>
-        <w:t xml:space="preserve">    if (</w:t>
-      </w:r>
-      <w:proofErr w:type="spellStart"/>
-      <w:r>
-        <w:rPr>
-          <w:color w:val="EE0000"/>
-          <w:sz w:val="22"/>
-          <w:szCs w:val="22"/>
-        </w:rPr>
-        <w:t>userService.exists</w:t>
-      </w:r>
-      <w:proofErr w:type="spellEnd"/>
-      <w:r>
-        <w:rPr>
-          <w:color w:val="EE0000"/>
-          <w:sz w:val="22"/>
-          <w:szCs w:val="22"/>
-        </w:rPr>
-        <w:t>(id)) {</w:t>
-      </w:r>
-    </w:p>
-    <w:p>
-      <w:pPr>
-        <w:rPr>
-          <w:color w:val="EE0000"/>
-          <w:sz w:val="22"/>
-          <w:szCs w:val="22"/>
-        </w:rPr>
-      </w:pPr>
-      <w:r>
-        <w:rPr>
-          <w:color w:val="EE0000"/>
-          <w:sz w:val="22"/>
-          <w:szCs w:val="22"/>
-        </w:rPr>
-        <w:t xml:space="preserve">        return </w:t>
-      </w:r>
-      <w:proofErr w:type="spellStart"/>
-      <w:r>
-        <w:rPr>
-          <w:color w:val="EE0000"/>
-          <w:sz w:val="22"/>
-          <w:szCs w:val="22"/>
-        </w:rPr>
-        <w:t>ResponseEntity.ok</w:t>
-      </w:r>
-      <w:proofErr w:type="spellEnd"/>
-      <w:r>
-        <w:rPr>
-          <w:color w:val="EE0000"/>
-          <w:sz w:val="22"/>
-          <w:szCs w:val="22"/>
-        </w:rPr>
-        <w:t>(</w:t>
-      </w:r>
-      <w:proofErr w:type="gramStart"/>
-      <w:r>
-        <w:rPr>
-          <w:color w:val="EE0000"/>
-          <w:sz w:val="22"/>
-          <w:szCs w:val="22"/>
-        </w:rPr>
-        <w:t>).build</w:t>
-      </w:r>
-      <w:proofErr w:type="gramEnd"/>
-      <w:r>
-        <w:rPr>
-          <w:color w:val="EE0000"/>
-          <w:sz w:val="22"/>
-          <w:szCs w:val="22"/>
-        </w:rPr>
-        <w:t>();</w:t>
+        <w:t>@RequestMapping(value = "/users/{id}", method = RequestMethod.HEAD)</w:t>
+      </w:r>
+    </w:p>
+    <w:p>
+      <w:pPr>
+        <w:rPr>
+          <w:color w:val="EE0000"/>
+          <w:sz w:val="22"/>
+          <w:szCs w:val="22"/>
+        </w:rPr>
+      </w:pPr>
+      <w:r>
+        <w:rPr>
+          <w:color w:val="EE0000"/>
+          <w:sz w:val="22"/>
+          <w:szCs w:val="22"/>
+        </w:rPr>
+        <w:t>public ResponseEntity&lt;Void&gt; headUser(@PathVariable Long id) {</w:t>
+      </w:r>
+    </w:p>
+    <w:p>
+      <w:pPr>
+        <w:rPr>
+          <w:color w:val="EE0000"/>
+          <w:sz w:val="22"/>
+          <w:szCs w:val="22"/>
+        </w:rPr>
+      </w:pPr>
+      <w:r>
+        <w:rPr>
+          <w:color w:val="EE0000"/>
+          <w:sz w:val="22"/>
+          <w:szCs w:val="22"/>
+        </w:rPr>
+        <w:t xml:space="preserve">    if (userService.exists(id)) {</w:t>
+      </w:r>
+    </w:p>
+    <w:p>
+      <w:pPr>
+        <w:rPr>
+          <w:color w:val="EE0000"/>
+          <w:sz w:val="22"/>
+          <w:szCs w:val="22"/>
+        </w:rPr>
+      </w:pPr>
+      <w:r>
+        <w:rPr>
+          <w:color w:val="EE0000"/>
+          <w:sz w:val="22"/>
+          <w:szCs w:val="22"/>
+        </w:rPr>
+        <w:t xml:space="preserve">        return ResponseEntity.ok().build();</w:t>
       </w:r>
     </w:p>
     <w:p>
@@ -2796,43 +2202,7 @@
           <w:sz w:val="22"/>
           <w:szCs w:val="22"/>
         </w:rPr>
-        <w:t xml:space="preserve">        return </w:t>
-      </w:r>
-      <w:proofErr w:type="spellStart"/>
-      <w:r>
-        <w:rPr>
-          <w:color w:val="EE0000"/>
-          <w:sz w:val="22"/>
-          <w:szCs w:val="22"/>
-        </w:rPr>
-        <w:t>ResponseEntity.notFound</w:t>
-      </w:r>
-      <w:proofErr w:type="spellEnd"/>
-      <w:r>
-        <w:rPr>
-          <w:color w:val="EE0000"/>
-          <w:sz w:val="22"/>
-          <w:szCs w:val="22"/>
-        </w:rPr>
-        <w:t>(</w:t>
-      </w:r>
-      <w:proofErr w:type="gramStart"/>
-      <w:r>
-        <w:rPr>
-          <w:color w:val="EE0000"/>
-          <w:sz w:val="22"/>
-          <w:szCs w:val="22"/>
-        </w:rPr>
-        <w:t>).build</w:t>
-      </w:r>
-      <w:proofErr w:type="gramEnd"/>
-      <w:r>
-        <w:rPr>
-          <w:color w:val="EE0000"/>
-          <w:sz w:val="22"/>
-          <w:szCs w:val="22"/>
-        </w:rPr>
-        <w:t>();</w:t>
+        <w:t xml:space="preserve">        return ResponseEntity.notFound().build();</w:t>
       </w:r>
     </w:p>
     <w:p>
@@ -3117,25 +2487,7 @@
           <w:sz w:val="22"/>
           <w:szCs w:val="22"/>
         </w:rPr>
-        <w:t xml:space="preserve"> for caching, if the current version matches the version in the client </w:t>
-      </w:r>
-      <w:proofErr w:type="gramStart"/>
-      <w:r>
-        <w:rPr>
-          <w:color w:val="000000" w:themeColor="text1"/>
-          <w:sz w:val="22"/>
-          <w:szCs w:val="22"/>
-        </w:rPr>
-        <w:t>cache</w:t>
-      </w:r>
-      <w:proofErr w:type="gramEnd"/>
-      <w:r>
-        <w:rPr>
-          <w:color w:val="000000" w:themeColor="text1"/>
-          <w:sz w:val="22"/>
-          <w:szCs w:val="22"/>
-        </w:rPr>
-        <w:t xml:space="preserve"> we get this message from the server and no more content. We just use the local version of the request.</w:t>
+        <w:t xml:space="preserve"> for caching, if the current version matches the version in the client cache we get this message from the server and no more content. We just use the local version of the request.</w:t>
       </w:r>
     </w:p>
     <w:p>
@@ -3184,25 +2536,7 @@
           <w:sz w:val="22"/>
           <w:szCs w:val="22"/>
         </w:rPr>
-        <w:t xml:space="preserve">, 400 bad </w:t>
-      </w:r>
-      <w:proofErr w:type="gramStart"/>
-      <w:r>
-        <w:rPr>
-          <w:color w:val="000000" w:themeColor="text1"/>
-          <w:sz w:val="22"/>
-          <w:szCs w:val="22"/>
-        </w:rPr>
-        <w:t>request</w:t>
-      </w:r>
-      <w:proofErr w:type="gramEnd"/>
-      <w:r>
-        <w:rPr>
-          <w:color w:val="000000" w:themeColor="text1"/>
-          <w:sz w:val="22"/>
-          <w:szCs w:val="22"/>
-        </w:rPr>
-        <w:t xml:space="preserve">, the server was not able to understand the request because of invalid syntax. 401 unauthorized -&gt; means requires user authentication. 403 forbidden the client does not have the necessary authorization for the certain resources. </w:t>
+        <w:t xml:space="preserve">, 400 bad request, the server was not able to understand the request because of invalid syntax. 401 unauthorized -&gt; means requires user authentication. 403 forbidden the client does not have the necessary authorization for the certain resources. </w:t>
       </w:r>
     </w:p>
     <w:p>
@@ -3251,25 +2585,7 @@
           <w:sz w:val="22"/>
           <w:szCs w:val="22"/>
         </w:rPr>
-        <w:t xml:space="preserve">, 500 server error when the server has an undefined issue and no more information is known or provided. 503 </w:t>
-      </w:r>
-      <w:proofErr w:type="gramStart"/>
-      <w:r>
-        <w:rPr>
-          <w:color w:val="000000" w:themeColor="text1"/>
-          <w:sz w:val="22"/>
-          <w:szCs w:val="22"/>
-        </w:rPr>
-        <w:t>server</w:t>
-      </w:r>
-      <w:proofErr w:type="gramEnd"/>
-      <w:r>
-        <w:rPr>
-          <w:color w:val="000000" w:themeColor="text1"/>
-          <w:sz w:val="22"/>
-          <w:szCs w:val="22"/>
-        </w:rPr>
-        <w:t xml:space="preserve"> unavailable, which means that the server is down because its overloaded or under maintenance. </w:t>
+        <w:t xml:space="preserve">, 500 server error when the server has an undefined issue and no more information is known or provided. 503 server unavailable, which means that the server is down because its overloaded or under maintenance. </w:t>
       </w:r>
     </w:p>
     <w:p>
@@ -3514,25 +2830,7 @@
           <w:szCs w:val="22"/>
         </w:rPr>
         <w:br/>
-        <w:t>@</w:t>
-      </w:r>
-      <w:proofErr w:type="gramStart"/>
-      <w:r>
-        <w:rPr>
-          <w:color w:val="000000" w:themeColor="text1"/>
-          <w:sz w:val="22"/>
-          <w:szCs w:val="22"/>
-        </w:rPr>
-        <w:t>ResponseStatus(</w:t>
-      </w:r>
-      <w:proofErr w:type="gramEnd"/>
-      <w:r>
-        <w:rPr>
-          <w:color w:val="000000" w:themeColor="text1"/>
-          <w:sz w:val="22"/>
-          <w:szCs w:val="22"/>
-        </w:rPr>
-        <w:t>HttpStatus.CREATED)</w:t>
+        <w:t>@ResponseStatus(HttpStatus.CREATED)</w:t>
       </w:r>
       <w:r>
         <w:rPr>
@@ -3541,35 +2839,7 @@
           <w:szCs w:val="22"/>
         </w:rPr>
         <w:br/>
-        <w:t xml:space="preserve">public User </w:t>
-      </w:r>
-      <w:proofErr w:type="spellStart"/>
-      <w:proofErr w:type="gramStart"/>
-      <w:r>
-        <w:rPr>
-          <w:color w:val="000000" w:themeColor="text1"/>
-          <w:sz w:val="22"/>
-          <w:szCs w:val="22"/>
-        </w:rPr>
-        <w:t>createUser</w:t>
-      </w:r>
-      <w:proofErr w:type="spellEnd"/>
-      <w:r>
-        <w:rPr>
-          <w:color w:val="000000" w:themeColor="text1"/>
-          <w:sz w:val="22"/>
-          <w:szCs w:val="22"/>
-        </w:rPr>
-        <w:t>(</w:t>
-      </w:r>
-      <w:proofErr w:type="gramEnd"/>
-      <w:r>
-        <w:rPr>
-          <w:color w:val="000000" w:themeColor="text1"/>
-          <w:sz w:val="22"/>
-          <w:szCs w:val="22"/>
-        </w:rPr>
-        <w:t>@RequestBody User user) {</w:t>
+        <w:t>public User createUser(@RequestBody User user) {</w:t>
       </w:r>
       <w:r>
         <w:rPr>
@@ -3722,25 +2992,7 @@
           <w:szCs w:val="22"/>
         </w:rPr>
         <w:br/>
-        <w:t>@</w:t>
-      </w:r>
-      <w:proofErr w:type="gramStart"/>
-      <w:r>
-        <w:rPr>
-          <w:color w:val="4472C4" w:themeColor="accent1"/>
-          <w:sz w:val="22"/>
-          <w:szCs w:val="22"/>
-        </w:rPr>
-        <w:t>ResponseStatus(</w:t>
-      </w:r>
-      <w:proofErr w:type="gramEnd"/>
-      <w:r>
-        <w:rPr>
-          <w:color w:val="4472C4" w:themeColor="accent1"/>
-          <w:sz w:val="22"/>
-          <w:szCs w:val="22"/>
-        </w:rPr>
-        <w:t>HttpStatus.</w:t>
+        <w:t>@ResponseStatus(HttpStatus.</w:t>
       </w:r>
       <w:r>
         <w:rPr>
@@ -3800,46 +3052,8 @@
           <w:szCs w:val="22"/>
         </w:rPr>
         <w:br/>
-        <w:t xml:space="preserve">public String </w:t>
-      </w:r>
-      <w:proofErr w:type="spellStart"/>
-      <w:proofErr w:type="gramStart"/>
-      <w:r>
-        <w:rPr>
-          <w:color w:val="4472C4" w:themeColor="accent1"/>
-          <w:sz w:val="22"/>
-          <w:szCs w:val="22"/>
-        </w:rPr>
-        <w:t>printUser</w:t>
-      </w:r>
-      <w:proofErr w:type="spellEnd"/>
-      <w:r>
-        <w:rPr>
-          <w:color w:val="4472C4" w:themeColor="accent1"/>
-          <w:sz w:val="22"/>
-          <w:szCs w:val="22"/>
-        </w:rPr>
-        <w:t>( @</w:t>
-      </w:r>
-      <w:proofErr w:type="gramEnd"/>
-      <w:r>
-        <w:rPr>
-          <w:color w:val="4472C4" w:themeColor="accent1"/>
-          <w:sz w:val="22"/>
-          <w:szCs w:val="22"/>
-        </w:rPr>
-        <w:t xml:space="preserve">RequestBody Order </w:t>
-      </w:r>
-      <w:proofErr w:type="gramStart"/>
-      <w:r>
-        <w:rPr>
-          <w:color w:val="4472C4" w:themeColor="accent1"/>
-          <w:sz w:val="22"/>
-          <w:szCs w:val="22"/>
-        </w:rPr>
-        <w:t>order){</w:t>
-      </w:r>
-      <w:proofErr w:type="gramEnd"/>
+        <w:t>public String printUser( @RequestBody Order order){</w:t>
+      </w:r>
       <w:r>
         <w:rPr>
           <w:color w:val="4472C4" w:themeColor="accent1"/>
@@ -3847,27 +3061,7 @@
           <w:szCs w:val="22"/>
         </w:rPr>
         <w:br/>
-        <w:t xml:space="preserve">    return "welcome the order details are " + </w:t>
-      </w:r>
-      <w:proofErr w:type="spellStart"/>
-      <w:proofErr w:type="gramStart"/>
-      <w:r>
-        <w:rPr>
-          <w:color w:val="4472C4" w:themeColor="accent1"/>
-          <w:sz w:val="22"/>
-          <w:szCs w:val="22"/>
-        </w:rPr>
-        <w:t>order.toString</w:t>
-      </w:r>
-      <w:proofErr w:type="spellEnd"/>
-      <w:proofErr w:type="gramEnd"/>
-      <w:r>
-        <w:rPr>
-          <w:color w:val="4472C4" w:themeColor="accent1"/>
-          <w:sz w:val="22"/>
-          <w:szCs w:val="22"/>
-        </w:rPr>
-        <w:t>();</w:t>
+        <w:t xml:space="preserve">    return "welcome the order details are " + order.toString();</w:t>
       </w:r>
       <w:r>
         <w:rPr>
@@ -3919,43 +3113,7 @@
           <w:sz w:val="22"/>
           <w:szCs w:val="22"/>
         </w:rPr>
-        <w:t xml:space="preserve">After collecting this </w:t>
-      </w:r>
-      <w:proofErr w:type="gramStart"/>
-      <w:r>
-        <w:rPr>
-          <w:color w:val="000000" w:themeColor="text1"/>
-          <w:sz w:val="22"/>
-          <w:szCs w:val="22"/>
-        </w:rPr>
-        <w:t>data</w:t>
-      </w:r>
-      <w:proofErr w:type="gramEnd"/>
-      <w:r>
-        <w:rPr>
-          <w:color w:val="000000" w:themeColor="text1"/>
-          <w:sz w:val="22"/>
-          <w:szCs w:val="22"/>
-        </w:rPr>
-        <w:t xml:space="preserve"> we should then inside the order class map our </w:t>
-      </w:r>
-      <w:proofErr w:type="spellStart"/>
-      <w:r>
-        <w:rPr>
-          <w:color w:val="000000" w:themeColor="text1"/>
-          <w:sz w:val="22"/>
-          <w:szCs w:val="22"/>
-        </w:rPr>
-        <w:t>json</w:t>
-      </w:r>
-      <w:proofErr w:type="spellEnd"/>
-      <w:r>
-        <w:rPr>
-          <w:color w:val="000000" w:themeColor="text1"/>
-          <w:sz w:val="22"/>
-          <w:szCs w:val="22"/>
-        </w:rPr>
-        <w:t xml:space="preserve"> into java variables.</w:t>
+        <w:t>After collecting this data we should then inside the order class map our json into java variables.</w:t>
       </w:r>
     </w:p>
     <w:p>
@@ -4114,159 +3272,41 @@
           <w:sz w:val="22"/>
           <w:szCs w:val="22"/>
         </w:rPr>
-        <w:t xml:space="preserve">Example from the online course: when we were mapping the JSON data from the request body into the </w:t>
-      </w:r>
-      <w:proofErr w:type="gramStart"/>
-      <w:r>
-        <w:rPr>
-          <w:color w:val="000000" w:themeColor="text1"/>
-          <w:sz w:val="22"/>
-          <w:szCs w:val="22"/>
-        </w:rPr>
-        <w:t>class</w:t>
-      </w:r>
-      <w:proofErr w:type="gramEnd"/>
-      <w:r>
-        <w:rPr>
-          <w:color w:val="000000" w:themeColor="text1"/>
-          <w:sz w:val="22"/>
-          <w:szCs w:val="22"/>
-        </w:rPr>
-        <w:t xml:space="preserve"> we were using a class called order, inside this class we mapped the </w:t>
-      </w:r>
-      <w:proofErr w:type="spellStart"/>
-      <w:r>
-        <w:rPr>
-          <w:color w:val="000000" w:themeColor="text1"/>
-          <w:sz w:val="22"/>
-          <w:szCs w:val="22"/>
-        </w:rPr>
-        <w:t>json</w:t>
-      </w:r>
-      <w:proofErr w:type="spellEnd"/>
-      <w:r>
-        <w:rPr>
-          <w:color w:val="000000" w:themeColor="text1"/>
-          <w:sz w:val="22"/>
-          <w:szCs w:val="22"/>
-        </w:rPr>
-        <w:t xml:space="preserve"> variables on the variables of the class, then declared setters and getters. </w:t>
-      </w:r>
-    </w:p>
-    <w:p>
-      <w:pPr>
-        <w:rPr>
-          <w:color w:val="000000" w:themeColor="text1"/>
-          <w:sz w:val="22"/>
-          <w:szCs w:val="22"/>
-        </w:rPr>
-      </w:pPr>
-      <w:r>
-        <w:rPr>
-          <w:color w:val="000000" w:themeColor="text1"/>
-          <w:sz w:val="22"/>
-          <w:szCs w:val="22"/>
-        </w:rPr>
-        <w:t xml:space="preserve">A record class declared as public record </w:t>
-      </w:r>
-      <w:proofErr w:type="gramStart"/>
-      <w:r>
-        <w:rPr>
-          <w:color w:val="000000" w:themeColor="text1"/>
-          <w:sz w:val="22"/>
-          <w:szCs w:val="22"/>
-        </w:rPr>
-        <w:t>order(</w:t>
-      </w:r>
-      <w:proofErr w:type="gramEnd"/>
-      <w:r>
-        <w:rPr>
-          <w:color w:val="000000" w:themeColor="text1"/>
-          <w:sz w:val="22"/>
-          <w:szCs w:val="22"/>
-        </w:rPr>
-        <w:t>variable1, variable2, variable</w:t>
-      </w:r>
-      <w:proofErr w:type="gramStart"/>
-      <w:r>
-        <w:rPr>
-          <w:color w:val="000000" w:themeColor="text1"/>
-          <w:sz w:val="22"/>
-          <w:szCs w:val="22"/>
-        </w:rPr>
-        <w:t>3){</w:t>
-      </w:r>
-      <w:proofErr w:type="gramEnd"/>
-      <w:r>
-        <w:rPr>
-          <w:color w:val="000000" w:themeColor="text1"/>
-          <w:sz w:val="22"/>
-          <w:szCs w:val="22"/>
-        </w:rPr>
-        <w:t>}</w:t>
-      </w:r>
-    </w:p>
-    <w:p>
-      <w:pPr>
-        <w:rPr>
-          <w:color w:val="000000" w:themeColor="text1"/>
-          <w:sz w:val="22"/>
-          <w:szCs w:val="22"/>
-        </w:rPr>
-      </w:pPr>
-      <w:r>
-        <w:rPr>
-          <w:color w:val="000000" w:themeColor="text1"/>
-          <w:sz w:val="22"/>
-          <w:szCs w:val="22"/>
-        </w:rPr>
-        <w:t xml:space="preserve">The record creates setters and getters and </w:t>
-      </w:r>
-      <w:proofErr w:type="spellStart"/>
-      <w:proofErr w:type="gramStart"/>
-      <w:r>
-        <w:rPr>
-          <w:color w:val="000000" w:themeColor="text1"/>
-          <w:sz w:val="22"/>
-          <w:szCs w:val="22"/>
-        </w:rPr>
-        <w:t>toString</w:t>
-      </w:r>
-      <w:proofErr w:type="spellEnd"/>
-      <w:r>
-        <w:rPr>
-          <w:color w:val="000000" w:themeColor="text1"/>
-          <w:sz w:val="22"/>
-          <w:szCs w:val="22"/>
-        </w:rPr>
-        <w:t>(</w:t>
-      </w:r>
-      <w:proofErr w:type="gramEnd"/>
-      <w:r>
-        <w:rPr>
-          <w:color w:val="000000" w:themeColor="text1"/>
-          <w:sz w:val="22"/>
-          <w:szCs w:val="22"/>
-        </w:rPr>
-        <w:t xml:space="preserve">) automatically and maps the </w:t>
-      </w:r>
-      <w:proofErr w:type="spellStart"/>
-      <w:r>
-        <w:rPr>
-          <w:color w:val="000000" w:themeColor="text1"/>
-          <w:sz w:val="22"/>
-          <w:szCs w:val="22"/>
-        </w:rPr>
-        <w:t>json</w:t>
-      </w:r>
-      <w:proofErr w:type="spellEnd"/>
-      <w:r>
-        <w:rPr>
-          <w:color w:val="000000" w:themeColor="text1"/>
-          <w:sz w:val="22"/>
-          <w:szCs w:val="22"/>
-        </w:rPr>
-        <w:t xml:space="preserve"> data on our record.</w:t>
+        <w:t xml:space="preserve">Example from the online course: when we were mapping the JSON data from the request body into the class we were using a class called order, inside this class we mapped the json variables on the variables of the class, then declared setters and getters. </w:t>
+      </w:r>
+    </w:p>
+    <w:p>
+      <w:pPr>
+        <w:rPr>
+          <w:color w:val="000000" w:themeColor="text1"/>
+          <w:sz w:val="22"/>
+          <w:szCs w:val="22"/>
+        </w:rPr>
+      </w:pPr>
+      <w:r>
+        <w:rPr>
+          <w:color w:val="000000" w:themeColor="text1"/>
+          <w:sz w:val="22"/>
+          <w:szCs w:val="22"/>
+        </w:rPr>
+        <w:t>A record class declared as public record order(variable1, variable2, variable3){}</w:t>
+      </w:r>
+    </w:p>
+    <w:p>
+      <w:pPr>
+        <w:rPr>
+          <w:color w:val="000000" w:themeColor="text1"/>
+          <w:sz w:val="22"/>
+          <w:szCs w:val="22"/>
+        </w:rPr>
+      </w:pPr>
+      <w:r>
+        <w:rPr>
+          <w:color w:val="000000" w:themeColor="text1"/>
+          <w:sz w:val="22"/>
+          <w:szCs w:val="22"/>
+        </w:rPr>
+        <w:t>The record creates setters and getters and toString() automatically and maps the json data on our record.</w:t>
       </w:r>
     </w:p>
     <w:p>
@@ -4300,33 +3340,7 @@
           <w:sz w:val="22"/>
           <w:szCs w:val="22"/>
         </w:rPr>
-        <w:t>P</w:t>
-      </w:r>
-      <w:r>
-        <w:rPr>
-          <w:color w:val="4472C4" w:themeColor="accent1"/>
-          <w:sz w:val="22"/>
-          <w:szCs w:val="22"/>
-        </w:rPr>
-        <w:t xml:space="preserve">ublic record </w:t>
-      </w:r>
-      <w:proofErr w:type="spellStart"/>
-      <w:r>
-        <w:rPr>
-          <w:color w:val="4472C4" w:themeColor="accent1"/>
-          <w:sz w:val="22"/>
-          <w:szCs w:val="22"/>
-        </w:rPr>
-        <w:t>OrderRequest</w:t>
-      </w:r>
-      <w:proofErr w:type="spellEnd"/>
-      <w:r>
-        <w:rPr>
-          <w:color w:val="4472C4" w:themeColor="accent1"/>
-          <w:sz w:val="22"/>
-          <w:szCs w:val="22"/>
-        </w:rPr>
-        <w:t>(</w:t>
+        <w:t>Public record OrderRequest(</w:t>
       </w:r>
       <w:r>
         <w:rPr>
@@ -4367,25 +3381,7 @@
           <w:sz w:val="22"/>
           <w:szCs w:val="22"/>
         </w:rPr>
-        <w:t xml:space="preserve">) String </w:t>
-      </w:r>
-      <w:proofErr w:type="spellStart"/>
-      <w:r>
-        <w:rPr>
-          <w:color w:val="4472C4" w:themeColor="accent1"/>
-          <w:sz w:val="22"/>
-          <w:szCs w:val="22"/>
-        </w:rPr>
-        <w:t>customerName</w:t>
-      </w:r>
-      <w:proofErr w:type="spellEnd"/>
-      <w:r>
-        <w:rPr>
-          <w:color w:val="4472C4" w:themeColor="accent1"/>
-          <w:sz w:val="22"/>
-          <w:szCs w:val="22"/>
-        </w:rPr>
-        <w:t>,</w:t>
+        <w:t>) String customerName,</w:t>
       </w:r>
       <w:r>
         <w:rPr>
@@ -4426,25 +3422,7 @@
           <w:sz w:val="22"/>
           <w:szCs w:val="22"/>
         </w:rPr>
-        <w:t xml:space="preserve">) String </w:t>
-      </w:r>
-      <w:proofErr w:type="spellStart"/>
-      <w:r>
-        <w:rPr>
-          <w:color w:val="4472C4" w:themeColor="accent1"/>
-          <w:sz w:val="22"/>
-          <w:szCs w:val="22"/>
-        </w:rPr>
-        <w:t>productName</w:t>
-      </w:r>
-      <w:proofErr w:type="spellEnd"/>
-      <w:r>
-        <w:rPr>
-          <w:color w:val="4472C4" w:themeColor="accent1"/>
-          <w:sz w:val="22"/>
-          <w:szCs w:val="22"/>
-        </w:rPr>
-        <w:t>,</w:t>
+        <w:t>) String productName,</w:t>
       </w:r>
       <w:r>
         <w:rPr>
@@ -4554,35 +3532,7 @@
           <w:sz w:val="22"/>
           <w:szCs w:val="22"/>
         </w:rPr>
-        <w:t xml:space="preserve">public String </w:t>
-      </w:r>
-      <w:proofErr w:type="spellStart"/>
-      <w:proofErr w:type="gramStart"/>
-      <w:r>
-        <w:rPr>
-          <w:color w:val="4472C4" w:themeColor="accent1"/>
-          <w:sz w:val="22"/>
-          <w:szCs w:val="22"/>
-        </w:rPr>
-        <w:t>getOrder</w:t>
-      </w:r>
-      <w:proofErr w:type="spellEnd"/>
-      <w:r>
-        <w:rPr>
-          <w:color w:val="4472C4" w:themeColor="accent1"/>
-          <w:sz w:val="22"/>
-          <w:szCs w:val="22"/>
-        </w:rPr>
-        <w:t>(</w:t>
-      </w:r>
-      <w:proofErr w:type="gramEnd"/>
-      <w:r>
-        <w:rPr>
-          <w:color w:val="4472C4" w:themeColor="accent1"/>
-          <w:sz w:val="22"/>
-          <w:szCs w:val="22"/>
-        </w:rPr>
-        <w:t>@PathVariable int id) {</w:t>
+        <w:t>public String getOrder(@PathVariable int id) {</w:t>
       </w:r>
     </w:p>
     <w:p>
@@ -4641,15 +3591,7 @@
           <w:sz w:val="22"/>
           <w:szCs w:val="22"/>
         </w:rPr>
-        <w:t>Variable as request paramete</w:t>
-      </w:r>
-      <w:r>
-        <w:rPr>
-          <w:color w:val="000000" w:themeColor="text1"/>
-          <w:sz w:val="22"/>
-          <w:szCs w:val="22"/>
-        </w:rPr>
-        <w:t>r</w:t>
+        <w:t>Variable as request parameter</w:t>
       </w:r>
     </w:p>
     <w:p>
@@ -4700,28 +3642,8 @@
           <w:sz w:val="22"/>
           <w:szCs w:val="22"/>
         </w:rPr>
-        <w:t xml:space="preserve">public String </w:t>
-      </w:r>
-      <w:proofErr w:type="spellStart"/>
-      <w:proofErr w:type="gramStart"/>
-      <w:r>
-        <w:rPr>
-          <w:color w:val="4472C4" w:themeColor="accent1"/>
-          <w:sz w:val="22"/>
-          <w:szCs w:val="22"/>
-        </w:rPr>
-        <w:t>getOrder</w:t>
-      </w:r>
-      <w:proofErr w:type="spellEnd"/>
-      <w:r>
-        <w:rPr>
-          <w:color w:val="4472C4" w:themeColor="accent1"/>
-          <w:sz w:val="22"/>
-          <w:szCs w:val="22"/>
-        </w:rPr>
-        <w:t>(</w:t>
-      </w:r>
-      <w:proofErr w:type="gramEnd"/>
+        <w:t>public String getOrder(</w:t>
+      </w:r>
     </w:p>
     <w:p>
       <w:pPr>
@@ -4848,43 +3770,7 @@
           <w:sz w:val="22"/>
           <w:szCs w:val="22"/>
         </w:rPr>
-        <w:t xml:space="preserve">We can have 2 </w:t>
-      </w:r>
-      <w:proofErr w:type="gramStart"/>
-      <w:r>
-        <w:rPr>
-          <w:color w:val="EE0000"/>
-          <w:sz w:val="22"/>
-          <w:szCs w:val="22"/>
-        </w:rPr>
-        <w:t>method</w:t>
-      </w:r>
-      <w:proofErr w:type="gramEnd"/>
-      <w:r>
-        <w:rPr>
-          <w:color w:val="EE0000"/>
-          <w:sz w:val="22"/>
-          <w:szCs w:val="22"/>
-        </w:rPr>
-        <w:t xml:space="preserve"> called /hello but for different methods so one can be </w:t>
-      </w:r>
-      <w:proofErr w:type="gramStart"/>
-      <w:r>
-        <w:rPr>
-          <w:color w:val="EE0000"/>
-          <w:sz w:val="22"/>
-          <w:szCs w:val="22"/>
-        </w:rPr>
-        <w:t>get</w:t>
-      </w:r>
-      <w:proofErr w:type="gramEnd"/>
-      <w:r>
-        <w:rPr>
-          <w:color w:val="EE0000"/>
-          <w:sz w:val="22"/>
-          <w:szCs w:val="22"/>
-        </w:rPr>
-        <w:t xml:space="preserve"> and the other post</w:t>
+        <w:t>We can have 2 method called /hello but for different methods so one can be get and the other post</w:t>
       </w:r>
     </w:p>
     <w:p>
@@ -4980,24 +3866,7 @@
           <w:szCs w:val="22"/>
         </w:rPr>
         <w:tab/>
-      </w:r>
-      <w:proofErr w:type="spellStart"/>
-      <w:r>
-        <w:rPr>
-          <w:color w:val="000000" w:themeColor="text1"/>
-          <w:sz w:val="22"/>
-          <w:szCs w:val="22"/>
-        </w:rPr>
-        <w:t>Datasource</w:t>
-      </w:r>
-      <w:proofErr w:type="spellEnd"/>
-      <w:r>
-        <w:rPr>
-          <w:color w:val="000000" w:themeColor="text1"/>
-          <w:sz w:val="22"/>
-          <w:szCs w:val="22"/>
-        </w:rPr>
-        <w:t>:</w:t>
+        <w:t>Datasource:</w:t>
       </w:r>
     </w:p>
     <w:p>
@@ -5077,18 +3946,8 @@
           <w:szCs w:val="22"/>
         </w:rPr>
         <w:tab/>
-        <w:t xml:space="preserve">driver-class-name: for this we need to add the database dependency of </w:t>
-      </w:r>
-      <w:proofErr w:type="spellStart"/>
-      <w:r>
-        <w:rPr>
-          <w:color w:val="000000" w:themeColor="text1"/>
-          <w:sz w:val="22"/>
-          <w:szCs w:val="22"/>
-        </w:rPr>
-        <w:t>mysql</w:t>
-      </w:r>
-      <w:proofErr w:type="spellEnd"/>
+        <w:t>driver-class-name: for this we need to add the database dependency of mysql</w:t>
+      </w:r>
     </w:p>
     <w:p>
       <w:pPr>
@@ -5283,43 +4142,7 @@
           <w:sz w:val="22"/>
           <w:szCs w:val="22"/>
         </w:rPr>
-        <w:t>@</w:t>
-      </w:r>
-      <w:proofErr w:type="gramStart"/>
-      <w:r>
-        <w:rPr>
-          <w:color w:val="4472C4" w:themeColor="accent1"/>
-          <w:sz w:val="22"/>
-          <w:szCs w:val="22"/>
-        </w:rPr>
-        <w:t>Table(</w:t>
-      </w:r>
-      <w:proofErr w:type="gramEnd"/>
-      <w:r>
-        <w:rPr>
-          <w:color w:val="4472C4" w:themeColor="accent1"/>
-          <w:sz w:val="22"/>
-          <w:szCs w:val="22"/>
-        </w:rPr>
-        <w:t>name = “</w:t>
-      </w:r>
-      <w:proofErr w:type="spellStart"/>
-      <w:r>
-        <w:rPr>
-          <w:color w:val="4472C4" w:themeColor="accent1"/>
-          <w:sz w:val="22"/>
-          <w:szCs w:val="22"/>
-        </w:rPr>
-        <w:t>table_name</w:t>
-      </w:r>
-      <w:proofErr w:type="spellEnd"/>
-      <w:r>
-        <w:rPr>
-          <w:color w:val="4472C4" w:themeColor="accent1"/>
-          <w:sz w:val="22"/>
-          <w:szCs w:val="22"/>
-        </w:rPr>
-        <w:t>”)</w:t>
+        <w:t>@Table(name = “table_name”)</w:t>
       </w:r>
       <w:r>
         <w:rPr>
@@ -5387,43 +4210,7 @@
           <w:sz w:val="22"/>
           <w:szCs w:val="22"/>
         </w:rPr>
-        <w:t>@</w:t>
-      </w:r>
-      <w:proofErr w:type="gramStart"/>
-      <w:r>
-        <w:rPr>
-          <w:color w:val="4472C4" w:themeColor="accent1"/>
-          <w:sz w:val="22"/>
-          <w:szCs w:val="22"/>
-        </w:rPr>
-        <w:t>Column(</w:t>
-      </w:r>
-      <w:proofErr w:type="gramEnd"/>
-      <w:r>
-        <w:rPr>
-          <w:color w:val="4472C4" w:themeColor="accent1"/>
-          <w:sz w:val="22"/>
-          <w:szCs w:val="22"/>
-        </w:rPr>
-        <w:t>name = "</w:t>
-      </w:r>
-      <w:proofErr w:type="spellStart"/>
-      <w:r>
-        <w:rPr>
-          <w:color w:val="4472C4" w:themeColor="accent1"/>
-          <w:sz w:val="22"/>
-          <w:szCs w:val="22"/>
-        </w:rPr>
-        <w:t>email_address</w:t>
-      </w:r>
-      <w:proofErr w:type="spellEnd"/>
-      <w:r>
-        <w:rPr>
-          <w:color w:val="4472C4" w:themeColor="accent1"/>
-          <w:sz w:val="22"/>
-          <w:szCs w:val="22"/>
-        </w:rPr>
-        <w:t>", nullable = false)</w:t>
+        <w:t>@Column(name = "email_address", nullable = false)</w:t>
       </w:r>
       <w:r>
         <w:rPr>
@@ -5449,18 +4236,8 @@
           <w:sz w:val="22"/>
           <w:szCs w:val="22"/>
         </w:rPr>
-        <w:t>@</w:t>
-      </w:r>
-      <w:proofErr w:type="gramStart"/>
-      <w:r>
-        <w:rPr>
-          <w:color w:val="4472C4" w:themeColor="accent1"/>
-          <w:sz w:val="22"/>
-          <w:szCs w:val="22"/>
-        </w:rPr>
-        <w:t>Column(</w:t>
-      </w:r>
-      <w:proofErr w:type="gramEnd"/>
+        <w:t>@Column(</w:t>
+      </w:r>
       <w:r>
         <w:rPr>
           <w:color w:val="4472C4" w:themeColor="accent1"/>
@@ -5468,25 +4245,7 @@
           <w:szCs w:val="22"/>
         </w:rPr>
         <w:br/>
-        <w:t>name = "</w:t>
-      </w:r>
-      <w:proofErr w:type="spellStart"/>
-      <w:r>
-        <w:rPr>
-          <w:color w:val="4472C4" w:themeColor="accent1"/>
-          <w:sz w:val="22"/>
-          <w:szCs w:val="22"/>
-        </w:rPr>
-        <w:t>email_address</w:t>
-      </w:r>
-      <w:proofErr w:type="spellEnd"/>
-      <w:r>
-        <w:rPr>
-          <w:color w:val="4472C4" w:themeColor="accent1"/>
-          <w:sz w:val="22"/>
-          <w:szCs w:val="22"/>
-        </w:rPr>
-        <w:t>",</w:t>
+        <w:t>name = "email_address",</w:t>
       </w:r>
       <w:r>
         <w:rPr>
@@ -5610,18 +4369,8 @@
           <w:szCs w:val="22"/>
         </w:rPr>
         <w:lastRenderedPageBreak/>
-        <w:t>@</w:t>
-      </w:r>
-      <w:proofErr w:type="gramStart"/>
-      <w:r>
-        <w:rPr>
-          <w:color w:val="4472C4" w:themeColor="accent1"/>
-          <w:sz w:val="22"/>
-          <w:szCs w:val="22"/>
-        </w:rPr>
-        <w:t>Table(</w:t>
-      </w:r>
-      <w:proofErr w:type="gramEnd"/>
+        <w:t>@Table(</w:t>
+      </w:r>
     </w:p>
     <w:p>
       <w:pPr>
@@ -5654,78 +4403,24 @@
           <w:sz w:val="22"/>
           <w:szCs w:val="22"/>
         </w:rPr>
-        <w:t xml:space="preserve">    </w:t>
-      </w:r>
-      <w:proofErr w:type="spellStart"/>
-      <w:r>
-        <w:rPr>
-          <w:color w:val="4472C4" w:themeColor="accent1"/>
-          <w:sz w:val="22"/>
-          <w:szCs w:val="22"/>
-        </w:rPr>
-        <w:t>uniqueConstraints</w:t>
-      </w:r>
-      <w:proofErr w:type="spellEnd"/>
-      <w:r>
-        <w:rPr>
-          <w:color w:val="4472C4" w:themeColor="accent1"/>
-          <w:sz w:val="22"/>
-          <w:szCs w:val="22"/>
-        </w:rPr>
-        <w:t xml:space="preserve"> = {</w:t>
-      </w:r>
-    </w:p>
-    <w:p>
-      <w:pPr>
-        <w:rPr>
-          <w:color w:val="4472C4" w:themeColor="accent1"/>
-          <w:sz w:val="22"/>
-          <w:szCs w:val="22"/>
-        </w:rPr>
-      </w:pPr>
-      <w:r>
-        <w:rPr>
-          <w:color w:val="4472C4" w:themeColor="accent1"/>
-          <w:sz w:val="22"/>
-          <w:szCs w:val="22"/>
-        </w:rPr>
-        <w:t xml:space="preserve">        @</w:t>
-      </w:r>
-      <w:proofErr w:type="gramStart"/>
-      <w:r>
-        <w:rPr>
-          <w:color w:val="4472C4" w:themeColor="accent1"/>
-          <w:sz w:val="22"/>
-          <w:szCs w:val="22"/>
-        </w:rPr>
-        <w:t>UniqueConstraint(</w:t>
-      </w:r>
-      <w:proofErr w:type="gramEnd"/>
-      <w:r>
-        <w:rPr>
-          <w:color w:val="4472C4" w:themeColor="accent1"/>
-          <w:sz w:val="22"/>
-          <w:szCs w:val="22"/>
-        </w:rPr>
-        <w:t>columnNames = {"email", "</w:t>
-      </w:r>
-      <w:proofErr w:type="spellStart"/>
-      <w:r>
-        <w:rPr>
-          <w:color w:val="4472C4" w:themeColor="accent1"/>
-          <w:sz w:val="22"/>
-          <w:szCs w:val="22"/>
-        </w:rPr>
-        <w:t>tenant_id</w:t>
-      </w:r>
-      <w:proofErr w:type="spellEnd"/>
-      <w:r>
-        <w:rPr>
-          <w:color w:val="4472C4" w:themeColor="accent1"/>
-          <w:sz w:val="22"/>
-          <w:szCs w:val="22"/>
-        </w:rPr>
-        <w:t>"})</w:t>
+        <w:t xml:space="preserve">    uniqueConstraints = {</w:t>
+      </w:r>
+    </w:p>
+    <w:p>
+      <w:pPr>
+        <w:rPr>
+          <w:color w:val="4472C4" w:themeColor="accent1"/>
+          <w:sz w:val="22"/>
+          <w:szCs w:val="22"/>
+        </w:rPr>
+      </w:pPr>
+      <w:r>
+        <w:rPr>
+          <w:color w:val="4472C4" w:themeColor="accent1"/>
+          <w:sz w:val="22"/>
+          <w:szCs w:val="22"/>
+        </w:rPr>
+        <w:t xml:space="preserve">        @UniqueConstraint(columnNames = {"email", "tenant_id"})</w:t>
       </w:r>
     </w:p>
     <w:p>
@@ -5769,78 +4464,40 @@
         </w:rPr>
         <w:t xml:space="preserve"> </w:t>
       </w:r>
-      <w:proofErr w:type="gramStart"/>
-      <w:r>
-        <w:rPr>
-          <w:color w:val="000000" w:themeColor="text1"/>
-          <w:sz w:val="22"/>
-          <w:szCs w:val="22"/>
-        </w:rPr>
-        <w:t>this</w:t>
-      </w:r>
-      <w:proofErr w:type="gramEnd"/>
-      <w:r>
-        <w:rPr>
-          <w:color w:val="000000" w:themeColor="text1"/>
-          <w:sz w:val="22"/>
-          <w:szCs w:val="22"/>
-        </w:rPr>
-        <w:t xml:space="preserve"> is very strong and it forces the table to have only one email and one </w:t>
-      </w:r>
-      <w:proofErr w:type="spellStart"/>
-      <w:r>
-        <w:rPr>
-          <w:color w:val="000000" w:themeColor="text1"/>
-          <w:sz w:val="22"/>
-          <w:szCs w:val="22"/>
-        </w:rPr>
-        <w:t>tenant_id</w:t>
-      </w:r>
-      <w:proofErr w:type="spellEnd"/>
-      <w:r>
-        <w:rPr>
-          <w:color w:val="000000" w:themeColor="text1"/>
-          <w:sz w:val="22"/>
-          <w:szCs w:val="22"/>
-        </w:rPr>
-        <w:t xml:space="preserve"> per user name</w:t>
-      </w:r>
-    </w:p>
-    <w:p>
-      <w:pPr>
-        <w:rPr>
-          <w:color w:val="000000" w:themeColor="text1"/>
-          <w:sz w:val="22"/>
-          <w:szCs w:val="22"/>
-        </w:rPr>
-      </w:pPr>
-    </w:p>
-    <w:p>
-      <w:pPr>
-        <w:rPr>
-          <w:color w:val="000000" w:themeColor="text1"/>
-          <w:sz w:val="22"/>
-          <w:szCs w:val="22"/>
-        </w:rPr>
-      </w:pPr>
-      <w:r>
-        <w:rPr>
-          <w:color w:val="4472C4" w:themeColor="accent1"/>
-          <w:sz w:val="22"/>
-          <w:szCs w:val="22"/>
-        </w:rPr>
-        <w:t>@Entity @</w:t>
-      </w:r>
-      <w:proofErr w:type="gramStart"/>
-      <w:r>
-        <w:rPr>
-          <w:color w:val="4472C4" w:themeColor="accent1"/>
-          <w:sz w:val="22"/>
-          <w:szCs w:val="22"/>
-        </w:rPr>
-        <w:t>Table</w:t>
-      </w:r>
-      <w:proofErr w:type="gramEnd"/>
+      <w:r>
+        <w:rPr>
+          <w:color w:val="000000" w:themeColor="text1"/>
+          <w:sz w:val="22"/>
+          <w:szCs w:val="22"/>
+        </w:rPr>
+        <w:t>this is very strong and it forces the table to have only one email and one tenant_id per user name</w:t>
+      </w:r>
+    </w:p>
+    <w:p>
+      <w:pPr>
+        <w:rPr>
+          <w:color w:val="000000" w:themeColor="text1"/>
+          <w:sz w:val="22"/>
+          <w:szCs w:val="22"/>
+        </w:rPr>
+      </w:pPr>
+    </w:p>
+    <w:p>
+      <w:pPr>
+        <w:rPr>
+          <w:color w:val="000000" w:themeColor="text1"/>
+          <w:sz w:val="22"/>
+          <w:szCs w:val="22"/>
+        </w:rPr>
+      </w:pPr>
+      <w:r>
+        <w:rPr>
+          <w:color w:val="4472C4" w:themeColor="accent1"/>
+          <w:sz w:val="22"/>
+          <w:szCs w:val="22"/>
+        </w:rPr>
+        <w:t>@Entity @Table</w:t>
+      </w:r>
       <w:r>
         <w:rPr>
           <w:color w:val="000000" w:themeColor="text1"/>
@@ -5985,25 +4642,13 @@
           <w:szCs w:val="22"/>
         </w:rPr>
       </w:pPr>
-      <w:proofErr w:type="spellStart"/>
-      <w:proofErr w:type="gramStart"/>
-      <w:r>
-        <w:rPr>
-          <w:color w:val="000000" w:themeColor="text1"/>
-          <w:sz w:val="22"/>
-          <w:szCs w:val="22"/>
-        </w:rPr>
-        <w:t>user.setId</w:t>
-      </w:r>
-      <w:proofErr w:type="spellEnd"/>
-      <w:proofErr w:type="gramEnd"/>
-      <w:r>
-        <w:rPr>
-          <w:color w:val="000000" w:themeColor="text1"/>
-          <w:sz w:val="22"/>
-          <w:szCs w:val="22"/>
-        </w:rPr>
-        <w:t>(1L);</w:t>
+      <w:r>
+        <w:rPr>
+          <w:color w:val="000000" w:themeColor="text1"/>
+          <w:sz w:val="22"/>
+          <w:szCs w:val="22"/>
+        </w:rPr>
+        <w:t>user.setId(1L);</w:t>
       </w:r>
     </w:p>
     <w:p>
@@ -6046,43 +4691,7 @@
           <w:sz w:val="22"/>
           <w:szCs w:val="22"/>
         </w:rPr>
-        <w:t>@</w:t>
-      </w:r>
-      <w:proofErr w:type="gramStart"/>
-      <w:r>
-        <w:rPr>
-          <w:color w:val="4472C4" w:themeColor="accent1"/>
-          <w:sz w:val="22"/>
-          <w:szCs w:val="22"/>
-        </w:rPr>
-        <w:t>GeneratedValue(</w:t>
-      </w:r>
-      <w:proofErr w:type="gramEnd"/>
-      <w:r>
-        <w:rPr>
-          <w:color w:val="4472C4" w:themeColor="accent1"/>
-          <w:sz w:val="22"/>
-          <w:szCs w:val="22"/>
-        </w:rPr>
-        <w:t xml:space="preserve">strategy = </w:t>
-      </w:r>
-      <w:proofErr w:type="spellStart"/>
-      <w:r>
-        <w:rPr>
-          <w:color w:val="4472C4" w:themeColor="accent1"/>
-          <w:sz w:val="22"/>
-          <w:szCs w:val="22"/>
-        </w:rPr>
-        <w:t>GenerationType.X</w:t>
-      </w:r>
-      <w:proofErr w:type="spellEnd"/>
-      <w:r>
-        <w:rPr>
-          <w:color w:val="4472C4" w:themeColor="accent1"/>
-          <w:sz w:val="22"/>
-          <w:szCs w:val="22"/>
-        </w:rPr>
-        <w:t>)</w:t>
+        <w:t>@GeneratedValue(strategy = GenerationType.X)</w:t>
       </w:r>
     </w:p>
     <w:p>
@@ -6110,79 +4719,50 @@
           <w:szCs w:val="22"/>
         </w:rPr>
       </w:pPr>
-      <w:proofErr w:type="gramStart"/>
-      <w:r>
-        <w:rPr>
-          <w:color w:val="000000" w:themeColor="text1"/>
-          <w:sz w:val="22"/>
-          <w:szCs w:val="22"/>
-        </w:rPr>
-        <w:t>.IDENTITY</w:t>
-      </w:r>
-      <w:proofErr w:type="gramEnd"/>
-      <w:r>
-        <w:rPr>
-          <w:color w:val="000000" w:themeColor="text1"/>
-          <w:sz w:val="22"/>
-          <w:szCs w:val="22"/>
-        </w:rPr>
-        <w:t xml:space="preserve"> is the equivalent of </w:t>
-      </w:r>
-      <w:proofErr w:type="spellStart"/>
-      <w:r>
-        <w:rPr>
-          <w:color w:val="000000" w:themeColor="text1"/>
-          <w:sz w:val="22"/>
-          <w:szCs w:val="22"/>
-        </w:rPr>
-        <w:t>usin</w:t>
-      </w:r>
-      <w:proofErr w:type="spellEnd"/>
-      <w:r>
-        <w:rPr>
-          <w:color w:val="000000" w:themeColor="text1"/>
-          <w:sz w:val="22"/>
-          <w:szCs w:val="22"/>
-        </w:rPr>
-        <w:t xml:space="preserve"> AUTO_INCREMENT in SQL </w:t>
-      </w:r>
-    </w:p>
-    <w:p>
-      <w:pPr>
-        <w:rPr>
-          <w:color w:val="000000" w:themeColor="text1"/>
-          <w:sz w:val="22"/>
-          <w:szCs w:val="22"/>
-        </w:rPr>
-      </w:pPr>
-    </w:p>
-    <w:p>
-      <w:pPr>
-        <w:rPr>
-          <w:color w:val="000000" w:themeColor="text1"/>
-          <w:sz w:val="22"/>
-          <w:szCs w:val="22"/>
-        </w:rPr>
-      </w:pPr>
-    </w:p>
-    <w:p>
-      <w:pPr>
-        <w:rPr>
-          <w:color w:val="000000" w:themeColor="text1"/>
-          <w:sz w:val="22"/>
-          <w:szCs w:val="22"/>
-        </w:rPr>
-      </w:pPr>
-    </w:p>
-    <w:p>
-      <w:pPr>
-        <w:rPr>
-          <w:color w:val="000000" w:themeColor="text1"/>
-          <w:sz w:val="22"/>
-          <w:szCs w:val="22"/>
-        </w:rPr>
-      </w:pPr>
-      <w:proofErr w:type="spellStart"/>
+      <w:r>
+        <w:rPr>
+          <w:color w:val="000000" w:themeColor="text1"/>
+          <w:sz w:val="22"/>
+          <w:szCs w:val="22"/>
+        </w:rPr>
+        <w:t xml:space="preserve">.IDENTITY is the equivalent of usin AUTO_INCREMENT in SQL </w:t>
+      </w:r>
+    </w:p>
+    <w:p>
+      <w:pPr>
+        <w:rPr>
+          <w:color w:val="000000" w:themeColor="text1"/>
+          <w:sz w:val="22"/>
+          <w:szCs w:val="22"/>
+        </w:rPr>
+      </w:pPr>
+    </w:p>
+    <w:p>
+      <w:pPr>
+        <w:rPr>
+          <w:color w:val="000000" w:themeColor="text1"/>
+          <w:sz w:val="22"/>
+          <w:szCs w:val="22"/>
+        </w:rPr>
+      </w:pPr>
+    </w:p>
+    <w:p>
+      <w:pPr>
+        <w:rPr>
+          <w:color w:val="000000" w:themeColor="text1"/>
+          <w:sz w:val="22"/>
+          <w:szCs w:val="22"/>
+        </w:rPr>
+      </w:pPr>
+    </w:p>
+    <w:p>
+      <w:pPr>
+        <w:rPr>
+          <w:color w:val="000000" w:themeColor="text1"/>
+          <w:sz w:val="22"/>
+          <w:szCs w:val="22"/>
+        </w:rPr>
+      </w:pPr>
       <w:r>
         <w:rPr>
           <w:color w:val="000000" w:themeColor="text1"/>
@@ -6190,16 +4770,7 @@
           <w:szCs w:val="22"/>
         </w:rPr>
         <w:lastRenderedPageBreak/>
-        <w:t>Jpa</w:t>
-      </w:r>
-      <w:proofErr w:type="spellEnd"/>
-      <w:r>
-        <w:rPr>
-          <w:color w:val="000000" w:themeColor="text1"/>
-          <w:sz w:val="22"/>
-          <w:szCs w:val="22"/>
-        </w:rPr>
-        <w:t>:</w:t>
+        <w:t>Jpa:</w:t>
       </w:r>
     </w:p>
     <w:p>
@@ -6243,24 +4814,7 @@
           <w:szCs w:val="22"/>
         </w:rPr>
         <w:tab/>
-      </w:r>
-      <w:proofErr w:type="spellStart"/>
-      <w:r>
-        <w:rPr>
-          <w:color w:val="000000" w:themeColor="text1"/>
-          <w:sz w:val="22"/>
-          <w:szCs w:val="22"/>
-        </w:rPr>
-        <w:t>Ddl</w:t>
-      </w:r>
-      <w:proofErr w:type="spellEnd"/>
-      <w:r>
-        <w:rPr>
-          <w:color w:val="000000" w:themeColor="text1"/>
-          <w:sz w:val="22"/>
-          <w:szCs w:val="22"/>
-        </w:rPr>
-        <w:t>-auto: create</w:t>
+        <w:t>Ddl-auto: create</w:t>
       </w:r>
     </w:p>
     <w:p>
@@ -6278,25 +4832,7 @@
           <w:szCs w:val="22"/>
         </w:rPr>
         <w:tab/>
-        <w:t>Show-</w:t>
-      </w:r>
-      <w:proofErr w:type="spellStart"/>
-      <w:r>
-        <w:rPr>
-          <w:color w:val="000000" w:themeColor="text1"/>
-          <w:sz w:val="22"/>
-          <w:szCs w:val="22"/>
-        </w:rPr>
-        <w:t>sql</w:t>
-      </w:r>
-      <w:proofErr w:type="spellEnd"/>
-      <w:r>
-        <w:rPr>
-          <w:color w:val="000000" w:themeColor="text1"/>
-          <w:sz w:val="22"/>
-          <w:szCs w:val="22"/>
-        </w:rPr>
-        <w:t>: true</w:t>
+        <w:t>Show-sql: true</w:t>
       </w:r>
     </w:p>
     <w:p>
@@ -6374,25 +4910,7 @@
           <w:szCs w:val="22"/>
         </w:rPr>
         <w:tab/>
-        <w:t>Format-</w:t>
-      </w:r>
-      <w:proofErr w:type="spellStart"/>
-      <w:r>
-        <w:rPr>
-          <w:color w:val="000000" w:themeColor="text1"/>
-          <w:sz w:val="22"/>
-          <w:szCs w:val="22"/>
-        </w:rPr>
-        <w:t>sql</w:t>
-      </w:r>
-      <w:proofErr w:type="spellEnd"/>
-      <w:r>
-        <w:rPr>
-          <w:color w:val="000000" w:themeColor="text1"/>
-          <w:sz w:val="22"/>
-          <w:szCs w:val="22"/>
-        </w:rPr>
-        <w:t>: true</w:t>
+        <w:t>Format-sql: true</w:t>
       </w:r>
     </w:p>
     <w:p>
@@ -6418,18 +4936,8 @@
           <w:szCs w:val="22"/>
         </w:rPr>
         <w:tab/>
-        <w:t>Database-</w:t>
-      </w:r>
-      <w:proofErr w:type="spellStart"/>
-      <w:r>
-        <w:rPr>
-          <w:color w:val="000000" w:themeColor="text1"/>
-          <w:sz w:val="22"/>
-          <w:szCs w:val="22"/>
-        </w:rPr>
-        <w:t>paltform</w:t>
-      </w:r>
-      <w:proofErr w:type="spellEnd"/>
+        <w:t>Database-paltform</w:t>
+      </w:r>
     </w:p>
     <w:p>
       <w:pPr>
@@ -6452,7 +4960,6 @@
           <w:u w:val="single"/>
         </w:rPr>
       </w:pPr>
-      <w:proofErr w:type="spellStart"/>
       <w:r>
         <w:rPr>
           <w:b/>
@@ -6473,9 +4980,8 @@
           <w:szCs w:val="32"/>
           <w:u w:val="single"/>
         </w:rPr>
-        <w:t>Repository</w:t>
-      </w:r>
-      <w:proofErr w:type="spellEnd"/>
+        <w:t xml:space="preserve">Repository </w:t>
+      </w:r>
       <w:r>
         <w:rPr>
           <w:b/>
@@ -6485,162 +4991,142 @@
           <w:szCs w:val="32"/>
           <w:u w:val="single"/>
         </w:rPr>
-        <w:t xml:space="preserve"> </w:t>
+        <w:t>Interface</w:t>
+      </w:r>
+    </w:p>
+    <w:p>
+      <w:pPr>
+        <w:rPr>
+          <w:color w:val="000000" w:themeColor="text1"/>
+          <w:sz w:val="22"/>
+          <w:szCs w:val="22"/>
+        </w:rPr>
+      </w:pPr>
+      <w:r>
+        <w:rPr>
+          <w:color w:val="000000" w:themeColor="text1"/>
+          <w:sz w:val="22"/>
+          <w:szCs w:val="22"/>
+        </w:rPr>
+        <w:t>The hierarchy is:</w:t>
+      </w:r>
+    </w:p>
+    <w:p>
+      <w:pPr>
+        <w:rPr>
+          <w:color w:val="000000" w:themeColor="text1"/>
+          <w:sz w:val="22"/>
+          <w:szCs w:val="22"/>
+        </w:rPr>
+      </w:pPr>
+      <w:r>
+        <w:rPr>
+          <w:color w:val="000000" w:themeColor="text1"/>
+          <w:sz w:val="22"/>
+          <w:szCs w:val="22"/>
+        </w:rPr>
+        <w:t>Repository (marker interface)</w:t>
+      </w:r>
+      <w:r>
+        <w:rPr>
+          <w:color w:val="000000" w:themeColor="text1"/>
+          <w:sz w:val="22"/>
+          <w:szCs w:val="22"/>
+        </w:rPr>
+        <w:br/>
+        <w:t xml:space="preserve">        ↓</w:t>
+      </w:r>
+      <w:r>
+        <w:rPr>
+          <w:color w:val="000000" w:themeColor="text1"/>
+          <w:sz w:val="22"/>
+          <w:szCs w:val="22"/>
+        </w:rPr>
+        <w:br/>
+        <w:t>CrudRepository</w:t>
+      </w:r>
+      <w:r>
+        <w:rPr>
+          <w:color w:val="000000" w:themeColor="text1"/>
+          <w:sz w:val="22"/>
+          <w:szCs w:val="22"/>
+        </w:rPr>
+        <w:br/>
+        <w:t xml:space="preserve">        ↓</w:t>
+      </w:r>
+      <w:r>
+        <w:rPr>
+          <w:color w:val="000000" w:themeColor="text1"/>
+          <w:sz w:val="22"/>
+          <w:szCs w:val="22"/>
+        </w:rPr>
+        <w:br/>
+        <w:t>PagingAndSortingRepository</w:t>
+      </w:r>
+      <w:r>
+        <w:rPr>
+          <w:color w:val="000000" w:themeColor="text1"/>
+          <w:sz w:val="22"/>
+          <w:szCs w:val="22"/>
+        </w:rPr>
+        <w:br/>
+        <w:t xml:space="preserve">        ↓</w:t>
+      </w:r>
+      <w:r>
+        <w:rPr>
+          <w:color w:val="000000" w:themeColor="text1"/>
+          <w:sz w:val="22"/>
+          <w:szCs w:val="22"/>
+        </w:rPr>
+        <w:br/>
+        <w:t>JpaRepository</w:t>
+      </w:r>
+    </w:p>
+    <w:p>
+      <w:pPr>
+        <w:rPr>
+          <w:color w:val="000000" w:themeColor="text1"/>
+          <w:sz w:val="22"/>
+          <w:szCs w:val="22"/>
+        </w:rPr>
+      </w:pPr>
+      <w:r>
+        <w:rPr>
+          <w:color w:val="000000" w:themeColor="text1"/>
+          <w:sz w:val="22"/>
+          <w:szCs w:val="22"/>
+        </w:rPr>
+        <w:t xml:space="preserve">JpaRepository is the </w:t>
       </w:r>
       <w:r>
         <w:rPr>
           <w:b/>
           <w:bCs/>
-          <w:color w:val="EE0000"/>
-          <w:sz w:val="32"/>
-          <w:szCs w:val="32"/>
-          <w:u w:val="single"/>
-        </w:rPr>
-        <w:t>Interface</w:t>
-      </w:r>
-    </w:p>
-    <w:p>
-      <w:pPr>
-        <w:rPr>
-          <w:color w:val="000000" w:themeColor="text1"/>
-          <w:sz w:val="22"/>
-          <w:szCs w:val="22"/>
-        </w:rPr>
-      </w:pPr>
-      <w:r>
-        <w:rPr>
-          <w:color w:val="000000" w:themeColor="text1"/>
-          <w:sz w:val="22"/>
-          <w:szCs w:val="22"/>
-        </w:rPr>
-        <w:t>The hierarchy is:</w:t>
-      </w:r>
-    </w:p>
-    <w:p>
-      <w:pPr>
-        <w:rPr>
-          <w:color w:val="000000" w:themeColor="text1"/>
-          <w:sz w:val="22"/>
-          <w:szCs w:val="22"/>
-        </w:rPr>
-      </w:pPr>
-      <w:r>
-        <w:rPr>
-          <w:color w:val="000000" w:themeColor="text1"/>
-          <w:sz w:val="22"/>
-          <w:szCs w:val="22"/>
-        </w:rPr>
-        <w:t>Repository (marker interface)</w:t>
-      </w:r>
-      <w:r>
-        <w:rPr>
-          <w:color w:val="000000" w:themeColor="text1"/>
-          <w:sz w:val="22"/>
-          <w:szCs w:val="22"/>
-        </w:rPr>
-        <w:br/>
-        <w:t xml:space="preserve">        ↓</w:t>
-      </w:r>
-      <w:r>
-        <w:rPr>
-          <w:color w:val="000000" w:themeColor="text1"/>
-          <w:sz w:val="22"/>
-          <w:szCs w:val="22"/>
-        </w:rPr>
-        <w:br/>
-      </w:r>
-      <w:proofErr w:type="spellStart"/>
-      <w:r>
-        <w:rPr>
-          <w:color w:val="000000" w:themeColor="text1"/>
-          <w:sz w:val="22"/>
-          <w:szCs w:val="22"/>
-        </w:rPr>
-        <w:t>CrudRepository</w:t>
-      </w:r>
-      <w:proofErr w:type="spellEnd"/>
-      <w:r>
-        <w:rPr>
-          <w:color w:val="000000" w:themeColor="text1"/>
-          <w:sz w:val="22"/>
-          <w:szCs w:val="22"/>
-        </w:rPr>
-        <w:br/>
-        <w:t xml:space="preserve">        ↓</w:t>
-      </w:r>
-      <w:r>
-        <w:rPr>
-          <w:color w:val="000000" w:themeColor="text1"/>
-          <w:sz w:val="22"/>
-          <w:szCs w:val="22"/>
-        </w:rPr>
-        <w:br/>
-      </w:r>
-      <w:proofErr w:type="spellStart"/>
-      <w:r>
-        <w:rPr>
-          <w:color w:val="000000" w:themeColor="text1"/>
-          <w:sz w:val="22"/>
-          <w:szCs w:val="22"/>
-        </w:rPr>
-        <w:t>PagingAndSortingRepository</w:t>
-      </w:r>
-      <w:proofErr w:type="spellEnd"/>
-      <w:r>
-        <w:rPr>
-          <w:color w:val="000000" w:themeColor="text1"/>
-          <w:sz w:val="22"/>
-          <w:szCs w:val="22"/>
-        </w:rPr>
-        <w:br/>
-        <w:t xml:space="preserve">        ↓</w:t>
-      </w:r>
-      <w:r>
-        <w:rPr>
-          <w:color w:val="000000" w:themeColor="text1"/>
-          <w:sz w:val="22"/>
-          <w:szCs w:val="22"/>
-        </w:rPr>
-        <w:br/>
-      </w:r>
-      <w:proofErr w:type="spellStart"/>
-      <w:r>
-        <w:rPr>
-          <w:color w:val="000000" w:themeColor="text1"/>
-          <w:sz w:val="22"/>
-          <w:szCs w:val="22"/>
-        </w:rPr>
-        <w:t>JpaRepository</w:t>
-      </w:r>
-      <w:proofErr w:type="spellEnd"/>
-    </w:p>
-    <w:p>
-      <w:pPr>
-        <w:rPr>
-          <w:color w:val="000000" w:themeColor="text1"/>
-          <w:sz w:val="22"/>
-          <w:szCs w:val="22"/>
-        </w:rPr>
-      </w:pPr>
-      <w:proofErr w:type="spellStart"/>
-      <w:r>
-        <w:rPr>
-          <w:color w:val="000000" w:themeColor="text1"/>
-          <w:sz w:val="22"/>
-          <w:szCs w:val="22"/>
-        </w:rPr>
-        <w:t>JpaRepository</w:t>
-      </w:r>
-      <w:proofErr w:type="spellEnd"/>
-      <w:r>
-        <w:rPr>
-          <w:color w:val="000000" w:themeColor="text1"/>
-          <w:sz w:val="22"/>
-          <w:szCs w:val="22"/>
-        </w:rPr>
-        <w:t xml:space="preserve"> is the </w:t>
-      </w:r>
-      <w:r>
+          <w:color w:val="000000" w:themeColor="text1"/>
+          <w:sz w:val="22"/>
+          <w:szCs w:val="22"/>
+        </w:rPr>
+        <w:t>most feature-complete interface in this chain</w:t>
+      </w:r>
+      <w:r>
+        <w:rPr>
+          <w:color w:val="000000" w:themeColor="text1"/>
+          <w:sz w:val="22"/>
+          <w:szCs w:val="22"/>
+        </w:rPr>
+        <w:t>.</w:t>
+      </w:r>
+      <w:r>
+        <w:rPr>
+          <w:color w:val="000000" w:themeColor="text1"/>
+          <w:sz w:val="22"/>
+          <w:szCs w:val="22"/>
+        </w:rPr>
+        <w:t xml:space="preserve"> It will give us more control, over our repo and the most optioned layer. It a generic interface.</w:t>
+      </w:r>
+    </w:p>
+    <w:p>
+      <w:pPr>
         <w:rPr>
           <w:b/>
           <w:bCs/>
@@ -6648,27 +5134,16 @@
           <w:sz w:val="22"/>
           <w:szCs w:val="22"/>
         </w:rPr>
-        <w:t>most feature-complete interface in this chain</w:t>
-      </w:r>
-      <w:r>
-        <w:rPr>
-          <w:color w:val="000000" w:themeColor="text1"/>
-          <w:sz w:val="22"/>
-          <w:szCs w:val="22"/>
-        </w:rPr>
-        <w:t>.</w:t>
-      </w:r>
-      <w:r>
-        <w:rPr>
-          <w:color w:val="000000" w:themeColor="text1"/>
-          <w:sz w:val="22"/>
-          <w:szCs w:val="22"/>
-        </w:rPr>
-        <w:t xml:space="preserve"> It will give us more control, over our repo and the most optioned layer. It a generic interface.</w:t>
-      </w:r>
-    </w:p>
-    <w:p>
-      <w:pPr>
+      </w:pPr>
+      <w:r>
+        <w:rPr>
+          <w:color w:val="000000" w:themeColor="text1"/>
+          <w:sz w:val="22"/>
+          <w:szCs w:val="22"/>
+        </w:rPr>
+        <w:t>It has all the CRUD operations: C</w:t>
+      </w:r>
+      <w:r>
         <w:rPr>
           <w:b/>
           <w:bCs/>
@@ -6676,35 +5151,8 @@
           <w:sz w:val="22"/>
           <w:szCs w:val="22"/>
         </w:rPr>
-      </w:pPr>
-      <w:r>
-        <w:rPr>
-          <w:color w:val="000000" w:themeColor="text1"/>
-          <w:sz w:val="22"/>
-          <w:szCs w:val="22"/>
-        </w:rPr>
-        <w:t xml:space="preserve">It has all the CRUD operations: </w:t>
-      </w:r>
-      <w:proofErr w:type="spellStart"/>
-      <w:r>
-        <w:rPr>
-          <w:color w:val="000000" w:themeColor="text1"/>
-          <w:sz w:val="22"/>
-          <w:szCs w:val="22"/>
-        </w:rPr>
-        <w:t>C</w:t>
-      </w:r>
-      <w:r>
-        <w:rPr>
-          <w:b/>
-          <w:bCs/>
-          <w:color w:val="000000" w:themeColor="text1"/>
-          <w:sz w:val="22"/>
-          <w:szCs w:val="22"/>
-        </w:rPr>
         <w:t>rudRepository</w:t>
       </w:r>
-      <w:proofErr w:type="spellEnd"/>
     </w:p>
     <w:p>
       <w:pPr>
@@ -6746,24 +5194,7 @@
           <w:szCs w:val="22"/>
         </w:rPr>
         <w:br/>
-      </w:r>
-      <w:proofErr w:type="spellStart"/>
-      <w:r>
-        <w:rPr>
-          <w:color w:val="000000" w:themeColor="text1"/>
-          <w:sz w:val="22"/>
-          <w:szCs w:val="22"/>
-        </w:rPr>
-        <w:t>findById</w:t>
-      </w:r>
-      <w:proofErr w:type="spellEnd"/>
-      <w:r>
-        <w:rPr>
-          <w:color w:val="000000" w:themeColor="text1"/>
-          <w:sz w:val="22"/>
-          <w:szCs w:val="22"/>
-        </w:rPr>
-        <w:t>()</w:t>
+        <w:t>findById()</w:t>
       </w:r>
       <w:r>
         <w:rPr>
@@ -6772,24 +5203,7 @@
           <w:szCs w:val="22"/>
         </w:rPr>
         <w:br/>
-      </w:r>
-      <w:proofErr w:type="spellStart"/>
-      <w:r>
-        <w:rPr>
-          <w:color w:val="000000" w:themeColor="text1"/>
-          <w:sz w:val="22"/>
-          <w:szCs w:val="22"/>
-        </w:rPr>
-        <w:t>findAll</w:t>
-      </w:r>
-      <w:proofErr w:type="spellEnd"/>
-      <w:r>
-        <w:rPr>
-          <w:color w:val="000000" w:themeColor="text1"/>
-          <w:sz w:val="22"/>
-          <w:szCs w:val="22"/>
-        </w:rPr>
-        <w:t>()</w:t>
+        <w:t>findAll()</w:t>
       </w:r>
       <w:r>
         <w:rPr>
@@ -6816,147 +5230,68 @@
           <w:szCs w:val="22"/>
         </w:rPr>
         <w:br/>
-      </w:r>
-      <w:proofErr w:type="spellStart"/>
-      <w:proofErr w:type="gramStart"/>
-      <w:r>
-        <w:rPr>
-          <w:color w:val="000000" w:themeColor="text1"/>
-          <w:sz w:val="22"/>
-          <w:szCs w:val="22"/>
-        </w:rPr>
-        <w:t>existsById</w:t>
-      </w:r>
-      <w:proofErr w:type="spellEnd"/>
-      <w:r>
-        <w:rPr>
-          <w:color w:val="000000" w:themeColor="text1"/>
-          <w:sz w:val="22"/>
-          <w:szCs w:val="22"/>
-        </w:rPr>
-        <w:t>(</w:t>
-      </w:r>
-      <w:proofErr w:type="gramEnd"/>
-      <w:r>
-        <w:rPr>
-          <w:color w:val="000000" w:themeColor="text1"/>
-          <w:sz w:val="22"/>
-          <w:szCs w:val="22"/>
-        </w:rPr>
-        <w:t>)</w:t>
-      </w:r>
-    </w:p>
-    <w:p>
-      <w:pPr>
-        <w:rPr>
-          <w:color w:val="000000" w:themeColor="text1"/>
-          <w:sz w:val="22"/>
-          <w:szCs w:val="22"/>
-        </w:rPr>
-      </w:pPr>
-      <w:proofErr w:type="gramStart"/>
-      <w:r>
-        <w:rPr>
-          <w:color w:val="000000" w:themeColor="text1"/>
-          <w:sz w:val="22"/>
-          <w:szCs w:val="22"/>
-        </w:rPr>
-        <w:t>flush(</w:t>
-      </w:r>
-      <w:proofErr w:type="gramEnd"/>
-      <w:r>
-        <w:rPr>
-          <w:color w:val="000000" w:themeColor="text1"/>
-          <w:sz w:val="22"/>
-          <w:szCs w:val="22"/>
-        </w:rPr>
-        <w:t>)</w:t>
-      </w:r>
-    </w:p>
-    <w:p>
-      <w:pPr>
-        <w:rPr>
-          <w:color w:val="000000" w:themeColor="text1"/>
-          <w:sz w:val="22"/>
-          <w:szCs w:val="22"/>
-        </w:rPr>
-      </w:pPr>
-      <w:proofErr w:type="spellStart"/>
-      <w:proofErr w:type="gramStart"/>
-      <w:r>
-        <w:rPr>
-          <w:color w:val="000000" w:themeColor="text1"/>
-          <w:sz w:val="22"/>
-          <w:szCs w:val="22"/>
-        </w:rPr>
-        <w:t>saveAndFlush</w:t>
-      </w:r>
-      <w:proofErr w:type="spellEnd"/>
-      <w:r>
-        <w:rPr>
-          <w:color w:val="000000" w:themeColor="text1"/>
-          <w:sz w:val="22"/>
-          <w:szCs w:val="22"/>
-        </w:rPr>
-        <w:t>(</w:t>
-      </w:r>
-      <w:proofErr w:type="gramEnd"/>
-      <w:r>
-        <w:rPr>
-          <w:color w:val="000000" w:themeColor="text1"/>
-          <w:sz w:val="22"/>
-          <w:szCs w:val="22"/>
-        </w:rPr>
-        <w:t>)</w:t>
-      </w:r>
-    </w:p>
-    <w:p>
-      <w:pPr>
-        <w:rPr>
-          <w:color w:val="000000" w:themeColor="text1"/>
-          <w:sz w:val="22"/>
-          <w:szCs w:val="22"/>
-        </w:rPr>
-      </w:pPr>
-      <w:proofErr w:type="spellStart"/>
-      <w:proofErr w:type="gramStart"/>
-      <w:r>
-        <w:rPr>
-          <w:color w:val="000000" w:themeColor="text1"/>
-          <w:sz w:val="22"/>
-          <w:szCs w:val="22"/>
-        </w:rPr>
-        <w:t>deleteInBatch</w:t>
-      </w:r>
-      <w:proofErr w:type="spellEnd"/>
-      <w:r>
-        <w:rPr>
-          <w:color w:val="000000" w:themeColor="text1"/>
-          <w:sz w:val="22"/>
-          <w:szCs w:val="22"/>
-        </w:rPr>
-        <w:t>(</w:t>
-      </w:r>
-      <w:proofErr w:type="gramEnd"/>
-      <w:r>
-        <w:rPr>
-          <w:color w:val="000000" w:themeColor="text1"/>
-          <w:sz w:val="22"/>
-          <w:szCs w:val="22"/>
-        </w:rPr>
-        <w:t>)</w:t>
-      </w:r>
-    </w:p>
-    <w:p>
-      <w:pPr>
-        <w:rPr>
-          <w:color w:val="000000" w:themeColor="text1"/>
-          <w:sz w:val="22"/>
-          <w:szCs w:val="22"/>
-        </w:rPr>
-      </w:pPr>
-      <w:proofErr w:type="spellStart"/>
-      <w:proofErr w:type="gramStart"/>
+        <w:t>existsById()</w:t>
+      </w:r>
+    </w:p>
+    <w:p>
+      <w:pPr>
+        <w:rPr>
+          <w:color w:val="000000" w:themeColor="text1"/>
+          <w:sz w:val="22"/>
+          <w:szCs w:val="22"/>
+        </w:rPr>
+      </w:pPr>
+      <w:r>
+        <w:rPr>
+          <w:color w:val="000000" w:themeColor="text1"/>
+          <w:sz w:val="22"/>
+          <w:szCs w:val="22"/>
+        </w:rPr>
+        <w:t>flush()</w:t>
+      </w:r>
+    </w:p>
+    <w:p>
+      <w:pPr>
+        <w:rPr>
+          <w:color w:val="000000" w:themeColor="text1"/>
+          <w:sz w:val="22"/>
+          <w:szCs w:val="22"/>
+        </w:rPr>
+      </w:pPr>
+      <w:r>
+        <w:rPr>
+          <w:color w:val="000000" w:themeColor="text1"/>
+          <w:sz w:val="22"/>
+          <w:szCs w:val="22"/>
+        </w:rPr>
+        <w:t>saveAndFlush()</w:t>
+      </w:r>
+    </w:p>
+    <w:p>
+      <w:pPr>
+        <w:rPr>
+          <w:color w:val="000000" w:themeColor="text1"/>
+          <w:sz w:val="22"/>
+          <w:szCs w:val="22"/>
+        </w:rPr>
+      </w:pPr>
+      <w:r>
+        <w:rPr>
+          <w:color w:val="000000" w:themeColor="text1"/>
+          <w:sz w:val="22"/>
+          <w:szCs w:val="22"/>
+        </w:rPr>
+        <w:t>deleteInBatch()</w:t>
+      </w:r>
+    </w:p>
+    <w:p>
+      <w:pPr>
+        <w:rPr>
+          <w:color w:val="000000" w:themeColor="text1"/>
+          <w:sz w:val="22"/>
+          <w:szCs w:val="22"/>
+        </w:rPr>
+      </w:pPr>
       <w:r>
         <w:rPr>
           <w:color w:val="000000" w:themeColor="text1"/>
@@ -6964,178 +5299,80 @@
           <w:szCs w:val="22"/>
         </w:rPr>
         <w:lastRenderedPageBreak/>
-        <w:t>findAll</w:t>
-      </w:r>
-      <w:proofErr w:type="spellEnd"/>
-      <w:r>
-        <w:rPr>
-          <w:color w:val="000000" w:themeColor="text1"/>
-          <w:sz w:val="22"/>
-          <w:szCs w:val="22"/>
-        </w:rPr>
-        <w:t>(</w:t>
-      </w:r>
-      <w:proofErr w:type="gramEnd"/>
-      <w:r>
-        <w:rPr>
-          <w:color w:val="000000" w:themeColor="text1"/>
-          <w:sz w:val="22"/>
-          <w:szCs w:val="22"/>
-        </w:rPr>
-        <w:t>Specification)</w:t>
-      </w:r>
-    </w:p>
-    <w:p>
-      <w:pPr>
-        <w:rPr>
-          <w:color w:val="000000" w:themeColor="text1"/>
-          <w:sz w:val="22"/>
-          <w:szCs w:val="22"/>
-        </w:rPr>
-      </w:pPr>
-    </w:p>
-    <w:p>
-      <w:pPr>
-        <w:rPr>
-          <w:color w:val="4472C4" w:themeColor="accent1"/>
-        </w:rPr>
-      </w:pPr>
-      <w:proofErr w:type="spellStart"/>
-      <w:r>
-        <w:rPr>
-          <w:color w:val="4472C4" w:themeColor="accent1"/>
-        </w:rPr>
-        <w:t>userRepository.save</w:t>
-      </w:r>
-      <w:proofErr w:type="spellEnd"/>
-      <w:r>
-        <w:rPr>
-          <w:color w:val="4472C4" w:themeColor="accent1"/>
-        </w:rPr>
-        <w:t>(user);</w:t>
-      </w:r>
-    </w:p>
-    <w:p>
-      <w:pPr>
-        <w:rPr>
-          <w:color w:val="000000" w:themeColor="text1"/>
-          <w:sz w:val="22"/>
-          <w:szCs w:val="22"/>
-        </w:rPr>
-      </w:pPr>
-      <w:r>
-        <w:rPr>
-          <w:color w:val="000000" w:themeColor="text1"/>
-          <w:sz w:val="22"/>
-          <w:szCs w:val="22"/>
-        </w:rPr>
-        <w:t xml:space="preserve">what happens here is that </w:t>
-      </w:r>
-      <w:proofErr w:type="spellStart"/>
-      <w:r>
-        <w:rPr>
-          <w:color w:val="000000" w:themeColor="text1"/>
-          <w:sz w:val="22"/>
-          <w:szCs w:val="22"/>
-        </w:rPr>
-        <w:t>JpaRepository</w:t>
-      </w:r>
-      <w:proofErr w:type="spellEnd"/>
-      <w:r>
-        <w:rPr>
-          <w:color w:val="000000" w:themeColor="text1"/>
-          <w:sz w:val="22"/>
-          <w:szCs w:val="22"/>
-        </w:rPr>
-        <w:t xml:space="preserve"> checks whether the user entity object has an already Id if id == null then it creates a row using </w:t>
-      </w:r>
-      <w:proofErr w:type="gramStart"/>
-      <w:r>
-        <w:rPr>
-          <w:color w:val="000000" w:themeColor="text1"/>
-          <w:sz w:val="22"/>
-          <w:szCs w:val="22"/>
-        </w:rPr>
-        <w:t>persist(</w:t>
-      </w:r>
-      <w:proofErr w:type="gramEnd"/>
-      <w:r>
-        <w:rPr>
-          <w:color w:val="000000" w:themeColor="text1"/>
-          <w:sz w:val="22"/>
-          <w:szCs w:val="22"/>
-        </w:rPr>
-        <w:t>), if its untracked and exists meaning that id != null, it calls for merge(). If it exists and is tracked nothing happens.</w:t>
-      </w:r>
-    </w:p>
-    <w:p>
-      <w:pPr>
-        <w:rPr>
-          <w:color w:val="000000" w:themeColor="text1"/>
-          <w:sz w:val="22"/>
-          <w:szCs w:val="22"/>
-        </w:rPr>
-      </w:pPr>
-    </w:p>
-    <w:p>
-      <w:pPr>
-        <w:rPr>
-          <w:color w:val="000000" w:themeColor="text1"/>
-          <w:sz w:val="22"/>
-          <w:szCs w:val="22"/>
-        </w:rPr>
-      </w:pPr>
-      <w:r>
-        <w:rPr>
-          <w:color w:val="000000" w:themeColor="text1"/>
-          <w:sz w:val="22"/>
-          <w:szCs w:val="22"/>
-        </w:rPr>
-        <w:t xml:space="preserve">Optional&lt;User&gt; user = </w:t>
-      </w:r>
-      <w:proofErr w:type="spellStart"/>
-      <w:r>
-        <w:rPr>
-          <w:color w:val="000000" w:themeColor="text1"/>
-          <w:sz w:val="22"/>
-          <w:szCs w:val="22"/>
-        </w:rPr>
-        <w:t>userRepository.findById</w:t>
-      </w:r>
-      <w:proofErr w:type="spellEnd"/>
-      <w:r>
-        <w:rPr>
-          <w:color w:val="000000" w:themeColor="text1"/>
-          <w:sz w:val="22"/>
-          <w:szCs w:val="22"/>
-        </w:rPr>
-        <w:t>(1L);</w:t>
-      </w:r>
-      <w:r>
-        <w:rPr>
-          <w:color w:val="000000" w:themeColor="text1"/>
-          <w:sz w:val="22"/>
-          <w:szCs w:val="22"/>
-        </w:rPr>
-        <w:t xml:space="preserve"> is equivalent to the </w:t>
-      </w:r>
-      <w:proofErr w:type="spellStart"/>
-      <w:r>
-        <w:rPr>
-          <w:color w:val="000000" w:themeColor="text1"/>
-          <w:sz w:val="22"/>
-          <w:szCs w:val="22"/>
-        </w:rPr>
-        <w:t>sql</w:t>
-      </w:r>
-      <w:proofErr w:type="spellEnd"/>
-      <w:r>
-        <w:rPr>
-          <w:color w:val="000000" w:themeColor="text1"/>
-          <w:sz w:val="22"/>
-          <w:szCs w:val="22"/>
-        </w:rPr>
-        <w:t xml:space="preserve"> of</w:t>
+        <w:t>findAll(Specification)</w:t>
+      </w:r>
+    </w:p>
+    <w:p>
+      <w:pPr>
+        <w:rPr>
+          <w:color w:val="000000" w:themeColor="text1"/>
+          <w:sz w:val="22"/>
+          <w:szCs w:val="22"/>
+        </w:rPr>
+      </w:pPr>
+    </w:p>
+    <w:p>
+      <w:pPr>
+        <w:rPr>
+          <w:color w:val="4472C4" w:themeColor="accent1"/>
+        </w:rPr>
+      </w:pPr>
+      <w:r>
+        <w:rPr>
+          <w:color w:val="4472C4" w:themeColor="accent1"/>
+        </w:rPr>
+        <w:t>userRepository.save(user);</w:t>
+      </w:r>
+    </w:p>
+    <w:p>
+      <w:pPr>
+        <w:rPr>
+          <w:color w:val="000000" w:themeColor="text1"/>
+          <w:sz w:val="22"/>
+          <w:szCs w:val="22"/>
+        </w:rPr>
+      </w:pPr>
+      <w:r>
+        <w:rPr>
+          <w:color w:val="000000" w:themeColor="text1"/>
+          <w:sz w:val="22"/>
+          <w:szCs w:val="22"/>
+        </w:rPr>
+        <w:t>what happens here is that JpaRepository checks whether the user entity object has an already Id if id == null then it creates a row using persist(), if its untracked and exists meaning that id != null, it calls for merge(). If it exists and is tracked nothing happens.</w:t>
+      </w:r>
+    </w:p>
+    <w:p>
+      <w:pPr>
+        <w:rPr>
+          <w:color w:val="000000" w:themeColor="text1"/>
+          <w:sz w:val="22"/>
+          <w:szCs w:val="22"/>
+        </w:rPr>
+      </w:pPr>
+    </w:p>
+    <w:p>
+      <w:pPr>
+        <w:rPr>
+          <w:color w:val="000000" w:themeColor="text1"/>
+          <w:sz w:val="22"/>
+          <w:szCs w:val="22"/>
+        </w:rPr>
+      </w:pPr>
+      <w:r>
+        <w:rPr>
+          <w:color w:val="000000" w:themeColor="text1"/>
+          <w:sz w:val="22"/>
+          <w:szCs w:val="22"/>
+        </w:rPr>
+        <w:t>Optional&lt;User&gt; user = userRepository.findById(1L);</w:t>
+      </w:r>
+      <w:r>
+        <w:rPr>
+          <w:color w:val="000000" w:themeColor="text1"/>
+          <w:sz w:val="22"/>
+          <w:szCs w:val="22"/>
+        </w:rPr>
+        <w:t xml:space="preserve"> is equivalent to the sql of</w:t>
       </w:r>
     </w:p>
     <w:p>
@@ -7180,6 +5417,273 @@
         </w:rPr>
         <w:t>@query</w:t>
       </w:r>
+    </w:p>
+    <w:p>
+      <w:pPr>
+        <w:rPr>
+          <w:color w:val="000000" w:themeColor="text1"/>
+          <w:sz w:val="22"/>
+          <w:szCs w:val="22"/>
+        </w:rPr>
+      </w:pPr>
+    </w:p>
+    <w:p>
+      <w:pPr>
+        <w:rPr>
+          <w:color w:val="000000" w:themeColor="text1"/>
+          <w:sz w:val="22"/>
+          <w:szCs w:val="22"/>
+        </w:rPr>
+      </w:pPr>
+    </w:p>
+    <w:p>
+      <w:pPr>
+        <w:rPr>
+          <w:color w:val="000000" w:themeColor="text1"/>
+          <w:sz w:val="22"/>
+          <w:szCs w:val="22"/>
+        </w:rPr>
+      </w:pPr>
+      <w:r>
+        <w:rPr>
+          <w:color w:val="000000" w:themeColor="text1"/>
+          <w:sz w:val="22"/>
+          <w:szCs w:val="22"/>
+        </w:rPr>
+        <w:t xml:space="preserve">To get started with spring jpa we should create an interface of our class that holds the table example: </w:t>
+      </w:r>
+    </w:p>
+    <w:p>
+      <w:pPr>
+        <w:rPr>
+          <w:color w:val="000000" w:themeColor="text1"/>
+          <w:sz w:val="22"/>
+          <w:szCs w:val="22"/>
+        </w:rPr>
+      </w:pPr>
+      <w:r>
+        <w:rPr>
+          <w:color w:val="000000" w:themeColor="text1"/>
+          <w:sz w:val="22"/>
+          <w:szCs w:val="22"/>
+        </w:rPr>
+        <w:t xml:space="preserve">public interface StudentInterface extends JpaRepository &lt;Student, Integer&gt; </w:t>
+      </w:r>
+    </w:p>
+    <w:p>
+      <w:pPr>
+        <w:rPr>
+          <w:color w:val="000000" w:themeColor="text1"/>
+          <w:sz w:val="22"/>
+          <w:szCs w:val="22"/>
+        </w:rPr>
+      </w:pPr>
+      <w:r>
+        <w:rPr>
+          <w:color w:val="000000" w:themeColor="text1"/>
+          <w:sz w:val="22"/>
+          <w:szCs w:val="22"/>
+        </w:rPr>
+        <w:t>here the Student is the class name, and the integer is the Id which is primary key</w:t>
+      </w:r>
+      <w:r>
+        <w:rPr>
+          <w:color w:val="000000" w:themeColor="text1"/>
+          <w:sz w:val="22"/>
+          <w:szCs w:val="22"/>
+        </w:rPr>
+        <w:t xml:space="preserve"> </w:t>
+      </w:r>
+    </w:p>
+    <w:p>
+      <w:pPr>
+        <w:rPr>
+          <w:color w:val="000000" w:themeColor="text1"/>
+          <w:sz w:val="22"/>
+          <w:szCs w:val="22"/>
+        </w:rPr>
+      </w:pPr>
+      <w:r>
+        <w:rPr>
+          <w:color w:val="000000" w:themeColor="text1"/>
+          <w:sz w:val="22"/>
+          <w:szCs w:val="22"/>
+        </w:rPr>
+        <w:t>no annotation needed here for the student jpa interface</w:t>
+      </w:r>
+    </w:p>
+    <w:p>
+      <w:pPr>
+        <w:rPr>
+          <w:color w:val="000000" w:themeColor="text1"/>
+          <w:sz w:val="22"/>
+          <w:szCs w:val="22"/>
+        </w:rPr>
+      </w:pPr>
+      <w:r>
+        <w:rPr>
+          <w:color w:val="000000" w:themeColor="text1"/>
+          <w:sz w:val="22"/>
+          <w:szCs w:val="22"/>
+        </w:rPr>
+        <w:t>to use our interface we should inject it in some component, for this example we inject it in our controller</w:t>
+      </w:r>
+    </w:p>
+    <w:p>
+      <w:pPr>
+        <w:rPr>
+          <w:color w:val="000000" w:themeColor="text1"/>
+          <w:sz w:val="22"/>
+          <w:szCs w:val="22"/>
+        </w:rPr>
+      </w:pPr>
+    </w:p>
+    <w:p>
+      <w:pPr>
+        <w:rPr>
+          <w:color w:val="000000" w:themeColor="text1"/>
+          <w:sz w:val="22"/>
+          <w:szCs w:val="22"/>
+        </w:rPr>
+      </w:pPr>
+      <w:r>
+        <w:rPr>
+          <w:color w:val="000000" w:themeColor="text1"/>
+          <w:sz w:val="22"/>
+          <w:szCs w:val="22"/>
+        </w:rPr>
+        <w:t>to add to our repository we should use repository.save(object) object here is an equivalent of a row</w:t>
+      </w:r>
+    </w:p>
+    <w:p>
+      <w:pPr>
+        <w:rPr>
+          <w:color w:val="000000" w:themeColor="text1"/>
+          <w:sz w:val="22"/>
+          <w:szCs w:val="22"/>
+        </w:rPr>
+      </w:pPr>
+    </w:p>
+    <w:p>
+      <w:pPr>
+        <w:rPr>
+          <w:color w:val="000000" w:themeColor="text1"/>
+          <w:sz w:val="22"/>
+          <w:szCs w:val="22"/>
+        </w:rPr>
+      </w:pPr>
+      <w:r>
+        <w:rPr>
+          <w:color w:val="000000" w:themeColor="text1"/>
+          <w:sz w:val="22"/>
+          <w:szCs w:val="22"/>
+        </w:rPr>
+        <w:t>to find we can use findById</w:t>
+      </w:r>
+    </w:p>
+    <w:p>
+      <w:pPr>
+        <w:rPr>
+          <w:color w:val="000000" w:themeColor="text1"/>
+          <w:sz w:val="22"/>
+          <w:szCs w:val="22"/>
+        </w:rPr>
+      </w:pPr>
+      <w:r>
+        <w:rPr>
+          <w:color w:val="000000" w:themeColor="text1"/>
+          <w:sz w:val="22"/>
+          <w:szCs w:val="22"/>
+        </w:rPr>
+        <w:t>or findall</w:t>
+      </w:r>
+    </w:p>
+    <w:p>
+      <w:pPr>
+        <w:rPr>
+          <w:color w:val="000000" w:themeColor="text1"/>
+          <w:sz w:val="22"/>
+          <w:szCs w:val="22"/>
+        </w:rPr>
+      </w:pPr>
+    </w:p>
+    <w:p>
+      <w:pPr>
+        <w:rPr>
+          <w:color w:val="000000" w:themeColor="text1"/>
+          <w:sz w:val="22"/>
+          <w:szCs w:val="22"/>
+        </w:rPr>
+      </w:pPr>
+      <w:r>
+        <w:rPr>
+          <w:color w:val="000000" w:themeColor="text1"/>
+          <w:sz w:val="22"/>
+          <w:szCs w:val="22"/>
+        </w:rPr>
+        <w:t>to add a new method we can define it in our interface of the repository and the java jpa will create a query for us</w:t>
+      </w:r>
+    </w:p>
+    <w:p>
+      <w:pPr>
+        <w:rPr>
+          <w:color w:val="000000" w:themeColor="text1"/>
+          <w:sz w:val="22"/>
+          <w:szCs w:val="22"/>
+        </w:rPr>
+      </w:pPr>
+      <w:r>
+        <w:rPr>
+          <w:color w:val="000000" w:themeColor="text1"/>
+          <w:sz w:val="22"/>
+          <w:szCs w:val="22"/>
+        </w:rPr>
+        <w:lastRenderedPageBreak/>
+        <w:t>Here's the simple rule for capitalization across your entire Spring Boot application: Java field names start with a lowercase letter (e.g., fName, email, id), and their corresponding getter/setter methods capitalize the field name after get/set (e.g., getFName(), setFName()) — but Spring Data JPA repository methods must match the exact field name starting with lowercase (findByfNameContaining, NOT findByFNameContaining). Database columns via @Column(name = "f_name") can be whatever naming convention you want (usually snake_case). Path variables in @GetMapping like /{name} are independent and just pass values. The only places where capitalization breaks everything are: (1) repository method names must match Java field names exactly (case-sensitive), (2) getters/setters must follow the getFieldName() pattern with capital after get, and (3) JSON responses rely on those getters being correct — everything else (URLs, database columns) is more flexible but keeping consistent lowercase for fields and camelCase for getters avoids confusion.</w:t>
+      </w:r>
+      <w:r>
+        <w:rPr>
+          <w:color w:val="000000" w:themeColor="text1"/>
+          <w:sz w:val="22"/>
+          <w:szCs w:val="22"/>
+        </w:rPr>
+        <w:t xml:space="preserve"> </w:t>
+      </w:r>
+    </w:p>
+    <w:p>
+      <w:pPr>
+        <w:rPr>
+          <w:color w:val="000000" w:themeColor="text1"/>
+          <w:sz w:val="22"/>
+          <w:szCs w:val="22"/>
+        </w:rPr>
+      </w:pPr>
+    </w:p>
+    <w:p>
+      <w:pPr>
+        <w:rPr>
+          <w:color w:val="000000" w:themeColor="text1"/>
+          <w:sz w:val="22"/>
+          <w:szCs w:val="22"/>
+        </w:rPr>
+      </w:pPr>
+      <w:r>
+        <w:rPr>
+          <w:color w:val="000000" w:themeColor="text1"/>
+          <w:sz w:val="22"/>
+          <w:szCs w:val="22"/>
+        </w:rPr>
+        <w:t>@OnetoOne(cascade = cascadetype.al, mappedby = “class_name”l) this means whenever our entity object is deleted the object which its annotated on will also be deleted.</w:t>
+      </w:r>
+    </w:p>
+    <w:p>
+      <w:pPr>
+        <w:rPr>
+          <w:color w:val="000000" w:themeColor="text1"/>
+          <w:sz w:val="22"/>
+          <w:szCs w:val="22"/>
+        </w:rPr>
+      </w:pPr>
     </w:p>
     <w:sectPr>
       <w:pgSz w:w="12240" w:h="15840"/>

</xml_diff>

<commit_message>
add DTO practice and service migration
</commit_message>
<xml_diff>
--- a/Notes.docx
+++ b/Notes.docx
@@ -79,7 +79,25 @@
           <w:sz w:val="22"/>
           <w:szCs w:val="22"/>
         </w:rPr>
-        <w:t xml:space="preserve"> in a normal condition or without spring framework we would need to create an instance(object) of the class and inject it where it should, manage it. This creates tight coupling. However the inversion of control allows spring boot using @Autowired to create an object for us, inject where its needed.</w:t>
+        <w:t xml:space="preserve"> in a normal condition or without spring framework we would need to create an instance(object) of the class and inject it where it should, manage it. This creates tight coupling. However the inversion of control allows spring boot using @Autowired to create an object for us, inject where </w:t>
+      </w:r>
+      <w:proofErr w:type="spellStart"/>
+      <w:r>
+        <w:rPr>
+          <w:color w:val="000000" w:themeColor="text1"/>
+          <w:sz w:val="22"/>
+          <w:szCs w:val="22"/>
+        </w:rPr>
+        <w:t>its</w:t>
+      </w:r>
+      <w:proofErr w:type="spellEnd"/>
+      <w:r>
+        <w:rPr>
+          <w:color w:val="000000" w:themeColor="text1"/>
+          <w:sz w:val="22"/>
+          <w:szCs w:val="22"/>
+        </w:rPr>
+        <w:t xml:space="preserve"> needed.</w:t>
       </w:r>
     </w:p>
     <w:p>
@@ -1318,24 +1336,60 @@
           <w:sz w:val="22"/>
           <w:szCs w:val="22"/>
         </w:rPr>
-        <w:t>Public void printProduct(){}</w:t>
-      </w:r>
-    </w:p>
-    <w:p>
-      <w:pPr>
-        <w:rPr>
-          <w:color w:val="000000" w:themeColor="text1"/>
-          <w:sz w:val="22"/>
-          <w:szCs w:val="22"/>
-        </w:rPr>
-      </w:pPr>
-      <w:r>
-        <w:rPr>
-          <w:color w:val="000000" w:themeColor="text1"/>
-          <w:sz w:val="22"/>
-          <w:szCs w:val="22"/>
-        </w:rPr>
-        <w:t>This annotation is triggered aka mapped into the function its on once the http request of get/users/{id} is accessed it just fetches data from the server and show it to the user its very safe</w:t>
+        <w:t xml:space="preserve">Public void </w:t>
+      </w:r>
+      <w:proofErr w:type="spellStart"/>
+      <w:r>
+        <w:rPr>
+          <w:color w:val="EE0000"/>
+          <w:sz w:val="22"/>
+          <w:szCs w:val="22"/>
+        </w:rPr>
+        <w:t>printProduct</w:t>
+      </w:r>
+      <w:proofErr w:type="spellEnd"/>
+      <w:r>
+        <w:rPr>
+          <w:color w:val="EE0000"/>
+          <w:sz w:val="22"/>
+          <w:szCs w:val="22"/>
+        </w:rPr>
+        <w:t>(){}</w:t>
+      </w:r>
+    </w:p>
+    <w:p>
+      <w:pPr>
+        <w:rPr>
+          <w:color w:val="000000" w:themeColor="text1"/>
+          <w:sz w:val="22"/>
+          <w:szCs w:val="22"/>
+        </w:rPr>
+      </w:pPr>
+      <w:r>
+        <w:rPr>
+          <w:color w:val="000000" w:themeColor="text1"/>
+          <w:sz w:val="22"/>
+          <w:szCs w:val="22"/>
+        </w:rPr>
+        <w:t xml:space="preserve">This annotation is triggered aka mapped into the function </w:t>
+      </w:r>
+      <w:proofErr w:type="spellStart"/>
+      <w:r>
+        <w:rPr>
+          <w:color w:val="000000" w:themeColor="text1"/>
+          <w:sz w:val="22"/>
+          <w:szCs w:val="22"/>
+        </w:rPr>
+        <w:t>its</w:t>
+      </w:r>
+      <w:proofErr w:type="spellEnd"/>
+      <w:r>
+        <w:rPr>
+          <w:color w:val="000000" w:themeColor="text1"/>
+          <w:sz w:val="22"/>
+          <w:szCs w:val="22"/>
+        </w:rPr>
+        <w:t xml:space="preserve"> on once the http request of get/users/{id} is accessed it just fetches data from the server and show it to the user its very safe</w:t>
       </w:r>
     </w:p>
     <w:p>
@@ -1464,7 +1518,25 @@
           <w:szCs w:val="22"/>
         </w:rPr>
         <w:br/>
-        <w:t>public User updateUser(@PathVariable Long id, @RequestBody User user) {</w:t>
+        <w:t xml:space="preserve">public User </w:t>
+      </w:r>
+      <w:proofErr w:type="spellStart"/>
+      <w:r>
+        <w:rPr>
+          <w:color w:val="EE0000"/>
+          <w:sz w:val="22"/>
+          <w:szCs w:val="22"/>
+        </w:rPr>
+        <w:t>updateUser</w:t>
+      </w:r>
+      <w:proofErr w:type="spellEnd"/>
+      <w:r>
+        <w:rPr>
+          <w:color w:val="EE0000"/>
+          <w:sz w:val="22"/>
+          <w:szCs w:val="22"/>
+        </w:rPr>
+        <w:t>(@PathVariable Long id, @RequestBody User user) {</w:t>
       </w:r>
       <w:r>
         <w:rPr>
@@ -1473,7 +1545,25 @@
           <w:szCs w:val="22"/>
         </w:rPr>
         <w:br/>
-        <w:t xml:space="preserve">    user.setId(id);</w:t>
+        <w:t xml:space="preserve">    </w:t>
+      </w:r>
+      <w:proofErr w:type="spellStart"/>
+      <w:r>
+        <w:rPr>
+          <w:color w:val="EE0000"/>
+          <w:sz w:val="22"/>
+          <w:szCs w:val="22"/>
+        </w:rPr>
+        <w:t>user.setId</w:t>
+      </w:r>
+      <w:proofErr w:type="spellEnd"/>
+      <w:r>
+        <w:rPr>
+          <w:color w:val="EE0000"/>
+          <w:sz w:val="22"/>
+          <w:szCs w:val="22"/>
+        </w:rPr>
+        <w:t>(id);</w:t>
       </w:r>
       <w:r>
         <w:rPr>
@@ -1482,7 +1572,25 @@
           <w:szCs w:val="22"/>
         </w:rPr>
         <w:br/>
-        <w:t xml:space="preserve">    return userService.update(user);</w:t>
+        <w:t xml:space="preserve">    return </w:t>
+      </w:r>
+      <w:proofErr w:type="spellStart"/>
+      <w:r>
+        <w:rPr>
+          <w:color w:val="EE0000"/>
+          <w:sz w:val="22"/>
+          <w:szCs w:val="22"/>
+        </w:rPr>
+        <w:t>userService.update</w:t>
+      </w:r>
+      <w:proofErr w:type="spellEnd"/>
+      <w:r>
+        <w:rPr>
+          <w:color w:val="EE0000"/>
+          <w:sz w:val="22"/>
+          <w:szCs w:val="22"/>
+        </w:rPr>
+        <w:t>(user);</w:t>
       </w:r>
       <w:r>
         <w:rPr>
@@ -1650,24 +1758,60 @@
           <w:sz w:val="22"/>
           <w:szCs w:val="22"/>
         </w:rPr>
-        <w:t>public void deleteUser(@PathVariable Long id) {</w:t>
-      </w:r>
-    </w:p>
-    <w:p>
-      <w:pPr>
-        <w:rPr>
-          <w:color w:val="EE0000"/>
-          <w:sz w:val="22"/>
-          <w:szCs w:val="22"/>
-        </w:rPr>
-      </w:pPr>
-      <w:r>
-        <w:rPr>
-          <w:color w:val="EE0000"/>
-          <w:sz w:val="22"/>
-          <w:szCs w:val="22"/>
-        </w:rPr>
-        <w:t xml:space="preserve">    userService.delete(id);</w:t>
+        <w:t xml:space="preserve">public void </w:t>
+      </w:r>
+      <w:proofErr w:type="spellStart"/>
+      <w:r>
+        <w:rPr>
+          <w:color w:val="EE0000"/>
+          <w:sz w:val="22"/>
+          <w:szCs w:val="22"/>
+        </w:rPr>
+        <w:t>deleteUser</w:t>
+      </w:r>
+      <w:proofErr w:type="spellEnd"/>
+      <w:r>
+        <w:rPr>
+          <w:color w:val="EE0000"/>
+          <w:sz w:val="22"/>
+          <w:szCs w:val="22"/>
+        </w:rPr>
+        <w:t>(@PathVariable Long id) {</w:t>
+      </w:r>
+    </w:p>
+    <w:p>
+      <w:pPr>
+        <w:rPr>
+          <w:color w:val="EE0000"/>
+          <w:sz w:val="22"/>
+          <w:szCs w:val="22"/>
+        </w:rPr>
+      </w:pPr>
+      <w:r>
+        <w:rPr>
+          <w:color w:val="EE0000"/>
+          <w:sz w:val="22"/>
+          <w:szCs w:val="22"/>
+        </w:rPr>
+        <w:t xml:space="preserve">    </w:t>
+      </w:r>
+      <w:proofErr w:type="spellStart"/>
+      <w:r>
+        <w:rPr>
+          <w:color w:val="EE0000"/>
+          <w:sz w:val="22"/>
+          <w:szCs w:val="22"/>
+        </w:rPr>
+        <w:t>userService.delete</w:t>
+      </w:r>
+      <w:proofErr w:type="spellEnd"/>
+      <w:r>
+        <w:rPr>
+          <w:color w:val="EE0000"/>
+          <w:sz w:val="22"/>
+          <w:szCs w:val="22"/>
+        </w:rPr>
+        <w:t>(id);</w:t>
       </w:r>
     </w:p>
     <w:p>
@@ -1701,8 +1845,18 @@
           <w:sz w:val="22"/>
           <w:szCs w:val="22"/>
         </w:rPr>
-        <w:t>Is used to remove a resource from the databse</w:t>
-      </w:r>
+        <w:t xml:space="preserve">Is used to remove a resource from the </w:t>
+      </w:r>
+      <w:proofErr w:type="spellStart"/>
+      <w:r>
+        <w:rPr>
+          <w:color w:val="000000" w:themeColor="text1"/>
+          <w:sz w:val="22"/>
+          <w:szCs w:val="22"/>
+        </w:rPr>
+        <w:t>databse</w:t>
+      </w:r>
+      <w:proofErr w:type="spellEnd"/>
     </w:p>
     <w:p>
       <w:pPr>
@@ -1770,24 +1924,60 @@
           <w:sz w:val="22"/>
           <w:szCs w:val="22"/>
         </w:rPr>
-        <w:t>public User patchUser(@PathVariable Long id, @RequestBody Map&lt;String, Object&gt; updates) {</w:t>
-      </w:r>
-    </w:p>
-    <w:p>
-      <w:pPr>
-        <w:rPr>
-          <w:color w:val="EE0000"/>
-          <w:sz w:val="22"/>
-          <w:szCs w:val="22"/>
-        </w:rPr>
-      </w:pPr>
-      <w:r>
-        <w:rPr>
-          <w:color w:val="EE0000"/>
-          <w:sz w:val="22"/>
-          <w:szCs w:val="22"/>
-        </w:rPr>
-        <w:t xml:space="preserve">    return userService.partialUpdate(id, updates);</w:t>
+        <w:t xml:space="preserve">public User </w:t>
+      </w:r>
+      <w:proofErr w:type="spellStart"/>
+      <w:r>
+        <w:rPr>
+          <w:color w:val="EE0000"/>
+          <w:sz w:val="22"/>
+          <w:szCs w:val="22"/>
+        </w:rPr>
+        <w:t>patchUser</w:t>
+      </w:r>
+      <w:proofErr w:type="spellEnd"/>
+      <w:r>
+        <w:rPr>
+          <w:color w:val="EE0000"/>
+          <w:sz w:val="22"/>
+          <w:szCs w:val="22"/>
+        </w:rPr>
+        <w:t>(@PathVariable Long id, @RequestBody Map&lt;String, Object&gt; updates) {</w:t>
+      </w:r>
+    </w:p>
+    <w:p>
+      <w:pPr>
+        <w:rPr>
+          <w:color w:val="EE0000"/>
+          <w:sz w:val="22"/>
+          <w:szCs w:val="22"/>
+        </w:rPr>
+      </w:pPr>
+      <w:r>
+        <w:rPr>
+          <w:color w:val="EE0000"/>
+          <w:sz w:val="22"/>
+          <w:szCs w:val="22"/>
+        </w:rPr>
+        <w:t xml:space="preserve">    return </w:t>
+      </w:r>
+      <w:proofErr w:type="spellStart"/>
+      <w:r>
+        <w:rPr>
+          <w:color w:val="EE0000"/>
+          <w:sz w:val="22"/>
+          <w:szCs w:val="22"/>
+        </w:rPr>
+        <w:t>userService.partialUpdate</w:t>
+      </w:r>
+      <w:proofErr w:type="spellEnd"/>
+      <w:r>
+        <w:rPr>
+          <w:color w:val="EE0000"/>
+          <w:sz w:val="22"/>
+          <w:szCs w:val="22"/>
+        </w:rPr>
+        <w:t>(id, updates);</w:t>
       </w:r>
     </w:p>
     <w:p>
@@ -1890,41 +2080,95 @@
           <w:sz w:val="22"/>
           <w:szCs w:val="22"/>
         </w:rPr>
-        <w:t>@RequestMapping(value = "/users", method = RequestMethod.OPTIONS)</w:t>
-      </w:r>
-    </w:p>
-    <w:p>
-      <w:pPr>
-        <w:rPr>
-          <w:color w:val="EE0000"/>
-          <w:sz w:val="22"/>
-          <w:szCs w:val="22"/>
-        </w:rPr>
-      </w:pPr>
-      <w:r>
-        <w:rPr>
-          <w:color w:val="EE0000"/>
-          <w:sz w:val="22"/>
-          <w:szCs w:val="22"/>
-        </w:rPr>
-        <w:t>public ResponseEntity&lt;?&gt; options() {</w:t>
-      </w:r>
-    </w:p>
-    <w:p>
-      <w:pPr>
-        <w:rPr>
-          <w:color w:val="EE0000"/>
-          <w:sz w:val="22"/>
-          <w:szCs w:val="22"/>
-        </w:rPr>
-      </w:pPr>
-      <w:r>
-        <w:rPr>
-          <w:color w:val="EE0000"/>
-          <w:sz w:val="22"/>
-          <w:szCs w:val="22"/>
-        </w:rPr>
-        <w:t xml:space="preserve">    return ResponseEntity.ok()</w:t>
+        <w:t xml:space="preserve">@RequestMapping(value = "/users", method = </w:t>
+      </w:r>
+      <w:proofErr w:type="spellStart"/>
+      <w:r>
+        <w:rPr>
+          <w:color w:val="EE0000"/>
+          <w:sz w:val="22"/>
+          <w:szCs w:val="22"/>
+        </w:rPr>
+        <w:t>RequestMethod.OPTIONS</w:t>
+      </w:r>
+      <w:proofErr w:type="spellEnd"/>
+      <w:r>
+        <w:rPr>
+          <w:color w:val="EE0000"/>
+          <w:sz w:val="22"/>
+          <w:szCs w:val="22"/>
+        </w:rPr>
+        <w:t>)</w:t>
+      </w:r>
+    </w:p>
+    <w:p>
+      <w:pPr>
+        <w:rPr>
+          <w:color w:val="EE0000"/>
+          <w:sz w:val="22"/>
+          <w:szCs w:val="22"/>
+        </w:rPr>
+      </w:pPr>
+      <w:r>
+        <w:rPr>
+          <w:color w:val="EE0000"/>
+          <w:sz w:val="22"/>
+          <w:szCs w:val="22"/>
+        </w:rPr>
+        <w:t xml:space="preserve">public </w:t>
+      </w:r>
+      <w:proofErr w:type="spellStart"/>
+      <w:r>
+        <w:rPr>
+          <w:color w:val="EE0000"/>
+          <w:sz w:val="22"/>
+          <w:szCs w:val="22"/>
+        </w:rPr>
+        <w:t>ResponseEntity</w:t>
+      </w:r>
+      <w:proofErr w:type="spellEnd"/>
+      <w:r>
+        <w:rPr>
+          <w:color w:val="EE0000"/>
+          <w:sz w:val="22"/>
+          <w:szCs w:val="22"/>
+        </w:rPr>
+        <w:t>&lt;?&gt; options() {</w:t>
+      </w:r>
+    </w:p>
+    <w:p>
+      <w:pPr>
+        <w:rPr>
+          <w:color w:val="EE0000"/>
+          <w:sz w:val="22"/>
+          <w:szCs w:val="22"/>
+        </w:rPr>
+      </w:pPr>
+      <w:r>
+        <w:rPr>
+          <w:color w:val="EE0000"/>
+          <w:sz w:val="22"/>
+          <w:szCs w:val="22"/>
+        </w:rPr>
+        <w:t xml:space="preserve">    return </w:t>
+      </w:r>
+      <w:proofErr w:type="spellStart"/>
+      <w:r>
+        <w:rPr>
+          <w:color w:val="EE0000"/>
+          <w:sz w:val="22"/>
+          <w:szCs w:val="22"/>
+        </w:rPr>
+        <w:t>ResponseEntity.ok</w:t>
+      </w:r>
+      <w:proofErr w:type="spellEnd"/>
+      <w:r>
+        <w:rPr>
+          <w:color w:val="EE0000"/>
+          <w:sz w:val="22"/>
+          <w:szCs w:val="22"/>
+        </w:rPr>
+        <w:t>()</w:t>
       </w:r>
     </w:p>
     <w:p>
@@ -2117,58 +2361,148 @@
           <w:sz w:val="22"/>
           <w:szCs w:val="22"/>
         </w:rPr>
-        <w:t>@RequestMapping(value = "/users/{id}", method = RequestMethod.HEAD)</w:t>
-      </w:r>
-    </w:p>
-    <w:p>
-      <w:pPr>
-        <w:rPr>
-          <w:color w:val="EE0000"/>
-          <w:sz w:val="22"/>
-          <w:szCs w:val="22"/>
-        </w:rPr>
-      </w:pPr>
-      <w:r>
-        <w:rPr>
-          <w:color w:val="EE0000"/>
-          <w:sz w:val="22"/>
-          <w:szCs w:val="22"/>
-        </w:rPr>
-        <w:t>public ResponseEntity&lt;Void&gt; headUser(@PathVariable Long id) {</w:t>
-      </w:r>
-    </w:p>
-    <w:p>
-      <w:pPr>
-        <w:rPr>
-          <w:color w:val="EE0000"/>
-          <w:sz w:val="22"/>
-          <w:szCs w:val="22"/>
-        </w:rPr>
-      </w:pPr>
-      <w:r>
-        <w:rPr>
-          <w:color w:val="EE0000"/>
-          <w:sz w:val="22"/>
-          <w:szCs w:val="22"/>
-        </w:rPr>
-        <w:t xml:space="preserve">    if (userService.exists(id)) {</w:t>
-      </w:r>
-    </w:p>
-    <w:p>
-      <w:pPr>
-        <w:rPr>
-          <w:color w:val="EE0000"/>
-          <w:sz w:val="22"/>
-          <w:szCs w:val="22"/>
-        </w:rPr>
-      </w:pPr>
-      <w:r>
-        <w:rPr>
-          <w:color w:val="EE0000"/>
-          <w:sz w:val="22"/>
-          <w:szCs w:val="22"/>
-        </w:rPr>
-        <w:t xml:space="preserve">        return ResponseEntity.ok().build();</w:t>
+        <w:t xml:space="preserve">@RequestMapping(value = "/users/{id}", method = </w:t>
+      </w:r>
+      <w:proofErr w:type="spellStart"/>
+      <w:r>
+        <w:rPr>
+          <w:color w:val="EE0000"/>
+          <w:sz w:val="22"/>
+          <w:szCs w:val="22"/>
+        </w:rPr>
+        <w:t>RequestMethod.HEAD</w:t>
+      </w:r>
+      <w:proofErr w:type="spellEnd"/>
+      <w:r>
+        <w:rPr>
+          <w:color w:val="EE0000"/>
+          <w:sz w:val="22"/>
+          <w:szCs w:val="22"/>
+        </w:rPr>
+        <w:t>)</w:t>
+      </w:r>
+    </w:p>
+    <w:p>
+      <w:pPr>
+        <w:rPr>
+          <w:color w:val="EE0000"/>
+          <w:sz w:val="22"/>
+          <w:szCs w:val="22"/>
+        </w:rPr>
+      </w:pPr>
+      <w:r>
+        <w:rPr>
+          <w:color w:val="EE0000"/>
+          <w:sz w:val="22"/>
+          <w:szCs w:val="22"/>
+        </w:rPr>
+        <w:t xml:space="preserve">public </w:t>
+      </w:r>
+      <w:proofErr w:type="spellStart"/>
+      <w:r>
+        <w:rPr>
+          <w:color w:val="EE0000"/>
+          <w:sz w:val="22"/>
+          <w:szCs w:val="22"/>
+        </w:rPr>
+        <w:t>ResponseEntity</w:t>
+      </w:r>
+      <w:proofErr w:type="spellEnd"/>
+      <w:r>
+        <w:rPr>
+          <w:color w:val="EE0000"/>
+          <w:sz w:val="22"/>
+          <w:szCs w:val="22"/>
+        </w:rPr>
+        <w:t xml:space="preserve">&lt;Void&gt; </w:t>
+      </w:r>
+      <w:proofErr w:type="spellStart"/>
+      <w:r>
+        <w:rPr>
+          <w:color w:val="EE0000"/>
+          <w:sz w:val="22"/>
+          <w:szCs w:val="22"/>
+        </w:rPr>
+        <w:t>headUser</w:t>
+      </w:r>
+      <w:proofErr w:type="spellEnd"/>
+      <w:r>
+        <w:rPr>
+          <w:color w:val="EE0000"/>
+          <w:sz w:val="22"/>
+          <w:szCs w:val="22"/>
+        </w:rPr>
+        <w:t>(@PathVariable Long id) {</w:t>
+      </w:r>
+    </w:p>
+    <w:p>
+      <w:pPr>
+        <w:rPr>
+          <w:color w:val="EE0000"/>
+          <w:sz w:val="22"/>
+          <w:szCs w:val="22"/>
+        </w:rPr>
+      </w:pPr>
+      <w:r>
+        <w:rPr>
+          <w:color w:val="EE0000"/>
+          <w:sz w:val="22"/>
+          <w:szCs w:val="22"/>
+        </w:rPr>
+        <w:t xml:space="preserve">    if (</w:t>
+      </w:r>
+      <w:proofErr w:type="spellStart"/>
+      <w:r>
+        <w:rPr>
+          <w:color w:val="EE0000"/>
+          <w:sz w:val="22"/>
+          <w:szCs w:val="22"/>
+        </w:rPr>
+        <w:t>userService.exists</w:t>
+      </w:r>
+      <w:proofErr w:type="spellEnd"/>
+      <w:r>
+        <w:rPr>
+          <w:color w:val="EE0000"/>
+          <w:sz w:val="22"/>
+          <w:szCs w:val="22"/>
+        </w:rPr>
+        <w:t>(id)) {</w:t>
+      </w:r>
+    </w:p>
+    <w:p>
+      <w:pPr>
+        <w:rPr>
+          <w:color w:val="EE0000"/>
+          <w:sz w:val="22"/>
+          <w:szCs w:val="22"/>
+        </w:rPr>
+      </w:pPr>
+      <w:r>
+        <w:rPr>
+          <w:color w:val="EE0000"/>
+          <w:sz w:val="22"/>
+          <w:szCs w:val="22"/>
+        </w:rPr>
+        <w:t xml:space="preserve">        return </w:t>
+      </w:r>
+      <w:proofErr w:type="spellStart"/>
+      <w:r>
+        <w:rPr>
+          <w:color w:val="EE0000"/>
+          <w:sz w:val="22"/>
+          <w:szCs w:val="22"/>
+        </w:rPr>
+        <w:t>ResponseEntity.ok</w:t>
+      </w:r>
+      <w:proofErr w:type="spellEnd"/>
+      <w:r>
+        <w:rPr>
+          <w:color w:val="EE0000"/>
+          <w:sz w:val="22"/>
+          <w:szCs w:val="22"/>
+        </w:rPr>
+        <w:t>().build();</w:t>
       </w:r>
     </w:p>
     <w:p>
@@ -2202,7 +2536,25 @@
           <w:sz w:val="22"/>
           <w:szCs w:val="22"/>
         </w:rPr>
-        <w:t xml:space="preserve">        return ResponseEntity.notFound().build();</w:t>
+        <w:t xml:space="preserve">        return </w:t>
+      </w:r>
+      <w:proofErr w:type="spellStart"/>
+      <w:r>
+        <w:rPr>
+          <w:color w:val="EE0000"/>
+          <w:sz w:val="22"/>
+          <w:szCs w:val="22"/>
+        </w:rPr>
+        <w:t>ResponseEntity.notFound</w:t>
+      </w:r>
+      <w:proofErr w:type="spellEnd"/>
+      <w:r>
+        <w:rPr>
+          <w:color w:val="EE0000"/>
+          <w:sz w:val="22"/>
+          <w:szCs w:val="22"/>
+        </w:rPr>
+        <w:t>().build();</w:t>
       </w:r>
     </w:p>
     <w:p>
@@ -2839,7 +3191,25 @@
           <w:szCs w:val="22"/>
         </w:rPr>
         <w:br/>
-        <w:t>public User createUser(@RequestBody User user) {</w:t>
+        <w:t xml:space="preserve">public User </w:t>
+      </w:r>
+      <w:proofErr w:type="spellStart"/>
+      <w:r>
+        <w:rPr>
+          <w:color w:val="000000" w:themeColor="text1"/>
+          <w:sz w:val="22"/>
+          <w:szCs w:val="22"/>
+        </w:rPr>
+        <w:t>createUser</w:t>
+      </w:r>
+      <w:proofErr w:type="spellEnd"/>
+      <w:r>
+        <w:rPr>
+          <w:color w:val="000000" w:themeColor="text1"/>
+          <w:sz w:val="22"/>
+          <w:szCs w:val="22"/>
+        </w:rPr>
+        <w:t>(@RequestBody User user) {</w:t>
       </w:r>
       <w:r>
         <w:rPr>
@@ -2859,15 +3229,6 @@
         <w:br/>
         <w:t>}</w:t>
       </w:r>
-    </w:p>
-    <w:p>
-      <w:pPr>
-        <w:rPr>
-          <w:color w:val="EE0000"/>
-          <w:sz w:val="22"/>
-          <w:szCs w:val="22"/>
-        </w:rPr>
-      </w:pPr>
     </w:p>
     <w:p>
       <w:pPr>
@@ -3052,7 +3413,25 @@
           <w:szCs w:val="22"/>
         </w:rPr>
         <w:br/>
-        <w:t>public String printUser( @RequestBody Order order){</w:t>
+        <w:t xml:space="preserve">public String </w:t>
+      </w:r>
+      <w:proofErr w:type="spellStart"/>
+      <w:r>
+        <w:rPr>
+          <w:color w:val="4472C4" w:themeColor="accent1"/>
+          <w:sz w:val="22"/>
+          <w:szCs w:val="22"/>
+        </w:rPr>
+        <w:t>printUser</w:t>
+      </w:r>
+      <w:proofErr w:type="spellEnd"/>
+      <w:r>
+        <w:rPr>
+          <w:color w:val="4472C4" w:themeColor="accent1"/>
+          <w:sz w:val="22"/>
+          <w:szCs w:val="22"/>
+        </w:rPr>
+        <w:t>( @RequestBody Order order){</w:t>
       </w:r>
       <w:r>
         <w:rPr>
@@ -3061,7 +3440,25 @@
           <w:szCs w:val="22"/>
         </w:rPr>
         <w:br/>
-        <w:t xml:space="preserve">    return "welcome the order details are " + order.toString();</w:t>
+        <w:t xml:space="preserve">    return "welcome the order details are " + </w:t>
+      </w:r>
+      <w:proofErr w:type="spellStart"/>
+      <w:r>
+        <w:rPr>
+          <w:color w:val="4472C4" w:themeColor="accent1"/>
+          <w:sz w:val="22"/>
+          <w:szCs w:val="22"/>
+        </w:rPr>
+        <w:t>order.toString</w:t>
+      </w:r>
+      <w:proofErr w:type="spellEnd"/>
+      <w:r>
+        <w:rPr>
+          <w:color w:val="4472C4" w:themeColor="accent1"/>
+          <w:sz w:val="22"/>
+          <w:szCs w:val="22"/>
+        </w:rPr>
+        <w:t>();</w:t>
       </w:r>
       <w:r>
         <w:rPr>
@@ -3087,8 +3484,17 @@
           <w:sz w:val="22"/>
           <w:szCs w:val="22"/>
         </w:rPr>
-        <w:t xml:space="preserve">To explain the dynamics, here we have a post (create new user or data), and we just take the data from the user and printing it no logic is happening in the backend, the @RequestBody is the </w:t>
-      </w:r>
+        <w:t>To explain the dynamics, here we have a post (create new user or data), and we just take the data from the user and printing it no logic is happening in the backend, the @RequestBody is the focus. The request body tells the Spring boot that we will be passing data in the http request body and this data should be changed from JSON into JAVA object called order</w:t>
+      </w:r>
+    </w:p>
+    <w:p>
+      <w:pPr>
+        <w:rPr>
+          <w:color w:val="000000" w:themeColor="text1"/>
+          <w:sz w:val="22"/>
+          <w:szCs w:val="22"/>
+        </w:rPr>
+      </w:pPr>
       <w:r>
         <w:rPr>
           <w:color w:val="000000" w:themeColor="text1"/>
@@ -3096,24 +3502,25 @@
           <w:szCs w:val="22"/>
         </w:rPr>
         <w:lastRenderedPageBreak/>
-        <w:t>focus. The request body tells the Spring boot that we will be passing data in the http request body and this data should be changed from JSON into JAVA object called order</w:t>
-      </w:r>
-    </w:p>
-    <w:p>
-      <w:pPr>
-        <w:rPr>
-          <w:color w:val="000000" w:themeColor="text1"/>
-          <w:sz w:val="22"/>
-          <w:szCs w:val="22"/>
-        </w:rPr>
-      </w:pPr>
-      <w:r>
-        <w:rPr>
-          <w:color w:val="000000" w:themeColor="text1"/>
-          <w:sz w:val="22"/>
-          <w:szCs w:val="22"/>
-        </w:rPr>
-        <w:t>After collecting this data we should then inside the order class map our json into java variables.</w:t>
+        <w:t xml:space="preserve">After collecting this data we should then inside the order class map our </w:t>
+      </w:r>
+      <w:proofErr w:type="spellStart"/>
+      <w:r>
+        <w:rPr>
+          <w:color w:val="000000" w:themeColor="text1"/>
+          <w:sz w:val="22"/>
+          <w:szCs w:val="22"/>
+        </w:rPr>
+        <w:t>json</w:t>
+      </w:r>
+      <w:proofErr w:type="spellEnd"/>
+      <w:r>
+        <w:rPr>
+          <w:color w:val="000000" w:themeColor="text1"/>
+          <w:sz w:val="22"/>
+          <w:szCs w:val="22"/>
+        </w:rPr>
+        <w:t xml:space="preserve"> into java variables.</w:t>
       </w:r>
     </w:p>
     <w:p>
@@ -3272,7 +3679,25 @@
           <w:sz w:val="22"/>
           <w:szCs w:val="22"/>
         </w:rPr>
-        <w:t xml:space="preserve">Example from the online course: when we were mapping the JSON data from the request body into the class we were using a class called order, inside this class we mapped the json variables on the variables of the class, then declared setters and getters. </w:t>
+        <w:t xml:space="preserve">Example from the online course: when we were mapping the JSON data from the request body into the class we were using a class called order, inside this class we mapped the </w:t>
+      </w:r>
+      <w:proofErr w:type="spellStart"/>
+      <w:r>
+        <w:rPr>
+          <w:color w:val="000000" w:themeColor="text1"/>
+          <w:sz w:val="22"/>
+          <w:szCs w:val="22"/>
+        </w:rPr>
+        <w:t>json</w:t>
+      </w:r>
+      <w:proofErr w:type="spellEnd"/>
+      <w:r>
+        <w:rPr>
+          <w:color w:val="000000" w:themeColor="text1"/>
+          <w:sz w:val="22"/>
+          <w:szCs w:val="22"/>
+        </w:rPr>
+        <w:t xml:space="preserve"> variables on the variables of the class, then declared setters and getters. </w:t>
       </w:r>
     </w:p>
     <w:p>
@@ -3306,7 +3731,43 @@
           <w:sz w:val="22"/>
           <w:szCs w:val="22"/>
         </w:rPr>
-        <w:t>The record creates setters and getters and toString() automatically and maps the json data on our record.</w:t>
+        <w:t xml:space="preserve">The record creates setters and getters and </w:t>
+      </w:r>
+      <w:proofErr w:type="spellStart"/>
+      <w:r>
+        <w:rPr>
+          <w:color w:val="000000" w:themeColor="text1"/>
+          <w:sz w:val="22"/>
+          <w:szCs w:val="22"/>
+        </w:rPr>
+        <w:t>toString</w:t>
+      </w:r>
+      <w:proofErr w:type="spellEnd"/>
+      <w:r>
+        <w:rPr>
+          <w:color w:val="000000" w:themeColor="text1"/>
+          <w:sz w:val="22"/>
+          <w:szCs w:val="22"/>
+        </w:rPr>
+        <w:t xml:space="preserve">() automatically and maps the </w:t>
+      </w:r>
+      <w:proofErr w:type="spellStart"/>
+      <w:r>
+        <w:rPr>
+          <w:color w:val="000000" w:themeColor="text1"/>
+          <w:sz w:val="22"/>
+          <w:szCs w:val="22"/>
+        </w:rPr>
+        <w:t>json</w:t>
+      </w:r>
+      <w:proofErr w:type="spellEnd"/>
+      <w:r>
+        <w:rPr>
+          <w:color w:val="000000" w:themeColor="text1"/>
+          <w:sz w:val="22"/>
+          <w:szCs w:val="22"/>
+        </w:rPr>
+        <w:t xml:space="preserve"> data on our record.</w:t>
       </w:r>
     </w:p>
     <w:p>
@@ -3340,7 +3801,25 @@
           <w:sz w:val="22"/>
           <w:szCs w:val="22"/>
         </w:rPr>
-        <w:t>Public record OrderRequest(</w:t>
+        <w:t xml:space="preserve">Public record </w:t>
+      </w:r>
+      <w:proofErr w:type="spellStart"/>
+      <w:r>
+        <w:rPr>
+          <w:color w:val="4472C4" w:themeColor="accent1"/>
+          <w:sz w:val="22"/>
+          <w:szCs w:val="22"/>
+        </w:rPr>
+        <w:t>OrderRequest</w:t>
+      </w:r>
+      <w:proofErr w:type="spellEnd"/>
+      <w:r>
+        <w:rPr>
+          <w:color w:val="4472C4" w:themeColor="accent1"/>
+          <w:sz w:val="22"/>
+          <w:szCs w:val="22"/>
+        </w:rPr>
+        <w:t>(</w:t>
       </w:r>
       <w:r>
         <w:rPr>
@@ -3381,7 +3860,25 @@
           <w:sz w:val="22"/>
           <w:szCs w:val="22"/>
         </w:rPr>
-        <w:t>) String customerName,</w:t>
+        <w:t xml:space="preserve">) String </w:t>
+      </w:r>
+      <w:proofErr w:type="spellStart"/>
+      <w:r>
+        <w:rPr>
+          <w:color w:val="4472C4" w:themeColor="accent1"/>
+          <w:sz w:val="22"/>
+          <w:szCs w:val="22"/>
+        </w:rPr>
+        <w:t>customerName</w:t>
+      </w:r>
+      <w:proofErr w:type="spellEnd"/>
+      <w:r>
+        <w:rPr>
+          <w:color w:val="4472C4" w:themeColor="accent1"/>
+          <w:sz w:val="22"/>
+          <w:szCs w:val="22"/>
+        </w:rPr>
+        <w:t>,</w:t>
       </w:r>
       <w:r>
         <w:rPr>
@@ -3422,7 +3919,25 @@
           <w:sz w:val="22"/>
           <w:szCs w:val="22"/>
         </w:rPr>
-        <w:t>) String productName,</w:t>
+        <w:t xml:space="preserve">) String </w:t>
+      </w:r>
+      <w:proofErr w:type="spellStart"/>
+      <w:r>
+        <w:rPr>
+          <w:color w:val="4472C4" w:themeColor="accent1"/>
+          <w:sz w:val="22"/>
+          <w:szCs w:val="22"/>
+        </w:rPr>
+        <w:t>productName</w:t>
+      </w:r>
+      <w:proofErr w:type="spellEnd"/>
+      <w:r>
+        <w:rPr>
+          <w:color w:val="4472C4" w:themeColor="accent1"/>
+          <w:sz w:val="22"/>
+          <w:szCs w:val="22"/>
+        </w:rPr>
+        <w:t>,</w:t>
       </w:r>
       <w:r>
         <w:rPr>
@@ -3532,7 +4047,25 @@
           <w:sz w:val="22"/>
           <w:szCs w:val="22"/>
         </w:rPr>
-        <w:t>public String getOrder(@PathVariable int id) {</w:t>
+        <w:t xml:space="preserve">public String </w:t>
+      </w:r>
+      <w:proofErr w:type="spellStart"/>
+      <w:r>
+        <w:rPr>
+          <w:color w:val="4472C4" w:themeColor="accent1"/>
+          <w:sz w:val="22"/>
+          <w:szCs w:val="22"/>
+        </w:rPr>
+        <w:t>getOrder</w:t>
+      </w:r>
+      <w:proofErr w:type="spellEnd"/>
+      <w:r>
+        <w:rPr>
+          <w:color w:val="4472C4" w:themeColor="accent1"/>
+          <w:sz w:val="22"/>
+          <w:szCs w:val="22"/>
+        </w:rPr>
+        <w:t>(@PathVariable int id) {</w:t>
       </w:r>
     </w:p>
     <w:p>
@@ -3573,24 +4106,24 @@
           <w:szCs w:val="32"/>
           <w:u w:val="single"/>
         </w:rPr>
+        <w:t>@RequestParam</w:t>
+      </w:r>
+    </w:p>
+    <w:p>
+      <w:pPr>
+        <w:rPr>
+          <w:color w:val="000000" w:themeColor="text1"/>
+          <w:sz w:val="22"/>
+          <w:szCs w:val="22"/>
+        </w:rPr>
+      </w:pPr>
+      <w:r>
+        <w:rPr>
+          <w:color w:val="000000" w:themeColor="text1"/>
+          <w:sz w:val="22"/>
+          <w:szCs w:val="22"/>
+        </w:rPr>
         <w:lastRenderedPageBreak/>
-        <w:t>@RequestParam</w:t>
-      </w:r>
-    </w:p>
-    <w:p>
-      <w:pPr>
-        <w:rPr>
-          <w:color w:val="000000" w:themeColor="text1"/>
-          <w:sz w:val="22"/>
-          <w:szCs w:val="22"/>
-        </w:rPr>
-      </w:pPr>
-      <w:r>
-        <w:rPr>
-          <w:color w:val="000000" w:themeColor="text1"/>
-          <w:sz w:val="22"/>
-          <w:szCs w:val="22"/>
-        </w:rPr>
         <w:t>Variable as request parameter</w:t>
       </w:r>
     </w:p>
@@ -3642,7 +4175,25 @@
           <w:sz w:val="22"/>
           <w:szCs w:val="22"/>
         </w:rPr>
-        <w:t>public String getOrder(</w:t>
+        <w:t xml:space="preserve">public String </w:t>
+      </w:r>
+      <w:proofErr w:type="spellStart"/>
+      <w:r>
+        <w:rPr>
+          <w:color w:val="4472C4" w:themeColor="accent1"/>
+          <w:sz w:val="22"/>
+          <w:szCs w:val="22"/>
+        </w:rPr>
+        <w:t>getOrder</w:t>
+      </w:r>
+      <w:proofErr w:type="spellEnd"/>
+      <w:r>
+        <w:rPr>
+          <w:color w:val="4472C4" w:themeColor="accent1"/>
+          <w:sz w:val="22"/>
+          <w:szCs w:val="22"/>
+        </w:rPr>
+        <w:t>(</w:t>
       </w:r>
     </w:p>
     <w:p>
@@ -3866,7 +4417,24 @@
           <w:szCs w:val="22"/>
         </w:rPr>
         <w:tab/>
-        <w:t>Datasource:</w:t>
+      </w:r>
+      <w:proofErr w:type="spellStart"/>
+      <w:r>
+        <w:rPr>
+          <w:color w:val="000000" w:themeColor="text1"/>
+          <w:sz w:val="22"/>
+          <w:szCs w:val="22"/>
+        </w:rPr>
+        <w:t>Datasource</w:t>
+      </w:r>
+      <w:proofErr w:type="spellEnd"/>
+      <w:r>
+        <w:rPr>
+          <w:color w:val="000000" w:themeColor="text1"/>
+          <w:sz w:val="22"/>
+          <w:szCs w:val="22"/>
+        </w:rPr>
+        <w:t>:</w:t>
       </w:r>
     </w:p>
     <w:p>
@@ -3946,8 +4514,27 @@
           <w:szCs w:val="22"/>
         </w:rPr>
         <w:tab/>
-        <w:t>driver-class-name: for this we need to add the database dependency of mysql</w:t>
-      </w:r>
+        <w:t xml:space="preserve">driver-class-name: for this we need to add the database dependency of </w:t>
+      </w:r>
+      <w:proofErr w:type="spellStart"/>
+      <w:r>
+        <w:rPr>
+          <w:color w:val="000000" w:themeColor="text1"/>
+          <w:sz w:val="22"/>
+          <w:szCs w:val="22"/>
+        </w:rPr>
+        <w:t>mysql</w:t>
+      </w:r>
+      <w:proofErr w:type="spellEnd"/>
+    </w:p>
+    <w:p>
+      <w:pPr>
+        <w:rPr>
+          <w:color w:val="000000" w:themeColor="text1"/>
+          <w:sz w:val="22"/>
+          <w:szCs w:val="22"/>
+        </w:rPr>
+      </w:pPr>
     </w:p>
     <w:p>
       <w:pPr>
@@ -4142,7 +4729,25 @@
           <w:sz w:val="22"/>
           <w:szCs w:val="22"/>
         </w:rPr>
-        <w:t>@Table(name = “table_name”)</w:t>
+        <w:t>@Table(name = “</w:t>
+      </w:r>
+      <w:proofErr w:type="spellStart"/>
+      <w:r>
+        <w:rPr>
+          <w:color w:val="4472C4" w:themeColor="accent1"/>
+          <w:sz w:val="22"/>
+          <w:szCs w:val="22"/>
+        </w:rPr>
+        <w:t>table_name</w:t>
+      </w:r>
+      <w:proofErr w:type="spellEnd"/>
+      <w:r>
+        <w:rPr>
+          <w:color w:val="4472C4" w:themeColor="accent1"/>
+          <w:sz w:val="22"/>
+          <w:szCs w:val="22"/>
+        </w:rPr>
+        <w:t>”)</w:t>
       </w:r>
       <w:r>
         <w:rPr>
@@ -4210,7 +4815,25 @@
           <w:sz w:val="22"/>
           <w:szCs w:val="22"/>
         </w:rPr>
-        <w:t>@Column(name = "email_address", nullable = false)</w:t>
+        <w:t>@Column(name = "</w:t>
+      </w:r>
+      <w:proofErr w:type="spellStart"/>
+      <w:r>
+        <w:rPr>
+          <w:color w:val="4472C4" w:themeColor="accent1"/>
+          <w:sz w:val="22"/>
+          <w:szCs w:val="22"/>
+        </w:rPr>
+        <w:t>email_address</w:t>
+      </w:r>
+      <w:proofErr w:type="spellEnd"/>
+      <w:r>
+        <w:rPr>
+          <w:color w:val="4472C4" w:themeColor="accent1"/>
+          <w:sz w:val="22"/>
+          <w:szCs w:val="22"/>
+        </w:rPr>
+        <w:t>", nullable = false)</w:t>
       </w:r>
       <w:r>
         <w:rPr>
@@ -4245,7 +4868,25 @@
           <w:szCs w:val="22"/>
         </w:rPr>
         <w:br/>
-        <w:t>name = "email_address",</w:t>
+        <w:t>name = "</w:t>
+      </w:r>
+      <w:proofErr w:type="spellStart"/>
+      <w:r>
+        <w:rPr>
+          <w:color w:val="4472C4" w:themeColor="accent1"/>
+          <w:sz w:val="22"/>
+          <w:szCs w:val="22"/>
+        </w:rPr>
+        <w:t>email_address</w:t>
+      </w:r>
+      <w:proofErr w:type="spellEnd"/>
+      <w:r>
+        <w:rPr>
+          <w:color w:val="4472C4" w:themeColor="accent1"/>
+          <w:sz w:val="22"/>
+          <w:szCs w:val="22"/>
+        </w:rPr>
+        <w:t>",</w:t>
       </w:r>
       <w:r>
         <w:rPr>
@@ -4403,24 +5044,60 @@
           <w:sz w:val="22"/>
           <w:szCs w:val="22"/>
         </w:rPr>
-        <w:t xml:space="preserve">    uniqueConstraints = {</w:t>
-      </w:r>
-    </w:p>
-    <w:p>
-      <w:pPr>
-        <w:rPr>
-          <w:color w:val="4472C4" w:themeColor="accent1"/>
-          <w:sz w:val="22"/>
-          <w:szCs w:val="22"/>
-        </w:rPr>
-      </w:pPr>
-      <w:r>
-        <w:rPr>
-          <w:color w:val="4472C4" w:themeColor="accent1"/>
-          <w:sz w:val="22"/>
-          <w:szCs w:val="22"/>
-        </w:rPr>
-        <w:t xml:space="preserve">        @UniqueConstraint(columnNames = {"email", "tenant_id"})</w:t>
+        <w:t xml:space="preserve">    </w:t>
+      </w:r>
+      <w:proofErr w:type="spellStart"/>
+      <w:r>
+        <w:rPr>
+          <w:color w:val="4472C4" w:themeColor="accent1"/>
+          <w:sz w:val="22"/>
+          <w:szCs w:val="22"/>
+        </w:rPr>
+        <w:t>uniqueConstraints</w:t>
+      </w:r>
+      <w:proofErr w:type="spellEnd"/>
+      <w:r>
+        <w:rPr>
+          <w:color w:val="4472C4" w:themeColor="accent1"/>
+          <w:sz w:val="22"/>
+          <w:szCs w:val="22"/>
+        </w:rPr>
+        <w:t xml:space="preserve"> = {</w:t>
+      </w:r>
+    </w:p>
+    <w:p>
+      <w:pPr>
+        <w:rPr>
+          <w:color w:val="4472C4" w:themeColor="accent1"/>
+          <w:sz w:val="22"/>
+          <w:szCs w:val="22"/>
+        </w:rPr>
+      </w:pPr>
+      <w:r>
+        <w:rPr>
+          <w:color w:val="4472C4" w:themeColor="accent1"/>
+          <w:sz w:val="22"/>
+          <w:szCs w:val="22"/>
+        </w:rPr>
+        <w:t xml:space="preserve">        @UniqueConstraint(columnNames = {"email", "</w:t>
+      </w:r>
+      <w:proofErr w:type="spellStart"/>
+      <w:r>
+        <w:rPr>
+          <w:color w:val="4472C4" w:themeColor="accent1"/>
+          <w:sz w:val="22"/>
+          <w:szCs w:val="22"/>
+        </w:rPr>
+        <w:t>tenant_id</w:t>
+      </w:r>
+      <w:proofErr w:type="spellEnd"/>
+      <w:r>
+        <w:rPr>
+          <w:color w:val="4472C4" w:themeColor="accent1"/>
+          <w:sz w:val="22"/>
+          <w:szCs w:val="22"/>
+        </w:rPr>
+        <w:t>"})</w:t>
       </w:r>
     </w:p>
     <w:p>
@@ -4470,7 +5147,25 @@
           <w:sz w:val="22"/>
           <w:szCs w:val="22"/>
         </w:rPr>
-        <w:t>this is very strong and it forces the table to have only one email and one tenant_id per user name</w:t>
+        <w:t xml:space="preserve">this is very strong and it forces the table to have only one email and one </w:t>
+      </w:r>
+      <w:proofErr w:type="spellStart"/>
+      <w:r>
+        <w:rPr>
+          <w:color w:val="000000" w:themeColor="text1"/>
+          <w:sz w:val="22"/>
+          <w:szCs w:val="22"/>
+        </w:rPr>
+        <w:t>tenant_id</w:t>
+      </w:r>
+      <w:proofErr w:type="spellEnd"/>
+      <w:r>
+        <w:rPr>
+          <w:color w:val="000000" w:themeColor="text1"/>
+          <w:sz w:val="22"/>
+          <w:szCs w:val="22"/>
+        </w:rPr>
+        <w:t xml:space="preserve"> per user name</w:t>
       </w:r>
     </w:p>
     <w:p>
@@ -4642,13 +5337,23 @@
           <w:szCs w:val="22"/>
         </w:rPr>
       </w:pPr>
-      <w:r>
-        <w:rPr>
-          <w:color w:val="000000" w:themeColor="text1"/>
-          <w:sz w:val="22"/>
-          <w:szCs w:val="22"/>
-        </w:rPr>
-        <w:t>user.setId(1L);</w:t>
+      <w:proofErr w:type="spellStart"/>
+      <w:r>
+        <w:rPr>
+          <w:color w:val="000000" w:themeColor="text1"/>
+          <w:sz w:val="22"/>
+          <w:szCs w:val="22"/>
+        </w:rPr>
+        <w:t>user.setId</w:t>
+      </w:r>
+      <w:proofErr w:type="spellEnd"/>
+      <w:r>
+        <w:rPr>
+          <w:color w:val="000000" w:themeColor="text1"/>
+          <w:sz w:val="22"/>
+          <w:szCs w:val="22"/>
+        </w:rPr>
+        <w:t>(1L);</w:t>
       </w:r>
     </w:p>
     <w:p>
@@ -4691,7 +5396,25 @@
           <w:sz w:val="22"/>
           <w:szCs w:val="22"/>
         </w:rPr>
-        <w:t>@GeneratedValue(strategy = GenerationType.X)</w:t>
+        <w:t xml:space="preserve">@GeneratedValue(strategy = </w:t>
+      </w:r>
+      <w:proofErr w:type="spellStart"/>
+      <w:r>
+        <w:rPr>
+          <w:color w:val="4472C4" w:themeColor="accent1"/>
+          <w:sz w:val="22"/>
+          <w:szCs w:val="22"/>
+        </w:rPr>
+        <w:t>GenerationType.X</w:t>
+      </w:r>
+      <w:proofErr w:type="spellEnd"/>
+      <w:r>
+        <w:rPr>
+          <w:color w:val="4472C4" w:themeColor="accent1"/>
+          <w:sz w:val="22"/>
+          <w:szCs w:val="22"/>
+        </w:rPr>
+        <w:t>)</w:t>
       </w:r>
     </w:p>
     <w:p>
@@ -4725,44 +5448,63 @@
           <w:sz w:val="22"/>
           <w:szCs w:val="22"/>
         </w:rPr>
-        <w:t xml:space="preserve">.IDENTITY is the equivalent of usin AUTO_INCREMENT in SQL </w:t>
-      </w:r>
-    </w:p>
-    <w:p>
-      <w:pPr>
-        <w:rPr>
-          <w:color w:val="000000" w:themeColor="text1"/>
-          <w:sz w:val="22"/>
-          <w:szCs w:val="22"/>
-        </w:rPr>
-      </w:pPr>
-    </w:p>
-    <w:p>
-      <w:pPr>
-        <w:rPr>
-          <w:color w:val="000000" w:themeColor="text1"/>
-          <w:sz w:val="22"/>
-          <w:szCs w:val="22"/>
-        </w:rPr>
-      </w:pPr>
-    </w:p>
-    <w:p>
-      <w:pPr>
-        <w:rPr>
-          <w:color w:val="000000" w:themeColor="text1"/>
-          <w:sz w:val="22"/>
-          <w:szCs w:val="22"/>
-        </w:rPr>
-      </w:pPr>
-    </w:p>
-    <w:p>
-      <w:pPr>
-        <w:rPr>
-          <w:color w:val="000000" w:themeColor="text1"/>
-          <w:sz w:val="22"/>
-          <w:szCs w:val="22"/>
-        </w:rPr>
-      </w:pPr>
+        <w:t xml:space="preserve">.IDENTITY is the equivalent of </w:t>
+      </w:r>
+      <w:proofErr w:type="spellStart"/>
+      <w:r>
+        <w:rPr>
+          <w:color w:val="000000" w:themeColor="text1"/>
+          <w:sz w:val="22"/>
+          <w:szCs w:val="22"/>
+        </w:rPr>
+        <w:t>usin</w:t>
+      </w:r>
+      <w:proofErr w:type="spellEnd"/>
+      <w:r>
+        <w:rPr>
+          <w:color w:val="000000" w:themeColor="text1"/>
+          <w:sz w:val="22"/>
+          <w:szCs w:val="22"/>
+        </w:rPr>
+        <w:t xml:space="preserve"> AUTO_INCREMENT in SQL </w:t>
+      </w:r>
+    </w:p>
+    <w:p>
+      <w:pPr>
+        <w:rPr>
+          <w:color w:val="000000" w:themeColor="text1"/>
+          <w:sz w:val="22"/>
+          <w:szCs w:val="22"/>
+        </w:rPr>
+      </w:pPr>
+    </w:p>
+    <w:p>
+      <w:pPr>
+        <w:rPr>
+          <w:color w:val="000000" w:themeColor="text1"/>
+          <w:sz w:val="22"/>
+          <w:szCs w:val="22"/>
+        </w:rPr>
+      </w:pPr>
+    </w:p>
+    <w:p>
+      <w:pPr>
+        <w:rPr>
+          <w:color w:val="000000" w:themeColor="text1"/>
+          <w:sz w:val="22"/>
+          <w:szCs w:val="22"/>
+        </w:rPr>
+      </w:pPr>
+    </w:p>
+    <w:p>
+      <w:pPr>
+        <w:rPr>
+          <w:color w:val="000000" w:themeColor="text1"/>
+          <w:sz w:val="22"/>
+          <w:szCs w:val="22"/>
+        </w:rPr>
+      </w:pPr>
+      <w:proofErr w:type="spellStart"/>
       <w:r>
         <w:rPr>
           <w:color w:val="000000" w:themeColor="text1"/>
@@ -4770,7 +5512,16 @@
           <w:szCs w:val="22"/>
         </w:rPr>
         <w:lastRenderedPageBreak/>
-        <w:t>Jpa:</w:t>
+        <w:t>Jpa</w:t>
+      </w:r>
+      <w:proofErr w:type="spellEnd"/>
+      <w:r>
+        <w:rPr>
+          <w:color w:val="000000" w:themeColor="text1"/>
+          <w:sz w:val="22"/>
+          <w:szCs w:val="22"/>
+        </w:rPr>
+        <w:t>:</w:t>
       </w:r>
     </w:p>
     <w:p>
@@ -4814,7 +5565,24 @@
           <w:szCs w:val="22"/>
         </w:rPr>
         <w:tab/>
-        <w:t>Ddl-auto: create</w:t>
+      </w:r>
+      <w:proofErr w:type="spellStart"/>
+      <w:r>
+        <w:rPr>
+          <w:color w:val="000000" w:themeColor="text1"/>
+          <w:sz w:val="22"/>
+          <w:szCs w:val="22"/>
+        </w:rPr>
+        <w:t>Ddl</w:t>
+      </w:r>
+      <w:proofErr w:type="spellEnd"/>
+      <w:r>
+        <w:rPr>
+          <w:color w:val="000000" w:themeColor="text1"/>
+          <w:sz w:val="22"/>
+          <w:szCs w:val="22"/>
+        </w:rPr>
+        <w:t>-auto: create</w:t>
       </w:r>
     </w:p>
     <w:p>
@@ -4832,7 +5600,25 @@
           <w:szCs w:val="22"/>
         </w:rPr>
         <w:tab/>
-        <w:t>Show-sql: true</w:t>
+        <w:t>Show-</w:t>
+      </w:r>
+      <w:proofErr w:type="spellStart"/>
+      <w:r>
+        <w:rPr>
+          <w:color w:val="000000" w:themeColor="text1"/>
+          <w:sz w:val="22"/>
+          <w:szCs w:val="22"/>
+        </w:rPr>
+        <w:t>sql</w:t>
+      </w:r>
+      <w:proofErr w:type="spellEnd"/>
+      <w:r>
+        <w:rPr>
+          <w:color w:val="000000" w:themeColor="text1"/>
+          <w:sz w:val="22"/>
+          <w:szCs w:val="22"/>
+        </w:rPr>
+        <w:t>: true</w:t>
       </w:r>
     </w:p>
     <w:p>
@@ -4910,7 +5696,25 @@
           <w:szCs w:val="22"/>
         </w:rPr>
         <w:tab/>
-        <w:t>Format-sql: true</w:t>
+        <w:t>Format-</w:t>
+      </w:r>
+      <w:proofErr w:type="spellStart"/>
+      <w:r>
+        <w:rPr>
+          <w:color w:val="000000" w:themeColor="text1"/>
+          <w:sz w:val="22"/>
+          <w:szCs w:val="22"/>
+        </w:rPr>
+        <w:t>sql</w:t>
+      </w:r>
+      <w:proofErr w:type="spellEnd"/>
+      <w:r>
+        <w:rPr>
+          <w:color w:val="000000" w:themeColor="text1"/>
+          <w:sz w:val="22"/>
+          <w:szCs w:val="22"/>
+        </w:rPr>
+        <w:t>: true</w:t>
       </w:r>
     </w:p>
     <w:p>
@@ -4936,8 +5740,18 @@
           <w:szCs w:val="22"/>
         </w:rPr>
         <w:tab/>
-        <w:t>Database-paltform</w:t>
-      </w:r>
+        <w:t>Database-</w:t>
+      </w:r>
+      <w:proofErr w:type="spellStart"/>
+      <w:r>
+        <w:rPr>
+          <w:color w:val="000000" w:themeColor="text1"/>
+          <w:sz w:val="22"/>
+          <w:szCs w:val="22"/>
+        </w:rPr>
+        <w:t>paltform</w:t>
+      </w:r>
+      <w:proofErr w:type="spellEnd"/>
     </w:p>
     <w:p>
       <w:pPr>
@@ -4960,6 +5774,7 @@
           <w:u w:val="single"/>
         </w:rPr>
       </w:pPr>
+      <w:proofErr w:type="spellStart"/>
       <w:r>
         <w:rPr>
           <w:b/>
@@ -4980,8 +5795,9 @@
           <w:szCs w:val="32"/>
           <w:u w:val="single"/>
         </w:rPr>
-        <w:t xml:space="preserve">Repository </w:t>
-      </w:r>
+        <w:t>Repository</w:t>
+      </w:r>
+      <w:proofErr w:type="spellEnd"/>
       <w:r>
         <w:rPr>
           <w:b/>
@@ -4991,6 +5807,17 @@
           <w:szCs w:val="32"/>
           <w:u w:val="single"/>
         </w:rPr>
+        <w:t xml:space="preserve"> </w:t>
+      </w:r>
+      <w:r>
+        <w:rPr>
+          <w:b/>
+          <w:bCs/>
+          <w:color w:val="EE0000"/>
+          <w:sz w:val="32"/>
+          <w:szCs w:val="32"/>
+          <w:u w:val="single"/>
+        </w:rPr>
         <w:t>Interface</w:t>
       </w:r>
     </w:p>
@@ -5043,8 +5870,17 @@
           <w:szCs w:val="22"/>
         </w:rPr>
         <w:br/>
+      </w:r>
+      <w:proofErr w:type="spellStart"/>
+      <w:r>
+        <w:rPr>
+          <w:color w:val="000000" w:themeColor="text1"/>
+          <w:sz w:val="22"/>
+          <w:szCs w:val="22"/>
+        </w:rPr>
         <w:t>CrudRepository</w:t>
       </w:r>
+      <w:proofErr w:type="spellEnd"/>
       <w:r>
         <w:rPr>
           <w:color w:val="000000" w:themeColor="text1"/>
@@ -5061,8 +5897,17 @@
           <w:szCs w:val="22"/>
         </w:rPr>
         <w:br/>
+      </w:r>
+      <w:proofErr w:type="spellStart"/>
+      <w:r>
+        <w:rPr>
+          <w:color w:val="000000" w:themeColor="text1"/>
+          <w:sz w:val="22"/>
+          <w:szCs w:val="22"/>
+        </w:rPr>
         <w:t>PagingAndSortingRepository</w:t>
       </w:r>
+      <w:proofErr w:type="spellEnd"/>
       <w:r>
         <w:rPr>
           <w:color w:val="000000" w:themeColor="text1"/>
@@ -5079,24 +5924,43 @@
           <w:szCs w:val="22"/>
         </w:rPr>
         <w:br/>
+      </w:r>
+      <w:proofErr w:type="spellStart"/>
+      <w:r>
+        <w:rPr>
+          <w:color w:val="000000" w:themeColor="text1"/>
+          <w:sz w:val="22"/>
+          <w:szCs w:val="22"/>
+        </w:rPr>
         <w:t>JpaRepository</w:t>
       </w:r>
-    </w:p>
-    <w:p>
-      <w:pPr>
-        <w:rPr>
-          <w:color w:val="000000" w:themeColor="text1"/>
-          <w:sz w:val="22"/>
-          <w:szCs w:val="22"/>
-        </w:rPr>
-      </w:pPr>
-      <w:r>
-        <w:rPr>
-          <w:color w:val="000000" w:themeColor="text1"/>
-          <w:sz w:val="22"/>
-          <w:szCs w:val="22"/>
-        </w:rPr>
-        <w:t xml:space="preserve">JpaRepository is the </w:t>
+      <w:proofErr w:type="spellEnd"/>
+    </w:p>
+    <w:p>
+      <w:pPr>
+        <w:rPr>
+          <w:color w:val="000000" w:themeColor="text1"/>
+          <w:sz w:val="22"/>
+          <w:szCs w:val="22"/>
+        </w:rPr>
+      </w:pPr>
+      <w:proofErr w:type="spellStart"/>
+      <w:r>
+        <w:rPr>
+          <w:color w:val="000000" w:themeColor="text1"/>
+          <w:sz w:val="22"/>
+          <w:szCs w:val="22"/>
+        </w:rPr>
+        <w:t>JpaRepository</w:t>
+      </w:r>
+      <w:proofErr w:type="spellEnd"/>
+      <w:r>
+        <w:rPr>
+          <w:color w:val="000000" w:themeColor="text1"/>
+          <w:sz w:val="22"/>
+          <w:szCs w:val="22"/>
+        </w:rPr>
+        <w:t xml:space="preserve"> is the </w:t>
       </w:r>
       <w:r>
         <w:rPr>
@@ -5141,7 +6005,16 @@
           <w:sz w:val="22"/>
           <w:szCs w:val="22"/>
         </w:rPr>
-        <w:t>It has all the CRUD operations: C</w:t>
+        <w:t xml:space="preserve">It has all the CRUD operations: </w:t>
+      </w:r>
+      <w:proofErr w:type="spellStart"/>
+      <w:r>
+        <w:rPr>
+          <w:color w:val="000000" w:themeColor="text1"/>
+          <w:sz w:val="22"/>
+          <w:szCs w:val="22"/>
+        </w:rPr>
+        <w:t>C</w:t>
       </w:r>
       <w:r>
         <w:rPr>
@@ -5153,6 +6026,7 @@
         </w:rPr>
         <w:t>rudRepository</w:t>
       </w:r>
+      <w:proofErr w:type="spellEnd"/>
     </w:p>
     <w:p>
       <w:pPr>
@@ -5194,7 +6068,24 @@
           <w:szCs w:val="22"/>
         </w:rPr>
         <w:br/>
-        <w:t>findById()</w:t>
+      </w:r>
+      <w:proofErr w:type="spellStart"/>
+      <w:r>
+        <w:rPr>
+          <w:color w:val="000000" w:themeColor="text1"/>
+          <w:sz w:val="22"/>
+          <w:szCs w:val="22"/>
+        </w:rPr>
+        <w:t>findById</w:t>
+      </w:r>
+      <w:proofErr w:type="spellEnd"/>
+      <w:r>
+        <w:rPr>
+          <w:color w:val="000000" w:themeColor="text1"/>
+          <w:sz w:val="22"/>
+          <w:szCs w:val="22"/>
+        </w:rPr>
+        <w:t>()</w:t>
       </w:r>
       <w:r>
         <w:rPr>
@@ -5203,7 +6094,24 @@
           <w:szCs w:val="22"/>
         </w:rPr>
         <w:br/>
-        <w:t>findAll()</w:t>
+      </w:r>
+      <w:proofErr w:type="spellStart"/>
+      <w:r>
+        <w:rPr>
+          <w:color w:val="000000" w:themeColor="text1"/>
+          <w:sz w:val="22"/>
+          <w:szCs w:val="22"/>
+        </w:rPr>
+        <w:t>findAll</w:t>
+      </w:r>
+      <w:proofErr w:type="spellEnd"/>
+      <w:r>
+        <w:rPr>
+          <w:color w:val="000000" w:themeColor="text1"/>
+          <w:sz w:val="22"/>
+          <w:szCs w:val="22"/>
+        </w:rPr>
+        <w:t>()</w:t>
       </w:r>
       <w:r>
         <w:rPr>
@@ -5230,7 +6138,24 @@
           <w:szCs w:val="22"/>
         </w:rPr>
         <w:br/>
-        <w:t>existsById()</w:t>
+      </w:r>
+      <w:proofErr w:type="spellStart"/>
+      <w:r>
+        <w:rPr>
+          <w:color w:val="000000" w:themeColor="text1"/>
+          <w:sz w:val="22"/>
+          <w:szCs w:val="22"/>
+        </w:rPr>
+        <w:t>existsById</w:t>
+      </w:r>
+      <w:proofErr w:type="spellEnd"/>
+      <w:r>
+        <w:rPr>
+          <w:color w:val="000000" w:themeColor="text1"/>
+          <w:sz w:val="22"/>
+          <w:szCs w:val="22"/>
+        </w:rPr>
+        <w:t>()</w:t>
       </w:r>
     </w:p>
     <w:p>
@@ -5258,40 +6183,61 @@
           <w:szCs w:val="22"/>
         </w:rPr>
       </w:pPr>
-      <w:r>
-        <w:rPr>
-          <w:color w:val="000000" w:themeColor="text1"/>
-          <w:sz w:val="22"/>
-          <w:szCs w:val="22"/>
-        </w:rPr>
-        <w:t>saveAndFlush()</w:t>
-      </w:r>
-    </w:p>
-    <w:p>
-      <w:pPr>
-        <w:rPr>
-          <w:color w:val="000000" w:themeColor="text1"/>
-          <w:sz w:val="22"/>
-          <w:szCs w:val="22"/>
-        </w:rPr>
-      </w:pPr>
-      <w:r>
-        <w:rPr>
-          <w:color w:val="000000" w:themeColor="text1"/>
-          <w:sz w:val="22"/>
-          <w:szCs w:val="22"/>
-        </w:rPr>
-        <w:t>deleteInBatch()</w:t>
-      </w:r>
-    </w:p>
-    <w:p>
-      <w:pPr>
-        <w:rPr>
-          <w:color w:val="000000" w:themeColor="text1"/>
-          <w:sz w:val="22"/>
-          <w:szCs w:val="22"/>
-        </w:rPr>
-      </w:pPr>
+      <w:proofErr w:type="spellStart"/>
+      <w:r>
+        <w:rPr>
+          <w:color w:val="000000" w:themeColor="text1"/>
+          <w:sz w:val="22"/>
+          <w:szCs w:val="22"/>
+        </w:rPr>
+        <w:t>saveAndFlush</w:t>
+      </w:r>
+      <w:proofErr w:type="spellEnd"/>
+      <w:r>
+        <w:rPr>
+          <w:color w:val="000000" w:themeColor="text1"/>
+          <w:sz w:val="22"/>
+          <w:szCs w:val="22"/>
+        </w:rPr>
+        <w:t>()</w:t>
+      </w:r>
+    </w:p>
+    <w:p>
+      <w:pPr>
+        <w:rPr>
+          <w:color w:val="000000" w:themeColor="text1"/>
+          <w:sz w:val="22"/>
+          <w:szCs w:val="22"/>
+        </w:rPr>
+      </w:pPr>
+      <w:proofErr w:type="spellStart"/>
+      <w:r>
+        <w:rPr>
+          <w:color w:val="000000" w:themeColor="text1"/>
+          <w:sz w:val="22"/>
+          <w:szCs w:val="22"/>
+        </w:rPr>
+        <w:t>deleteInBatch</w:t>
+      </w:r>
+      <w:proofErr w:type="spellEnd"/>
+      <w:r>
+        <w:rPr>
+          <w:color w:val="000000" w:themeColor="text1"/>
+          <w:sz w:val="22"/>
+          <w:szCs w:val="22"/>
+        </w:rPr>
+        <w:t>()</w:t>
+      </w:r>
+    </w:p>
+    <w:p>
+      <w:pPr>
+        <w:rPr>
+          <w:color w:val="000000" w:themeColor="text1"/>
+          <w:sz w:val="22"/>
+          <w:szCs w:val="22"/>
+        </w:rPr>
+      </w:pPr>
+      <w:proofErr w:type="spellStart"/>
       <w:r>
         <w:rPr>
           <w:color w:val="000000" w:themeColor="text1"/>
@@ -5299,80 +6245,151 @@
           <w:szCs w:val="22"/>
         </w:rPr>
         <w:lastRenderedPageBreak/>
-        <w:t>findAll(Specification)</w:t>
-      </w:r>
-    </w:p>
-    <w:p>
-      <w:pPr>
-        <w:rPr>
-          <w:color w:val="000000" w:themeColor="text1"/>
-          <w:sz w:val="22"/>
-          <w:szCs w:val="22"/>
-        </w:rPr>
-      </w:pPr>
-    </w:p>
-    <w:p>
-      <w:pPr>
-        <w:rPr>
-          <w:color w:val="4472C4" w:themeColor="accent1"/>
-        </w:rPr>
-      </w:pPr>
-      <w:r>
-        <w:rPr>
-          <w:color w:val="4472C4" w:themeColor="accent1"/>
-        </w:rPr>
-        <w:t>userRepository.save(user);</w:t>
-      </w:r>
-    </w:p>
-    <w:p>
-      <w:pPr>
-        <w:rPr>
-          <w:color w:val="000000" w:themeColor="text1"/>
-          <w:sz w:val="22"/>
-          <w:szCs w:val="22"/>
-        </w:rPr>
-      </w:pPr>
-      <w:r>
-        <w:rPr>
-          <w:color w:val="000000" w:themeColor="text1"/>
-          <w:sz w:val="22"/>
-          <w:szCs w:val="22"/>
-        </w:rPr>
-        <w:t>what happens here is that JpaRepository checks whether the user entity object has an already Id if id == null then it creates a row using persist(), if its untracked and exists meaning that id != null, it calls for merge(). If it exists and is tracked nothing happens.</w:t>
-      </w:r>
-    </w:p>
-    <w:p>
-      <w:pPr>
-        <w:rPr>
-          <w:color w:val="000000" w:themeColor="text1"/>
-          <w:sz w:val="22"/>
-          <w:szCs w:val="22"/>
-        </w:rPr>
-      </w:pPr>
-    </w:p>
-    <w:p>
-      <w:pPr>
-        <w:rPr>
-          <w:color w:val="000000" w:themeColor="text1"/>
-          <w:sz w:val="22"/>
-          <w:szCs w:val="22"/>
-        </w:rPr>
-      </w:pPr>
-      <w:r>
-        <w:rPr>
-          <w:color w:val="000000" w:themeColor="text1"/>
-          <w:sz w:val="22"/>
-          <w:szCs w:val="22"/>
-        </w:rPr>
-        <w:t>Optional&lt;User&gt; user = userRepository.findById(1L);</w:t>
-      </w:r>
-      <w:r>
-        <w:rPr>
-          <w:color w:val="000000" w:themeColor="text1"/>
-          <w:sz w:val="22"/>
-          <w:szCs w:val="22"/>
-        </w:rPr>
-        <w:t xml:space="preserve"> is equivalent to the sql of</w:t>
+        <w:t>findAll</w:t>
+      </w:r>
+      <w:proofErr w:type="spellEnd"/>
+      <w:r>
+        <w:rPr>
+          <w:color w:val="000000" w:themeColor="text1"/>
+          <w:sz w:val="22"/>
+          <w:szCs w:val="22"/>
+        </w:rPr>
+        <w:t>(Specification)</w:t>
+      </w:r>
+    </w:p>
+    <w:p>
+      <w:pPr>
+        <w:rPr>
+          <w:color w:val="000000" w:themeColor="text1"/>
+          <w:sz w:val="22"/>
+          <w:szCs w:val="22"/>
+        </w:rPr>
+      </w:pPr>
+    </w:p>
+    <w:p>
+      <w:pPr>
+        <w:rPr>
+          <w:color w:val="4472C4" w:themeColor="accent1"/>
+        </w:rPr>
+      </w:pPr>
+      <w:proofErr w:type="spellStart"/>
+      <w:r>
+        <w:rPr>
+          <w:color w:val="4472C4" w:themeColor="accent1"/>
+        </w:rPr>
+        <w:t>userRepository.save</w:t>
+      </w:r>
+      <w:proofErr w:type="spellEnd"/>
+      <w:r>
+        <w:rPr>
+          <w:color w:val="4472C4" w:themeColor="accent1"/>
+        </w:rPr>
+        <w:t>(user);</w:t>
+      </w:r>
+    </w:p>
+    <w:p>
+      <w:pPr>
+        <w:rPr>
+          <w:color w:val="000000" w:themeColor="text1"/>
+          <w:sz w:val="22"/>
+          <w:szCs w:val="22"/>
+        </w:rPr>
+      </w:pPr>
+      <w:r>
+        <w:rPr>
+          <w:color w:val="000000" w:themeColor="text1"/>
+          <w:sz w:val="22"/>
+          <w:szCs w:val="22"/>
+        </w:rPr>
+        <w:t xml:space="preserve">what happens here is that </w:t>
+      </w:r>
+      <w:proofErr w:type="spellStart"/>
+      <w:r>
+        <w:rPr>
+          <w:color w:val="000000" w:themeColor="text1"/>
+          <w:sz w:val="22"/>
+          <w:szCs w:val="22"/>
+        </w:rPr>
+        <w:t>JpaRepository</w:t>
+      </w:r>
+      <w:proofErr w:type="spellEnd"/>
+      <w:r>
+        <w:rPr>
+          <w:color w:val="000000" w:themeColor="text1"/>
+          <w:sz w:val="22"/>
+          <w:szCs w:val="22"/>
+        </w:rPr>
+        <w:t xml:space="preserve"> checks whether the user entity object has an already Id if id == null then it creates a row using persist(), if its untracked and exists meaning that id != null, it calls for merge(). If it exists and is tracked nothing happens.</w:t>
+      </w:r>
+    </w:p>
+    <w:p>
+      <w:pPr>
+        <w:rPr>
+          <w:color w:val="000000" w:themeColor="text1"/>
+          <w:sz w:val="22"/>
+          <w:szCs w:val="22"/>
+        </w:rPr>
+      </w:pPr>
+    </w:p>
+    <w:p>
+      <w:pPr>
+        <w:rPr>
+          <w:color w:val="000000" w:themeColor="text1"/>
+          <w:sz w:val="22"/>
+          <w:szCs w:val="22"/>
+        </w:rPr>
+      </w:pPr>
+      <w:r>
+        <w:rPr>
+          <w:color w:val="000000" w:themeColor="text1"/>
+          <w:sz w:val="22"/>
+          <w:szCs w:val="22"/>
+        </w:rPr>
+        <w:t xml:space="preserve">Optional&lt;User&gt; user = </w:t>
+      </w:r>
+      <w:proofErr w:type="spellStart"/>
+      <w:r>
+        <w:rPr>
+          <w:color w:val="000000" w:themeColor="text1"/>
+          <w:sz w:val="22"/>
+          <w:szCs w:val="22"/>
+        </w:rPr>
+        <w:t>userRepository.findById</w:t>
+      </w:r>
+      <w:proofErr w:type="spellEnd"/>
+      <w:r>
+        <w:rPr>
+          <w:color w:val="000000" w:themeColor="text1"/>
+          <w:sz w:val="22"/>
+          <w:szCs w:val="22"/>
+        </w:rPr>
+        <w:t>(1L);</w:t>
+      </w:r>
+      <w:r>
+        <w:rPr>
+          <w:color w:val="000000" w:themeColor="text1"/>
+          <w:sz w:val="22"/>
+          <w:szCs w:val="22"/>
+        </w:rPr>
+        <w:t xml:space="preserve"> is equivalent to the </w:t>
+      </w:r>
+      <w:proofErr w:type="spellStart"/>
+      <w:r>
+        <w:rPr>
+          <w:color w:val="000000" w:themeColor="text1"/>
+          <w:sz w:val="22"/>
+          <w:szCs w:val="22"/>
+        </w:rPr>
+        <w:t>sql</w:t>
+      </w:r>
+      <w:proofErr w:type="spellEnd"/>
+      <w:r>
+        <w:rPr>
+          <w:color w:val="000000" w:themeColor="text1"/>
+          <w:sz w:val="22"/>
+          <w:szCs w:val="22"/>
+        </w:rPr>
+        <w:t xml:space="preserve"> of</w:t>
       </w:r>
     </w:p>
     <w:p>
@@ -5450,24 +6467,78 @@
           <w:sz w:val="22"/>
           <w:szCs w:val="22"/>
         </w:rPr>
-        <w:t xml:space="preserve">To get started with spring jpa we should create an interface of our class that holds the table example: </w:t>
-      </w:r>
-    </w:p>
-    <w:p>
-      <w:pPr>
-        <w:rPr>
-          <w:color w:val="000000" w:themeColor="text1"/>
-          <w:sz w:val="22"/>
-          <w:szCs w:val="22"/>
-        </w:rPr>
-      </w:pPr>
-      <w:r>
-        <w:rPr>
-          <w:color w:val="000000" w:themeColor="text1"/>
-          <w:sz w:val="22"/>
-          <w:szCs w:val="22"/>
-        </w:rPr>
-        <w:t xml:space="preserve">public interface StudentInterface extends JpaRepository &lt;Student, Integer&gt; </w:t>
+        <w:t xml:space="preserve">To get started with spring </w:t>
+      </w:r>
+      <w:proofErr w:type="spellStart"/>
+      <w:r>
+        <w:rPr>
+          <w:color w:val="000000" w:themeColor="text1"/>
+          <w:sz w:val="22"/>
+          <w:szCs w:val="22"/>
+        </w:rPr>
+        <w:t>jpa</w:t>
+      </w:r>
+      <w:proofErr w:type="spellEnd"/>
+      <w:r>
+        <w:rPr>
+          <w:color w:val="000000" w:themeColor="text1"/>
+          <w:sz w:val="22"/>
+          <w:szCs w:val="22"/>
+        </w:rPr>
+        <w:t xml:space="preserve"> we should create an interface of our class that holds the table example: </w:t>
+      </w:r>
+    </w:p>
+    <w:p>
+      <w:pPr>
+        <w:rPr>
+          <w:color w:val="000000" w:themeColor="text1"/>
+          <w:sz w:val="22"/>
+          <w:szCs w:val="22"/>
+        </w:rPr>
+      </w:pPr>
+      <w:r>
+        <w:rPr>
+          <w:color w:val="000000" w:themeColor="text1"/>
+          <w:sz w:val="22"/>
+          <w:szCs w:val="22"/>
+        </w:rPr>
+        <w:t xml:space="preserve">public interface </w:t>
+      </w:r>
+      <w:proofErr w:type="spellStart"/>
+      <w:r>
+        <w:rPr>
+          <w:color w:val="000000" w:themeColor="text1"/>
+          <w:sz w:val="22"/>
+          <w:szCs w:val="22"/>
+        </w:rPr>
+        <w:t>StudentInterface</w:t>
+      </w:r>
+      <w:proofErr w:type="spellEnd"/>
+      <w:r>
+        <w:rPr>
+          <w:color w:val="000000" w:themeColor="text1"/>
+          <w:sz w:val="22"/>
+          <w:szCs w:val="22"/>
+        </w:rPr>
+        <w:t xml:space="preserve"> extends </w:t>
+      </w:r>
+      <w:proofErr w:type="spellStart"/>
+      <w:r>
+        <w:rPr>
+          <w:color w:val="000000" w:themeColor="text1"/>
+          <w:sz w:val="22"/>
+          <w:szCs w:val="22"/>
+        </w:rPr>
+        <w:t>JpaRepository</w:t>
+      </w:r>
+      <w:proofErr w:type="spellEnd"/>
+      <w:r>
+        <w:rPr>
+          <w:color w:val="000000" w:themeColor="text1"/>
+          <w:sz w:val="22"/>
+          <w:szCs w:val="22"/>
+        </w:rPr>
+        <w:t xml:space="preserve"> &lt;Student, Integer&gt; </w:t>
       </w:r>
     </w:p>
     <w:p>
@@ -5509,7 +6580,25 @@
           <w:sz w:val="22"/>
           <w:szCs w:val="22"/>
         </w:rPr>
-        <w:t>no annotation needed here for the student jpa interface</w:t>
+        <w:t xml:space="preserve">no annotation needed here for the student </w:t>
+      </w:r>
+      <w:proofErr w:type="spellStart"/>
+      <w:r>
+        <w:rPr>
+          <w:color w:val="000000" w:themeColor="text1"/>
+          <w:sz w:val="22"/>
+          <w:szCs w:val="22"/>
+        </w:rPr>
+        <w:t>jpa</w:t>
+      </w:r>
+      <w:proofErr w:type="spellEnd"/>
+      <w:r>
+        <w:rPr>
+          <w:color w:val="000000" w:themeColor="text1"/>
+          <w:sz w:val="22"/>
+          <w:szCs w:val="22"/>
+        </w:rPr>
+        <w:t xml:space="preserve"> interface</w:t>
       </w:r>
     </w:p>
     <w:p>
@@ -5552,76 +6641,132 @@
           <w:sz w:val="22"/>
           <w:szCs w:val="22"/>
         </w:rPr>
-        <w:t>to add to our repository we should use repository.save(object) object here is an equivalent of a row</w:t>
-      </w:r>
-    </w:p>
-    <w:p>
-      <w:pPr>
-        <w:rPr>
-          <w:color w:val="000000" w:themeColor="text1"/>
-          <w:sz w:val="22"/>
-          <w:szCs w:val="22"/>
-        </w:rPr>
-      </w:pPr>
-    </w:p>
-    <w:p>
-      <w:pPr>
-        <w:rPr>
-          <w:color w:val="000000" w:themeColor="text1"/>
-          <w:sz w:val="22"/>
-          <w:szCs w:val="22"/>
-        </w:rPr>
-      </w:pPr>
-      <w:r>
-        <w:rPr>
-          <w:color w:val="000000" w:themeColor="text1"/>
-          <w:sz w:val="22"/>
-          <w:szCs w:val="22"/>
-        </w:rPr>
-        <w:t>to find we can use findById</w:t>
-      </w:r>
-    </w:p>
-    <w:p>
-      <w:pPr>
-        <w:rPr>
-          <w:color w:val="000000" w:themeColor="text1"/>
-          <w:sz w:val="22"/>
-          <w:szCs w:val="22"/>
-        </w:rPr>
-      </w:pPr>
-      <w:r>
-        <w:rPr>
-          <w:color w:val="000000" w:themeColor="text1"/>
-          <w:sz w:val="22"/>
-          <w:szCs w:val="22"/>
-        </w:rPr>
-        <w:t>or findall</w:t>
-      </w:r>
-    </w:p>
-    <w:p>
-      <w:pPr>
-        <w:rPr>
-          <w:color w:val="000000" w:themeColor="text1"/>
-          <w:sz w:val="22"/>
-          <w:szCs w:val="22"/>
-        </w:rPr>
-      </w:pPr>
-    </w:p>
-    <w:p>
-      <w:pPr>
-        <w:rPr>
-          <w:color w:val="000000" w:themeColor="text1"/>
-          <w:sz w:val="22"/>
-          <w:szCs w:val="22"/>
-        </w:rPr>
-      </w:pPr>
-      <w:r>
-        <w:rPr>
-          <w:color w:val="000000" w:themeColor="text1"/>
-          <w:sz w:val="22"/>
-          <w:szCs w:val="22"/>
-        </w:rPr>
-        <w:t>to add a new method we can define it in our interface of the repository and the java jpa will create a query for us</w:t>
+        <w:t xml:space="preserve">to add to our repository we should use </w:t>
+      </w:r>
+      <w:proofErr w:type="spellStart"/>
+      <w:r>
+        <w:rPr>
+          <w:color w:val="000000" w:themeColor="text1"/>
+          <w:sz w:val="22"/>
+          <w:szCs w:val="22"/>
+        </w:rPr>
+        <w:t>repository.save</w:t>
+      </w:r>
+      <w:proofErr w:type="spellEnd"/>
+      <w:r>
+        <w:rPr>
+          <w:color w:val="000000" w:themeColor="text1"/>
+          <w:sz w:val="22"/>
+          <w:szCs w:val="22"/>
+        </w:rPr>
+        <w:t>(object) object here is an equivalent of a row</w:t>
+      </w:r>
+    </w:p>
+    <w:p>
+      <w:pPr>
+        <w:rPr>
+          <w:color w:val="000000" w:themeColor="text1"/>
+          <w:sz w:val="22"/>
+          <w:szCs w:val="22"/>
+        </w:rPr>
+      </w:pPr>
+    </w:p>
+    <w:p>
+      <w:pPr>
+        <w:rPr>
+          <w:color w:val="000000" w:themeColor="text1"/>
+          <w:sz w:val="22"/>
+          <w:szCs w:val="22"/>
+        </w:rPr>
+      </w:pPr>
+      <w:r>
+        <w:rPr>
+          <w:color w:val="000000" w:themeColor="text1"/>
+          <w:sz w:val="22"/>
+          <w:szCs w:val="22"/>
+        </w:rPr>
+        <w:t xml:space="preserve">to find we can use </w:t>
+      </w:r>
+      <w:proofErr w:type="spellStart"/>
+      <w:r>
+        <w:rPr>
+          <w:color w:val="000000" w:themeColor="text1"/>
+          <w:sz w:val="22"/>
+          <w:szCs w:val="22"/>
+        </w:rPr>
+        <w:t>findById</w:t>
+      </w:r>
+      <w:proofErr w:type="spellEnd"/>
+    </w:p>
+    <w:p>
+      <w:pPr>
+        <w:rPr>
+          <w:color w:val="000000" w:themeColor="text1"/>
+          <w:sz w:val="22"/>
+          <w:szCs w:val="22"/>
+        </w:rPr>
+      </w:pPr>
+      <w:r>
+        <w:rPr>
+          <w:color w:val="000000" w:themeColor="text1"/>
+          <w:sz w:val="22"/>
+          <w:szCs w:val="22"/>
+        </w:rPr>
+        <w:t xml:space="preserve">or </w:t>
+      </w:r>
+      <w:proofErr w:type="spellStart"/>
+      <w:r>
+        <w:rPr>
+          <w:color w:val="000000" w:themeColor="text1"/>
+          <w:sz w:val="22"/>
+          <w:szCs w:val="22"/>
+        </w:rPr>
+        <w:t>findall</w:t>
+      </w:r>
+      <w:proofErr w:type="spellEnd"/>
+    </w:p>
+    <w:p>
+      <w:pPr>
+        <w:rPr>
+          <w:color w:val="000000" w:themeColor="text1"/>
+          <w:sz w:val="22"/>
+          <w:szCs w:val="22"/>
+        </w:rPr>
+      </w:pPr>
+    </w:p>
+    <w:p>
+      <w:pPr>
+        <w:rPr>
+          <w:color w:val="000000" w:themeColor="text1"/>
+          <w:sz w:val="22"/>
+          <w:szCs w:val="22"/>
+        </w:rPr>
+      </w:pPr>
+      <w:r>
+        <w:rPr>
+          <w:color w:val="000000" w:themeColor="text1"/>
+          <w:sz w:val="22"/>
+          <w:szCs w:val="22"/>
+        </w:rPr>
+        <w:t xml:space="preserve">to add a new method we can define it in our interface of the repository and the java </w:t>
+      </w:r>
+      <w:proofErr w:type="spellStart"/>
+      <w:r>
+        <w:rPr>
+          <w:color w:val="000000" w:themeColor="text1"/>
+          <w:sz w:val="22"/>
+          <w:szCs w:val="22"/>
+        </w:rPr>
+        <w:t>jpa</w:t>
+      </w:r>
+      <w:proofErr w:type="spellEnd"/>
+      <w:r>
+        <w:rPr>
+          <w:color w:val="000000" w:themeColor="text1"/>
+          <w:sz w:val="22"/>
+          <w:szCs w:val="22"/>
+        </w:rPr>
+        <w:t xml:space="preserve"> will create a query for us</w:t>
       </w:r>
     </w:p>
     <w:p>
@@ -5639,7 +6784,151 @@
           <w:szCs w:val="22"/>
         </w:rPr>
         <w:lastRenderedPageBreak/>
-        <w:t>Here's the simple rule for capitalization across your entire Spring Boot application: Java field names start with a lowercase letter (e.g., fName, email, id), and their corresponding getter/setter methods capitalize the field name after get/set (e.g., getFName(), setFName()) — but Spring Data JPA repository methods must match the exact field name starting with lowercase (findByfNameContaining, NOT findByFNameContaining). Database columns via @Column(name = "f_name") can be whatever naming convention you want (usually snake_case). Path variables in @GetMapping like /{name} are independent and just pass values. The only places where capitalization breaks everything are: (1) repository method names must match Java field names exactly (case-sensitive), (2) getters/setters must follow the getFieldName() pattern with capital after get, and (3) JSON responses rely on those getters being correct — everything else (URLs, database columns) is more flexible but keeping consistent lowercase for fields and camelCase for getters avoids confusion.</w:t>
+        <w:t>Here's the simple rule for capitalization across your entire Spring Boot application: Java field names start with a lowercase letter (e.g., </w:t>
+      </w:r>
+      <w:proofErr w:type="spellStart"/>
+      <w:r>
+        <w:rPr>
+          <w:color w:val="000000" w:themeColor="text1"/>
+          <w:sz w:val="22"/>
+          <w:szCs w:val="22"/>
+        </w:rPr>
+        <w:t>fName</w:t>
+      </w:r>
+      <w:proofErr w:type="spellEnd"/>
+      <w:r>
+        <w:rPr>
+          <w:color w:val="000000" w:themeColor="text1"/>
+          <w:sz w:val="22"/>
+          <w:szCs w:val="22"/>
+        </w:rPr>
+        <w:t>, email, id), and their corresponding getter/setter methods capitalize the field name after get/set (e.g., </w:t>
+      </w:r>
+      <w:proofErr w:type="spellStart"/>
+      <w:r>
+        <w:rPr>
+          <w:color w:val="000000" w:themeColor="text1"/>
+          <w:sz w:val="22"/>
+          <w:szCs w:val="22"/>
+        </w:rPr>
+        <w:t>getFName</w:t>
+      </w:r>
+      <w:proofErr w:type="spellEnd"/>
+      <w:r>
+        <w:rPr>
+          <w:color w:val="000000" w:themeColor="text1"/>
+          <w:sz w:val="22"/>
+          <w:szCs w:val="22"/>
+        </w:rPr>
+        <w:t>(), </w:t>
+      </w:r>
+      <w:proofErr w:type="spellStart"/>
+      <w:r>
+        <w:rPr>
+          <w:color w:val="000000" w:themeColor="text1"/>
+          <w:sz w:val="22"/>
+          <w:szCs w:val="22"/>
+        </w:rPr>
+        <w:t>setFName</w:t>
+      </w:r>
+      <w:proofErr w:type="spellEnd"/>
+      <w:r>
+        <w:rPr>
+          <w:color w:val="000000" w:themeColor="text1"/>
+          <w:sz w:val="22"/>
+          <w:szCs w:val="22"/>
+        </w:rPr>
+        <w:t>()) — but Spring Data JPA repository methods must match the exact field name starting with lowercase (</w:t>
+      </w:r>
+      <w:proofErr w:type="spellStart"/>
+      <w:r>
+        <w:rPr>
+          <w:color w:val="000000" w:themeColor="text1"/>
+          <w:sz w:val="22"/>
+          <w:szCs w:val="22"/>
+        </w:rPr>
+        <w:t>findByfNameContaining</w:t>
+      </w:r>
+      <w:proofErr w:type="spellEnd"/>
+      <w:r>
+        <w:rPr>
+          <w:color w:val="000000" w:themeColor="text1"/>
+          <w:sz w:val="22"/>
+          <w:szCs w:val="22"/>
+        </w:rPr>
+        <w:t>, NOT </w:t>
+      </w:r>
+      <w:proofErr w:type="spellStart"/>
+      <w:r>
+        <w:rPr>
+          <w:color w:val="000000" w:themeColor="text1"/>
+          <w:sz w:val="22"/>
+          <w:szCs w:val="22"/>
+        </w:rPr>
+        <w:t>findByFNameContaining</w:t>
+      </w:r>
+      <w:proofErr w:type="spellEnd"/>
+      <w:r>
+        <w:rPr>
+          <w:color w:val="000000" w:themeColor="text1"/>
+          <w:sz w:val="22"/>
+          <w:szCs w:val="22"/>
+        </w:rPr>
+        <w:t>). Database columns via @Column(name = "</w:t>
+      </w:r>
+      <w:proofErr w:type="spellStart"/>
+      <w:r>
+        <w:rPr>
+          <w:color w:val="000000" w:themeColor="text1"/>
+          <w:sz w:val="22"/>
+          <w:szCs w:val="22"/>
+        </w:rPr>
+        <w:t>f_name</w:t>
+      </w:r>
+      <w:proofErr w:type="spellEnd"/>
+      <w:r>
+        <w:rPr>
+          <w:color w:val="000000" w:themeColor="text1"/>
+          <w:sz w:val="22"/>
+          <w:szCs w:val="22"/>
+        </w:rPr>
+        <w:t xml:space="preserve">") can be whatever naming convention you want (usually </w:t>
+      </w:r>
+      <w:proofErr w:type="spellStart"/>
+      <w:r>
+        <w:rPr>
+          <w:color w:val="000000" w:themeColor="text1"/>
+          <w:sz w:val="22"/>
+          <w:szCs w:val="22"/>
+        </w:rPr>
+        <w:t>snake_case</w:t>
+      </w:r>
+      <w:proofErr w:type="spellEnd"/>
+      <w:r>
+        <w:rPr>
+          <w:color w:val="000000" w:themeColor="text1"/>
+          <w:sz w:val="22"/>
+          <w:szCs w:val="22"/>
+        </w:rPr>
+        <w:t>). Path variables in @GetMapping like /{name} are independent and just pass values. The only places where capitalization breaks everything are: (1) repository method names must match Java field names exactly (case-sensitive), (2) getters/setters must follow the </w:t>
+      </w:r>
+      <w:proofErr w:type="spellStart"/>
+      <w:r>
+        <w:rPr>
+          <w:color w:val="000000" w:themeColor="text1"/>
+          <w:sz w:val="22"/>
+          <w:szCs w:val="22"/>
+        </w:rPr>
+        <w:t>getFieldName</w:t>
+      </w:r>
+      <w:proofErr w:type="spellEnd"/>
+      <w:r>
+        <w:rPr>
+          <w:color w:val="000000" w:themeColor="text1"/>
+          <w:sz w:val="22"/>
+          <w:szCs w:val="22"/>
+        </w:rPr>
+        <w:t>() pattern with capital after get, and (3) JSON responses rely on those getters being correct — everything else (URLs, database columns) is more flexible but keeping consistent lowercase for fields and camelCase for getters avoids confusion.</w:t>
       </w:r>
       <w:r>
         <w:rPr>
@@ -5687,7 +6976,43 @@
           <w:sz w:val="22"/>
           <w:szCs w:val="22"/>
         </w:rPr>
-        <w:t xml:space="preserve"> = cascadetype.al, mappedby = “class_name”l) this means whenever our entity object is deleted the object which its annotated on will also be deleted.</w:t>
+        <w:t xml:space="preserve"> = cascadetype.al, </w:t>
+      </w:r>
+      <w:proofErr w:type="spellStart"/>
+      <w:r>
+        <w:rPr>
+          <w:color w:val="000000" w:themeColor="text1"/>
+          <w:sz w:val="22"/>
+          <w:szCs w:val="22"/>
+        </w:rPr>
+        <w:t>mappedby</w:t>
+      </w:r>
+      <w:proofErr w:type="spellEnd"/>
+      <w:r>
+        <w:rPr>
+          <w:color w:val="000000" w:themeColor="text1"/>
+          <w:sz w:val="22"/>
+          <w:szCs w:val="22"/>
+        </w:rPr>
+        <w:t xml:space="preserve"> = “</w:t>
+      </w:r>
+      <w:proofErr w:type="spellStart"/>
+      <w:r>
+        <w:rPr>
+          <w:color w:val="000000" w:themeColor="text1"/>
+          <w:sz w:val="22"/>
+          <w:szCs w:val="22"/>
+        </w:rPr>
+        <w:t>class_name”l</w:t>
+      </w:r>
+      <w:proofErr w:type="spellEnd"/>
+      <w:r>
+        <w:rPr>
+          <w:color w:val="000000" w:themeColor="text1"/>
+          <w:sz w:val="22"/>
+          <w:szCs w:val="22"/>
+        </w:rPr>
+        <w:t>) this means whenever our entity object is deleted the object which its annotated on will also be deleted.</w:t>
       </w:r>
     </w:p>
     <w:p>
@@ -5751,7 +7076,25 @@
           <w:sz w:val="22"/>
           <w:szCs w:val="22"/>
         </w:rPr>
-        <w:t xml:space="preserve">    private Locker locker;  </w:t>
+        <w:t xml:space="preserve">    private Locker </w:t>
+      </w:r>
+      <w:proofErr w:type="spellStart"/>
+      <w:r>
+        <w:rPr>
+          <w:color w:val="000000" w:themeColor="text1"/>
+          <w:sz w:val="22"/>
+          <w:szCs w:val="22"/>
+        </w:rPr>
+        <w:t>locker</w:t>
+      </w:r>
+      <w:proofErr w:type="spellEnd"/>
+      <w:r>
+        <w:rPr>
+          <w:color w:val="000000" w:themeColor="text1"/>
+          <w:sz w:val="22"/>
+          <w:szCs w:val="22"/>
+        </w:rPr>
+        <w:t xml:space="preserve">;  </w:t>
       </w:r>
       <w:r>
         <w:rPr>
@@ -5795,7 +7138,25 @@
           <w:sz w:val="22"/>
           <w:szCs w:val="22"/>
         </w:rPr>
-        <w:t xml:space="preserve">    @JoinColumn(name = "locker_id")  </w:t>
+        <w:t xml:space="preserve">    @JoinColumn(name = "</w:t>
+      </w:r>
+      <w:proofErr w:type="spellStart"/>
+      <w:r>
+        <w:rPr>
+          <w:color w:val="000000" w:themeColor="text1"/>
+          <w:sz w:val="22"/>
+          <w:szCs w:val="22"/>
+        </w:rPr>
+        <w:t>locker_id</w:t>
+      </w:r>
+      <w:proofErr w:type="spellEnd"/>
+      <w:r>
+        <w:rPr>
+          <w:color w:val="000000" w:themeColor="text1"/>
+          <w:sz w:val="22"/>
+          <w:szCs w:val="22"/>
+        </w:rPr>
+        <w:t xml:space="preserve">")  </w:t>
       </w:r>
       <w:r>
         <w:rPr>
@@ -5832,7 +7193,25 @@
           <w:sz w:val="22"/>
           <w:szCs w:val="22"/>
         </w:rPr>
-        <w:t xml:space="preserve">    private Locker locker;           </w:t>
+        <w:t xml:space="preserve">    private Locker </w:t>
+      </w:r>
+      <w:proofErr w:type="spellStart"/>
+      <w:r>
+        <w:rPr>
+          <w:color w:val="000000" w:themeColor="text1"/>
+          <w:sz w:val="22"/>
+          <w:szCs w:val="22"/>
+        </w:rPr>
+        <w:t>locker</w:t>
+      </w:r>
+      <w:proofErr w:type="spellEnd"/>
+      <w:r>
+        <w:rPr>
+          <w:color w:val="000000" w:themeColor="text1"/>
+          <w:sz w:val="22"/>
+          <w:szCs w:val="22"/>
+        </w:rPr>
+        <w:t xml:space="preserve">;           </w:t>
       </w:r>
       <w:r>
         <w:rPr>
@@ -5949,7 +7328,25 @@
           <w:sz w:val="22"/>
           <w:szCs w:val="22"/>
         </w:rPr>
-        <w:t xml:space="preserve">    private Student student;</w:t>
+        <w:t xml:space="preserve">    private Student </w:t>
+      </w:r>
+      <w:proofErr w:type="spellStart"/>
+      <w:r>
+        <w:rPr>
+          <w:color w:val="000000" w:themeColor="text1"/>
+          <w:sz w:val="22"/>
+          <w:szCs w:val="22"/>
+        </w:rPr>
+        <w:t>student</w:t>
+      </w:r>
+      <w:proofErr w:type="spellEnd"/>
+      <w:r>
+        <w:rPr>
+          <w:color w:val="000000" w:themeColor="text1"/>
+          <w:sz w:val="22"/>
+          <w:szCs w:val="22"/>
+        </w:rPr>
+        <w:t>;</w:t>
       </w:r>
     </w:p>
     <w:p>
@@ -5986,6 +7383,7 @@
           <w:szCs w:val="22"/>
         </w:rPr>
       </w:pPr>
+      <w:proofErr w:type="spellStart"/>
       <w:r>
         <w:rPr>
           <w:color w:val="EE0000"/>
@@ -5993,7 +7391,16 @@
           <w:szCs w:val="22"/>
         </w:rPr>
         <w:lastRenderedPageBreak/>
-        <w:t>mappedBy goes on the </w:t>
+        <w:t>mappedBy</w:t>
+      </w:r>
+      <w:proofErr w:type="spellEnd"/>
+      <w:r>
+        <w:rPr>
+          <w:color w:val="EE0000"/>
+          <w:sz w:val="22"/>
+          <w:szCs w:val="22"/>
+        </w:rPr>
+        <w:t> goes on the </w:t>
       </w:r>
       <w:r>
         <w:rPr>
@@ -6037,24 +7444,60 @@
           <w:sz w:val="22"/>
           <w:szCs w:val="22"/>
         </w:rPr>
-        <w:t>@JoinColumn(name = "locker_id") means:</w:t>
-      </w:r>
-    </w:p>
-    <w:p>
-      <w:pPr>
-        <w:rPr>
-          <w:color w:val="EE0000"/>
-          <w:sz w:val="22"/>
-          <w:szCs w:val="22"/>
-        </w:rPr>
-      </w:pPr>
-      <w:r>
-        <w:rPr>
-          <w:color w:val="EE0000"/>
-          <w:sz w:val="22"/>
-          <w:szCs w:val="22"/>
-        </w:rPr>
-        <w:t>"Create a column called locker_id in THIS table. This column will hold the ID of a row from the OTHER table (Locker)."</w:t>
+        <w:t>@JoinColumn(name = "</w:t>
+      </w:r>
+      <w:proofErr w:type="spellStart"/>
+      <w:r>
+        <w:rPr>
+          <w:color w:val="EE0000"/>
+          <w:sz w:val="22"/>
+          <w:szCs w:val="22"/>
+        </w:rPr>
+        <w:t>locker_id</w:t>
+      </w:r>
+      <w:proofErr w:type="spellEnd"/>
+      <w:r>
+        <w:rPr>
+          <w:color w:val="EE0000"/>
+          <w:sz w:val="22"/>
+          <w:szCs w:val="22"/>
+        </w:rPr>
+        <w:t>") means:</w:t>
+      </w:r>
+    </w:p>
+    <w:p>
+      <w:pPr>
+        <w:rPr>
+          <w:color w:val="EE0000"/>
+          <w:sz w:val="22"/>
+          <w:szCs w:val="22"/>
+        </w:rPr>
+      </w:pPr>
+      <w:r>
+        <w:rPr>
+          <w:color w:val="EE0000"/>
+          <w:sz w:val="22"/>
+          <w:szCs w:val="22"/>
+        </w:rPr>
+        <w:t>"Create a column called </w:t>
+      </w:r>
+      <w:proofErr w:type="spellStart"/>
+      <w:r>
+        <w:rPr>
+          <w:color w:val="EE0000"/>
+          <w:sz w:val="22"/>
+          <w:szCs w:val="22"/>
+        </w:rPr>
+        <w:t>locker_id</w:t>
+      </w:r>
+      <w:proofErr w:type="spellEnd"/>
+      <w:r>
+        <w:rPr>
+          <w:color w:val="EE0000"/>
+          <w:sz w:val="22"/>
+          <w:szCs w:val="22"/>
+        </w:rPr>
+        <w:t> in THIS table. This column will hold the ID of a row from the OTHER table (Locker)."</w:t>
       </w:r>
     </w:p>
     <w:p>
@@ -6077,6 +7520,7 @@
           <w:u w:val="single"/>
         </w:rPr>
       </w:pPr>
+      <w:proofErr w:type="spellStart"/>
       <w:r>
         <w:rPr>
           <w:b/>
@@ -6086,8 +7530,9 @@
           <w:szCs w:val="28"/>
           <w:u w:val="single"/>
         </w:rPr>
-        <w:t>mappedBy Explained Simply</w:t>
-      </w:r>
+        <w:t>mappedBy</w:t>
+      </w:r>
+      <w:proofErr w:type="spellEnd"/>
       <w:r>
         <w:rPr>
           <w:b/>
@@ -6097,24 +7542,34 @@
           <w:szCs w:val="28"/>
           <w:u w:val="single"/>
         </w:rPr>
-        <w:t>:</w:t>
-      </w:r>
-    </w:p>
-    <w:p>
-      <w:pPr>
-        <w:rPr>
-          <w:color w:val="000000" w:themeColor="text1"/>
-          <w:sz w:val="22"/>
-          <w:szCs w:val="22"/>
-        </w:rPr>
-      </w:pPr>
-      <w:r>
-        <w:rPr>
-          <w:color w:val="000000" w:themeColor="text1"/>
-          <w:sz w:val="22"/>
-          <w:szCs w:val="22"/>
-        </w:rPr>
-        <w:t>mappedBy tells JPA: "I'm not the boss. Go look in the other class to find how these connect."</w:t>
+        <w:t xml:space="preserve"> Explained Simply:</w:t>
+      </w:r>
+    </w:p>
+    <w:p>
+      <w:pPr>
+        <w:rPr>
+          <w:color w:val="000000" w:themeColor="text1"/>
+          <w:sz w:val="22"/>
+          <w:szCs w:val="22"/>
+        </w:rPr>
+      </w:pPr>
+      <w:proofErr w:type="spellStart"/>
+      <w:r>
+        <w:rPr>
+          <w:color w:val="000000" w:themeColor="text1"/>
+          <w:sz w:val="22"/>
+          <w:szCs w:val="22"/>
+        </w:rPr>
+        <w:t>mappedBy</w:t>
+      </w:r>
+      <w:proofErr w:type="spellEnd"/>
+      <w:r>
+        <w:rPr>
+          <w:color w:val="000000" w:themeColor="text1"/>
+          <w:sz w:val="22"/>
+          <w:szCs w:val="22"/>
+        </w:rPr>
+        <w:t> tells JPA: "I'm not the boss. Go look in the other class to find how these connect."</w:t>
       </w:r>
     </w:p>
     <w:p>
@@ -6148,7 +7603,25 @@
           <w:sz w:val="22"/>
           <w:szCs w:val="22"/>
         </w:rPr>
-        <w:t>@OneToMany(mappedBy = "category")  // Look in Product.class for a field called "category"</w:t>
+        <w:t xml:space="preserve">@OneToMany(mappedBy = "category")  // Look in </w:t>
+      </w:r>
+      <w:proofErr w:type="spellStart"/>
+      <w:r>
+        <w:rPr>
+          <w:color w:val="000000" w:themeColor="text1"/>
+          <w:sz w:val="22"/>
+          <w:szCs w:val="22"/>
+        </w:rPr>
+        <w:t>Product.class</w:t>
+      </w:r>
+      <w:proofErr w:type="spellEnd"/>
+      <w:r>
+        <w:rPr>
+          <w:color w:val="000000" w:themeColor="text1"/>
+          <w:sz w:val="22"/>
+          <w:szCs w:val="22"/>
+        </w:rPr>
+        <w:t xml:space="preserve"> for a field called "category"</w:t>
       </w:r>
     </w:p>
     <w:p>
@@ -6215,6 +7688,7 @@
                 <w:szCs w:val="22"/>
               </w:rPr>
             </w:pPr>
+            <w:proofErr w:type="spellStart"/>
             <w:r>
               <w:rPr>
                 <w:color w:val="000000" w:themeColor="text1"/>
@@ -6223,6 +7697,7 @@
               </w:rPr>
               <w:t>CascadeType.PERSIST</w:t>
             </w:r>
+            <w:proofErr w:type="spellEnd"/>
           </w:p>
         </w:tc>
         <w:tc>
@@ -6279,6 +7754,7 @@
                 <w:szCs w:val="22"/>
               </w:rPr>
             </w:pPr>
+            <w:proofErr w:type="spellStart"/>
             <w:r>
               <w:rPr>
                 <w:color w:val="000000" w:themeColor="text1"/>
@@ -6287,6 +7763,7 @@
               </w:rPr>
               <w:t>CascadeType.REMOVE</w:t>
             </w:r>
+            <w:proofErr w:type="spellEnd"/>
           </w:p>
         </w:tc>
         <w:tc>
@@ -6343,6 +7820,7 @@
                 <w:szCs w:val="22"/>
               </w:rPr>
             </w:pPr>
+            <w:proofErr w:type="spellStart"/>
             <w:r>
               <w:rPr>
                 <w:color w:val="000000" w:themeColor="text1"/>
@@ -6351,6 +7829,7 @@
               </w:rPr>
               <w:t>CascadeType.ALL</w:t>
             </w:r>
+            <w:proofErr w:type="spellEnd"/>
           </w:p>
         </w:tc>
         <w:tc>
@@ -6490,24 +7969,60 @@
           <w:sz w:val="22"/>
           <w:szCs w:val="22"/>
         </w:rPr>
-        <w:t xml:space="preserve">    @OneToMany(mappedBy = "category", cascade = CascadeType.ALL)</w:t>
-      </w:r>
-    </w:p>
-    <w:p>
-      <w:pPr>
-        <w:rPr>
-          <w:color w:val="000000" w:themeColor="text1"/>
-          <w:sz w:val="22"/>
-          <w:szCs w:val="22"/>
-        </w:rPr>
-      </w:pPr>
-      <w:r>
-        <w:rPr>
-          <w:color w:val="000000" w:themeColor="text1"/>
-          <w:sz w:val="22"/>
-          <w:szCs w:val="22"/>
-        </w:rPr>
-        <w:t xml:space="preserve">    private List&lt;Product&gt; products = new ArrayList&lt;&gt;();</w:t>
+        <w:t xml:space="preserve">    @OneToMany(mappedBy = "category", cascade = </w:t>
+      </w:r>
+      <w:proofErr w:type="spellStart"/>
+      <w:r>
+        <w:rPr>
+          <w:color w:val="000000" w:themeColor="text1"/>
+          <w:sz w:val="22"/>
+          <w:szCs w:val="22"/>
+        </w:rPr>
+        <w:t>CascadeType.ALL</w:t>
+      </w:r>
+      <w:proofErr w:type="spellEnd"/>
+      <w:r>
+        <w:rPr>
+          <w:color w:val="000000" w:themeColor="text1"/>
+          <w:sz w:val="22"/>
+          <w:szCs w:val="22"/>
+        </w:rPr>
+        <w:t>)</w:t>
+      </w:r>
+    </w:p>
+    <w:p>
+      <w:pPr>
+        <w:rPr>
+          <w:color w:val="000000" w:themeColor="text1"/>
+          <w:sz w:val="22"/>
+          <w:szCs w:val="22"/>
+        </w:rPr>
+      </w:pPr>
+      <w:r>
+        <w:rPr>
+          <w:color w:val="000000" w:themeColor="text1"/>
+          <w:sz w:val="22"/>
+          <w:szCs w:val="22"/>
+        </w:rPr>
+        <w:t xml:space="preserve">    private List&lt;Product&gt; products = new </w:t>
+      </w:r>
+      <w:proofErr w:type="spellStart"/>
+      <w:r>
+        <w:rPr>
+          <w:color w:val="000000" w:themeColor="text1"/>
+          <w:sz w:val="22"/>
+          <w:szCs w:val="22"/>
+        </w:rPr>
+        <w:t>ArrayList</w:t>
+      </w:r>
+      <w:proofErr w:type="spellEnd"/>
+      <w:r>
+        <w:rPr>
+          <w:color w:val="000000" w:themeColor="text1"/>
+          <w:sz w:val="22"/>
+          <w:szCs w:val="22"/>
+        </w:rPr>
+        <w:t>&lt;&gt;();</w:t>
       </w:r>
     </w:p>
     <w:p>
@@ -6604,56 +8119,86 @@
           <w:szCs w:val="22"/>
         </w:rPr>
       </w:pPr>
-      <w:r>
-        <w:rPr>
-          <w:color w:val="000000" w:themeColor="text1"/>
-          <w:sz w:val="22"/>
-          <w:szCs w:val="22"/>
-        </w:rPr>
-        <w:t>laptop.setCategory(electronics);</w:t>
-      </w:r>
-    </w:p>
-    <w:p>
-      <w:pPr>
-        <w:rPr>
-          <w:color w:val="000000" w:themeColor="text1"/>
-          <w:sz w:val="22"/>
-          <w:szCs w:val="22"/>
-        </w:rPr>
-      </w:pPr>
-      <w:r>
-        <w:rPr>
-          <w:color w:val="000000" w:themeColor="text1"/>
-          <w:sz w:val="22"/>
-          <w:szCs w:val="22"/>
-        </w:rPr>
-        <w:t>electronics.getProducts().add(laptop);</w:t>
-      </w:r>
-    </w:p>
-    <w:p>
-      <w:pPr>
-        <w:rPr>
-          <w:color w:val="000000" w:themeColor="text1"/>
-          <w:sz w:val="22"/>
-          <w:szCs w:val="22"/>
-        </w:rPr>
-      </w:pPr>
-    </w:p>
-    <w:p>
-      <w:pPr>
-        <w:rPr>
-          <w:color w:val="000000" w:themeColor="text1"/>
-          <w:sz w:val="22"/>
-          <w:szCs w:val="22"/>
-        </w:rPr>
-      </w:pPr>
-      <w:r>
-        <w:rPr>
-          <w:color w:val="000000" w:themeColor="text1"/>
-          <w:sz w:val="22"/>
-          <w:szCs w:val="22"/>
-        </w:rPr>
-        <w:t xml:space="preserve">categoryRepository.save(electronics);  </w:t>
+      <w:proofErr w:type="spellStart"/>
+      <w:r>
+        <w:rPr>
+          <w:color w:val="000000" w:themeColor="text1"/>
+          <w:sz w:val="22"/>
+          <w:szCs w:val="22"/>
+        </w:rPr>
+        <w:t>laptop.setCategory</w:t>
+      </w:r>
+      <w:proofErr w:type="spellEnd"/>
+      <w:r>
+        <w:rPr>
+          <w:color w:val="000000" w:themeColor="text1"/>
+          <w:sz w:val="22"/>
+          <w:szCs w:val="22"/>
+        </w:rPr>
+        <w:t>(electronics);</w:t>
+      </w:r>
+    </w:p>
+    <w:p>
+      <w:pPr>
+        <w:rPr>
+          <w:color w:val="000000" w:themeColor="text1"/>
+          <w:sz w:val="22"/>
+          <w:szCs w:val="22"/>
+        </w:rPr>
+      </w:pPr>
+      <w:proofErr w:type="spellStart"/>
+      <w:r>
+        <w:rPr>
+          <w:color w:val="000000" w:themeColor="text1"/>
+          <w:sz w:val="22"/>
+          <w:szCs w:val="22"/>
+        </w:rPr>
+        <w:t>electronics.getProducts</w:t>
+      </w:r>
+      <w:proofErr w:type="spellEnd"/>
+      <w:r>
+        <w:rPr>
+          <w:color w:val="000000" w:themeColor="text1"/>
+          <w:sz w:val="22"/>
+          <w:szCs w:val="22"/>
+        </w:rPr>
+        <w:t>().add(laptop);</w:t>
+      </w:r>
+    </w:p>
+    <w:p>
+      <w:pPr>
+        <w:rPr>
+          <w:color w:val="000000" w:themeColor="text1"/>
+          <w:sz w:val="22"/>
+          <w:szCs w:val="22"/>
+        </w:rPr>
+      </w:pPr>
+    </w:p>
+    <w:p>
+      <w:pPr>
+        <w:rPr>
+          <w:color w:val="000000" w:themeColor="text1"/>
+          <w:sz w:val="22"/>
+          <w:szCs w:val="22"/>
+        </w:rPr>
+      </w:pPr>
+      <w:proofErr w:type="spellStart"/>
+      <w:r>
+        <w:rPr>
+          <w:color w:val="000000" w:themeColor="text1"/>
+          <w:sz w:val="22"/>
+          <w:szCs w:val="22"/>
+        </w:rPr>
+        <w:t>categoryRepository.save</w:t>
+      </w:r>
+      <w:proofErr w:type="spellEnd"/>
+      <w:r>
+        <w:rPr>
+          <w:color w:val="000000" w:themeColor="text1"/>
+          <w:sz w:val="22"/>
+          <w:szCs w:val="22"/>
+        </w:rPr>
+        <w:t xml:space="preserve">(electronics);  </w:t>
       </w:r>
       <w:r>
         <w:rPr>
@@ -6665,6 +8210,474 @@
         </w:rPr>
         <w:t>// BOTH category AND product saved automatically!</w:t>
       </w:r>
+    </w:p>
+    <w:p>
+      <w:pPr>
+        <w:rPr>
+          <w:color w:val="000000" w:themeColor="text1"/>
+          <w:sz w:val="22"/>
+          <w:szCs w:val="22"/>
+        </w:rPr>
+      </w:pPr>
+    </w:p>
+    <w:p>
+      <w:pPr>
+        <w:rPr>
+          <w:color w:val="000000" w:themeColor="text1"/>
+          <w:sz w:val="22"/>
+          <w:szCs w:val="22"/>
+        </w:rPr>
+      </w:pPr>
+    </w:p>
+    <w:p>
+      <w:pPr>
+        <w:rPr>
+          <w:color w:val="000000" w:themeColor="text1"/>
+          <w:sz w:val="22"/>
+          <w:szCs w:val="22"/>
+        </w:rPr>
+      </w:pPr>
+    </w:p>
+    <w:p>
+      <w:pPr>
+        <w:rPr>
+          <w:color w:val="000000" w:themeColor="text1"/>
+          <w:sz w:val="22"/>
+          <w:szCs w:val="22"/>
+        </w:rPr>
+      </w:pPr>
+      <w:r>
+        <w:rPr>
+          <w:color w:val="000000" w:themeColor="text1"/>
+          <w:sz w:val="22"/>
+          <w:szCs w:val="22"/>
+        </w:rPr>
+        <w:t xml:space="preserve">@JSONBACKREFERENCE </w:t>
+      </w:r>
+    </w:p>
+    <w:p>
+      <w:pPr>
+        <w:rPr>
+          <w:color w:val="000000" w:themeColor="text1"/>
+          <w:sz w:val="22"/>
+          <w:szCs w:val="22"/>
+        </w:rPr>
+      </w:pPr>
+      <w:r>
+        <w:rPr>
+          <w:color w:val="000000" w:themeColor="text1"/>
+          <w:sz w:val="22"/>
+          <w:szCs w:val="22"/>
+        </w:rPr>
+        <w:t>Service</w:t>
+      </w:r>
+      <w:r>
+        <w:rPr>
+          <w:color w:val="000000" w:themeColor="text1"/>
+          <w:sz w:val="22"/>
+          <w:szCs w:val="22"/>
+        </w:rPr>
+        <w:t xml:space="preserve"> </w:t>
+      </w:r>
+      <w:r>
+        <w:rPr>
+          <w:color w:val="000000" w:themeColor="text1"/>
+          <w:sz w:val="22"/>
+          <w:szCs w:val="22"/>
+        </w:rPr>
+        <w:sym w:font="Wingdings" w:char="F0E0"/>
+      </w:r>
+      <w:r>
+        <w:rPr>
+          <w:color w:val="000000" w:themeColor="text1"/>
+          <w:sz w:val="22"/>
+          <w:szCs w:val="22"/>
+        </w:rPr>
+        <w:t xml:space="preserve"> it separates the logic from the data layer (entity) and representation layer (the controller) </w:t>
+      </w:r>
+      <w:r>
+        <w:rPr>
+          <w:color w:val="000000" w:themeColor="text1"/>
+          <w:sz w:val="22"/>
+          <w:szCs w:val="22"/>
+        </w:rPr>
+        <w:t xml:space="preserve"> the service layer is responsible for implementing the business logic and hard calculations</w:t>
+      </w:r>
+    </w:p>
+    <w:p>
+      <w:pPr>
+        <w:rPr>
+          <w:color w:val="000000" w:themeColor="text1"/>
+          <w:sz w:val="22"/>
+          <w:szCs w:val="22"/>
+        </w:rPr>
+      </w:pPr>
+      <w:r>
+        <w:rPr>
+          <w:color w:val="000000" w:themeColor="text1"/>
+          <w:sz w:val="22"/>
+          <w:szCs w:val="22"/>
+        </w:rPr>
+        <w:t xml:space="preserve">And by this separation using the service layer we can focus on testing the business logic solely </w:t>
+      </w:r>
+    </w:p>
+    <w:p>
+      <w:pPr>
+        <w:rPr>
+          <w:color w:val="000000" w:themeColor="text1"/>
+          <w:sz w:val="22"/>
+          <w:szCs w:val="22"/>
+        </w:rPr>
+      </w:pPr>
+    </w:p>
+    <w:p>
+      <w:pPr>
+        <w:rPr>
+          <w:color w:val="000000" w:themeColor="text1"/>
+          <w:sz w:val="22"/>
+          <w:szCs w:val="22"/>
+        </w:rPr>
+      </w:pPr>
+    </w:p>
+    <w:p>
+      <w:pPr>
+        <w:rPr>
+          <w:color w:val="000000" w:themeColor="text1"/>
+          <w:sz w:val="22"/>
+          <w:szCs w:val="22"/>
+        </w:rPr>
+      </w:pPr>
+    </w:p>
+    <w:p>
+      <w:pPr>
+        <w:rPr>
+          <w:color w:val="000000" w:themeColor="text1"/>
+          <w:sz w:val="22"/>
+          <w:szCs w:val="22"/>
+        </w:rPr>
+      </w:pPr>
+    </w:p>
+    <w:p>
+      <w:pPr>
+        <w:rPr>
+          <w:color w:val="000000" w:themeColor="text1"/>
+          <w:sz w:val="22"/>
+          <w:szCs w:val="22"/>
+        </w:rPr>
+      </w:pPr>
+    </w:p>
+    <w:p>
+      <w:pPr>
+        <w:rPr>
+          <w:color w:val="000000" w:themeColor="text1"/>
+          <w:sz w:val="22"/>
+          <w:szCs w:val="22"/>
+        </w:rPr>
+      </w:pPr>
+    </w:p>
+    <w:p>
+      <w:pPr>
+        <w:rPr>
+          <w:color w:val="000000" w:themeColor="text1"/>
+          <w:sz w:val="22"/>
+          <w:szCs w:val="22"/>
+        </w:rPr>
+      </w:pPr>
+    </w:p>
+    <w:p>
+      <w:pPr>
+        <w:rPr>
+          <w:color w:val="000000" w:themeColor="text1"/>
+          <w:sz w:val="22"/>
+          <w:szCs w:val="22"/>
+        </w:rPr>
+      </w:pPr>
+    </w:p>
+    <w:p>
+      <w:pPr>
+        <w:rPr>
+          <w:color w:val="000000" w:themeColor="text1"/>
+          <w:sz w:val="22"/>
+          <w:szCs w:val="22"/>
+        </w:rPr>
+      </w:pPr>
+    </w:p>
+    <w:p>
+      <w:pPr>
+        <w:rPr>
+          <w:color w:val="000000" w:themeColor="text1"/>
+          <w:sz w:val="22"/>
+          <w:szCs w:val="22"/>
+        </w:rPr>
+      </w:pPr>
+    </w:p>
+    <w:p>
+      <w:pPr>
+        <w:rPr>
+          <w:color w:val="000000" w:themeColor="text1"/>
+          <w:sz w:val="22"/>
+          <w:szCs w:val="22"/>
+        </w:rPr>
+      </w:pPr>
+    </w:p>
+    <w:p>
+      <w:pPr>
+        <w:rPr>
+          <w:color w:val="000000" w:themeColor="text1"/>
+          <w:sz w:val="22"/>
+          <w:szCs w:val="22"/>
+        </w:rPr>
+      </w:pPr>
+    </w:p>
+    <w:p>
+      <w:pPr>
+        <w:rPr>
+          <w:color w:val="000000" w:themeColor="text1"/>
+          <w:sz w:val="22"/>
+          <w:szCs w:val="22"/>
+        </w:rPr>
+      </w:pPr>
+    </w:p>
+    <w:p>
+      <w:pPr>
+        <w:rPr>
+          <w:color w:val="000000" w:themeColor="text1"/>
+          <w:sz w:val="22"/>
+          <w:szCs w:val="22"/>
+        </w:rPr>
+      </w:pPr>
+    </w:p>
+    <w:p>
+      <w:pPr>
+        <w:rPr>
+          <w:color w:val="000000" w:themeColor="text1"/>
+          <w:sz w:val="22"/>
+          <w:szCs w:val="22"/>
+        </w:rPr>
+      </w:pPr>
+    </w:p>
+    <w:p>
+      <w:pPr>
+        <w:rPr>
+          <w:color w:val="000000" w:themeColor="text1"/>
+          <w:sz w:val="22"/>
+          <w:szCs w:val="22"/>
+        </w:rPr>
+      </w:pPr>
+    </w:p>
+    <w:p>
+      <w:pPr>
+        <w:rPr>
+          <w:color w:val="000000" w:themeColor="text1"/>
+          <w:sz w:val="22"/>
+          <w:szCs w:val="22"/>
+        </w:rPr>
+      </w:pPr>
+    </w:p>
+    <w:p>
+      <w:pPr>
+        <w:jc w:val="center"/>
+        <w:rPr>
+          <w:b/>
+          <w:bCs/>
+          <w:color w:val="EE0000"/>
+          <w:sz w:val="32"/>
+          <w:szCs w:val="32"/>
+          <w:u w:val="single"/>
+        </w:rPr>
+      </w:pPr>
+      <w:r>
+        <w:rPr>
+          <w:b/>
+          <w:bCs/>
+          <w:color w:val="EE0000"/>
+          <w:sz w:val="32"/>
+          <w:szCs w:val="32"/>
+          <w:u w:val="single"/>
+        </w:rPr>
+        <w:t>DTO</w:t>
+      </w:r>
+      <w:r>
+        <w:rPr>
+          <w:b/>
+          <w:bCs/>
+          <w:color w:val="EE0000"/>
+          <w:sz w:val="32"/>
+          <w:szCs w:val="32"/>
+          <w:u w:val="single"/>
+        </w:rPr>
+        <w:t xml:space="preserve"> (Data Transfer Object)</w:t>
+      </w:r>
+    </w:p>
+    <w:p>
+      <w:pPr>
+        <w:rPr>
+          <w:color w:val="000000" w:themeColor="text1"/>
+          <w:sz w:val="22"/>
+          <w:szCs w:val="22"/>
+        </w:rPr>
+      </w:pPr>
+      <w:r>
+        <w:rPr>
+          <w:color w:val="000000" w:themeColor="text1"/>
+          <w:sz w:val="22"/>
+          <w:szCs w:val="22"/>
+        </w:rPr>
+        <w:t xml:space="preserve">The main purpose is to encapsulate data that needs to be transferred among systems </w:t>
+      </w:r>
+    </w:p>
+    <w:p>
+      <w:pPr>
+        <w:rPr>
+          <w:color w:val="000000" w:themeColor="text1"/>
+          <w:sz w:val="22"/>
+          <w:szCs w:val="22"/>
+        </w:rPr>
+      </w:pPr>
+      <w:r>
+        <w:rPr>
+          <w:color w:val="000000" w:themeColor="text1"/>
+          <w:sz w:val="22"/>
+          <w:szCs w:val="22"/>
+        </w:rPr>
+        <w:t>Usually includes attributes, we need to include a mechanism between the entities and the outside world to prohibit the exposure of certain data inside the entity/database.</w:t>
+      </w:r>
+      <w:r>
+        <w:rPr>
+          <w:color w:val="000000" w:themeColor="text1"/>
+          <w:sz w:val="22"/>
+          <w:szCs w:val="22"/>
+        </w:rPr>
+        <w:t xml:space="preserve"> </w:t>
+      </w:r>
+      <w:r>
+        <w:rPr>
+          <w:color w:val="000000" w:themeColor="text1"/>
+          <w:sz w:val="22"/>
+          <w:szCs w:val="22"/>
+        </w:rPr>
+        <w:sym w:font="Wingdings" w:char="F0E0"/>
+      </w:r>
+      <w:r>
+        <w:rPr>
+          <w:color w:val="000000" w:themeColor="text1"/>
+          <w:sz w:val="22"/>
+          <w:szCs w:val="22"/>
+        </w:rPr>
+        <w:t xml:space="preserve"> mapper </w:t>
+      </w:r>
+    </w:p>
+    <w:p>
+      <w:pPr>
+        <w:rPr>
+          <w:color w:val="000000" w:themeColor="text1"/>
+          <w:sz w:val="22"/>
+          <w:szCs w:val="22"/>
+        </w:rPr>
+      </w:pPr>
+      <w:r>
+        <w:rPr>
+          <w:color w:val="000000" w:themeColor="text1"/>
+          <w:sz w:val="22"/>
+          <w:szCs w:val="22"/>
+        </w:rPr>
+        <w:t>The mapper allows us to have multiple different representations of the same entity.</w:t>
+      </w:r>
+    </w:p>
+    <w:p>
+      <w:pPr>
+        <w:rPr>
+          <w:color w:val="000000" w:themeColor="text1"/>
+          <w:sz w:val="22"/>
+          <w:szCs w:val="22"/>
+        </w:rPr>
+      </w:pPr>
+    </w:p>
+    <w:p>
+      <w:pPr>
+        <w:rPr>
+          <w:color w:val="000000" w:themeColor="text1"/>
+          <w:sz w:val="22"/>
+          <w:szCs w:val="22"/>
+        </w:rPr>
+      </w:pPr>
+      <w:r>
+        <w:rPr>
+          <w:color w:val="000000" w:themeColor="text1"/>
+          <w:sz w:val="22"/>
+          <w:szCs w:val="22"/>
+        </w:rPr>
+        <w:t>DTO  helps with data separation</w:t>
+      </w:r>
+      <w:r>
+        <w:rPr>
+          <w:color w:val="000000" w:themeColor="text1"/>
+          <w:sz w:val="22"/>
+          <w:szCs w:val="22"/>
+        </w:rPr>
+        <w:t>, means that we can change the logic and it wont affect the end user, we can hide some confidential data</w:t>
+      </w:r>
+    </w:p>
+    <w:p>
+      <w:pPr>
+        <w:rPr>
+          <w:color w:val="000000" w:themeColor="text1"/>
+          <w:sz w:val="22"/>
+          <w:szCs w:val="22"/>
+        </w:rPr>
+      </w:pPr>
+      <w:r>
+        <w:rPr>
+          <w:color w:val="000000" w:themeColor="text1"/>
+          <w:sz w:val="22"/>
+          <w:szCs w:val="22"/>
+        </w:rPr>
+        <w:t>It improves also the performance by sending minimal data to the server, decreasing the time.</w:t>
+      </w:r>
+    </w:p>
+    <w:p>
+      <w:pPr>
+        <w:rPr>
+          <w:color w:val="000000" w:themeColor="text1"/>
+          <w:sz w:val="22"/>
+          <w:szCs w:val="22"/>
+        </w:rPr>
+      </w:pPr>
+      <w:r>
+        <w:rPr>
+          <w:color w:val="000000" w:themeColor="text1"/>
+          <w:sz w:val="22"/>
+          <w:szCs w:val="22"/>
+        </w:rPr>
+        <w:t>For DTOs we use records instead of classes</w:t>
+      </w:r>
+    </w:p>
+    <w:p>
+      <w:pPr>
+        <w:rPr>
+          <w:color w:val="000000" w:themeColor="text1"/>
+          <w:sz w:val="22"/>
+          <w:szCs w:val="22"/>
+        </w:rPr>
+      </w:pPr>
+    </w:p>
+    <w:p>
+      <w:pPr>
+        <w:rPr>
+          <w:color w:val="000000" w:themeColor="text1"/>
+          <w:sz w:val="22"/>
+          <w:szCs w:val="22"/>
+        </w:rPr>
+      </w:pPr>
+    </w:p>
+    <w:p>
+      <w:pPr>
+        <w:rPr>
+          <w:color w:val="000000" w:themeColor="text1"/>
+          <w:sz w:val="22"/>
+          <w:szCs w:val="22"/>
+        </w:rPr>
+      </w:pPr>
     </w:p>
     <w:p>
       <w:pPr>
@@ -7598,6 +9611,7 @@
   <w:style w:type="character" w:default="1" w:styleId="DefaultParagraphFont">
     <w:name w:val="Default Paragraph Font"/>
     <w:uiPriority w:val="1"/>
+    <w:semiHidden/>
     <w:unhideWhenUsed/>
   </w:style>
   <w:style w:type="table" w:default="1" w:styleId="TableNormal">

</xml_diff>

<commit_message>
add Repo and entity
</commit_message>
<xml_diff>
--- a/Notes.docx
+++ b/Notes.docx
@@ -79,7 +79,25 @@
           <w:sz w:val="22"/>
           <w:szCs w:val="22"/>
         </w:rPr>
-        <w:t xml:space="preserve"> in a normal condition or without spring framework we would need to create an instance(object) of the class and inject it where it should, manage it. This creates tight coupling. However the inversion of control allows spring boot using @Autowired to create an object for us, inject where </w:t>
+        <w:t xml:space="preserve"> in a normal condition or without spring framework we would need to create an instance(object) of the class and inject it where it should, manage it. This creates tight coupling. </w:t>
+      </w:r>
+      <w:proofErr w:type="gramStart"/>
+      <w:r>
+        <w:rPr>
+          <w:color w:val="000000" w:themeColor="text1"/>
+          <w:sz w:val="22"/>
+          <w:szCs w:val="22"/>
+        </w:rPr>
+        <w:t>However</w:t>
+      </w:r>
+      <w:proofErr w:type="gramEnd"/>
+      <w:r>
+        <w:rPr>
+          <w:color w:val="000000" w:themeColor="text1"/>
+          <w:sz w:val="22"/>
+          <w:szCs w:val="22"/>
+        </w:rPr>
+        <w:t xml:space="preserve"> the inversion of control allows spring boot using @Autowired to create an object for us, inject where </w:t>
       </w:r>
       <w:proofErr w:type="spellStart"/>
       <w:r>
@@ -427,7 +445,25 @@
           <w:sz w:val="22"/>
           <w:szCs w:val="22"/>
         </w:rPr>
-        <w:t>In the app configuration class when we define beans using methods we annotate those methods with @Bean, and this bean that is returned from the method is named the same as the method name but if we wrote @Bean(“name”) now the spring boot will name that bean as name.</w:t>
+        <w:t xml:space="preserve">In the app configuration class when we define beans using </w:t>
+      </w:r>
+      <w:proofErr w:type="gramStart"/>
+      <w:r>
+        <w:rPr>
+          <w:color w:val="000000" w:themeColor="text1"/>
+          <w:sz w:val="22"/>
+          <w:szCs w:val="22"/>
+        </w:rPr>
+        <w:t>methods</w:t>
+      </w:r>
+      <w:proofErr w:type="gramEnd"/>
+      <w:r>
+        <w:rPr>
+          <w:color w:val="000000" w:themeColor="text1"/>
+          <w:sz w:val="22"/>
+          <w:szCs w:val="22"/>
+        </w:rPr>
+        <w:t xml:space="preserve"> we annotate those methods with @Bean, and this bean that is returned from the method is named the same as the method name but if we wrote @Bean(“name”) now the spring boot will name that bean as name.</w:t>
       </w:r>
     </w:p>
     <w:p>
@@ -783,7 +819,25 @@
           <w:sz w:val="22"/>
           <w:szCs w:val="22"/>
         </w:rPr>
-        <w:t xml:space="preserve">@Value(“Actual value”) is used to inject value into a variable, whether its hardcoded or comes from another environment or class. Or class path, or file or variable. </w:t>
+        <w:t>@</w:t>
+      </w:r>
+      <w:proofErr w:type="gramStart"/>
+      <w:r>
+        <w:rPr>
+          <w:color w:val="000000" w:themeColor="text1"/>
+          <w:sz w:val="22"/>
+          <w:szCs w:val="22"/>
+        </w:rPr>
+        <w:t>Value(</w:t>
+      </w:r>
+      <w:proofErr w:type="gramEnd"/>
+      <w:r>
+        <w:rPr>
+          <w:color w:val="000000" w:themeColor="text1"/>
+          <w:sz w:val="22"/>
+          <w:szCs w:val="22"/>
+        </w:rPr>
+        <w:t xml:space="preserve">“Actual value”) is used to inject value into a variable, whether its hardcoded or comes from another environment or class. Or class path, or file or variable. </w:t>
       </w:r>
     </w:p>
     <w:p>
@@ -1199,7 +1253,25 @@
           <w:sz w:val="22"/>
           <w:szCs w:val="22"/>
         </w:rPr>
-        <w:t>In case of nested resources payments inside the accounts it should be like this</w:t>
+        <w:t xml:space="preserve">In case of nested resources payments inside the </w:t>
+      </w:r>
+      <w:proofErr w:type="gramStart"/>
+      <w:r>
+        <w:rPr>
+          <w:color w:val="000000" w:themeColor="text1"/>
+          <w:sz w:val="22"/>
+          <w:szCs w:val="22"/>
+        </w:rPr>
+        <w:t>accounts</w:t>
+      </w:r>
+      <w:proofErr w:type="gramEnd"/>
+      <w:r>
+        <w:rPr>
+          <w:color w:val="000000" w:themeColor="text1"/>
+          <w:sz w:val="22"/>
+          <w:szCs w:val="22"/>
+        </w:rPr>
+        <w:t xml:space="preserve"> it should be like this</w:t>
       </w:r>
     </w:p>
     <w:p>
@@ -1267,8 +1339,36 @@
           <w:sz w:val="22"/>
           <w:szCs w:val="22"/>
         </w:rPr>
-        <w:t>GET, POST, PUT, DELETE,PATCH,OPTIONS,HEAD</w:t>
-      </w:r>
+        <w:t xml:space="preserve">GET, POST, PUT, </w:t>
+      </w:r>
+      <w:proofErr w:type="gramStart"/>
+      <w:r>
+        <w:rPr>
+          <w:color w:val="EE0000"/>
+          <w:sz w:val="22"/>
+          <w:szCs w:val="22"/>
+        </w:rPr>
+        <w:t>DELETE,PATCH</w:t>
+      </w:r>
+      <w:proofErr w:type="gramEnd"/>
+      <w:r>
+        <w:rPr>
+          <w:color w:val="EE0000"/>
+          <w:sz w:val="22"/>
+          <w:szCs w:val="22"/>
+        </w:rPr>
+        <w:t>,</w:t>
+      </w:r>
+      <w:proofErr w:type="gramStart"/>
+      <w:r>
+        <w:rPr>
+          <w:color w:val="EE0000"/>
+          <w:sz w:val="22"/>
+          <w:szCs w:val="22"/>
+        </w:rPr>
+        <w:t>OPTIONS,HEAD</w:t>
+      </w:r>
+      <w:proofErr w:type="gramEnd"/>
       <w:r>
         <w:rPr>
           <w:color w:val="000000" w:themeColor="text1"/>
@@ -1339,6 +1439,7 @@
         <w:t xml:space="preserve">Public void </w:t>
       </w:r>
       <w:proofErr w:type="spellStart"/>
+      <w:proofErr w:type="gramStart"/>
       <w:r>
         <w:rPr>
           <w:color w:val="EE0000"/>
@@ -1354,7 +1455,16 @@
           <w:sz w:val="22"/>
           <w:szCs w:val="22"/>
         </w:rPr>
-        <w:t>(){}</w:t>
+        <w:t>(){</w:t>
+      </w:r>
+      <w:proofErr w:type="gramEnd"/>
+      <w:r>
+        <w:rPr>
+          <w:color w:val="EE0000"/>
+          <w:sz w:val="22"/>
+          <w:szCs w:val="22"/>
+        </w:rPr>
+        <w:t>}</w:t>
       </w:r>
     </w:p>
     <w:p>
@@ -1521,6 +1631,7 @@
         <w:t xml:space="preserve">public User </w:t>
       </w:r>
       <w:proofErr w:type="spellStart"/>
+      <w:proofErr w:type="gramStart"/>
       <w:r>
         <w:rPr>
           <w:color w:val="EE0000"/>
@@ -1536,7 +1647,16 @@
           <w:sz w:val="22"/>
           <w:szCs w:val="22"/>
         </w:rPr>
-        <w:t>(@PathVariable Long id, @RequestBody User user) {</w:t>
+        <w:t>(</w:t>
+      </w:r>
+      <w:proofErr w:type="gramEnd"/>
+      <w:r>
+        <w:rPr>
+          <w:color w:val="EE0000"/>
+          <w:sz w:val="22"/>
+          <w:szCs w:val="22"/>
+        </w:rPr>
+        <w:t>@PathVariable Long id, @RequestBody User user) {</w:t>
       </w:r>
       <w:r>
         <w:rPr>
@@ -1548,6 +1668,7 @@
         <w:t xml:space="preserve">    </w:t>
       </w:r>
       <w:proofErr w:type="spellStart"/>
+      <w:proofErr w:type="gramStart"/>
       <w:r>
         <w:rPr>
           <w:color w:val="EE0000"/>
@@ -1557,6 +1678,7 @@
         <w:t>user.setId</w:t>
       </w:r>
       <w:proofErr w:type="spellEnd"/>
+      <w:proofErr w:type="gramEnd"/>
       <w:r>
         <w:rPr>
           <w:color w:val="EE0000"/>
@@ -1761,6 +1883,7 @@
         <w:t xml:space="preserve">public void </w:t>
       </w:r>
       <w:proofErr w:type="spellStart"/>
+      <w:proofErr w:type="gramStart"/>
       <w:r>
         <w:rPr>
           <w:color w:val="EE0000"/>
@@ -1776,7 +1899,16 @@
           <w:sz w:val="22"/>
           <w:szCs w:val="22"/>
         </w:rPr>
-        <w:t>(@PathVariable Long id) {</w:t>
+        <w:t>(</w:t>
+      </w:r>
+      <w:proofErr w:type="gramEnd"/>
+      <w:r>
+        <w:rPr>
+          <w:color w:val="EE0000"/>
+          <w:sz w:val="22"/>
+          <w:szCs w:val="22"/>
+        </w:rPr>
+        <w:t>@PathVariable Long id) {</w:t>
       </w:r>
     </w:p>
     <w:p>
@@ -1845,18 +1977,24 @@
           <w:sz w:val="22"/>
           <w:szCs w:val="22"/>
         </w:rPr>
-        <w:t xml:space="preserve">Is used to remove a resource from the </w:t>
-      </w:r>
-      <w:proofErr w:type="spellStart"/>
-      <w:r>
-        <w:rPr>
-          <w:color w:val="000000" w:themeColor="text1"/>
-          <w:sz w:val="22"/>
-          <w:szCs w:val="22"/>
-        </w:rPr>
-        <w:t>databse</w:t>
-      </w:r>
-      <w:proofErr w:type="spellEnd"/>
+        <w:t>Is used to remove a resource from the datab</w:t>
+      </w:r>
+      <w:r>
+        <w:rPr>
+          <w:color w:val="000000" w:themeColor="text1"/>
+          <w:sz w:val="22"/>
+          <w:szCs w:val="22"/>
+        </w:rPr>
+        <w:t>a</w:t>
+      </w:r>
+      <w:r>
+        <w:rPr>
+          <w:color w:val="000000" w:themeColor="text1"/>
+          <w:sz w:val="22"/>
+          <w:szCs w:val="22"/>
+        </w:rPr>
+        <w:t>se</w:t>
+      </w:r>
     </w:p>
     <w:p>
       <w:pPr>
@@ -1927,6 +2065,7 @@
         <w:t xml:space="preserve">public User </w:t>
       </w:r>
       <w:proofErr w:type="spellStart"/>
+      <w:proofErr w:type="gramStart"/>
       <w:r>
         <w:rPr>
           <w:color w:val="EE0000"/>
@@ -1942,7 +2081,16 @@
           <w:sz w:val="22"/>
           <w:szCs w:val="22"/>
         </w:rPr>
-        <w:t>(@PathVariable Long id, @RequestBody Map&lt;String, Object&gt; updates) {</w:t>
+        <w:t>(</w:t>
+      </w:r>
+      <w:proofErr w:type="gramEnd"/>
+      <w:r>
+        <w:rPr>
+          <w:color w:val="EE0000"/>
+          <w:sz w:val="22"/>
+          <w:szCs w:val="22"/>
+        </w:rPr>
+        <w:t>@PathVariable Long id, @RequestBody Map&lt;String, Object&gt; updates) {</w:t>
       </w:r>
     </w:p>
     <w:p>
@@ -2080,7 +2228,25 @@
           <w:sz w:val="22"/>
           <w:szCs w:val="22"/>
         </w:rPr>
-        <w:t xml:space="preserve">@RequestMapping(value = "/users", method = </w:t>
+        <w:t>@</w:t>
+      </w:r>
+      <w:proofErr w:type="gramStart"/>
+      <w:r>
+        <w:rPr>
+          <w:color w:val="EE0000"/>
+          <w:sz w:val="22"/>
+          <w:szCs w:val="22"/>
+        </w:rPr>
+        <w:t>RequestMapping(</w:t>
+      </w:r>
+      <w:proofErr w:type="gramEnd"/>
+      <w:r>
+        <w:rPr>
+          <w:color w:val="EE0000"/>
+          <w:sz w:val="22"/>
+          <w:szCs w:val="22"/>
+        </w:rPr>
+        <w:t xml:space="preserve">value = "/users", method = </w:t>
       </w:r>
       <w:proofErr w:type="spellStart"/>
       <w:r>
@@ -2133,7 +2299,25 @@
           <w:sz w:val="22"/>
           <w:szCs w:val="22"/>
         </w:rPr>
-        <w:t>&lt;?&gt; options() {</w:t>
+        <w:t xml:space="preserve">&lt;?&gt; </w:t>
+      </w:r>
+      <w:proofErr w:type="gramStart"/>
+      <w:r>
+        <w:rPr>
+          <w:color w:val="EE0000"/>
+          <w:sz w:val="22"/>
+          <w:szCs w:val="22"/>
+        </w:rPr>
+        <w:t>options(</w:t>
+      </w:r>
+      <w:proofErr w:type="gramEnd"/>
+      <w:r>
+        <w:rPr>
+          <w:color w:val="EE0000"/>
+          <w:sz w:val="22"/>
+          <w:szCs w:val="22"/>
+        </w:rPr>
+        <w:t>) {</w:t>
       </w:r>
     </w:p>
     <w:p>
@@ -2185,24 +2369,60 @@
           <w:sz w:val="22"/>
           <w:szCs w:val="22"/>
         </w:rPr>
-        <w:t xml:space="preserve">        .header("Allow", "GET, POST, PUT, DELETE, PATCH, OPTIONS")</w:t>
-      </w:r>
-    </w:p>
-    <w:p>
-      <w:pPr>
-        <w:rPr>
-          <w:color w:val="EE0000"/>
-          <w:sz w:val="22"/>
-          <w:szCs w:val="22"/>
-        </w:rPr>
-      </w:pPr>
-      <w:r>
-        <w:rPr>
-          <w:color w:val="EE0000"/>
-          <w:sz w:val="22"/>
-          <w:szCs w:val="22"/>
-        </w:rPr>
-        <w:t xml:space="preserve">        .build();</w:t>
+        <w:t xml:space="preserve">        </w:t>
+      </w:r>
+      <w:proofErr w:type="gramStart"/>
+      <w:r>
+        <w:rPr>
+          <w:color w:val="EE0000"/>
+          <w:sz w:val="22"/>
+          <w:szCs w:val="22"/>
+        </w:rPr>
+        <w:t>.header</w:t>
+      </w:r>
+      <w:proofErr w:type="gramEnd"/>
+      <w:r>
+        <w:rPr>
+          <w:color w:val="EE0000"/>
+          <w:sz w:val="22"/>
+          <w:szCs w:val="22"/>
+        </w:rPr>
+        <w:t>("Allow", "GET, POST, PUT, DELETE, PATCH, OPTIONS")</w:t>
+      </w:r>
+    </w:p>
+    <w:p>
+      <w:pPr>
+        <w:rPr>
+          <w:color w:val="EE0000"/>
+          <w:sz w:val="22"/>
+          <w:szCs w:val="22"/>
+        </w:rPr>
+      </w:pPr>
+      <w:r>
+        <w:rPr>
+          <w:color w:val="EE0000"/>
+          <w:sz w:val="22"/>
+          <w:szCs w:val="22"/>
+        </w:rPr>
+        <w:t xml:space="preserve">        </w:t>
+      </w:r>
+      <w:proofErr w:type="gramStart"/>
+      <w:r>
+        <w:rPr>
+          <w:color w:val="EE0000"/>
+          <w:sz w:val="22"/>
+          <w:szCs w:val="22"/>
+        </w:rPr>
+        <w:t>.build</w:t>
+      </w:r>
+      <w:proofErr w:type="gramEnd"/>
+      <w:r>
+        <w:rPr>
+          <w:color w:val="EE0000"/>
+          <w:sz w:val="22"/>
+          <w:szCs w:val="22"/>
+        </w:rPr>
+        <w:t>();</w:t>
       </w:r>
     </w:p>
     <w:p>
@@ -2361,7 +2581,25 @@
           <w:sz w:val="22"/>
           <w:szCs w:val="22"/>
         </w:rPr>
-        <w:t xml:space="preserve">@RequestMapping(value = "/users/{id}", method = </w:t>
+        <w:t>@</w:t>
+      </w:r>
+      <w:proofErr w:type="gramStart"/>
+      <w:r>
+        <w:rPr>
+          <w:color w:val="EE0000"/>
+          <w:sz w:val="22"/>
+          <w:szCs w:val="22"/>
+        </w:rPr>
+        <w:t>RequestMapping(</w:t>
+      </w:r>
+      <w:proofErr w:type="gramEnd"/>
+      <w:r>
+        <w:rPr>
+          <w:color w:val="EE0000"/>
+          <w:sz w:val="22"/>
+          <w:szCs w:val="22"/>
+        </w:rPr>
+        <w:t xml:space="preserve">value = "/users/{id}", method = </w:t>
       </w:r>
       <w:proofErr w:type="spellStart"/>
       <w:r>
@@ -2417,6 +2655,7 @@
         <w:t xml:space="preserve">&lt;Void&gt; </w:t>
       </w:r>
       <w:proofErr w:type="spellStart"/>
+      <w:proofErr w:type="gramStart"/>
       <w:r>
         <w:rPr>
           <w:color w:val="EE0000"/>
@@ -2432,7 +2671,16 @@
           <w:sz w:val="22"/>
           <w:szCs w:val="22"/>
         </w:rPr>
-        <w:t>(@PathVariable Long id) {</w:t>
+        <w:t>(</w:t>
+      </w:r>
+      <w:proofErr w:type="gramEnd"/>
+      <w:r>
+        <w:rPr>
+          <w:color w:val="EE0000"/>
+          <w:sz w:val="22"/>
+          <w:szCs w:val="22"/>
+        </w:rPr>
+        <w:t>@PathVariable Long id) {</w:t>
       </w:r>
     </w:p>
     <w:p>
@@ -2502,7 +2750,25 @@
           <w:sz w:val="22"/>
           <w:szCs w:val="22"/>
         </w:rPr>
-        <w:t>().build();</w:t>
+        <w:t>(</w:t>
+      </w:r>
+      <w:proofErr w:type="gramStart"/>
+      <w:r>
+        <w:rPr>
+          <w:color w:val="EE0000"/>
+          <w:sz w:val="22"/>
+          <w:szCs w:val="22"/>
+        </w:rPr>
+        <w:t>).build</w:t>
+      </w:r>
+      <w:proofErr w:type="gramEnd"/>
+      <w:r>
+        <w:rPr>
+          <w:color w:val="EE0000"/>
+          <w:sz w:val="22"/>
+          <w:szCs w:val="22"/>
+        </w:rPr>
+        <w:t>();</w:t>
       </w:r>
     </w:p>
     <w:p>
@@ -2554,7 +2820,25 @@
           <w:sz w:val="22"/>
           <w:szCs w:val="22"/>
         </w:rPr>
-        <w:t>().build();</w:t>
+        <w:t>(</w:t>
+      </w:r>
+      <w:proofErr w:type="gramStart"/>
+      <w:r>
+        <w:rPr>
+          <w:color w:val="EE0000"/>
+          <w:sz w:val="22"/>
+          <w:szCs w:val="22"/>
+        </w:rPr>
+        <w:t>).build</w:t>
+      </w:r>
+      <w:proofErr w:type="gramEnd"/>
+      <w:r>
+        <w:rPr>
+          <w:color w:val="EE0000"/>
+          <w:sz w:val="22"/>
+          <w:szCs w:val="22"/>
+        </w:rPr>
+        <w:t>();</w:t>
       </w:r>
     </w:p>
     <w:p>
@@ -2839,7 +3123,25 @@
           <w:sz w:val="22"/>
           <w:szCs w:val="22"/>
         </w:rPr>
-        <w:t xml:space="preserve"> for caching, if the current version matches the version in the client cache we get this message from the server and no more content. We just use the local version of the request.</w:t>
+        <w:t xml:space="preserve"> for caching, if the current version matches the version in the client </w:t>
+      </w:r>
+      <w:proofErr w:type="gramStart"/>
+      <w:r>
+        <w:rPr>
+          <w:color w:val="000000" w:themeColor="text1"/>
+          <w:sz w:val="22"/>
+          <w:szCs w:val="22"/>
+        </w:rPr>
+        <w:t>cache</w:t>
+      </w:r>
+      <w:proofErr w:type="gramEnd"/>
+      <w:r>
+        <w:rPr>
+          <w:color w:val="000000" w:themeColor="text1"/>
+          <w:sz w:val="22"/>
+          <w:szCs w:val="22"/>
+        </w:rPr>
+        <w:t xml:space="preserve"> we get this message from the server and no more content. We just use the local version of the request.</w:t>
       </w:r>
     </w:p>
     <w:p>
@@ -2888,7 +3190,25 @@
           <w:sz w:val="22"/>
           <w:szCs w:val="22"/>
         </w:rPr>
-        <w:t xml:space="preserve">, 400 bad request, the server was not able to understand the request because of invalid syntax. 401 unauthorized -&gt; means requires user authentication. 403 forbidden the client does not have the necessary authorization for the certain resources. </w:t>
+        <w:t xml:space="preserve">, 400 bad </w:t>
+      </w:r>
+      <w:proofErr w:type="gramStart"/>
+      <w:r>
+        <w:rPr>
+          <w:color w:val="000000" w:themeColor="text1"/>
+          <w:sz w:val="22"/>
+          <w:szCs w:val="22"/>
+        </w:rPr>
+        <w:t>request</w:t>
+      </w:r>
+      <w:proofErr w:type="gramEnd"/>
+      <w:r>
+        <w:rPr>
+          <w:color w:val="000000" w:themeColor="text1"/>
+          <w:sz w:val="22"/>
+          <w:szCs w:val="22"/>
+        </w:rPr>
+        <w:t xml:space="preserve">, the server was not able to understand the request because of invalid syntax. 401 unauthorized -&gt; means requires user authentication. 403 forbidden the client does not have the necessary authorization for the certain resources. </w:t>
       </w:r>
     </w:p>
     <w:p>
@@ -2937,7 +3257,25 @@
           <w:sz w:val="22"/>
           <w:szCs w:val="22"/>
         </w:rPr>
-        <w:t xml:space="preserve">, 500 server error when the server has an undefined issue and no more information is known or provided. 503 server unavailable, which means that the server is down because its overloaded or under maintenance. </w:t>
+        <w:t xml:space="preserve">, 500 server error when the server has an undefined issue and no more information is known or provided. 503 </w:t>
+      </w:r>
+      <w:proofErr w:type="gramStart"/>
+      <w:r>
+        <w:rPr>
+          <w:color w:val="000000" w:themeColor="text1"/>
+          <w:sz w:val="22"/>
+          <w:szCs w:val="22"/>
+        </w:rPr>
+        <w:t>server</w:t>
+      </w:r>
+      <w:proofErr w:type="gramEnd"/>
+      <w:r>
+        <w:rPr>
+          <w:color w:val="000000" w:themeColor="text1"/>
+          <w:sz w:val="22"/>
+          <w:szCs w:val="22"/>
+        </w:rPr>
+        <w:t xml:space="preserve"> unavailable, which means that the server is down because its overloaded or under maintenance. </w:t>
       </w:r>
     </w:p>
     <w:p>
@@ -3182,7 +3520,25 @@
           <w:szCs w:val="22"/>
         </w:rPr>
         <w:br/>
-        <w:t>@ResponseStatus(HttpStatus.CREATED)</w:t>
+        <w:t>@</w:t>
+      </w:r>
+      <w:proofErr w:type="gramStart"/>
+      <w:r>
+        <w:rPr>
+          <w:color w:val="000000" w:themeColor="text1"/>
+          <w:sz w:val="22"/>
+          <w:szCs w:val="22"/>
+        </w:rPr>
+        <w:t>ResponseStatus(</w:t>
+      </w:r>
+      <w:proofErr w:type="gramEnd"/>
+      <w:r>
+        <w:rPr>
+          <w:color w:val="000000" w:themeColor="text1"/>
+          <w:sz w:val="22"/>
+          <w:szCs w:val="22"/>
+        </w:rPr>
+        <w:t>HttpStatus.CREATED)</w:t>
       </w:r>
       <w:r>
         <w:rPr>
@@ -3194,6 +3550,7 @@
         <w:t xml:space="preserve">public User </w:t>
       </w:r>
       <w:proofErr w:type="spellStart"/>
+      <w:proofErr w:type="gramStart"/>
       <w:r>
         <w:rPr>
           <w:color w:val="000000" w:themeColor="text1"/>
@@ -3209,7 +3566,16 @@
           <w:sz w:val="22"/>
           <w:szCs w:val="22"/>
         </w:rPr>
-        <w:t>(@RequestBody User user) {</w:t>
+        <w:t>(</w:t>
+      </w:r>
+      <w:proofErr w:type="gramEnd"/>
+      <w:r>
+        <w:rPr>
+          <w:color w:val="000000" w:themeColor="text1"/>
+          <w:sz w:val="22"/>
+          <w:szCs w:val="22"/>
+        </w:rPr>
+        <w:t>@RequestBody User user) {</w:t>
       </w:r>
       <w:r>
         <w:rPr>
@@ -3353,7 +3719,25 @@
           <w:szCs w:val="22"/>
         </w:rPr>
         <w:br/>
-        <w:t>@ResponseStatus(HttpStatus.</w:t>
+        <w:t>@</w:t>
+      </w:r>
+      <w:proofErr w:type="gramStart"/>
+      <w:r>
+        <w:rPr>
+          <w:color w:val="4472C4" w:themeColor="accent1"/>
+          <w:sz w:val="22"/>
+          <w:szCs w:val="22"/>
+        </w:rPr>
+        <w:t>ResponseStatus(</w:t>
+      </w:r>
+      <w:proofErr w:type="gramEnd"/>
+      <w:r>
+        <w:rPr>
+          <w:color w:val="4472C4" w:themeColor="accent1"/>
+          <w:sz w:val="22"/>
+          <w:szCs w:val="22"/>
+        </w:rPr>
+        <w:t>HttpStatus.</w:t>
       </w:r>
       <w:r>
         <w:rPr>
@@ -3416,6 +3800,7 @@
         <w:t xml:space="preserve">public String </w:t>
       </w:r>
       <w:proofErr w:type="spellStart"/>
+      <w:proofErr w:type="gramStart"/>
       <w:r>
         <w:rPr>
           <w:color w:val="4472C4" w:themeColor="accent1"/>
@@ -3431,8 +3816,27 @@
           <w:sz w:val="22"/>
           <w:szCs w:val="22"/>
         </w:rPr>
-        <w:t>( @RequestBody Order order){</w:t>
-      </w:r>
+        <w:t>( @</w:t>
+      </w:r>
+      <w:proofErr w:type="gramEnd"/>
+      <w:r>
+        <w:rPr>
+          <w:color w:val="4472C4" w:themeColor="accent1"/>
+          <w:sz w:val="22"/>
+          <w:szCs w:val="22"/>
+        </w:rPr>
+        <w:t xml:space="preserve">RequestBody Order </w:t>
+      </w:r>
+      <w:proofErr w:type="gramStart"/>
+      <w:r>
+        <w:rPr>
+          <w:color w:val="4472C4" w:themeColor="accent1"/>
+          <w:sz w:val="22"/>
+          <w:szCs w:val="22"/>
+        </w:rPr>
+        <w:t>order){</w:t>
+      </w:r>
+      <w:proofErr w:type="gramEnd"/>
       <w:r>
         <w:rPr>
           <w:color w:val="4472C4" w:themeColor="accent1"/>
@@ -3443,6 +3847,7 @@
         <w:t xml:space="preserve">    return "welcome the order details are " + </w:t>
       </w:r>
       <w:proofErr w:type="spellStart"/>
+      <w:proofErr w:type="gramStart"/>
       <w:r>
         <w:rPr>
           <w:color w:val="4472C4" w:themeColor="accent1"/>
@@ -3452,6 +3857,7 @@
         <w:t>order.toString</w:t>
       </w:r>
       <w:proofErr w:type="spellEnd"/>
+      <w:proofErr w:type="gramEnd"/>
       <w:r>
         <w:rPr>
           <w:color w:val="4472C4" w:themeColor="accent1"/>
@@ -3502,7 +3908,25 @@
           <w:szCs w:val="22"/>
         </w:rPr>
         <w:lastRenderedPageBreak/>
-        <w:t xml:space="preserve">After collecting this data we should then inside the order class map our </w:t>
+        <w:t xml:space="preserve">After collecting this </w:t>
+      </w:r>
+      <w:proofErr w:type="gramStart"/>
+      <w:r>
+        <w:rPr>
+          <w:color w:val="000000" w:themeColor="text1"/>
+          <w:sz w:val="22"/>
+          <w:szCs w:val="22"/>
+        </w:rPr>
+        <w:t>data</w:t>
+      </w:r>
+      <w:proofErr w:type="gramEnd"/>
+      <w:r>
+        <w:rPr>
+          <w:color w:val="000000" w:themeColor="text1"/>
+          <w:sz w:val="22"/>
+          <w:szCs w:val="22"/>
+        </w:rPr>
+        <w:t xml:space="preserve"> we should then inside the order class map our </w:t>
       </w:r>
       <w:proofErr w:type="spellStart"/>
       <w:r>
@@ -3679,7 +4103,25 @@
           <w:sz w:val="22"/>
           <w:szCs w:val="22"/>
         </w:rPr>
-        <w:t xml:space="preserve">Example from the online course: when we were mapping the JSON data from the request body into the class we were using a class called order, inside this class we mapped the </w:t>
+        <w:t xml:space="preserve">Example from the online course: when we were mapping the JSON data from the request body into the </w:t>
+      </w:r>
+      <w:proofErr w:type="gramStart"/>
+      <w:r>
+        <w:rPr>
+          <w:color w:val="000000" w:themeColor="text1"/>
+          <w:sz w:val="22"/>
+          <w:szCs w:val="22"/>
+        </w:rPr>
+        <w:t>class</w:t>
+      </w:r>
+      <w:proofErr w:type="gramEnd"/>
+      <w:r>
+        <w:rPr>
+          <w:color w:val="000000" w:themeColor="text1"/>
+          <w:sz w:val="22"/>
+          <w:szCs w:val="22"/>
+        </w:rPr>
+        <w:t xml:space="preserve"> we were using a class called order, inside this class we mapped the </w:t>
       </w:r>
       <w:proofErr w:type="spellStart"/>
       <w:r>
@@ -3714,7 +4156,43 @@
           <w:sz w:val="22"/>
           <w:szCs w:val="22"/>
         </w:rPr>
-        <w:t>A record class declared as public record order(variable1, variable2, variable3){}</w:t>
+        <w:t xml:space="preserve">A record class declared as public record </w:t>
+      </w:r>
+      <w:proofErr w:type="gramStart"/>
+      <w:r>
+        <w:rPr>
+          <w:color w:val="000000" w:themeColor="text1"/>
+          <w:sz w:val="22"/>
+          <w:szCs w:val="22"/>
+        </w:rPr>
+        <w:t>order(</w:t>
+      </w:r>
+      <w:proofErr w:type="gramEnd"/>
+      <w:r>
+        <w:rPr>
+          <w:color w:val="000000" w:themeColor="text1"/>
+          <w:sz w:val="22"/>
+          <w:szCs w:val="22"/>
+        </w:rPr>
+        <w:t>variable1, variable2, variable</w:t>
+      </w:r>
+      <w:proofErr w:type="gramStart"/>
+      <w:r>
+        <w:rPr>
+          <w:color w:val="000000" w:themeColor="text1"/>
+          <w:sz w:val="22"/>
+          <w:szCs w:val="22"/>
+        </w:rPr>
+        <w:t>3){</w:t>
+      </w:r>
+      <w:proofErr w:type="gramEnd"/>
+      <w:r>
+        <w:rPr>
+          <w:color w:val="000000" w:themeColor="text1"/>
+          <w:sz w:val="22"/>
+          <w:szCs w:val="22"/>
+        </w:rPr>
+        <w:t>}</w:t>
       </w:r>
     </w:p>
     <w:p>
@@ -3734,6 +4212,7 @@
         <w:t xml:space="preserve">The record creates setters and getters and </w:t>
       </w:r>
       <w:proofErr w:type="spellStart"/>
+      <w:proofErr w:type="gramStart"/>
       <w:r>
         <w:rPr>
           <w:color w:val="000000" w:themeColor="text1"/>
@@ -3749,7 +4228,16 @@
           <w:sz w:val="22"/>
           <w:szCs w:val="22"/>
         </w:rPr>
-        <w:t xml:space="preserve">() automatically and maps the </w:t>
+        <w:t>(</w:t>
+      </w:r>
+      <w:proofErr w:type="gramEnd"/>
+      <w:r>
+        <w:rPr>
+          <w:color w:val="000000" w:themeColor="text1"/>
+          <w:sz w:val="22"/>
+          <w:szCs w:val="22"/>
+        </w:rPr>
+        <w:t xml:space="preserve">) automatically and maps the </w:t>
       </w:r>
       <w:proofErr w:type="spellStart"/>
       <w:r>
@@ -4050,6 +4538,7 @@
         <w:t xml:space="preserve">public String </w:t>
       </w:r>
       <w:proofErr w:type="spellStart"/>
+      <w:proofErr w:type="gramStart"/>
       <w:r>
         <w:rPr>
           <w:color w:val="4472C4" w:themeColor="accent1"/>
@@ -4065,7 +4554,16 @@
           <w:sz w:val="22"/>
           <w:szCs w:val="22"/>
         </w:rPr>
-        <w:t>(@PathVariable int id) {</w:t>
+        <w:t>(</w:t>
+      </w:r>
+      <w:proofErr w:type="gramEnd"/>
+      <w:r>
+        <w:rPr>
+          <w:color w:val="4472C4" w:themeColor="accent1"/>
+          <w:sz w:val="22"/>
+          <w:szCs w:val="22"/>
+        </w:rPr>
+        <w:t>@PathVariable int id) {</w:t>
       </w:r>
     </w:p>
     <w:p>
@@ -4084,6 +4582,15 @@
         </w:rPr>
         <w:t xml:space="preserve">    return "Order ID: " + id;}</w:t>
       </w:r>
+    </w:p>
+    <w:p>
+      <w:pPr>
+        <w:rPr>
+          <w:color w:val="4472C4" w:themeColor="accent1"/>
+          <w:sz w:val="22"/>
+          <w:szCs w:val="22"/>
+        </w:rPr>
+      </w:pPr>
     </w:p>
     <w:p>
       <w:pPr>
@@ -4106,6 +4613,7 @@
           <w:szCs w:val="32"/>
           <w:u w:val="single"/>
         </w:rPr>
+        <w:lastRenderedPageBreak/>
         <w:t>@RequestParam</w:t>
       </w:r>
     </w:p>
@@ -4123,7 +4631,6 @@
           <w:sz w:val="22"/>
           <w:szCs w:val="22"/>
         </w:rPr>
-        <w:lastRenderedPageBreak/>
         <w:t>Variable as request parameter</w:t>
       </w:r>
     </w:p>
@@ -4178,6 +4685,7 @@
         <w:t xml:space="preserve">public String </w:t>
       </w:r>
       <w:proofErr w:type="spellStart"/>
+      <w:proofErr w:type="gramStart"/>
       <w:r>
         <w:rPr>
           <w:color w:val="4472C4" w:themeColor="accent1"/>
@@ -4195,6 +4703,7 @@
         </w:rPr>
         <w:t>(</w:t>
       </w:r>
+      <w:proofErr w:type="gramEnd"/>
     </w:p>
     <w:p>
       <w:pPr>
@@ -4321,7 +4830,43 @@
           <w:sz w:val="22"/>
           <w:szCs w:val="22"/>
         </w:rPr>
-        <w:t>We can have 2 method called /hello but for different methods so one can be get and the other post</w:t>
+        <w:t xml:space="preserve">We can have 2 </w:t>
+      </w:r>
+      <w:proofErr w:type="gramStart"/>
+      <w:r>
+        <w:rPr>
+          <w:color w:val="EE0000"/>
+          <w:sz w:val="22"/>
+          <w:szCs w:val="22"/>
+        </w:rPr>
+        <w:t>method</w:t>
+      </w:r>
+      <w:proofErr w:type="gramEnd"/>
+      <w:r>
+        <w:rPr>
+          <w:color w:val="EE0000"/>
+          <w:sz w:val="22"/>
+          <w:szCs w:val="22"/>
+        </w:rPr>
+        <w:t xml:space="preserve"> called /hello but for different methods so one can be </w:t>
+      </w:r>
+      <w:proofErr w:type="gramStart"/>
+      <w:r>
+        <w:rPr>
+          <w:color w:val="EE0000"/>
+          <w:sz w:val="22"/>
+          <w:szCs w:val="22"/>
+        </w:rPr>
+        <w:t>get</w:t>
+      </w:r>
+      <w:proofErr w:type="gramEnd"/>
+      <w:r>
+        <w:rPr>
+          <w:color w:val="EE0000"/>
+          <w:sz w:val="22"/>
+          <w:szCs w:val="22"/>
+        </w:rPr>
+        <w:t xml:space="preserve"> and the other post</w:t>
       </w:r>
     </w:p>
     <w:p>
@@ -4566,7 +5111,6 @@
           <w:szCs w:val="32"/>
           <w:u w:val="single"/>
         </w:rPr>
-        <w:lastRenderedPageBreak/>
         <w:t>Persistent entity for the database</w:t>
       </w:r>
     </w:p>
@@ -4729,7 +5273,25 @@
           <w:sz w:val="22"/>
           <w:szCs w:val="22"/>
         </w:rPr>
-        <w:t>@Table(name = “</w:t>
+        <w:t>@</w:t>
+      </w:r>
+      <w:proofErr w:type="gramStart"/>
+      <w:r>
+        <w:rPr>
+          <w:color w:val="4472C4" w:themeColor="accent1"/>
+          <w:sz w:val="22"/>
+          <w:szCs w:val="22"/>
+        </w:rPr>
+        <w:t>Table(</w:t>
+      </w:r>
+      <w:proofErr w:type="gramEnd"/>
+      <w:r>
+        <w:rPr>
+          <w:color w:val="4472C4" w:themeColor="accent1"/>
+          <w:sz w:val="22"/>
+          <w:szCs w:val="22"/>
+        </w:rPr>
+        <w:t>name = “</w:t>
       </w:r>
       <w:proofErr w:type="spellStart"/>
       <w:r>
@@ -4815,7 +5377,25 @@
           <w:sz w:val="22"/>
           <w:szCs w:val="22"/>
         </w:rPr>
-        <w:t>@Column(name = "</w:t>
+        <w:t>@</w:t>
+      </w:r>
+      <w:proofErr w:type="gramStart"/>
+      <w:r>
+        <w:rPr>
+          <w:color w:val="4472C4" w:themeColor="accent1"/>
+          <w:sz w:val="22"/>
+          <w:szCs w:val="22"/>
+        </w:rPr>
+        <w:t>Column(</w:t>
+      </w:r>
+      <w:proofErr w:type="gramEnd"/>
+      <w:r>
+        <w:rPr>
+          <w:color w:val="4472C4" w:themeColor="accent1"/>
+          <w:sz w:val="22"/>
+          <w:szCs w:val="22"/>
+        </w:rPr>
+        <w:t>name = "</w:t>
       </w:r>
       <w:proofErr w:type="spellStart"/>
       <w:r>
@@ -4859,8 +5439,18 @@
           <w:sz w:val="22"/>
           <w:szCs w:val="22"/>
         </w:rPr>
-        <w:t>@Column(</w:t>
-      </w:r>
+        <w:t>@</w:t>
+      </w:r>
+      <w:proofErr w:type="gramStart"/>
+      <w:r>
+        <w:rPr>
+          <w:color w:val="4472C4" w:themeColor="accent1"/>
+          <w:sz w:val="22"/>
+          <w:szCs w:val="22"/>
+        </w:rPr>
+        <w:t>Column(</w:t>
+      </w:r>
+      <w:proofErr w:type="gramEnd"/>
       <w:r>
         <w:rPr>
           <w:color w:val="4472C4" w:themeColor="accent1"/>
@@ -5009,9 +5599,18 @@
           <w:sz w:val="22"/>
           <w:szCs w:val="22"/>
         </w:rPr>
-        <w:lastRenderedPageBreak/>
-        <w:t>@Table(</w:t>
-      </w:r>
+        <w:t>@</w:t>
+      </w:r>
+      <w:proofErr w:type="gramStart"/>
+      <w:r>
+        <w:rPr>
+          <w:color w:val="4472C4" w:themeColor="accent1"/>
+          <w:sz w:val="22"/>
+          <w:szCs w:val="22"/>
+        </w:rPr>
+        <w:t>Table(</w:t>
+      </w:r>
+      <w:proofErr w:type="gramEnd"/>
     </w:p>
     <w:p>
       <w:pPr>
@@ -5079,7 +5678,25 @@
           <w:sz w:val="22"/>
           <w:szCs w:val="22"/>
         </w:rPr>
-        <w:t xml:space="preserve">        @UniqueConstraint(columnNames = {"email", "</w:t>
+        <w:t xml:space="preserve">        @</w:t>
+      </w:r>
+      <w:proofErr w:type="gramStart"/>
+      <w:r>
+        <w:rPr>
+          <w:color w:val="4472C4" w:themeColor="accent1"/>
+          <w:sz w:val="22"/>
+          <w:szCs w:val="22"/>
+        </w:rPr>
+        <w:t>UniqueConstraint(</w:t>
+      </w:r>
+      <w:proofErr w:type="gramEnd"/>
+      <w:r>
+        <w:rPr>
+          <w:color w:val="4472C4" w:themeColor="accent1"/>
+          <w:sz w:val="22"/>
+          <w:szCs w:val="22"/>
+        </w:rPr>
+        <w:t>columnNames = {"email", "</w:t>
       </w:r>
       <w:proofErr w:type="spellStart"/>
       <w:r>
@@ -5141,13 +5758,23 @@
         </w:rPr>
         <w:t xml:space="preserve"> </w:t>
       </w:r>
-      <w:r>
-        <w:rPr>
-          <w:color w:val="000000" w:themeColor="text1"/>
-          <w:sz w:val="22"/>
-          <w:szCs w:val="22"/>
-        </w:rPr>
-        <w:t xml:space="preserve">this is very strong and it forces the table to have only one email and one </w:t>
+      <w:proofErr w:type="gramStart"/>
+      <w:r>
+        <w:rPr>
+          <w:color w:val="000000" w:themeColor="text1"/>
+          <w:sz w:val="22"/>
+          <w:szCs w:val="22"/>
+        </w:rPr>
+        <w:t>this</w:t>
+      </w:r>
+      <w:proofErr w:type="gramEnd"/>
+      <w:r>
+        <w:rPr>
+          <w:color w:val="000000" w:themeColor="text1"/>
+          <w:sz w:val="22"/>
+          <w:szCs w:val="22"/>
+        </w:rPr>
+        <w:t xml:space="preserve"> is very strong and it forces the table to have only one email and one </w:t>
       </w:r>
       <w:proofErr w:type="spellStart"/>
       <w:r>
@@ -5191,8 +5818,18 @@
           <w:sz w:val="22"/>
           <w:szCs w:val="22"/>
         </w:rPr>
-        <w:t>@Entity @Table</w:t>
-      </w:r>
+        <w:t>@Entity @</w:t>
+      </w:r>
+      <w:proofErr w:type="gramStart"/>
+      <w:r>
+        <w:rPr>
+          <w:color w:val="4472C4" w:themeColor="accent1"/>
+          <w:sz w:val="22"/>
+          <w:szCs w:val="22"/>
+        </w:rPr>
+        <w:t>Table</w:t>
+      </w:r>
+      <w:proofErr w:type="gramEnd"/>
       <w:r>
         <w:rPr>
           <w:color w:val="000000" w:themeColor="text1"/>
@@ -5338,6 +5975,7 @@
         </w:rPr>
       </w:pPr>
       <w:proofErr w:type="spellStart"/>
+      <w:proofErr w:type="gramStart"/>
       <w:r>
         <w:rPr>
           <w:color w:val="000000" w:themeColor="text1"/>
@@ -5347,6 +5985,7 @@
         <w:t>user.setId</w:t>
       </w:r>
       <w:proofErr w:type="spellEnd"/>
+      <w:proofErr w:type="gramEnd"/>
       <w:r>
         <w:rPr>
           <w:color w:val="000000" w:themeColor="text1"/>
@@ -5396,7 +6035,25 @@
           <w:sz w:val="22"/>
           <w:szCs w:val="22"/>
         </w:rPr>
-        <w:t xml:space="preserve">@GeneratedValue(strategy = </w:t>
+        <w:t>@</w:t>
+      </w:r>
+      <w:proofErr w:type="gramStart"/>
+      <w:r>
+        <w:rPr>
+          <w:color w:val="4472C4" w:themeColor="accent1"/>
+          <w:sz w:val="22"/>
+          <w:szCs w:val="22"/>
+        </w:rPr>
+        <w:t>GeneratedValue(</w:t>
+      </w:r>
+      <w:proofErr w:type="gramEnd"/>
+      <w:r>
+        <w:rPr>
+          <w:color w:val="4472C4" w:themeColor="accent1"/>
+          <w:sz w:val="22"/>
+          <w:szCs w:val="22"/>
+        </w:rPr>
+        <w:t xml:space="preserve">strategy = </w:t>
       </w:r>
       <w:proofErr w:type="spellStart"/>
       <w:r>
@@ -5442,13 +6099,23 @@
           <w:szCs w:val="22"/>
         </w:rPr>
       </w:pPr>
-      <w:r>
-        <w:rPr>
-          <w:color w:val="000000" w:themeColor="text1"/>
-          <w:sz w:val="22"/>
-          <w:szCs w:val="22"/>
-        </w:rPr>
-        <w:t xml:space="preserve">.IDENTITY is the equivalent of </w:t>
+      <w:proofErr w:type="gramStart"/>
+      <w:r>
+        <w:rPr>
+          <w:color w:val="000000" w:themeColor="text1"/>
+          <w:sz w:val="22"/>
+          <w:szCs w:val="22"/>
+        </w:rPr>
+        <w:t>.IDENTITY</w:t>
+      </w:r>
+      <w:proofErr w:type="gramEnd"/>
+      <w:r>
+        <w:rPr>
+          <w:color w:val="000000" w:themeColor="text1"/>
+          <w:sz w:val="22"/>
+          <w:szCs w:val="22"/>
+        </w:rPr>
+        <w:t xml:space="preserve"> is the equivalent of </w:t>
       </w:r>
       <w:proofErr w:type="spellStart"/>
       <w:r>
@@ -5511,7 +6178,6 @@
           <w:sz w:val="22"/>
           <w:szCs w:val="22"/>
         </w:rPr>
-        <w:lastRenderedPageBreak/>
         <w:t>Jpa</w:t>
       </w:r>
       <w:proofErr w:type="spellEnd"/>
@@ -6140,6 +6806,7 @@
         <w:br/>
       </w:r>
       <w:proofErr w:type="spellStart"/>
+      <w:proofErr w:type="gramStart"/>
       <w:r>
         <w:rPr>
           <w:color w:val="000000" w:themeColor="text1"/>
@@ -6155,24 +6822,43 @@
           <w:sz w:val="22"/>
           <w:szCs w:val="22"/>
         </w:rPr>
-        <w:t>()</w:t>
-      </w:r>
-    </w:p>
-    <w:p>
-      <w:pPr>
-        <w:rPr>
-          <w:color w:val="000000" w:themeColor="text1"/>
-          <w:sz w:val="22"/>
-          <w:szCs w:val="22"/>
-        </w:rPr>
-      </w:pPr>
-      <w:r>
-        <w:rPr>
-          <w:color w:val="000000" w:themeColor="text1"/>
-          <w:sz w:val="22"/>
-          <w:szCs w:val="22"/>
-        </w:rPr>
-        <w:t>flush()</w:t>
+        <w:t>(</w:t>
+      </w:r>
+      <w:proofErr w:type="gramEnd"/>
+      <w:r>
+        <w:rPr>
+          <w:color w:val="000000" w:themeColor="text1"/>
+          <w:sz w:val="22"/>
+          <w:szCs w:val="22"/>
+        </w:rPr>
+        <w:t>)</w:t>
+      </w:r>
+    </w:p>
+    <w:p>
+      <w:pPr>
+        <w:rPr>
+          <w:color w:val="000000" w:themeColor="text1"/>
+          <w:sz w:val="22"/>
+          <w:szCs w:val="22"/>
+        </w:rPr>
+      </w:pPr>
+      <w:proofErr w:type="gramStart"/>
+      <w:r>
+        <w:rPr>
+          <w:color w:val="000000" w:themeColor="text1"/>
+          <w:sz w:val="22"/>
+          <w:szCs w:val="22"/>
+        </w:rPr>
+        <w:t>flush(</w:t>
+      </w:r>
+      <w:proofErr w:type="gramEnd"/>
+      <w:r>
+        <w:rPr>
+          <w:color w:val="000000" w:themeColor="text1"/>
+          <w:sz w:val="22"/>
+          <w:szCs w:val="22"/>
+        </w:rPr>
+        <w:t>)</w:t>
       </w:r>
     </w:p>
     <w:p>
@@ -6184,6 +6870,7 @@
         </w:rPr>
       </w:pPr>
       <w:proofErr w:type="spellStart"/>
+      <w:proofErr w:type="gramStart"/>
       <w:r>
         <w:rPr>
           <w:color w:val="000000" w:themeColor="text1"/>
@@ -6199,7 +6886,16 @@
           <w:sz w:val="22"/>
           <w:szCs w:val="22"/>
         </w:rPr>
-        <w:t>()</w:t>
+        <w:t>(</w:t>
+      </w:r>
+      <w:proofErr w:type="gramEnd"/>
+      <w:r>
+        <w:rPr>
+          <w:color w:val="000000" w:themeColor="text1"/>
+          <w:sz w:val="22"/>
+          <w:szCs w:val="22"/>
+        </w:rPr>
+        <w:t>)</w:t>
       </w:r>
     </w:p>
     <w:p>
@@ -6211,12 +6907,14 @@
         </w:rPr>
       </w:pPr>
       <w:proofErr w:type="spellStart"/>
-      <w:r>
-        <w:rPr>
-          <w:color w:val="000000" w:themeColor="text1"/>
-          <w:sz w:val="22"/>
-          <w:szCs w:val="22"/>
-        </w:rPr>
+      <w:proofErr w:type="gramStart"/>
+      <w:r>
+        <w:rPr>
+          <w:color w:val="000000" w:themeColor="text1"/>
+          <w:sz w:val="22"/>
+          <w:szCs w:val="22"/>
+        </w:rPr>
+        <w:lastRenderedPageBreak/>
         <w:t>deleteInBatch</w:t>
       </w:r>
       <w:proofErr w:type="spellEnd"/>
@@ -6226,7 +6924,16 @@
           <w:sz w:val="22"/>
           <w:szCs w:val="22"/>
         </w:rPr>
-        <w:t>()</w:t>
+        <w:t>(</w:t>
+      </w:r>
+      <w:proofErr w:type="gramEnd"/>
+      <w:r>
+        <w:rPr>
+          <w:color w:val="000000" w:themeColor="text1"/>
+          <w:sz w:val="22"/>
+          <w:szCs w:val="22"/>
+        </w:rPr>
+        <w:t>)</w:t>
       </w:r>
     </w:p>
     <w:p>
@@ -6238,13 +6945,13 @@
         </w:rPr>
       </w:pPr>
       <w:proofErr w:type="spellStart"/>
-      <w:r>
-        <w:rPr>
-          <w:color w:val="000000" w:themeColor="text1"/>
-          <w:sz w:val="22"/>
-          <w:szCs w:val="22"/>
-        </w:rPr>
-        <w:lastRenderedPageBreak/>
+      <w:proofErr w:type="gramStart"/>
+      <w:r>
+        <w:rPr>
+          <w:color w:val="000000" w:themeColor="text1"/>
+          <w:sz w:val="22"/>
+          <w:szCs w:val="22"/>
+        </w:rPr>
         <w:t>findAll</w:t>
       </w:r>
       <w:proofErr w:type="spellEnd"/>
@@ -6254,7 +6961,16 @@
           <w:sz w:val="22"/>
           <w:szCs w:val="22"/>
         </w:rPr>
-        <w:t>(Specification)</w:t>
+        <w:t>(</w:t>
+      </w:r>
+      <w:proofErr w:type="gramEnd"/>
+      <w:r>
+        <w:rPr>
+          <w:color w:val="000000" w:themeColor="text1"/>
+          <w:sz w:val="22"/>
+          <w:szCs w:val="22"/>
+        </w:rPr>
+        <w:t>Specification)</w:t>
       </w:r>
     </w:p>
     <w:p>
@@ -6319,7 +7035,61 @@
           <w:sz w:val="22"/>
           <w:szCs w:val="22"/>
         </w:rPr>
-        <w:t xml:space="preserve"> checks whether the user entity object has an already Id if id == null then it creates a row using persist(), if its untracked and exists meaning that id != null, it calls for merge(). If it exists and is tracked nothing happens.</w:t>
+        <w:t xml:space="preserve"> checks whether the user entity object has an already Id if id == null then it creates a row using </w:t>
+      </w:r>
+      <w:proofErr w:type="gramStart"/>
+      <w:r>
+        <w:rPr>
+          <w:color w:val="000000" w:themeColor="text1"/>
+          <w:sz w:val="22"/>
+          <w:szCs w:val="22"/>
+        </w:rPr>
+        <w:t>persist(</w:t>
+      </w:r>
+      <w:proofErr w:type="gramEnd"/>
+      <w:r>
+        <w:rPr>
+          <w:color w:val="000000" w:themeColor="text1"/>
+          <w:sz w:val="22"/>
+          <w:szCs w:val="22"/>
+        </w:rPr>
+        <w:t xml:space="preserve">), if its untracked and exists meaning that </w:t>
+      </w:r>
+      <w:proofErr w:type="gramStart"/>
+      <w:r>
+        <w:rPr>
+          <w:color w:val="000000" w:themeColor="text1"/>
+          <w:sz w:val="22"/>
+          <w:szCs w:val="22"/>
+        </w:rPr>
+        <w:t>id !</w:t>
+      </w:r>
+      <w:proofErr w:type="gramEnd"/>
+      <w:r>
+        <w:rPr>
+          <w:color w:val="000000" w:themeColor="text1"/>
+          <w:sz w:val="22"/>
+          <w:szCs w:val="22"/>
+        </w:rPr>
+        <w:t xml:space="preserve">= null, it calls for </w:t>
+      </w:r>
+      <w:proofErr w:type="gramStart"/>
+      <w:r>
+        <w:rPr>
+          <w:color w:val="000000" w:themeColor="text1"/>
+          <w:sz w:val="22"/>
+          <w:szCs w:val="22"/>
+        </w:rPr>
+        <w:t>merge(</w:t>
+      </w:r>
+      <w:proofErr w:type="gramEnd"/>
+      <w:r>
+        <w:rPr>
+          <w:color w:val="000000" w:themeColor="text1"/>
+          <w:sz w:val="22"/>
+          <w:szCs w:val="22"/>
+        </w:rPr>
+        <w:t>). If it exists and is tracked nothing happens.</w:t>
       </w:r>
     </w:p>
     <w:p>
@@ -6485,538 +7255,9 @@
           <w:sz w:val="22"/>
           <w:szCs w:val="22"/>
         </w:rPr>
-        <w:t xml:space="preserve"> we should create an interface of our class that holds the table example: </w:t>
-      </w:r>
-    </w:p>
-    <w:p>
-      <w:pPr>
-        <w:rPr>
-          <w:color w:val="000000" w:themeColor="text1"/>
-          <w:sz w:val="22"/>
-          <w:szCs w:val="22"/>
-        </w:rPr>
-      </w:pPr>
-      <w:r>
-        <w:rPr>
-          <w:color w:val="000000" w:themeColor="text1"/>
-          <w:sz w:val="22"/>
-          <w:szCs w:val="22"/>
-        </w:rPr>
-        <w:t xml:space="preserve">public interface </w:t>
-      </w:r>
-      <w:proofErr w:type="spellStart"/>
-      <w:r>
-        <w:rPr>
-          <w:color w:val="000000" w:themeColor="text1"/>
-          <w:sz w:val="22"/>
-          <w:szCs w:val="22"/>
-        </w:rPr>
-        <w:t>StudentInterface</w:t>
-      </w:r>
-      <w:proofErr w:type="spellEnd"/>
-      <w:r>
-        <w:rPr>
-          <w:color w:val="000000" w:themeColor="text1"/>
-          <w:sz w:val="22"/>
-          <w:szCs w:val="22"/>
-        </w:rPr>
-        <w:t xml:space="preserve"> extends </w:t>
-      </w:r>
-      <w:proofErr w:type="spellStart"/>
-      <w:r>
-        <w:rPr>
-          <w:color w:val="000000" w:themeColor="text1"/>
-          <w:sz w:val="22"/>
-          <w:szCs w:val="22"/>
-        </w:rPr>
-        <w:t>JpaRepository</w:t>
-      </w:r>
-      <w:proofErr w:type="spellEnd"/>
-      <w:r>
-        <w:rPr>
-          <w:color w:val="000000" w:themeColor="text1"/>
-          <w:sz w:val="22"/>
-          <w:szCs w:val="22"/>
-        </w:rPr>
-        <w:t xml:space="preserve"> &lt;Student, Integer&gt; </w:t>
-      </w:r>
-    </w:p>
-    <w:p>
-      <w:pPr>
-        <w:rPr>
-          <w:color w:val="000000" w:themeColor="text1"/>
-          <w:sz w:val="22"/>
-          <w:szCs w:val="22"/>
-        </w:rPr>
-      </w:pPr>
-      <w:r>
-        <w:rPr>
-          <w:color w:val="000000" w:themeColor="text1"/>
-          <w:sz w:val="22"/>
-          <w:szCs w:val="22"/>
-        </w:rPr>
-        <w:t>here the Student is the class name, and the integer is the Id which is primary key</w:t>
-      </w:r>
-      <w:r>
-        <w:rPr>
-          <w:color w:val="000000" w:themeColor="text1"/>
-          <w:sz w:val="22"/>
-          <w:szCs w:val="22"/>
-        </w:rPr>
-        <w:t xml:space="preserve"> </w:t>
-      </w:r>
-    </w:p>
-    <w:p>
-      <w:pPr>
-        <w:rPr>
-          <w:color w:val="000000" w:themeColor="text1"/>
-          <w:sz w:val="22"/>
-          <w:szCs w:val="22"/>
-        </w:rPr>
-      </w:pPr>
-      <w:r>
-        <w:rPr>
-          <w:color w:val="000000" w:themeColor="text1"/>
-          <w:sz w:val="22"/>
-          <w:szCs w:val="22"/>
-        </w:rPr>
-        <w:t xml:space="preserve">no annotation needed here for the student </w:t>
-      </w:r>
-      <w:proofErr w:type="spellStart"/>
-      <w:r>
-        <w:rPr>
-          <w:color w:val="000000" w:themeColor="text1"/>
-          <w:sz w:val="22"/>
-          <w:szCs w:val="22"/>
-        </w:rPr>
-        <w:t>jpa</w:t>
-      </w:r>
-      <w:proofErr w:type="spellEnd"/>
-      <w:r>
-        <w:rPr>
-          <w:color w:val="000000" w:themeColor="text1"/>
-          <w:sz w:val="22"/>
-          <w:szCs w:val="22"/>
-        </w:rPr>
-        <w:t xml:space="preserve"> interface</w:t>
-      </w:r>
-    </w:p>
-    <w:p>
-      <w:pPr>
-        <w:rPr>
-          <w:color w:val="000000" w:themeColor="text1"/>
-          <w:sz w:val="22"/>
-          <w:szCs w:val="22"/>
-        </w:rPr>
-      </w:pPr>
-      <w:r>
-        <w:rPr>
-          <w:color w:val="000000" w:themeColor="text1"/>
-          <w:sz w:val="22"/>
-          <w:szCs w:val="22"/>
-        </w:rPr>
-        <w:t>to use our interface we should inject it in some component, for this example we inject it in our controller</w:t>
-      </w:r>
-    </w:p>
-    <w:p>
-      <w:pPr>
-        <w:rPr>
-          <w:color w:val="000000" w:themeColor="text1"/>
-          <w:sz w:val="22"/>
-          <w:szCs w:val="22"/>
-        </w:rPr>
-      </w:pPr>
-    </w:p>
-    <w:p>
-      <w:pPr>
-        <w:rPr>
-          <w:color w:val="000000" w:themeColor="text1"/>
-          <w:sz w:val="22"/>
-          <w:szCs w:val="22"/>
-        </w:rPr>
-      </w:pPr>
-      <w:r>
-        <w:rPr>
-          <w:color w:val="000000" w:themeColor="text1"/>
-          <w:sz w:val="22"/>
-          <w:szCs w:val="22"/>
-        </w:rPr>
-        <w:t xml:space="preserve">to add to our repository we should use </w:t>
-      </w:r>
-      <w:proofErr w:type="spellStart"/>
-      <w:r>
-        <w:rPr>
-          <w:color w:val="000000" w:themeColor="text1"/>
-          <w:sz w:val="22"/>
-          <w:szCs w:val="22"/>
-        </w:rPr>
-        <w:t>repository.save</w:t>
-      </w:r>
-      <w:proofErr w:type="spellEnd"/>
-      <w:r>
-        <w:rPr>
-          <w:color w:val="000000" w:themeColor="text1"/>
-          <w:sz w:val="22"/>
-          <w:szCs w:val="22"/>
-        </w:rPr>
-        <w:t>(object) object here is an equivalent of a row</w:t>
-      </w:r>
-    </w:p>
-    <w:p>
-      <w:pPr>
-        <w:rPr>
-          <w:color w:val="000000" w:themeColor="text1"/>
-          <w:sz w:val="22"/>
-          <w:szCs w:val="22"/>
-        </w:rPr>
-      </w:pPr>
-    </w:p>
-    <w:p>
-      <w:pPr>
-        <w:rPr>
-          <w:color w:val="000000" w:themeColor="text1"/>
-          <w:sz w:val="22"/>
-          <w:szCs w:val="22"/>
-        </w:rPr>
-      </w:pPr>
-      <w:r>
-        <w:rPr>
-          <w:color w:val="000000" w:themeColor="text1"/>
-          <w:sz w:val="22"/>
-          <w:szCs w:val="22"/>
-        </w:rPr>
-        <w:t xml:space="preserve">to find we can use </w:t>
-      </w:r>
-      <w:proofErr w:type="spellStart"/>
-      <w:r>
-        <w:rPr>
-          <w:color w:val="000000" w:themeColor="text1"/>
-          <w:sz w:val="22"/>
-          <w:szCs w:val="22"/>
-        </w:rPr>
-        <w:t>findById</w:t>
-      </w:r>
-      <w:proofErr w:type="spellEnd"/>
-    </w:p>
-    <w:p>
-      <w:pPr>
-        <w:rPr>
-          <w:color w:val="000000" w:themeColor="text1"/>
-          <w:sz w:val="22"/>
-          <w:szCs w:val="22"/>
-        </w:rPr>
-      </w:pPr>
-      <w:r>
-        <w:rPr>
-          <w:color w:val="000000" w:themeColor="text1"/>
-          <w:sz w:val="22"/>
-          <w:szCs w:val="22"/>
-        </w:rPr>
-        <w:t xml:space="preserve">or </w:t>
-      </w:r>
-      <w:proofErr w:type="spellStart"/>
-      <w:r>
-        <w:rPr>
-          <w:color w:val="000000" w:themeColor="text1"/>
-          <w:sz w:val="22"/>
-          <w:szCs w:val="22"/>
-        </w:rPr>
-        <w:t>findall</w:t>
-      </w:r>
-      <w:proofErr w:type="spellEnd"/>
-    </w:p>
-    <w:p>
-      <w:pPr>
-        <w:rPr>
-          <w:color w:val="000000" w:themeColor="text1"/>
-          <w:sz w:val="22"/>
-          <w:szCs w:val="22"/>
-        </w:rPr>
-      </w:pPr>
-    </w:p>
-    <w:p>
-      <w:pPr>
-        <w:rPr>
-          <w:color w:val="000000" w:themeColor="text1"/>
-          <w:sz w:val="22"/>
-          <w:szCs w:val="22"/>
-        </w:rPr>
-      </w:pPr>
-      <w:r>
-        <w:rPr>
-          <w:color w:val="000000" w:themeColor="text1"/>
-          <w:sz w:val="22"/>
-          <w:szCs w:val="22"/>
-        </w:rPr>
-        <w:t xml:space="preserve">to add a new method we can define it in our interface of the repository and the java </w:t>
-      </w:r>
-      <w:proofErr w:type="spellStart"/>
-      <w:r>
-        <w:rPr>
-          <w:color w:val="000000" w:themeColor="text1"/>
-          <w:sz w:val="22"/>
-          <w:szCs w:val="22"/>
-        </w:rPr>
-        <w:t>jpa</w:t>
-      </w:r>
-      <w:proofErr w:type="spellEnd"/>
-      <w:r>
-        <w:rPr>
-          <w:color w:val="000000" w:themeColor="text1"/>
-          <w:sz w:val="22"/>
-          <w:szCs w:val="22"/>
-        </w:rPr>
-        <w:t xml:space="preserve"> will create a query for us</w:t>
-      </w:r>
-    </w:p>
-    <w:p>
-      <w:pPr>
-        <w:rPr>
-          <w:color w:val="000000" w:themeColor="text1"/>
-          <w:sz w:val="22"/>
-          <w:szCs w:val="22"/>
-        </w:rPr>
-      </w:pPr>
-      <w:r>
-        <w:rPr>
-          <w:color w:val="000000" w:themeColor="text1"/>
-          <w:sz w:val="22"/>
-          <w:szCs w:val="22"/>
-        </w:rPr>
-        <w:lastRenderedPageBreak/>
-        <w:t>Here's the simple rule for capitalization across your entire Spring Boot application: Java field names start with a lowercase letter (e.g., </w:t>
-      </w:r>
-      <w:proofErr w:type="spellStart"/>
-      <w:r>
-        <w:rPr>
-          <w:color w:val="000000" w:themeColor="text1"/>
-          <w:sz w:val="22"/>
-          <w:szCs w:val="22"/>
-        </w:rPr>
-        <w:t>fName</w:t>
-      </w:r>
-      <w:proofErr w:type="spellEnd"/>
-      <w:r>
-        <w:rPr>
-          <w:color w:val="000000" w:themeColor="text1"/>
-          <w:sz w:val="22"/>
-          <w:szCs w:val="22"/>
-        </w:rPr>
-        <w:t>, email, id), and their corresponding getter/setter methods capitalize the field name after get/set (e.g., </w:t>
-      </w:r>
-      <w:proofErr w:type="spellStart"/>
-      <w:r>
-        <w:rPr>
-          <w:color w:val="000000" w:themeColor="text1"/>
-          <w:sz w:val="22"/>
-          <w:szCs w:val="22"/>
-        </w:rPr>
-        <w:t>getFName</w:t>
-      </w:r>
-      <w:proofErr w:type="spellEnd"/>
-      <w:r>
-        <w:rPr>
-          <w:color w:val="000000" w:themeColor="text1"/>
-          <w:sz w:val="22"/>
-          <w:szCs w:val="22"/>
-        </w:rPr>
-        <w:t>(), </w:t>
-      </w:r>
-      <w:proofErr w:type="spellStart"/>
-      <w:r>
-        <w:rPr>
-          <w:color w:val="000000" w:themeColor="text1"/>
-          <w:sz w:val="22"/>
-          <w:szCs w:val="22"/>
-        </w:rPr>
-        <w:t>setFName</w:t>
-      </w:r>
-      <w:proofErr w:type="spellEnd"/>
-      <w:r>
-        <w:rPr>
-          <w:color w:val="000000" w:themeColor="text1"/>
-          <w:sz w:val="22"/>
-          <w:szCs w:val="22"/>
-        </w:rPr>
-        <w:t>()) — but Spring Data JPA repository methods must match the exact field name starting with lowercase (</w:t>
-      </w:r>
-      <w:proofErr w:type="spellStart"/>
-      <w:r>
-        <w:rPr>
-          <w:color w:val="000000" w:themeColor="text1"/>
-          <w:sz w:val="22"/>
-          <w:szCs w:val="22"/>
-        </w:rPr>
-        <w:t>findByfNameContaining</w:t>
-      </w:r>
-      <w:proofErr w:type="spellEnd"/>
-      <w:r>
-        <w:rPr>
-          <w:color w:val="000000" w:themeColor="text1"/>
-          <w:sz w:val="22"/>
-          <w:szCs w:val="22"/>
-        </w:rPr>
-        <w:t>, NOT </w:t>
-      </w:r>
-      <w:proofErr w:type="spellStart"/>
-      <w:r>
-        <w:rPr>
-          <w:color w:val="000000" w:themeColor="text1"/>
-          <w:sz w:val="22"/>
-          <w:szCs w:val="22"/>
-        </w:rPr>
-        <w:t>findByFNameContaining</w:t>
-      </w:r>
-      <w:proofErr w:type="spellEnd"/>
-      <w:r>
-        <w:rPr>
-          <w:color w:val="000000" w:themeColor="text1"/>
-          <w:sz w:val="22"/>
-          <w:szCs w:val="22"/>
-        </w:rPr>
-        <w:t>). Database columns via @Column(name = "</w:t>
-      </w:r>
-      <w:proofErr w:type="spellStart"/>
-      <w:r>
-        <w:rPr>
-          <w:color w:val="000000" w:themeColor="text1"/>
-          <w:sz w:val="22"/>
-          <w:szCs w:val="22"/>
-        </w:rPr>
-        <w:t>f_name</w:t>
-      </w:r>
-      <w:proofErr w:type="spellEnd"/>
-      <w:r>
-        <w:rPr>
-          <w:color w:val="000000" w:themeColor="text1"/>
-          <w:sz w:val="22"/>
-          <w:szCs w:val="22"/>
-        </w:rPr>
-        <w:t xml:space="preserve">") can be whatever naming convention you want (usually </w:t>
-      </w:r>
-      <w:proofErr w:type="spellStart"/>
-      <w:r>
-        <w:rPr>
-          <w:color w:val="000000" w:themeColor="text1"/>
-          <w:sz w:val="22"/>
-          <w:szCs w:val="22"/>
-        </w:rPr>
-        <w:t>snake_case</w:t>
-      </w:r>
-      <w:proofErr w:type="spellEnd"/>
-      <w:r>
-        <w:rPr>
-          <w:color w:val="000000" w:themeColor="text1"/>
-          <w:sz w:val="22"/>
-          <w:szCs w:val="22"/>
-        </w:rPr>
-        <w:t>). Path variables in @GetMapping like /{name} are independent and just pass values. The only places where capitalization breaks everything are: (1) repository method names must match Java field names exactly (case-sensitive), (2) getters/setters must follow the </w:t>
-      </w:r>
-      <w:proofErr w:type="spellStart"/>
-      <w:r>
-        <w:rPr>
-          <w:color w:val="000000" w:themeColor="text1"/>
-          <w:sz w:val="22"/>
-          <w:szCs w:val="22"/>
-        </w:rPr>
-        <w:t>getFieldName</w:t>
-      </w:r>
-      <w:proofErr w:type="spellEnd"/>
-      <w:r>
-        <w:rPr>
-          <w:color w:val="000000" w:themeColor="text1"/>
-          <w:sz w:val="22"/>
-          <w:szCs w:val="22"/>
-        </w:rPr>
-        <w:t>() pattern with capital after get, and (3) JSON responses rely on those getters being correct — everything else (URLs, database columns) is more flexible but keeping consistent lowercase for fields and camelCase for getters avoids confusion.</w:t>
-      </w:r>
-      <w:r>
-        <w:rPr>
-          <w:color w:val="000000" w:themeColor="text1"/>
-          <w:sz w:val="22"/>
-          <w:szCs w:val="22"/>
-        </w:rPr>
-        <w:t xml:space="preserve"> </w:t>
-      </w:r>
-    </w:p>
-    <w:p>
-      <w:pPr>
-        <w:rPr>
-          <w:color w:val="000000" w:themeColor="text1"/>
-          <w:sz w:val="22"/>
-          <w:szCs w:val="22"/>
-        </w:rPr>
-      </w:pPr>
-    </w:p>
-    <w:p>
-      <w:pPr>
-        <w:rPr>
-          <w:color w:val="000000" w:themeColor="text1"/>
-          <w:sz w:val="22"/>
-          <w:szCs w:val="22"/>
-        </w:rPr>
-      </w:pPr>
-      <w:r>
-        <w:rPr>
-          <w:color w:val="000000" w:themeColor="text1"/>
-          <w:sz w:val="22"/>
-          <w:szCs w:val="22"/>
-        </w:rPr>
-        <w:t>@OnetoOne(</w:t>
-      </w:r>
-      <w:r>
-        <w:rPr>
-          <w:color w:val="000000" w:themeColor="text1"/>
-        </w:rPr>
-        <w:t>cascade</w:t>
-      </w:r>
-      <w:r>
-        <w:rPr>
-          <w:color w:val="000000" w:themeColor="text1"/>
-          <w:sz w:val="22"/>
-          <w:szCs w:val="22"/>
-        </w:rPr>
-        <w:t xml:space="preserve"> = cascadetype.al, </w:t>
-      </w:r>
-      <w:proofErr w:type="spellStart"/>
-      <w:r>
-        <w:rPr>
-          <w:color w:val="000000" w:themeColor="text1"/>
-          <w:sz w:val="22"/>
-          <w:szCs w:val="22"/>
-        </w:rPr>
-        <w:t>mappedby</w:t>
-      </w:r>
-      <w:proofErr w:type="spellEnd"/>
-      <w:r>
-        <w:rPr>
-          <w:color w:val="000000" w:themeColor="text1"/>
-          <w:sz w:val="22"/>
-          <w:szCs w:val="22"/>
-        </w:rPr>
-        <w:t xml:space="preserve"> = “</w:t>
-      </w:r>
-      <w:proofErr w:type="spellStart"/>
-      <w:r>
-        <w:rPr>
-          <w:color w:val="000000" w:themeColor="text1"/>
-          <w:sz w:val="22"/>
-          <w:szCs w:val="22"/>
-        </w:rPr>
-        <w:t>class_name”l</w:t>
-      </w:r>
-      <w:proofErr w:type="spellEnd"/>
-      <w:r>
-        <w:rPr>
-          <w:color w:val="000000" w:themeColor="text1"/>
-          <w:sz w:val="22"/>
-          <w:szCs w:val="22"/>
-        </w:rPr>
-        <w:t>) this means whenever our entity object is deleted the object which its annotated on will also be deleted.</w:t>
-      </w:r>
-    </w:p>
-    <w:p>
-      <w:pPr>
+        <w:t xml:space="preserve"> we should create an </w:t>
+      </w:r>
+      <w:r>
         <w:rPr>
           <w:b/>
           <w:bCs/>
@@ -7024,7 +7265,655 @@
           <w:sz w:val="22"/>
           <w:szCs w:val="22"/>
         </w:rPr>
-      </w:pPr>
+        <w:t>interface</w:t>
+      </w:r>
+      <w:r>
+        <w:rPr>
+          <w:color w:val="000000" w:themeColor="text1"/>
+          <w:sz w:val="22"/>
+          <w:szCs w:val="22"/>
+        </w:rPr>
+        <w:t xml:space="preserve"> of our class that holds the table example: </w:t>
+      </w:r>
+    </w:p>
+    <w:p>
+      <w:pPr>
+        <w:rPr>
+          <w:color w:val="000000" w:themeColor="text1"/>
+          <w:sz w:val="22"/>
+          <w:szCs w:val="22"/>
+        </w:rPr>
+      </w:pPr>
+      <w:r>
+        <w:rPr>
+          <w:color w:val="000000" w:themeColor="text1"/>
+          <w:sz w:val="22"/>
+          <w:szCs w:val="22"/>
+        </w:rPr>
+        <w:t xml:space="preserve">public interface </w:t>
+      </w:r>
+      <w:proofErr w:type="spellStart"/>
+      <w:r>
+        <w:rPr>
+          <w:color w:val="000000" w:themeColor="text1"/>
+          <w:sz w:val="22"/>
+          <w:szCs w:val="22"/>
+        </w:rPr>
+        <w:t>StudentInterface</w:t>
+      </w:r>
+      <w:proofErr w:type="spellEnd"/>
+      <w:r>
+        <w:rPr>
+          <w:color w:val="000000" w:themeColor="text1"/>
+          <w:sz w:val="22"/>
+          <w:szCs w:val="22"/>
+        </w:rPr>
+        <w:t xml:space="preserve"> extends </w:t>
+      </w:r>
+      <w:proofErr w:type="spellStart"/>
+      <w:r>
+        <w:rPr>
+          <w:color w:val="000000" w:themeColor="text1"/>
+          <w:sz w:val="22"/>
+          <w:szCs w:val="22"/>
+        </w:rPr>
+        <w:t>JpaRepository</w:t>
+      </w:r>
+      <w:proofErr w:type="spellEnd"/>
+      <w:r>
+        <w:rPr>
+          <w:color w:val="000000" w:themeColor="text1"/>
+          <w:sz w:val="22"/>
+          <w:szCs w:val="22"/>
+        </w:rPr>
+        <w:t xml:space="preserve"> &lt;Student, Integer&gt; </w:t>
+      </w:r>
+    </w:p>
+    <w:p>
+      <w:pPr>
+        <w:rPr>
+          <w:color w:val="000000" w:themeColor="text1"/>
+          <w:sz w:val="22"/>
+          <w:szCs w:val="22"/>
+        </w:rPr>
+      </w:pPr>
+      <w:r>
+        <w:rPr>
+          <w:color w:val="000000" w:themeColor="text1"/>
+          <w:sz w:val="22"/>
+          <w:szCs w:val="22"/>
+        </w:rPr>
+        <w:t xml:space="preserve">here the </w:t>
+      </w:r>
+      <w:proofErr w:type="gramStart"/>
+      <w:r>
+        <w:rPr>
+          <w:color w:val="000000" w:themeColor="text1"/>
+          <w:sz w:val="22"/>
+          <w:szCs w:val="22"/>
+        </w:rPr>
+        <w:t>Student</w:t>
+      </w:r>
+      <w:proofErr w:type="gramEnd"/>
+      <w:r>
+        <w:rPr>
+          <w:color w:val="000000" w:themeColor="text1"/>
+          <w:sz w:val="22"/>
+          <w:szCs w:val="22"/>
+        </w:rPr>
+        <w:t xml:space="preserve"> is the class name, and the integer is the Id which is primary key</w:t>
+      </w:r>
+      <w:r>
+        <w:rPr>
+          <w:color w:val="000000" w:themeColor="text1"/>
+          <w:sz w:val="22"/>
+          <w:szCs w:val="22"/>
+        </w:rPr>
+        <w:t xml:space="preserve"> </w:t>
+      </w:r>
+    </w:p>
+    <w:p>
+      <w:pPr>
+        <w:rPr>
+          <w:color w:val="000000" w:themeColor="text1"/>
+          <w:sz w:val="22"/>
+          <w:szCs w:val="22"/>
+        </w:rPr>
+      </w:pPr>
+      <w:r>
+        <w:rPr>
+          <w:color w:val="000000" w:themeColor="text1"/>
+          <w:sz w:val="22"/>
+          <w:szCs w:val="22"/>
+        </w:rPr>
+        <w:t xml:space="preserve">no annotation needed here for the student </w:t>
+      </w:r>
+      <w:proofErr w:type="spellStart"/>
+      <w:r>
+        <w:rPr>
+          <w:color w:val="000000" w:themeColor="text1"/>
+          <w:sz w:val="22"/>
+          <w:szCs w:val="22"/>
+        </w:rPr>
+        <w:t>jpa</w:t>
+      </w:r>
+      <w:proofErr w:type="spellEnd"/>
+      <w:r>
+        <w:rPr>
+          <w:color w:val="000000" w:themeColor="text1"/>
+          <w:sz w:val="22"/>
+          <w:szCs w:val="22"/>
+        </w:rPr>
+        <w:t xml:space="preserve"> interface</w:t>
+      </w:r>
+    </w:p>
+    <w:p>
+      <w:pPr>
+        <w:rPr>
+          <w:color w:val="000000" w:themeColor="text1"/>
+          <w:sz w:val="22"/>
+          <w:szCs w:val="22"/>
+        </w:rPr>
+      </w:pPr>
+      <w:r>
+        <w:rPr>
+          <w:color w:val="000000" w:themeColor="text1"/>
+          <w:sz w:val="22"/>
+          <w:szCs w:val="22"/>
+        </w:rPr>
+        <w:t xml:space="preserve">to use our </w:t>
+      </w:r>
+      <w:proofErr w:type="gramStart"/>
+      <w:r>
+        <w:rPr>
+          <w:color w:val="000000" w:themeColor="text1"/>
+          <w:sz w:val="22"/>
+          <w:szCs w:val="22"/>
+        </w:rPr>
+        <w:t>interface</w:t>
+      </w:r>
+      <w:proofErr w:type="gramEnd"/>
+      <w:r>
+        <w:rPr>
+          <w:color w:val="000000" w:themeColor="text1"/>
+          <w:sz w:val="22"/>
+          <w:szCs w:val="22"/>
+        </w:rPr>
+        <w:t xml:space="preserve"> we should inject it in some component, for this example we inject it in our controller</w:t>
+      </w:r>
+    </w:p>
+    <w:p>
+      <w:pPr>
+        <w:rPr>
+          <w:color w:val="000000" w:themeColor="text1"/>
+          <w:sz w:val="22"/>
+          <w:szCs w:val="22"/>
+        </w:rPr>
+      </w:pPr>
+    </w:p>
+    <w:p>
+      <w:pPr>
+        <w:rPr>
+          <w:color w:val="000000" w:themeColor="text1"/>
+          <w:sz w:val="22"/>
+          <w:szCs w:val="22"/>
+        </w:rPr>
+      </w:pPr>
+      <w:r>
+        <w:rPr>
+          <w:color w:val="000000" w:themeColor="text1"/>
+          <w:sz w:val="22"/>
+          <w:szCs w:val="22"/>
+        </w:rPr>
+        <w:t xml:space="preserve">to add to our </w:t>
+      </w:r>
+      <w:proofErr w:type="gramStart"/>
+      <w:r>
+        <w:rPr>
+          <w:color w:val="000000" w:themeColor="text1"/>
+          <w:sz w:val="22"/>
+          <w:szCs w:val="22"/>
+        </w:rPr>
+        <w:t>repository</w:t>
+      </w:r>
+      <w:proofErr w:type="gramEnd"/>
+      <w:r>
+        <w:rPr>
+          <w:color w:val="000000" w:themeColor="text1"/>
+          <w:sz w:val="22"/>
+          <w:szCs w:val="22"/>
+        </w:rPr>
+        <w:t xml:space="preserve"> we should use </w:t>
+      </w:r>
+      <w:proofErr w:type="spellStart"/>
+      <w:proofErr w:type="gramStart"/>
+      <w:r>
+        <w:rPr>
+          <w:color w:val="000000" w:themeColor="text1"/>
+          <w:sz w:val="22"/>
+          <w:szCs w:val="22"/>
+        </w:rPr>
+        <w:t>repository.save</w:t>
+      </w:r>
+      <w:proofErr w:type="spellEnd"/>
+      <w:proofErr w:type="gramEnd"/>
+      <w:r>
+        <w:rPr>
+          <w:color w:val="000000" w:themeColor="text1"/>
+          <w:sz w:val="22"/>
+          <w:szCs w:val="22"/>
+        </w:rPr>
+        <w:t>(object) object here is an equivalent of a row</w:t>
+      </w:r>
+    </w:p>
+    <w:p>
+      <w:pPr>
+        <w:rPr>
+          <w:color w:val="000000" w:themeColor="text1"/>
+          <w:sz w:val="22"/>
+          <w:szCs w:val="22"/>
+        </w:rPr>
+      </w:pPr>
+    </w:p>
+    <w:p>
+      <w:pPr>
+        <w:rPr>
+          <w:color w:val="000000" w:themeColor="text1"/>
+          <w:sz w:val="22"/>
+          <w:szCs w:val="22"/>
+        </w:rPr>
+      </w:pPr>
+      <w:r>
+        <w:rPr>
+          <w:color w:val="000000" w:themeColor="text1"/>
+          <w:sz w:val="22"/>
+          <w:szCs w:val="22"/>
+        </w:rPr>
+        <w:t xml:space="preserve">to find we can use </w:t>
+      </w:r>
+      <w:proofErr w:type="spellStart"/>
+      <w:r>
+        <w:rPr>
+          <w:color w:val="000000" w:themeColor="text1"/>
+          <w:sz w:val="22"/>
+          <w:szCs w:val="22"/>
+        </w:rPr>
+        <w:t>findById</w:t>
+      </w:r>
+      <w:proofErr w:type="spellEnd"/>
+    </w:p>
+    <w:p>
+      <w:pPr>
+        <w:rPr>
+          <w:color w:val="000000" w:themeColor="text1"/>
+          <w:sz w:val="22"/>
+          <w:szCs w:val="22"/>
+        </w:rPr>
+      </w:pPr>
+      <w:r>
+        <w:rPr>
+          <w:color w:val="000000" w:themeColor="text1"/>
+          <w:sz w:val="22"/>
+          <w:szCs w:val="22"/>
+        </w:rPr>
+        <w:t xml:space="preserve">or </w:t>
+      </w:r>
+      <w:proofErr w:type="spellStart"/>
+      <w:r>
+        <w:rPr>
+          <w:color w:val="000000" w:themeColor="text1"/>
+          <w:sz w:val="22"/>
+          <w:szCs w:val="22"/>
+        </w:rPr>
+        <w:t>findall</w:t>
+      </w:r>
+      <w:proofErr w:type="spellEnd"/>
+    </w:p>
+    <w:p>
+      <w:pPr>
+        <w:rPr>
+          <w:color w:val="000000" w:themeColor="text1"/>
+          <w:sz w:val="22"/>
+          <w:szCs w:val="22"/>
+        </w:rPr>
+      </w:pPr>
+    </w:p>
+    <w:p>
+      <w:pPr>
+        <w:rPr>
+          <w:color w:val="000000" w:themeColor="text1"/>
+          <w:sz w:val="22"/>
+          <w:szCs w:val="22"/>
+        </w:rPr>
+      </w:pPr>
+      <w:r>
+        <w:rPr>
+          <w:color w:val="000000" w:themeColor="text1"/>
+          <w:sz w:val="22"/>
+          <w:szCs w:val="22"/>
+        </w:rPr>
+        <w:lastRenderedPageBreak/>
+        <w:t xml:space="preserve">to add a new </w:t>
+      </w:r>
+      <w:proofErr w:type="gramStart"/>
+      <w:r>
+        <w:rPr>
+          <w:color w:val="000000" w:themeColor="text1"/>
+          <w:sz w:val="22"/>
+          <w:szCs w:val="22"/>
+        </w:rPr>
+        <w:t>method</w:t>
+      </w:r>
+      <w:proofErr w:type="gramEnd"/>
+      <w:r>
+        <w:rPr>
+          <w:color w:val="000000" w:themeColor="text1"/>
+          <w:sz w:val="22"/>
+          <w:szCs w:val="22"/>
+        </w:rPr>
+        <w:t xml:space="preserve"> we can define it in our interface of the repository and the java </w:t>
+      </w:r>
+      <w:proofErr w:type="spellStart"/>
+      <w:r>
+        <w:rPr>
+          <w:color w:val="000000" w:themeColor="text1"/>
+          <w:sz w:val="22"/>
+          <w:szCs w:val="22"/>
+        </w:rPr>
+        <w:t>jpa</w:t>
+      </w:r>
+      <w:proofErr w:type="spellEnd"/>
+      <w:r>
+        <w:rPr>
+          <w:color w:val="000000" w:themeColor="text1"/>
+          <w:sz w:val="22"/>
+          <w:szCs w:val="22"/>
+        </w:rPr>
+        <w:t xml:space="preserve"> will create a query for us</w:t>
+      </w:r>
+    </w:p>
+    <w:p>
+      <w:pPr>
+        <w:rPr>
+          <w:color w:val="000000" w:themeColor="text1"/>
+          <w:sz w:val="22"/>
+          <w:szCs w:val="22"/>
+        </w:rPr>
+      </w:pPr>
+      <w:r>
+        <w:rPr>
+          <w:color w:val="000000" w:themeColor="text1"/>
+          <w:sz w:val="22"/>
+          <w:szCs w:val="22"/>
+        </w:rPr>
+        <w:t>Here's the simple rule for capitalization across your entire Spring Boot application: Java field names start with a lowercase letter (e.g., </w:t>
+      </w:r>
+      <w:proofErr w:type="spellStart"/>
+      <w:r>
+        <w:rPr>
+          <w:color w:val="000000" w:themeColor="text1"/>
+          <w:sz w:val="22"/>
+          <w:szCs w:val="22"/>
+        </w:rPr>
+        <w:t>fName</w:t>
+      </w:r>
+      <w:proofErr w:type="spellEnd"/>
+      <w:r>
+        <w:rPr>
+          <w:color w:val="000000" w:themeColor="text1"/>
+          <w:sz w:val="22"/>
+          <w:szCs w:val="22"/>
+        </w:rPr>
+        <w:t>, email, id), and their corresponding getter/setter methods capitalize the field name after get/set (e.g., </w:t>
+      </w:r>
+      <w:proofErr w:type="spellStart"/>
+      <w:r>
+        <w:rPr>
+          <w:color w:val="000000" w:themeColor="text1"/>
+          <w:sz w:val="22"/>
+          <w:szCs w:val="22"/>
+        </w:rPr>
+        <w:t>getFName</w:t>
+      </w:r>
+      <w:proofErr w:type="spellEnd"/>
+      <w:r>
+        <w:rPr>
+          <w:color w:val="000000" w:themeColor="text1"/>
+          <w:sz w:val="22"/>
+          <w:szCs w:val="22"/>
+        </w:rPr>
+        <w:t>(), </w:t>
+      </w:r>
+      <w:proofErr w:type="spellStart"/>
+      <w:r>
+        <w:rPr>
+          <w:color w:val="000000" w:themeColor="text1"/>
+          <w:sz w:val="22"/>
+          <w:szCs w:val="22"/>
+        </w:rPr>
+        <w:t>setFName</w:t>
+      </w:r>
+      <w:proofErr w:type="spellEnd"/>
+      <w:r>
+        <w:rPr>
+          <w:color w:val="000000" w:themeColor="text1"/>
+          <w:sz w:val="22"/>
+          <w:szCs w:val="22"/>
+        </w:rPr>
+        <w:t>()) — but Spring Data JPA repository methods must match the exact field name starting with lowercase (</w:t>
+      </w:r>
+      <w:proofErr w:type="spellStart"/>
+      <w:r>
+        <w:rPr>
+          <w:color w:val="000000" w:themeColor="text1"/>
+          <w:sz w:val="22"/>
+          <w:szCs w:val="22"/>
+        </w:rPr>
+        <w:t>findByfNameContaining</w:t>
+      </w:r>
+      <w:proofErr w:type="spellEnd"/>
+      <w:r>
+        <w:rPr>
+          <w:color w:val="000000" w:themeColor="text1"/>
+          <w:sz w:val="22"/>
+          <w:szCs w:val="22"/>
+        </w:rPr>
+        <w:t>, NOT </w:t>
+      </w:r>
+      <w:proofErr w:type="spellStart"/>
+      <w:r>
+        <w:rPr>
+          <w:color w:val="000000" w:themeColor="text1"/>
+          <w:sz w:val="22"/>
+          <w:szCs w:val="22"/>
+        </w:rPr>
+        <w:t>findByFNameContaining</w:t>
+      </w:r>
+      <w:proofErr w:type="spellEnd"/>
+      <w:r>
+        <w:rPr>
+          <w:color w:val="000000" w:themeColor="text1"/>
+          <w:sz w:val="22"/>
+          <w:szCs w:val="22"/>
+        </w:rPr>
+        <w:t>). Database columns via @</w:t>
+      </w:r>
+      <w:proofErr w:type="gramStart"/>
+      <w:r>
+        <w:rPr>
+          <w:color w:val="000000" w:themeColor="text1"/>
+          <w:sz w:val="22"/>
+          <w:szCs w:val="22"/>
+        </w:rPr>
+        <w:t>Column(</w:t>
+      </w:r>
+      <w:proofErr w:type="gramEnd"/>
+      <w:r>
+        <w:rPr>
+          <w:color w:val="000000" w:themeColor="text1"/>
+          <w:sz w:val="22"/>
+          <w:szCs w:val="22"/>
+        </w:rPr>
+        <w:t>name = "</w:t>
+      </w:r>
+      <w:proofErr w:type="spellStart"/>
+      <w:r>
+        <w:rPr>
+          <w:color w:val="000000" w:themeColor="text1"/>
+          <w:sz w:val="22"/>
+          <w:szCs w:val="22"/>
+        </w:rPr>
+        <w:t>f_name</w:t>
+      </w:r>
+      <w:proofErr w:type="spellEnd"/>
+      <w:r>
+        <w:rPr>
+          <w:color w:val="000000" w:themeColor="text1"/>
+          <w:sz w:val="22"/>
+          <w:szCs w:val="22"/>
+        </w:rPr>
+        <w:t xml:space="preserve">") can be whatever naming convention you want (usually </w:t>
+      </w:r>
+      <w:proofErr w:type="spellStart"/>
+      <w:r>
+        <w:rPr>
+          <w:color w:val="000000" w:themeColor="text1"/>
+          <w:sz w:val="22"/>
+          <w:szCs w:val="22"/>
+        </w:rPr>
+        <w:t>snake_case</w:t>
+      </w:r>
+      <w:proofErr w:type="spellEnd"/>
+      <w:r>
+        <w:rPr>
+          <w:color w:val="000000" w:themeColor="text1"/>
+          <w:sz w:val="22"/>
+          <w:szCs w:val="22"/>
+        </w:rPr>
+        <w:t>). Path variables in @GetMapping like /{name} are independent and just pass values. The only places where capitalization breaks everything are: (1) repository method names must match Java field names exactly (case-sensitive), (2) getters/setters must follow the </w:t>
+      </w:r>
+      <w:proofErr w:type="spellStart"/>
+      <w:r>
+        <w:rPr>
+          <w:color w:val="000000" w:themeColor="text1"/>
+          <w:sz w:val="22"/>
+          <w:szCs w:val="22"/>
+        </w:rPr>
+        <w:t>getFieldName</w:t>
+      </w:r>
+      <w:proofErr w:type="spellEnd"/>
+      <w:r>
+        <w:rPr>
+          <w:color w:val="000000" w:themeColor="text1"/>
+          <w:sz w:val="22"/>
+          <w:szCs w:val="22"/>
+        </w:rPr>
+        <w:t>() pattern with capital after get, and (3) JSON responses rely on those getters being correct — everything else (URLs, database columns) is more flexible but keeping consistent lowercase for fields and camelCase for getters avoids confusion.</w:t>
+      </w:r>
+      <w:r>
+        <w:rPr>
+          <w:color w:val="000000" w:themeColor="text1"/>
+          <w:sz w:val="22"/>
+          <w:szCs w:val="22"/>
+        </w:rPr>
+        <w:t xml:space="preserve"> </w:t>
+      </w:r>
+    </w:p>
+    <w:p>
+      <w:pPr>
+        <w:rPr>
+          <w:color w:val="000000" w:themeColor="text1"/>
+          <w:sz w:val="22"/>
+          <w:szCs w:val="22"/>
+        </w:rPr>
+      </w:pPr>
+    </w:p>
+    <w:p>
+      <w:pPr>
+        <w:rPr>
+          <w:color w:val="000000" w:themeColor="text1"/>
+          <w:sz w:val="22"/>
+          <w:szCs w:val="22"/>
+        </w:rPr>
+      </w:pPr>
+      <w:r>
+        <w:rPr>
+          <w:color w:val="000000" w:themeColor="text1"/>
+          <w:sz w:val="22"/>
+          <w:szCs w:val="22"/>
+        </w:rPr>
+        <w:t>@</w:t>
+      </w:r>
+      <w:proofErr w:type="gramStart"/>
+      <w:r>
+        <w:rPr>
+          <w:color w:val="000000" w:themeColor="text1"/>
+          <w:sz w:val="22"/>
+          <w:szCs w:val="22"/>
+        </w:rPr>
+        <w:t>OnetoOne(</w:t>
+      </w:r>
+      <w:proofErr w:type="gramEnd"/>
+      <w:r>
+        <w:rPr>
+          <w:color w:val="000000" w:themeColor="text1"/>
+        </w:rPr>
+        <w:t>cascade</w:t>
+      </w:r>
+      <w:r>
+        <w:rPr>
+          <w:color w:val="000000" w:themeColor="text1"/>
+          <w:sz w:val="22"/>
+          <w:szCs w:val="22"/>
+        </w:rPr>
+        <w:t xml:space="preserve"> = cascadetype.al, </w:t>
+      </w:r>
+      <w:proofErr w:type="spellStart"/>
+      <w:r>
+        <w:rPr>
+          <w:color w:val="000000" w:themeColor="text1"/>
+          <w:sz w:val="22"/>
+          <w:szCs w:val="22"/>
+        </w:rPr>
+        <w:t>mappedby</w:t>
+      </w:r>
+      <w:proofErr w:type="spellEnd"/>
+      <w:r>
+        <w:rPr>
+          <w:color w:val="000000" w:themeColor="text1"/>
+          <w:sz w:val="22"/>
+          <w:szCs w:val="22"/>
+        </w:rPr>
+        <w:t xml:space="preserve"> = “</w:t>
+      </w:r>
+      <w:proofErr w:type="spellStart"/>
+      <w:r>
+        <w:rPr>
+          <w:color w:val="000000" w:themeColor="text1"/>
+          <w:sz w:val="22"/>
+          <w:szCs w:val="22"/>
+        </w:rPr>
+        <w:t>class_</w:t>
+      </w:r>
+      <w:proofErr w:type="gramStart"/>
+      <w:r>
+        <w:rPr>
+          <w:color w:val="000000" w:themeColor="text1"/>
+          <w:sz w:val="22"/>
+          <w:szCs w:val="22"/>
+        </w:rPr>
+        <w:t>name”l</w:t>
+      </w:r>
+      <w:proofErr w:type="spellEnd"/>
+      <w:proofErr w:type="gramEnd"/>
+      <w:r>
+        <w:rPr>
+          <w:color w:val="000000" w:themeColor="text1"/>
+          <w:sz w:val="22"/>
+          <w:szCs w:val="22"/>
+        </w:rPr>
+        <w:t>) this means whenever our entity object is deleted the object which its annotated on will also be deleted.</w:t>
+      </w:r>
     </w:p>
     <w:p>
       <w:pPr>
@@ -7032,16 +7921,27 @@
           <w:b/>
           <w:bCs/>
           <w:color w:val="000000" w:themeColor="text1"/>
-          <w:u w:val="single"/>
-        </w:rPr>
-      </w:pPr>
-      <w:r>
+          <w:sz w:val="22"/>
+          <w:szCs w:val="22"/>
+        </w:rPr>
+      </w:pPr>
+    </w:p>
+    <w:p>
+      <w:pPr>
         <w:rPr>
           <w:b/>
           <w:bCs/>
           <w:color w:val="000000" w:themeColor="text1"/>
           <w:u w:val="single"/>
         </w:rPr>
+      </w:pPr>
+      <w:r>
+        <w:rPr>
+          <w:b/>
+          <w:bCs/>
+          <w:color w:val="000000" w:themeColor="text1"/>
+          <w:u w:val="single"/>
+        </w:rPr>
         <w:t xml:space="preserve">Defining a foreign key: </w:t>
       </w:r>
     </w:p>
@@ -7079,6 +7979,7 @@
         <w:t xml:space="preserve">    private Locker </w:t>
       </w:r>
       <w:proofErr w:type="spellStart"/>
+      <w:proofErr w:type="gramStart"/>
       <w:r>
         <w:rPr>
           <w:color w:val="000000" w:themeColor="text1"/>
@@ -7104,60 +8005,9 @@
           <w:sz w:val="22"/>
           <w:szCs w:val="22"/>
         </w:rPr>
-        <w:t>// ← This field name is "locker"</w:t>
-      </w:r>
-    </w:p>
-    <w:p>
-      <w:pPr>
-        <w:rPr>
-          <w:color w:val="000000" w:themeColor="text1"/>
-          <w:sz w:val="22"/>
-          <w:szCs w:val="22"/>
-        </w:rPr>
-      </w:pPr>
-      <w:r>
-        <w:rPr>
-          <w:color w:val="000000" w:themeColor="text1"/>
-          <w:sz w:val="22"/>
-          <w:szCs w:val="22"/>
-        </w:rPr>
-        <w:t xml:space="preserve">    @OneToOne</w:t>
-      </w:r>
-    </w:p>
-    <w:p>
-      <w:pPr>
-        <w:rPr>
-          <w:color w:val="000000" w:themeColor="text1"/>
-          <w:sz w:val="22"/>
-          <w:szCs w:val="22"/>
-        </w:rPr>
-      </w:pPr>
-      <w:r>
-        <w:rPr>
-          <w:color w:val="000000" w:themeColor="text1"/>
-          <w:sz w:val="22"/>
-          <w:szCs w:val="22"/>
-        </w:rPr>
-        <w:t xml:space="preserve">    @JoinColumn(name = "</w:t>
-      </w:r>
-      <w:proofErr w:type="spellStart"/>
-      <w:r>
-        <w:rPr>
-          <w:color w:val="000000" w:themeColor="text1"/>
-          <w:sz w:val="22"/>
-          <w:szCs w:val="22"/>
-        </w:rPr>
-        <w:t>locker_id</w:t>
-      </w:r>
-      <w:proofErr w:type="spellEnd"/>
-      <w:r>
-        <w:rPr>
-          <w:color w:val="000000" w:themeColor="text1"/>
-          <w:sz w:val="22"/>
-          <w:szCs w:val="22"/>
-        </w:rPr>
-        <w:t xml:space="preserve">")  </w:t>
-      </w:r>
+        <w:t>/</w:t>
+      </w:r>
+      <w:proofErr w:type="gramEnd"/>
       <w:r>
         <w:rPr>
           <w:i/>
@@ -7166,7 +8016,78 @@
           <w:sz w:val="22"/>
           <w:szCs w:val="22"/>
         </w:rPr>
-        <w:t>// ← Database column name</w:t>
+        <w:t>/ ← This field name is "locker"</w:t>
+      </w:r>
+    </w:p>
+    <w:p>
+      <w:pPr>
+        <w:rPr>
+          <w:color w:val="000000" w:themeColor="text1"/>
+          <w:sz w:val="22"/>
+          <w:szCs w:val="22"/>
+        </w:rPr>
+      </w:pPr>
+      <w:r>
+        <w:rPr>
+          <w:color w:val="000000" w:themeColor="text1"/>
+          <w:sz w:val="22"/>
+          <w:szCs w:val="22"/>
+        </w:rPr>
+        <w:t xml:space="preserve">    @OneToOne</w:t>
+      </w:r>
+    </w:p>
+    <w:p>
+      <w:pPr>
+        <w:rPr>
+          <w:color w:val="000000" w:themeColor="text1"/>
+          <w:sz w:val="22"/>
+          <w:szCs w:val="22"/>
+        </w:rPr>
+      </w:pPr>
+      <w:r>
+        <w:rPr>
+          <w:color w:val="000000" w:themeColor="text1"/>
+          <w:sz w:val="22"/>
+          <w:szCs w:val="22"/>
+        </w:rPr>
+        <w:t xml:space="preserve">    @</w:t>
+      </w:r>
+      <w:proofErr w:type="gramStart"/>
+      <w:r>
+        <w:rPr>
+          <w:color w:val="000000" w:themeColor="text1"/>
+          <w:sz w:val="22"/>
+          <w:szCs w:val="22"/>
+        </w:rPr>
+        <w:t>JoinColumn(</w:t>
+      </w:r>
+      <w:proofErr w:type="gramEnd"/>
+      <w:r>
+        <w:rPr>
+          <w:color w:val="000000" w:themeColor="text1"/>
+          <w:sz w:val="22"/>
+          <w:szCs w:val="22"/>
+        </w:rPr>
+        <w:t>name = "</w:t>
+      </w:r>
+      <w:proofErr w:type="spellStart"/>
+      <w:r>
+        <w:rPr>
+          <w:color w:val="000000" w:themeColor="text1"/>
+          <w:sz w:val="22"/>
+          <w:szCs w:val="22"/>
+        </w:rPr>
+        <w:t>locker_id</w:t>
+      </w:r>
+      <w:proofErr w:type="spellEnd"/>
+      <w:proofErr w:type="gramStart"/>
+      <w:r>
+        <w:rPr>
+          <w:color w:val="000000" w:themeColor="text1"/>
+          <w:sz w:val="22"/>
+          <w:szCs w:val="22"/>
+        </w:rPr>
+        <w:t xml:space="preserve">")  </w:t>
       </w:r>
       <w:r>
         <w:rPr>
@@ -7176,43 +8097,9 @@
           <w:sz w:val="22"/>
           <w:szCs w:val="22"/>
         </w:rPr>
-        <w:t xml:space="preserve"> to be created in student entity, with the naming of the column</w:t>
-      </w:r>
-    </w:p>
-    <w:p>
-      <w:pPr>
-        <w:rPr>
-          <w:color w:val="000000" w:themeColor="text1"/>
-          <w:sz w:val="22"/>
-          <w:szCs w:val="22"/>
-        </w:rPr>
-      </w:pPr>
-      <w:r>
-        <w:rPr>
-          <w:color w:val="000000" w:themeColor="text1"/>
-          <w:sz w:val="22"/>
-          <w:szCs w:val="22"/>
-        </w:rPr>
-        <w:t xml:space="preserve">    private Locker </w:t>
-      </w:r>
-      <w:proofErr w:type="spellStart"/>
-      <w:r>
-        <w:rPr>
-          <w:color w:val="000000" w:themeColor="text1"/>
-          <w:sz w:val="22"/>
-          <w:szCs w:val="22"/>
-        </w:rPr>
-        <w:t>locker</w:t>
-      </w:r>
-      <w:proofErr w:type="spellEnd"/>
-      <w:r>
-        <w:rPr>
-          <w:color w:val="000000" w:themeColor="text1"/>
-          <w:sz w:val="22"/>
-          <w:szCs w:val="22"/>
-        </w:rPr>
-        <w:t xml:space="preserve">;           </w:t>
-      </w:r>
+        <w:t>/</w:t>
+      </w:r>
+      <w:proofErr w:type="gramEnd"/>
       <w:r>
         <w:rPr>
           <w:i/>
@@ -7221,34 +8108,8 @@
           <w:sz w:val="22"/>
           <w:szCs w:val="22"/>
         </w:rPr>
-        <w:t>// ← Same field!</w:t>
-      </w:r>
-    </w:p>
-    <w:p>
-      <w:pPr>
-        <w:rPr>
-          <w:color w:val="000000" w:themeColor="text1"/>
-          <w:sz w:val="22"/>
-          <w:szCs w:val="22"/>
-        </w:rPr>
-      </w:pPr>
-      <w:r>
-        <w:rPr>
-          <w:color w:val="000000" w:themeColor="text1"/>
-          <w:sz w:val="22"/>
-          <w:szCs w:val="22"/>
-        </w:rPr>
-        <w:t>}</w:t>
-      </w:r>
-    </w:p>
-    <w:p>
-      <w:pPr>
-        <w:rPr>
-          <w:color w:val="000000" w:themeColor="text1"/>
-          <w:sz w:val="22"/>
-          <w:szCs w:val="22"/>
-        </w:rPr>
-      </w:pPr>
+        <w:t>/ ← Database column name</w:t>
+      </w:r>
       <w:r>
         <w:rPr>
           <w:i/>
@@ -7257,41 +8118,52 @@
           <w:sz w:val="22"/>
           <w:szCs w:val="22"/>
         </w:rPr>
-        <w:t xml:space="preserve">// Locker.java  </w:t>
-      </w:r>
-    </w:p>
-    <w:p>
-      <w:pPr>
-        <w:rPr>
-          <w:color w:val="000000" w:themeColor="text1"/>
-          <w:sz w:val="22"/>
-          <w:szCs w:val="22"/>
-        </w:rPr>
-      </w:pPr>
-      <w:r>
-        <w:rPr>
-          <w:color w:val="000000" w:themeColor="text1"/>
-          <w:sz w:val="22"/>
-          <w:szCs w:val="22"/>
-        </w:rPr>
-        <w:t>public class Locker {</w:t>
-      </w:r>
-    </w:p>
-    <w:p>
-      <w:pPr>
-        <w:rPr>
-          <w:color w:val="000000" w:themeColor="text1"/>
-          <w:sz w:val="22"/>
-          <w:szCs w:val="22"/>
-        </w:rPr>
-      </w:pPr>
-      <w:r>
-        <w:rPr>
-          <w:color w:val="000000" w:themeColor="text1"/>
-          <w:sz w:val="22"/>
-          <w:szCs w:val="22"/>
-        </w:rPr>
-        <w:t xml:space="preserve">    @OneToOne(mappedBy = "locker")  </w:t>
+        <w:t xml:space="preserve"> to be created in student entity, with the naming of the column</w:t>
+      </w:r>
+    </w:p>
+    <w:p>
+      <w:pPr>
+        <w:rPr>
+          <w:color w:val="000000" w:themeColor="text1"/>
+          <w:sz w:val="22"/>
+          <w:szCs w:val="22"/>
+        </w:rPr>
+      </w:pPr>
+      <w:r>
+        <w:rPr>
+          <w:color w:val="000000" w:themeColor="text1"/>
+          <w:sz w:val="22"/>
+          <w:szCs w:val="22"/>
+        </w:rPr>
+        <w:t xml:space="preserve">    private Locker </w:t>
+      </w:r>
+      <w:proofErr w:type="spellStart"/>
+      <w:proofErr w:type="gramStart"/>
+      <w:r>
+        <w:rPr>
+          <w:color w:val="000000" w:themeColor="text1"/>
+          <w:sz w:val="22"/>
+          <w:szCs w:val="22"/>
+        </w:rPr>
+        <w:t>locker</w:t>
+      </w:r>
+      <w:proofErr w:type="spellEnd"/>
+      <w:r>
+        <w:rPr>
+          <w:color w:val="000000" w:themeColor="text1"/>
+          <w:sz w:val="22"/>
+          <w:szCs w:val="22"/>
+        </w:rPr>
+        <w:t xml:space="preserve">;   </w:t>
+      </w:r>
+      <w:proofErr w:type="gramEnd"/>
+      <w:r>
+        <w:rPr>
+          <w:color w:val="000000" w:themeColor="text1"/>
+          <w:sz w:val="22"/>
+          <w:szCs w:val="22"/>
+        </w:rPr>
+        <w:t xml:space="preserve">        </w:t>
       </w:r>
       <w:r>
         <w:rPr>
@@ -7301,8 +8173,34 @@
           <w:sz w:val="22"/>
           <w:szCs w:val="22"/>
         </w:rPr>
-        <w:t>// ← Points to Student's field name "locker"</w:t>
-      </w:r>
+        <w:t>// ← Same field!</w:t>
+      </w:r>
+    </w:p>
+    <w:p>
+      <w:pPr>
+        <w:rPr>
+          <w:color w:val="000000" w:themeColor="text1"/>
+          <w:sz w:val="22"/>
+          <w:szCs w:val="22"/>
+        </w:rPr>
+      </w:pPr>
+      <w:r>
+        <w:rPr>
+          <w:color w:val="000000" w:themeColor="text1"/>
+          <w:sz w:val="22"/>
+          <w:szCs w:val="22"/>
+        </w:rPr>
+        <w:t>}</w:t>
+      </w:r>
+    </w:p>
+    <w:p>
+      <w:pPr>
+        <w:rPr>
+          <w:color w:val="000000" w:themeColor="text1"/>
+          <w:sz w:val="22"/>
+          <w:szCs w:val="22"/>
+        </w:rPr>
+      </w:pPr>
       <w:r>
         <w:rPr>
           <w:i/>
@@ -7311,6 +8209,98 @@
           <w:sz w:val="22"/>
           <w:szCs w:val="22"/>
         </w:rPr>
+        <w:t xml:space="preserve">// Locker.java  </w:t>
+      </w:r>
+    </w:p>
+    <w:p>
+      <w:pPr>
+        <w:rPr>
+          <w:color w:val="000000" w:themeColor="text1"/>
+          <w:sz w:val="22"/>
+          <w:szCs w:val="22"/>
+        </w:rPr>
+      </w:pPr>
+      <w:r>
+        <w:rPr>
+          <w:color w:val="000000" w:themeColor="text1"/>
+          <w:sz w:val="22"/>
+          <w:szCs w:val="22"/>
+        </w:rPr>
+        <w:t>public class Locker {</w:t>
+      </w:r>
+    </w:p>
+    <w:p>
+      <w:pPr>
+        <w:rPr>
+          <w:color w:val="000000" w:themeColor="text1"/>
+          <w:sz w:val="22"/>
+          <w:szCs w:val="22"/>
+        </w:rPr>
+      </w:pPr>
+      <w:r>
+        <w:rPr>
+          <w:color w:val="000000" w:themeColor="text1"/>
+          <w:sz w:val="22"/>
+          <w:szCs w:val="22"/>
+        </w:rPr>
+        <w:t xml:space="preserve">    @</w:t>
+      </w:r>
+      <w:proofErr w:type="gramStart"/>
+      <w:r>
+        <w:rPr>
+          <w:color w:val="000000" w:themeColor="text1"/>
+          <w:sz w:val="22"/>
+          <w:szCs w:val="22"/>
+        </w:rPr>
+        <w:t>OneToOne(</w:t>
+      </w:r>
+      <w:proofErr w:type="gramEnd"/>
+      <w:r>
+        <w:rPr>
+          <w:color w:val="000000" w:themeColor="text1"/>
+          <w:sz w:val="22"/>
+          <w:szCs w:val="22"/>
+        </w:rPr>
+        <w:t>mappedBy = "locker</w:t>
+      </w:r>
+      <w:proofErr w:type="gramStart"/>
+      <w:r>
+        <w:rPr>
+          <w:color w:val="000000" w:themeColor="text1"/>
+          <w:sz w:val="22"/>
+          <w:szCs w:val="22"/>
+        </w:rPr>
+        <w:t xml:space="preserve">")  </w:t>
+      </w:r>
+      <w:r>
+        <w:rPr>
+          <w:i/>
+          <w:iCs/>
+          <w:color w:val="000000" w:themeColor="text1"/>
+          <w:sz w:val="22"/>
+          <w:szCs w:val="22"/>
+        </w:rPr>
+        <w:t>/</w:t>
+      </w:r>
+      <w:proofErr w:type="gramEnd"/>
+      <w:r>
+        <w:rPr>
+          <w:i/>
+          <w:iCs/>
+          <w:color w:val="000000" w:themeColor="text1"/>
+          <w:sz w:val="22"/>
+          <w:szCs w:val="22"/>
+        </w:rPr>
+        <w:t>/ ← Points to Student's field name "locker"</w:t>
+      </w:r>
+      <w:r>
+        <w:rPr>
+          <w:i/>
+          <w:iCs/>
+          <w:color w:val="000000" w:themeColor="text1"/>
+          <w:sz w:val="22"/>
+          <w:szCs w:val="22"/>
+        </w:rPr>
         <w:t xml:space="preserve"> so this is where the foreign key to be found, meaning in this class the foreign key comes from the locker</w:t>
       </w:r>
     </w:p>
@@ -7390,7 +8380,6 @@
           <w:sz w:val="22"/>
           <w:szCs w:val="22"/>
         </w:rPr>
-        <w:lastRenderedPageBreak/>
         <w:t>mappedBy</w:t>
       </w:r>
       <w:proofErr w:type="spellEnd"/>
@@ -7444,7 +8433,25 @@
           <w:sz w:val="22"/>
           <w:szCs w:val="22"/>
         </w:rPr>
-        <w:t>@JoinColumn(name = "</w:t>
+        <w:t>@</w:t>
+      </w:r>
+      <w:proofErr w:type="gramStart"/>
+      <w:r>
+        <w:rPr>
+          <w:color w:val="EE0000"/>
+          <w:sz w:val="22"/>
+          <w:szCs w:val="22"/>
+        </w:rPr>
+        <w:t>JoinColumn(</w:t>
+      </w:r>
+      <w:proofErr w:type="gramEnd"/>
+      <w:r>
+        <w:rPr>
+          <w:color w:val="EE0000"/>
+          <w:sz w:val="22"/>
+          <w:szCs w:val="22"/>
+        </w:rPr>
+        <w:t>name = "</w:t>
       </w:r>
       <w:proofErr w:type="spellStart"/>
       <w:r>
@@ -7603,7 +8610,43 @@
           <w:sz w:val="22"/>
           <w:szCs w:val="22"/>
         </w:rPr>
-        <w:t xml:space="preserve">@OneToMany(mappedBy = "category")  // Look in </w:t>
+        <w:t>@</w:t>
+      </w:r>
+      <w:proofErr w:type="gramStart"/>
+      <w:r>
+        <w:rPr>
+          <w:color w:val="000000" w:themeColor="text1"/>
+          <w:sz w:val="22"/>
+          <w:szCs w:val="22"/>
+        </w:rPr>
+        <w:t>OneToMany(</w:t>
+      </w:r>
+      <w:proofErr w:type="gramEnd"/>
+      <w:r>
+        <w:rPr>
+          <w:color w:val="000000" w:themeColor="text1"/>
+          <w:sz w:val="22"/>
+          <w:szCs w:val="22"/>
+        </w:rPr>
+        <w:t>mappedBy = "category</w:t>
+      </w:r>
+      <w:proofErr w:type="gramStart"/>
+      <w:r>
+        <w:rPr>
+          <w:color w:val="000000" w:themeColor="text1"/>
+          <w:sz w:val="22"/>
+          <w:szCs w:val="22"/>
+        </w:rPr>
+        <w:t>")  /</w:t>
+      </w:r>
+      <w:proofErr w:type="gramEnd"/>
+      <w:r>
+        <w:rPr>
+          <w:color w:val="000000" w:themeColor="text1"/>
+          <w:sz w:val="22"/>
+          <w:szCs w:val="22"/>
+        </w:rPr>
+        <w:t xml:space="preserve">/ Look in </w:t>
       </w:r>
       <w:proofErr w:type="spellStart"/>
       <w:r>
@@ -7969,7 +9012,25 @@
           <w:sz w:val="22"/>
           <w:szCs w:val="22"/>
         </w:rPr>
-        <w:t xml:space="preserve">    @OneToMany(mappedBy = "category", cascade = </w:t>
+        <w:t xml:space="preserve">    @</w:t>
+      </w:r>
+      <w:proofErr w:type="gramStart"/>
+      <w:r>
+        <w:rPr>
+          <w:color w:val="000000" w:themeColor="text1"/>
+          <w:sz w:val="22"/>
+          <w:szCs w:val="22"/>
+        </w:rPr>
+        <w:t>OneToMany(</w:t>
+      </w:r>
+      <w:proofErr w:type="gramEnd"/>
+      <w:r>
+        <w:rPr>
+          <w:color w:val="000000" w:themeColor="text1"/>
+          <w:sz w:val="22"/>
+          <w:szCs w:val="22"/>
+        </w:rPr>
+        <w:t xml:space="preserve">mappedBy = "category", cascade = </w:t>
       </w:r>
       <w:proofErr w:type="spellStart"/>
       <w:r>
@@ -8022,7 +9083,25 @@
           <w:sz w:val="22"/>
           <w:szCs w:val="22"/>
         </w:rPr>
-        <w:t>&lt;&gt;();</w:t>
+        <w:t>&lt;</w:t>
+      </w:r>
+      <w:proofErr w:type="gramStart"/>
+      <w:r>
+        <w:rPr>
+          <w:color w:val="000000" w:themeColor="text1"/>
+          <w:sz w:val="22"/>
+          <w:szCs w:val="22"/>
+        </w:rPr>
+        <w:t>&gt;(</w:t>
+      </w:r>
+      <w:proofErr w:type="gramEnd"/>
+      <w:r>
+        <w:rPr>
+          <w:color w:val="000000" w:themeColor="text1"/>
+          <w:sz w:val="22"/>
+          <w:szCs w:val="22"/>
+        </w:rPr>
+        <w:t>);</w:t>
       </w:r>
     </w:p>
     <w:p>
@@ -8056,6 +9135,7 @@
           <w:sz w:val="22"/>
           <w:szCs w:val="22"/>
         </w:rPr>
+        <w:lastRenderedPageBreak/>
         <w:t>Now when you do:</w:t>
       </w:r>
     </w:p>
@@ -8073,7 +9153,6 @@
           <w:sz w:val="22"/>
           <w:szCs w:val="22"/>
         </w:rPr>
-        <w:lastRenderedPageBreak/>
         <w:t>java</w:t>
       </w:r>
     </w:p>
@@ -8091,24 +9170,60 @@
           <w:sz w:val="22"/>
           <w:szCs w:val="22"/>
         </w:rPr>
-        <w:t>Category electronics = new Category();</w:t>
-      </w:r>
-    </w:p>
-    <w:p>
-      <w:pPr>
-        <w:rPr>
-          <w:color w:val="000000" w:themeColor="text1"/>
-          <w:sz w:val="22"/>
-          <w:szCs w:val="22"/>
-        </w:rPr>
-      </w:pPr>
-      <w:r>
-        <w:rPr>
-          <w:color w:val="000000" w:themeColor="text1"/>
-          <w:sz w:val="22"/>
-          <w:szCs w:val="22"/>
-        </w:rPr>
-        <w:t>Product laptop = new Product();</w:t>
+        <w:t xml:space="preserve">Category electronics = new </w:t>
+      </w:r>
+      <w:proofErr w:type="gramStart"/>
+      <w:r>
+        <w:rPr>
+          <w:color w:val="000000" w:themeColor="text1"/>
+          <w:sz w:val="22"/>
+          <w:szCs w:val="22"/>
+        </w:rPr>
+        <w:t>Category(</w:t>
+      </w:r>
+      <w:proofErr w:type="gramEnd"/>
+      <w:r>
+        <w:rPr>
+          <w:color w:val="000000" w:themeColor="text1"/>
+          <w:sz w:val="22"/>
+          <w:szCs w:val="22"/>
+        </w:rPr>
+        <w:t>);</w:t>
+      </w:r>
+    </w:p>
+    <w:p>
+      <w:pPr>
+        <w:rPr>
+          <w:color w:val="000000" w:themeColor="text1"/>
+          <w:sz w:val="22"/>
+          <w:szCs w:val="22"/>
+        </w:rPr>
+      </w:pPr>
+      <w:r>
+        <w:rPr>
+          <w:color w:val="000000" w:themeColor="text1"/>
+          <w:sz w:val="22"/>
+          <w:szCs w:val="22"/>
+        </w:rPr>
+        <w:t xml:space="preserve">Product laptop = new </w:t>
+      </w:r>
+      <w:proofErr w:type="gramStart"/>
+      <w:r>
+        <w:rPr>
+          <w:color w:val="000000" w:themeColor="text1"/>
+          <w:sz w:val="22"/>
+          <w:szCs w:val="22"/>
+        </w:rPr>
+        <w:t>Product(</w:t>
+      </w:r>
+      <w:proofErr w:type="gramEnd"/>
+      <w:r>
+        <w:rPr>
+          <w:color w:val="000000" w:themeColor="text1"/>
+          <w:sz w:val="22"/>
+          <w:szCs w:val="22"/>
+        </w:rPr>
+        <w:t>);</w:t>
       </w:r>
     </w:p>
     <w:p>
@@ -8120,6 +9235,7 @@
         </w:rPr>
       </w:pPr>
       <w:proofErr w:type="spellStart"/>
+      <w:proofErr w:type="gramStart"/>
       <w:r>
         <w:rPr>
           <w:color w:val="000000" w:themeColor="text1"/>
@@ -8129,6 +9245,7 @@
         <w:t>laptop.setCategory</w:t>
       </w:r>
       <w:proofErr w:type="spellEnd"/>
+      <w:proofErr w:type="gramEnd"/>
       <w:r>
         <w:rPr>
           <w:color w:val="000000" w:themeColor="text1"/>
@@ -8147,6 +9264,7 @@
         </w:rPr>
       </w:pPr>
       <w:proofErr w:type="spellStart"/>
+      <w:proofErr w:type="gramStart"/>
       <w:r>
         <w:rPr>
           <w:color w:val="000000" w:themeColor="text1"/>
@@ -8156,13 +9274,32 @@
         <w:t>electronics.getProducts</w:t>
       </w:r>
       <w:proofErr w:type="spellEnd"/>
-      <w:r>
-        <w:rPr>
-          <w:color w:val="000000" w:themeColor="text1"/>
-          <w:sz w:val="22"/>
-          <w:szCs w:val="22"/>
-        </w:rPr>
-        <w:t>().add(laptop);</w:t>
+      <w:proofErr w:type="gramEnd"/>
+      <w:r>
+        <w:rPr>
+          <w:color w:val="000000" w:themeColor="text1"/>
+          <w:sz w:val="22"/>
+          <w:szCs w:val="22"/>
+        </w:rPr>
+        <w:t>(</w:t>
+      </w:r>
+      <w:proofErr w:type="gramStart"/>
+      <w:r>
+        <w:rPr>
+          <w:color w:val="000000" w:themeColor="text1"/>
+          <w:sz w:val="22"/>
+          <w:szCs w:val="22"/>
+        </w:rPr>
+        <w:t>).add</w:t>
+      </w:r>
+      <w:proofErr w:type="gramEnd"/>
+      <w:r>
+        <w:rPr>
+          <w:color w:val="000000" w:themeColor="text1"/>
+          <w:sz w:val="22"/>
+          <w:szCs w:val="22"/>
+        </w:rPr>
+        <w:t>(laptop);</w:t>
       </w:r>
     </w:p>
     <w:p>
@@ -8198,7 +9335,16 @@
           <w:sz w:val="22"/>
           <w:szCs w:val="22"/>
         </w:rPr>
-        <w:t xml:space="preserve">(electronics);  </w:t>
+        <w:t>(electronics</w:t>
+      </w:r>
+      <w:proofErr w:type="gramStart"/>
+      <w:r>
+        <w:rPr>
+          <w:color w:val="000000" w:themeColor="text1"/>
+          <w:sz w:val="22"/>
+          <w:szCs w:val="22"/>
+        </w:rPr>
+        <w:t xml:space="preserve">);  </w:t>
       </w:r>
       <w:r>
         <w:rPr>
@@ -8208,7 +9354,18 @@
           <w:sz w:val="22"/>
           <w:szCs w:val="22"/>
         </w:rPr>
-        <w:t>// BOTH category AND product saved automatically!</w:t>
+        <w:t>/</w:t>
+      </w:r>
+      <w:proofErr w:type="gramEnd"/>
+      <w:r>
+        <w:rPr>
+          <w:i/>
+          <w:iCs/>
+          <w:color w:val="000000" w:themeColor="text1"/>
+          <w:sz w:val="22"/>
+          <w:szCs w:val="22"/>
+        </w:rPr>
+        <w:t>/ BOTH category AND product saved automatically!</w:t>
       </w:r>
     </w:p>
     <w:p>
@@ -8293,15 +9450,33 @@
           <w:sz w:val="22"/>
           <w:szCs w:val="22"/>
         </w:rPr>
-        <w:t xml:space="preserve"> it separates the logic from the data layer (entity) and representation layer (the controller) </w:t>
-      </w:r>
-      <w:r>
-        <w:rPr>
-          <w:color w:val="000000" w:themeColor="text1"/>
-          <w:sz w:val="22"/>
-          <w:szCs w:val="22"/>
-        </w:rPr>
-        <w:t xml:space="preserve"> the service layer is responsible for implementing the business logic and hard calculations</w:t>
+        <w:t xml:space="preserve"> it separates the logic from the data layer (entity) and representation layer (the </w:t>
+      </w:r>
+      <w:proofErr w:type="gramStart"/>
+      <w:r>
+        <w:rPr>
+          <w:color w:val="000000" w:themeColor="text1"/>
+          <w:sz w:val="22"/>
+          <w:szCs w:val="22"/>
+        </w:rPr>
+        <w:t xml:space="preserve">controller) </w:t>
+      </w:r>
+      <w:r>
+        <w:rPr>
+          <w:color w:val="000000" w:themeColor="text1"/>
+          <w:sz w:val="22"/>
+          <w:szCs w:val="22"/>
+        </w:rPr>
+        <w:t xml:space="preserve"> the</w:t>
+      </w:r>
+      <w:proofErr w:type="gramEnd"/>
+      <w:r>
+        <w:rPr>
+          <w:color w:val="000000" w:themeColor="text1"/>
+          <w:sz w:val="22"/>
+          <w:szCs w:val="22"/>
+        </w:rPr>
+        <w:t xml:space="preserve"> service layer is responsible for implementing the business logic and hard calculations</w:t>
       </w:r>
     </w:p>
     <w:p>
@@ -8320,42 +9495,6 @@
         </w:rPr>
         <w:t xml:space="preserve">And by this separation using the service layer we can focus on testing the business logic solely </w:t>
       </w:r>
-    </w:p>
-    <w:p>
-      <w:pPr>
-        <w:rPr>
-          <w:color w:val="000000" w:themeColor="text1"/>
-          <w:sz w:val="22"/>
-          <w:szCs w:val="22"/>
-        </w:rPr>
-      </w:pPr>
-    </w:p>
-    <w:p>
-      <w:pPr>
-        <w:rPr>
-          <w:color w:val="000000" w:themeColor="text1"/>
-          <w:sz w:val="22"/>
-          <w:szCs w:val="22"/>
-        </w:rPr>
-      </w:pPr>
-    </w:p>
-    <w:p>
-      <w:pPr>
-        <w:rPr>
-          <w:color w:val="000000" w:themeColor="text1"/>
-          <w:sz w:val="22"/>
-          <w:szCs w:val="22"/>
-        </w:rPr>
-      </w:pPr>
-    </w:p>
-    <w:p>
-      <w:pPr>
-        <w:rPr>
-          <w:color w:val="000000" w:themeColor="text1"/>
-          <w:sz w:val="22"/>
-          <w:szCs w:val="22"/>
-        </w:rPr>
-      </w:pPr>
     </w:p>
     <w:p>
       <w:pPr>
@@ -8601,21 +9740,49 @@
           <w:szCs w:val="22"/>
         </w:rPr>
       </w:pPr>
-      <w:r>
-        <w:rPr>
-          <w:color w:val="000000" w:themeColor="text1"/>
-          <w:sz w:val="22"/>
-          <w:szCs w:val="22"/>
-        </w:rPr>
-        <w:t>DTO  helps with data separation</w:t>
-      </w:r>
-      <w:r>
-        <w:rPr>
-          <w:color w:val="000000" w:themeColor="text1"/>
-          <w:sz w:val="22"/>
-          <w:szCs w:val="22"/>
-        </w:rPr>
-        <w:t>, means that we can change the logic and it wont affect the end user, we can hide some confidential data</w:t>
+      <w:proofErr w:type="gramStart"/>
+      <w:r>
+        <w:rPr>
+          <w:color w:val="000000" w:themeColor="text1"/>
+          <w:sz w:val="22"/>
+          <w:szCs w:val="22"/>
+        </w:rPr>
+        <w:t>DTO  helps</w:t>
+      </w:r>
+      <w:proofErr w:type="gramEnd"/>
+      <w:r>
+        <w:rPr>
+          <w:color w:val="000000" w:themeColor="text1"/>
+          <w:sz w:val="22"/>
+          <w:szCs w:val="22"/>
+        </w:rPr>
+        <w:t xml:space="preserve"> with data separation</w:t>
+      </w:r>
+      <w:r>
+        <w:rPr>
+          <w:color w:val="000000" w:themeColor="text1"/>
+          <w:sz w:val="22"/>
+          <w:szCs w:val="22"/>
+        </w:rPr>
+        <w:t xml:space="preserve">, means that we can change the logic and it </w:t>
+      </w:r>
+      <w:proofErr w:type="gramStart"/>
+      <w:r>
+        <w:rPr>
+          <w:color w:val="000000" w:themeColor="text1"/>
+          <w:sz w:val="22"/>
+          <w:szCs w:val="22"/>
+        </w:rPr>
+        <w:t>wont</w:t>
+      </w:r>
+      <w:proofErr w:type="gramEnd"/>
+      <w:r>
+        <w:rPr>
+          <w:color w:val="000000" w:themeColor="text1"/>
+          <w:sz w:val="22"/>
+          <w:szCs w:val="22"/>
+        </w:rPr>
+        <w:t xml:space="preserve"> affect the end user, we can hide some confidential data</w:t>
       </w:r>
     </w:p>
     <w:p>
@@ -8672,13 +9839,736 @@
     </w:p>
     <w:p>
       <w:pPr>
-        <w:rPr>
-          <w:color w:val="000000" w:themeColor="text1"/>
-          <w:sz w:val="22"/>
-          <w:szCs w:val="22"/>
-        </w:rPr>
-      </w:pPr>
-    </w:p>
+        <w:jc w:val="center"/>
+        <w:rPr>
+          <w:b/>
+          <w:bCs/>
+          <w:color w:val="EE0000"/>
+          <w:sz w:val="32"/>
+          <w:szCs w:val="32"/>
+          <w:u w:val="single"/>
+        </w:rPr>
+      </w:pPr>
+      <w:r>
+        <w:rPr>
+          <w:b/>
+          <w:bCs/>
+          <w:color w:val="EE0000"/>
+          <w:sz w:val="32"/>
+          <w:szCs w:val="32"/>
+          <w:u w:val="single"/>
+        </w:rPr>
+        <w:t>Cascade types and when to use what</w:t>
+      </w:r>
+    </w:p>
+    <w:tbl>
+      <w:tblPr>
+        <w:tblW w:w="11280" w:type="dxa"/>
+        <w:tblInd w:w="-1314" w:type="dxa"/>
+        <w:shd w:val="clear" w:color="auto" w:fill="FFFFFF"/>
+        <w:tblCellMar>
+          <w:top w:w="15" w:type="dxa"/>
+          <w:left w:w="15" w:type="dxa"/>
+          <w:bottom w:w="15" w:type="dxa"/>
+          <w:right w:w="15" w:type="dxa"/>
+        </w:tblCellMar>
+        <w:tblLook w:val="04A0" w:firstRow="1" w:lastRow="0" w:firstColumn="1" w:lastColumn="0" w:noHBand="0" w:noVBand="1"/>
+      </w:tblPr>
+      <w:tblGrid>
+        <w:gridCol w:w="1031"/>
+        <w:gridCol w:w="5316"/>
+        <w:gridCol w:w="4933"/>
+      </w:tblGrid>
+      <w:tr>
+        <w:trPr>
+          <w:tblHeader/>
+        </w:trPr>
+        <w:tc>
+          <w:tcPr>
+            <w:tcW w:w="0" w:type="auto"/>
+            <w:tcBorders>
+              <w:top w:val="nil"/>
+            </w:tcBorders>
+            <w:shd w:val="clear" w:color="auto" w:fill="FFFFFF"/>
+            <w:tcMar>
+              <w:top w:w="150" w:type="dxa"/>
+              <w:left w:w="0" w:type="dxa"/>
+              <w:bottom w:w="150" w:type="dxa"/>
+              <w:right w:w="240" w:type="dxa"/>
+            </w:tcMar>
+            <w:vAlign w:val="center"/>
+            <w:hideMark/>
+          </w:tcPr>
+          <w:p>
+            <w:pPr>
+              <w:rPr>
+                <w:b/>
+                <w:bCs/>
+                <w:color w:val="000000" w:themeColor="text1"/>
+                <w:sz w:val="22"/>
+                <w:szCs w:val="22"/>
+              </w:rPr>
+            </w:pPr>
+            <w:r>
+              <w:rPr>
+                <w:b/>
+                <w:bCs/>
+                <w:color w:val="000000" w:themeColor="text1"/>
+                <w:sz w:val="22"/>
+                <w:szCs w:val="22"/>
+              </w:rPr>
+              <w:t>Type</w:t>
+            </w:r>
+          </w:p>
+        </w:tc>
+        <w:tc>
+          <w:tcPr>
+            <w:tcW w:w="0" w:type="auto"/>
+            <w:tcBorders>
+              <w:top w:val="nil"/>
+            </w:tcBorders>
+            <w:shd w:val="clear" w:color="auto" w:fill="FFFFFF"/>
+            <w:tcMar>
+              <w:top w:w="150" w:type="dxa"/>
+              <w:left w:w="240" w:type="dxa"/>
+              <w:bottom w:w="150" w:type="dxa"/>
+              <w:right w:w="240" w:type="dxa"/>
+            </w:tcMar>
+            <w:vAlign w:val="center"/>
+            <w:hideMark/>
+          </w:tcPr>
+          <w:p>
+            <w:pPr>
+              <w:rPr>
+                <w:b/>
+                <w:bCs/>
+                <w:color w:val="000000" w:themeColor="text1"/>
+                <w:sz w:val="22"/>
+                <w:szCs w:val="22"/>
+              </w:rPr>
+            </w:pPr>
+            <w:r>
+              <w:rPr>
+                <w:b/>
+                <w:bCs/>
+                <w:color w:val="000000" w:themeColor="text1"/>
+                <w:sz w:val="22"/>
+                <w:szCs w:val="22"/>
+              </w:rPr>
+              <w:t>What it does</w:t>
+            </w:r>
+          </w:p>
+        </w:tc>
+        <w:tc>
+          <w:tcPr>
+            <w:tcW w:w="0" w:type="auto"/>
+            <w:tcBorders>
+              <w:top w:val="nil"/>
+            </w:tcBorders>
+            <w:shd w:val="clear" w:color="auto" w:fill="FFFFFF"/>
+            <w:tcMar>
+              <w:top w:w="150" w:type="dxa"/>
+              <w:left w:w="240" w:type="dxa"/>
+              <w:bottom w:w="150" w:type="dxa"/>
+              <w:right w:w="240" w:type="dxa"/>
+            </w:tcMar>
+            <w:vAlign w:val="center"/>
+            <w:hideMark/>
+          </w:tcPr>
+          <w:p>
+            <w:pPr>
+              <w:rPr>
+                <w:b/>
+                <w:bCs/>
+                <w:color w:val="000000" w:themeColor="text1"/>
+                <w:sz w:val="22"/>
+                <w:szCs w:val="22"/>
+              </w:rPr>
+            </w:pPr>
+            <w:r>
+              <w:rPr>
+                <w:b/>
+                <w:bCs/>
+                <w:color w:val="000000" w:themeColor="text1"/>
+                <w:sz w:val="22"/>
+                <w:szCs w:val="22"/>
+              </w:rPr>
+              <w:t>When to use</w:t>
+            </w:r>
+          </w:p>
+        </w:tc>
+      </w:tr>
+      <w:tr>
+        <w:tc>
+          <w:tcPr>
+            <w:tcW w:w="0" w:type="auto"/>
+            <w:shd w:val="clear" w:color="auto" w:fill="FFFFFF"/>
+            <w:tcMar>
+              <w:top w:w="150" w:type="dxa"/>
+              <w:left w:w="0" w:type="dxa"/>
+              <w:bottom w:w="150" w:type="dxa"/>
+              <w:right w:w="240" w:type="dxa"/>
+            </w:tcMar>
+            <w:vAlign w:val="center"/>
+            <w:hideMark/>
+          </w:tcPr>
+          <w:p>
+            <w:pPr>
+              <w:rPr>
+                <w:color w:val="000000" w:themeColor="text1"/>
+                <w:sz w:val="22"/>
+                <w:szCs w:val="22"/>
+              </w:rPr>
+            </w:pPr>
+            <w:r>
+              <w:rPr>
+                <w:color w:val="000000" w:themeColor="text1"/>
+                <w:sz w:val="22"/>
+                <w:szCs w:val="22"/>
+              </w:rPr>
+              <w:t>PERSIST</w:t>
+            </w:r>
+          </w:p>
+        </w:tc>
+        <w:tc>
+          <w:tcPr>
+            <w:tcW w:w="0" w:type="auto"/>
+            <w:shd w:val="clear" w:color="auto" w:fill="FFFFFF"/>
+            <w:tcMar>
+              <w:top w:w="150" w:type="dxa"/>
+              <w:left w:w="240" w:type="dxa"/>
+              <w:bottom w:w="150" w:type="dxa"/>
+              <w:right w:w="240" w:type="dxa"/>
+            </w:tcMar>
+            <w:vAlign w:val="center"/>
+            <w:hideMark/>
+          </w:tcPr>
+          <w:p>
+            <w:pPr>
+              <w:rPr>
+                <w:color w:val="000000" w:themeColor="text1"/>
+                <w:sz w:val="22"/>
+                <w:szCs w:val="22"/>
+              </w:rPr>
+            </w:pPr>
+            <w:r>
+              <w:rPr>
+                <w:color w:val="000000" w:themeColor="text1"/>
+                <w:sz w:val="22"/>
+                <w:szCs w:val="22"/>
+              </w:rPr>
+              <w:t>Save child when parent is saved</w:t>
+            </w:r>
+          </w:p>
+        </w:tc>
+        <w:tc>
+          <w:tcPr>
+            <w:tcW w:w="0" w:type="auto"/>
+            <w:shd w:val="clear" w:color="auto" w:fill="FFFFFF"/>
+            <w:tcMar>
+              <w:top w:w="150" w:type="dxa"/>
+              <w:left w:w="240" w:type="dxa"/>
+              <w:bottom w:w="150" w:type="dxa"/>
+              <w:right w:w="0" w:type="dxa"/>
+            </w:tcMar>
+            <w:vAlign w:val="center"/>
+            <w:hideMark/>
+          </w:tcPr>
+          <w:p>
+            <w:pPr>
+              <w:rPr>
+                <w:color w:val="000000" w:themeColor="text1"/>
+                <w:sz w:val="22"/>
+                <w:szCs w:val="22"/>
+              </w:rPr>
+            </w:pPr>
+            <w:r>
+              <w:rPr>
+                <w:color w:val="000000" w:themeColor="text1"/>
+                <w:sz w:val="22"/>
+                <w:szCs w:val="22"/>
+              </w:rPr>
+              <w:t>Child can't exist without parent</w:t>
+            </w:r>
+          </w:p>
+        </w:tc>
+      </w:tr>
+      <w:tr>
+        <w:tc>
+          <w:tcPr>
+            <w:tcW w:w="0" w:type="auto"/>
+            <w:shd w:val="clear" w:color="auto" w:fill="FFFFFF"/>
+            <w:tcMar>
+              <w:top w:w="150" w:type="dxa"/>
+              <w:left w:w="0" w:type="dxa"/>
+              <w:bottom w:w="150" w:type="dxa"/>
+              <w:right w:w="240" w:type="dxa"/>
+            </w:tcMar>
+            <w:vAlign w:val="center"/>
+            <w:hideMark/>
+          </w:tcPr>
+          <w:p>
+            <w:pPr>
+              <w:rPr>
+                <w:color w:val="000000" w:themeColor="text1"/>
+                <w:sz w:val="22"/>
+                <w:szCs w:val="22"/>
+              </w:rPr>
+            </w:pPr>
+            <w:r>
+              <w:rPr>
+                <w:color w:val="000000" w:themeColor="text1"/>
+                <w:sz w:val="22"/>
+                <w:szCs w:val="22"/>
+              </w:rPr>
+              <w:t>MERGE</w:t>
+            </w:r>
+          </w:p>
+        </w:tc>
+        <w:tc>
+          <w:tcPr>
+            <w:tcW w:w="0" w:type="auto"/>
+            <w:shd w:val="clear" w:color="auto" w:fill="FFFFFF"/>
+            <w:tcMar>
+              <w:top w:w="150" w:type="dxa"/>
+              <w:left w:w="240" w:type="dxa"/>
+              <w:bottom w:w="150" w:type="dxa"/>
+              <w:right w:w="240" w:type="dxa"/>
+            </w:tcMar>
+            <w:vAlign w:val="center"/>
+            <w:hideMark/>
+          </w:tcPr>
+          <w:p>
+            <w:pPr>
+              <w:rPr>
+                <w:color w:val="000000" w:themeColor="text1"/>
+                <w:sz w:val="22"/>
+                <w:szCs w:val="22"/>
+              </w:rPr>
+            </w:pPr>
+            <w:r>
+              <w:rPr>
+                <w:color w:val="000000" w:themeColor="text1"/>
+                <w:sz w:val="22"/>
+                <w:szCs w:val="22"/>
+              </w:rPr>
+              <w:t>Update child when parent is updated</w:t>
+            </w:r>
+          </w:p>
+        </w:tc>
+        <w:tc>
+          <w:tcPr>
+            <w:tcW w:w="0" w:type="auto"/>
+            <w:shd w:val="clear" w:color="auto" w:fill="FFFFFF"/>
+            <w:tcMar>
+              <w:top w:w="150" w:type="dxa"/>
+              <w:left w:w="240" w:type="dxa"/>
+              <w:bottom w:w="150" w:type="dxa"/>
+              <w:right w:w="0" w:type="dxa"/>
+            </w:tcMar>
+            <w:vAlign w:val="center"/>
+            <w:hideMark/>
+          </w:tcPr>
+          <w:p>
+            <w:pPr>
+              <w:rPr>
+                <w:color w:val="000000" w:themeColor="text1"/>
+                <w:sz w:val="22"/>
+                <w:szCs w:val="22"/>
+              </w:rPr>
+            </w:pPr>
+            <w:r>
+              <w:rPr>
+                <w:color w:val="000000" w:themeColor="text1"/>
+                <w:sz w:val="22"/>
+                <w:szCs w:val="22"/>
+              </w:rPr>
+              <w:t>Changes to parent should sync to child</w:t>
+            </w:r>
+          </w:p>
+        </w:tc>
+      </w:tr>
+      <w:tr>
+        <w:tc>
+          <w:tcPr>
+            <w:tcW w:w="0" w:type="auto"/>
+            <w:shd w:val="clear" w:color="auto" w:fill="FFFFFF"/>
+            <w:tcMar>
+              <w:top w:w="150" w:type="dxa"/>
+              <w:left w:w="0" w:type="dxa"/>
+              <w:bottom w:w="150" w:type="dxa"/>
+              <w:right w:w="240" w:type="dxa"/>
+            </w:tcMar>
+            <w:vAlign w:val="center"/>
+            <w:hideMark/>
+          </w:tcPr>
+          <w:p>
+            <w:pPr>
+              <w:rPr>
+                <w:color w:val="000000" w:themeColor="text1"/>
+                <w:sz w:val="22"/>
+                <w:szCs w:val="22"/>
+              </w:rPr>
+            </w:pPr>
+            <w:r>
+              <w:rPr>
+                <w:color w:val="000000" w:themeColor="text1"/>
+                <w:sz w:val="22"/>
+                <w:szCs w:val="22"/>
+              </w:rPr>
+              <w:t>REMOVE</w:t>
+            </w:r>
+          </w:p>
+        </w:tc>
+        <w:tc>
+          <w:tcPr>
+            <w:tcW w:w="0" w:type="auto"/>
+            <w:shd w:val="clear" w:color="auto" w:fill="FFFFFF"/>
+            <w:tcMar>
+              <w:top w:w="150" w:type="dxa"/>
+              <w:left w:w="240" w:type="dxa"/>
+              <w:bottom w:w="150" w:type="dxa"/>
+              <w:right w:w="240" w:type="dxa"/>
+            </w:tcMar>
+            <w:vAlign w:val="center"/>
+            <w:hideMark/>
+          </w:tcPr>
+          <w:p>
+            <w:pPr>
+              <w:rPr>
+                <w:color w:val="000000" w:themeColor="text1"/>
+                <w:sz w:val="22"/>
+                <w:szCs w:val="22"/>
+              </w:rPr>
+            </w:pPr>
+            <w:r>
+              <w:rPr>
+                <w:color w:val="000000" w:themeColor="text1"/>
+                <w:sz w:val="22"/>
+                <w:szCs w:val="22"/>
+              </w:rPr>
+              <w:t>Delete child when parent is deleted</w:t>
+            </w:r>
+          </w:p>
+        </w:tc>
+        <w:tc>
+          <w:tcPr>
+            <w:tcW w:w="0" w:type="auto"/>
+            <w:shd w:val="clear" w:color="auto" w:fill="FFFFFF"/>
+            <w:tcMar>
+              <w:top w:w="150" w:type="dxa"/>
+              <w:left w:w="240" w:type="dxa"/>
+              <w:bottom w:w="150" w:type="dxa"/>
+              <w:right w:w="0" w:type="dxa"/>
+            </w:tcMar>
+            <w:vAlign w:val="center"/>
+            <w:hideMark/>
+          </w:tcPr>
+          <w:p>
+            <w:pPr>
+              <w:rPr>
+                <w:color w:val="000000" w:themeColor="text1"/>
+                <w:sz w:val="22"/>
+                <w:szCs w:val="22"/>
+              </w:rPr>
+            </w:pPr>
+            <w:r>
+              <w:rPr>
+                <w:color w:val="000000" w:themeColor="text1"/>
+                <w:sz w:val="22"/>
+                <w:szCs w:val="22"/>
+              </w:rPr>
+              <w:t>Child has no meaning without parent</w:t>
+            </w:r>
+          </w:p>
+        </w:tc>
+      </w:tr>
+      <w:tr>
+        <w:tc>
+          <w:tcPr>
+            <w:tcW w:w="0" w:type="auto"/>
+            <w:shd w:val="clear" w:color="auto" w:fill="FFFFFF"/>
+            <w:tcMar>
+              <w:top w:w="150" w:type="dxa"/>
+              <w:left w:w="0" w:type="dxa"/>
+              <w:bottom w:w="150" w:type="dxa"/>
+              <w:right w:w="240" w:type="dxa"/>
+            </w:tcMar>
+            <w:vAlign w:val="center"/>
+            <w:hideMark/>
+          </w:tcPr>
+          <w:p>
+            <w:pPr>
+              <w:rPr>
+                <w:color w:val="000000" w:themeColor="text1"/>
+                <w:sz w:val="22"/>
+                <w:szCs w:val="22"/>
+              </w:rPr>
+            </w:pPr>
+            <w:r>
+              <w:rPr>
+                <w:color w:val="000000" w:themeColor="text1"/>
+                <w:sz w:val="22"/>
+                <w:szCs w:val="22"/>
+              </w:rPr>
+              <w:t>REFRESH</w:t>
+            </w:r>
+          </w:p>
+        </w:tc>
+        <w:tc>
+          <w:tcPr>
+            <w:tcW w:w="0" w:type="auto"/>
+            <w:shd w:val="clear" w:color="auto" w:fill="FFFFFF"/>
+            <w:tcMar>
+              <w:top w:w="150" w:type="dxa"/>
+              <w:left w:w="240" w:type="dxa"/>
+              <w:bottom w:w="150" w:type="dxa"/>
+              <w:right w:w="240" w:type="dxa"/>
+            </w:tcMar>
+            <w:vAlign w:val="center"/>
+            <w:hideMark/>
+          </w:tcPr>
+          <w:p>
+            <w:pPr>
+              <w:rPr>
+                <w:color w:val="000000" w:themeColor="text1"/>
+                <w:sz w:val="22"/>
+                <w:szCs w:val="22"/>
+              </w:rPr>
+            </w:pPr>
+            <w:r>
+              <w:rPr>
+                <w:color w:val="000000" w:themeColor="text1"/>
+                <w:sz w:val="22"/>
+                <w:szCs w:val="22"/>
+              </w:rPr>
+              <w:t>Reload child from DB when parent is reloaded</w:t>
+            </w:r>
+          </w:p>
+        </w:tc>
+        <w:tc>
+          <w:tcPr>
+            <w:tcW w:w="0" w:type="auto"/>
+            <w:shd w:val="clear" w:color="auto" w:fill="FFFFFF"/>
+            <w:tcMar>
+              <w:top w:w="150" w:type="dxa"/>
+              <w:left w:w="240" w:type="dxa"/>
+              <w:bottom w:w="150" w:type="dxa"/>
+              <w:right w:w="0" w:type="dxa"/>
+            </w:tcMar>
+            <w:vAlign w:val="center"/>
+            <w:hideMark/>
+          </w:tcPr>
+          <w:p>
+            <w:pPr>
+              <w:rPr>
+                <w:color w:val="000000" w:themeColor="text1"/>
+                <w:sz w:val="22"/>
+                <w:szCs w:val="22"/>
+              </w:rPr>
+            </w:pPr>
+            <w:r>
+              <w:rPr>
+                <w:color w:val="000000" w:themeColor="text1"/>
+                <w:sz w:val="22"/>
+                <w:szCs w:val="22"/>
+              </w:rPr>
+              <w:t>Keep child in sync with parent</w:t>
+            </w:r>
+          </w:p>
+        </w:tc>
+      </w:tr>
+      <w:tr>
+        <w:tc>
+          <w:tcPr>
+            <w:tcW w:w="0" w:type="auto"/>
+            <w:shd w:val="clear" w:color="auto" w:fill="FFFFFF"/>
+            <w:tcMar>
+              <w:top w:w="150" w:type="dxa"/>
+              <w:left w:w="0" w:type="dxa"/>
+              <w:bottom w:w="150" w:type="dxa"/>
+              <w:right w:w="240" w:type="dxa"/>
+            </w:tcMar>
+            <w:vAlign w:val="center"/>
+            <w:hideMark/>
+          </w:tcPr>
+          <w:p>
+            <w:pPr>
+              <w:rPr>
+                <w:color w:val="000000" w:themeColor="text1"/>
+                <w:sz w:val="22"/>
+                <w:szCs w:val="22"/>
+              </w:rPr>
+            </w:pPr>
+            <w:r>
+              <w:rPr>
+                <w:color w:val="000000" w:themeColor="text1"/>
+                <w:sz w:val="22"/>
+                <w:szCs w:val="22"/>
+              </w:rPr>
+              <w:t>DETACH</w:t>
+            </w:r>
+          </w:p>
+        </w:tc>
+        <w:tc>
+          <w:tcPr>
+            <w:tcW w:w="0" w:type="auto"/>
+            <w:shd w:val="clear" w:color="auto" w:fill="FFFFFF"/>
+            <w:tcMar>
+              <w:top w:w="150" w:type="dxa"/>
+              <w:left w:w="240" w:type="dxa"/>
+              <w:bottom w:w="150" w:type="dxa"/>
+              <w:right w:w="240" w:type="dxa"/>
+            </w:tcMar>
+            <w:vAlign w:val="center"/>
+            <w:hideMark/>
+          </w:tcPr>
+          <w:p>
+            <w:pPr>
+              <w:rPr>
+                <w:color w:val="000000" w:themeColor="text1"/>
+                <w:sz w:val="22"/>
+                <w:szCs w:val="22"/>
+              </w:rPr>
+            </w:pPr>
+            <w:r>
+              <w:rPr>
+                <w:color w:val="000000" w:themeColor="text1"/>
+                <w:sz w:val="22"/>
+                <w:szCs w:val="22"/>
+              </w:rPr>
+              <w:t>Remove child from persistence context when parent is detached</w:t>
+            </w:r>
+          </w:p>
+        </w:tc>
+        <w:tc>
+          <w:tcPr>
+            <w:tcW w:w="0" w:type="auto"/>
+            <w:shd w:val="clear" w:color="auto" w:fill="FFFFFF"/>
+            <w:tcMar>
+              <w:top w:w="150" w:type="dxa"/>
+              <w:left w:w="240" w:type="dxa"/>
+              <w:bottom w:w="150" w:type="dxa"/>
+              <w:right w:w="0" w:type="dxa"/>
+            </w:tcMar>
+            <w:vAlign w:val="center"/>
+            <w:hideMark/>
+          </w:tcPr>
+          <w:p>
+            <w:pPr>
+              <w:rPr>
+                <w:color w:val="000000" w:themeColor="text1"/>
+                <w:sz w:val="22"/>
+                <w:szCs w:val="22"/>
+              </w:rPr>
+            </w:pPr>
+            <w:r>
+              <w:rPr>
+                <w:color w:val="000000" w:themeColor="text1"/>
+                <w:sz w:val="22"/>
+                <w:szCs w:val="22"/>
+              </w:rPr>
+              <w:t>Rarely used directly</w:t>
+            </w:r>
+          </w:p>
+        </w:tc>
+      </w:tr>
+      <w:tr>
+        <w:tc>
+          <w:tcPr>
+            <w:tcW w:w="0" w:type="auto"/>
+            <w:shd w:val="clear" w:color="auto" w:fill="FFFFFF"/>
+            <w:tcMar>
+              <w:top w:w="150" w:type="dxa"/>
+              <w:left w:w="0" w:type="dxa"/>
+              <w:bottom w:w="150" w:type="dxa"/>
+              <w:right w:w="240" w:type="dxa"/>
+            </w:tcMar>
+            <w:vAlign w:val="center"/>
+            <w:hideMark/>
+          </w:tcPr>
+          <w:p>
+            <w:pPr>
+              <w:rPr>
+                <w:color w:val="000000" w:themeColor="text1"/>
+                <w:sz w:val="22"/>
+                <w:szCs w:val="22"/>
+              </w:rPr>
+            </w:pPr>
+            <w:r>
+              <w:rPr>
+                <w:color w:val="000000" w:themeColor="text1"/>
+                <w:sz w:val="22"/>
+                <w:szCs w:val="22"/>
+              </w:rPr>
+              <w:t>ALL</w:t>
+            </w:r>
+          </w:p>
+        </w:tc>
+        <w:tc>
+          <w:tcPr>
+            <w:tcW w:w="0" w:type="auto"/>
+            <w:shd w:val="clear" w:color="auto" w:fill="FFFFFF"/>
+            <w:tcMar>
+              <w:top w:w="150" w:type="dxa"/>
+              <w:left w:w="240" w:type="dxa"/>
+              <w:bottom w:w="150" w:type="dxa"/>
+              <w:right w:w="240" w:type="dxa"/>
+            </w:tcMar>
+            <w:vAlign w:val="center"/>
+            <w:hideMark/>
+          </w:tcPr>
+          <w:p>
+            <w:pPr>
+              <w:rPr>
+                <w:color w:val="000000" w:themeColor="text1"/>
+                <w:sz w:val="22"/>
+                <w:szCs w:val="22"/>
+              </w:rPr>
+            </w:pPr>
+            <w:r>
+              <w:rPr>
+                <w:color w:val="000000" w:themeColor="text1"/>
+                <w:sz w:val="22"/>
+                <w:szCs w:val="22"/>
+              </w:rPr>
+              <w:t>All of the above</w:t>
+            </w:r>
+          </w:p>
+        </w:tc>
+        <w:tc>
+          <w:tcPr>
+            <w:tcW w:w="0" w:type="auto"/>
+            <w:shd w:val="clear" w:color="auto" w:fill="FFFFFF"/>
+            <w:tcMar>
+              <w:top w:w="150" w:type="dxa"/>
+              <w:left w:w="240" w:type="dxa"/>
+              <w:bottom w:w="150" w:type="dxa"/>
+              <w:right w:w="0" w:type="dxa"/>
+            </w:tcMar>
+            <w:vAlign w:val="center"/>
+            <w:hideMark/>
+          </w:tcPr>
+          <w:p>
+            <w:pPr>
+              <w:rPr>
+                <w:color w:val="000000" w:themeColor="text1"/>
+                <w:sz w:val="22"/>
+                <w:szCs w:val="22"/>
+              </w:rPr>
+            </w:pPr>
+            <w:r>
+              <w:rPr>
+                <w:color w:val="000000" w:themeColor="text1"/>
+                <w:sz w:val="22"/>
+                <w:szCs w:val="22"/>
+              </w:rPr>
+              <w:t>Strong parent-child where child has no independent existence</w:t>
+            </w:r>
+          </w:p>
+        </w:tc>
+      </w:tr>
+    </w:tbl>
     <w:p>
       <w:pPr>
         <w:rPr>
@@ -9611,7 +11501,6 @@
   <w:style w:type="character" w:default="1" w:styleId="DefaultParagraphFont">
     <w:name w:val="Default Paragraph Font"/>
     <w:uiPriority w:val="1"/>
-    <w:semiHidden/>
     <w:unhideWhenUsed/>
   </w:style>
   <w:style w:type="table" w:default="1" w:styleId="TableNormal">

</xml_diff>